<commit_message>
docs: ajout des URLs de production (Vercel, Render, AlwaysData, Figma) dans README et dossier
</commit_message>
<xml_diff>
--- a/docs/dossier-trouve-ton-artisan.docx
+++ b/docs/dossier-trouve-ton-artisan.docx
@@ -106,7 +106,7 @@
         <w:t xml:space="preserve">Date de rendu : </w:t>
       </w:r>
       <w:r>
-        <w:t xml:space="preserve">15/05/2026</w:t>
+        <w:t xml:space="preserve">16/05/2026</w:t>
       </w:r>
     </w:p>
     <w:p>
@@ -1216,7 +1216,7 @@
       <w:r>
         <w:t xml:space="preserve">Maquettes complètes (consultation publique) : </w:t>
       </w:r>
-      <w:hyperlink w:history="1" r:id="rIdral2twnuzs4z-zjfkqzf-">
+      <w:hyperlink w:history="1" r:id="rId3pnnfz1t4hq2trm32vpbu">
         <w:r>
           <w:rPr>
             <w:rStyle w:val="Hyperlink"/>
@@ -1224,9 +1224,6 @@
           <w:t xml:space="preserve">Ouvrir le fichier Figma</w:t>
         </w:r>
       </w:hyperlink>
-      <w:r>
-        <w:t xml:space="preserve">  — (lien à compléter après publication)</w:t>
-      </w:r>
     </w:p>
     <w:p>
       <w:pPr>
@@ -4374,7 +4371,7 @@
       <w:r>
         <w:t xml:space="preserve">Le dépôt est public et contient l’intégralité du code, les scripts SQL et le README.md : </w:t>
       </w:r>
-      <w:hyperlink w:history="1" r:id="rId5hylwfqxbbye5g4vdqt4n">
+      <w:hyperlink w:history="1" r:id="rIdjk6iqpqve2cjm5odts3gd">
         <w:r>
           <w:rPr>
             <w:rStyle w:val="Hyperlink"/>
@@ -4382,9 +4379,6 @@
           <w:t xml:space="preserve">https://github.com/Sylvain13bdr/trouve-ton-artisan</w:t>
         </w:r>
       </w:hyperlink>
-      <w:r>
-        <w:t xml:space="preserve">  — (URL à confirmer après création du dépôt)</w:t>
-      </w:r>
     </w:p>
     <w:p>
       <w:pPr>
@@ -4431,7 +4425,7 @@
         <w:spacing w:after="80"/>
       </w:pPr>
       <w:r>
-        <w:t xml:space="preserve">database/01_schema.sql — Création de la base de données.</w:t>
+        <w:t xml:space="preserve">database/01_schema.sql — Création de la base de données (version XAMPP locale).</w:t>
       </w:r>
     </w:p>
     <w:p>
@@ -4457,7 +4451,7 @@
         <w:spacing w:after="80"/>
       </w:pPr>
       <w:r>
-        <w:t xml:space="preserve">docs/ — Documentation technique (sécurité, veille, BDD, maquettes).</w:t>
+        <w:t xml:space="preserve">database/remote/ — Variantes des scripts SQL pour hébergement distant (AlwaysData).</w:t>
       </w:r>
     </w:p>
     <w:p>
@@ -4470,6 +4464,19 @@
         <w:spacing w:after="80"/>
       </w:pPr>
       <w:r>
+        <w:t xml:space="preserve">docs/ — Documentation technique (sécurité, veille, BDD, maquettes).</w:t>
+      </w:r>
+    </w:p>
+    <w:p>
+      <w:pPr>
+        <w:pStyle w:val="ListParagraph"/>
+        <w:numPr>
+          <w:ilvl w:val="0"/>
+          <w:numId w:val="2"/>
+        </w:numPr>
+        <w:spacing w:after="80"/>
+      </w:pPr>
+      <w:r>
         <w:t xml:space="preserve">README.md — Prérequis, installation, lancement.</w:t>
       </w:r>
     </w:p>
@@ -4493,17 +4500,14 @@
       <w:r>
         <w:t xml:space="preserve">Frontend (Vercel) : </w:t>
       </w:r>
-      <w:hyperlink w:history="1" r:id="rIdymwrykzwommxbgjnjwdir">
+      <w:hyperlink w:history="1" r:id="rId3chlggcrituugwc-utrel">
         <w:r>
           <w:rPr>
             <w:rStyle w:val="Hyperlink"/>
           </w:rPr>
-          <w:t xml:space="preserve">https://trouve-ton-artisan.vercel.app/</w:t>
+          <w:t xml:space="preserve">https://trouve-ton-artisan-rosy.vercel.app/</w:t>
         </w:r>
       </w:hyperlink>
-      <w:r>
-        <w:t xml:space="preserve">  — (URL à confirmer après déploiement)</w:t>
-      </w:r>
     </w:p>
     <w:p>
       <w:pPr>
@@ -4512,16 +4516,22 @@
       <w:r>
         <w:t xml:space="preserve">API (Render) : </w:t>
       </w:r>
-      <w:hyperlink w:history="1" r:id="rIdn8acfw-uub7mec_i21vpj">
+      <w:hyperlink w:history="1" r:id="rIdgtym5m1vzjdbkmsvw42lg">
         <w:r>
           <w:rPr>
             <w:rStyle w:val="Hyperlink"/>
           </w:rPr>
-          <w:t xml:space="preserve">https://trouve-ton-artisan-api.onrender.com/api/health</w:t>
+          <w:t xml:space="preserve">https://trouve-ton-artisan-api-oqmj.onrender.com/api/health</w:t>
         </w:r>
       </w:hyperlink>
-      <w:r>
-        <w:t xml:space="preserve">  — (URL à confirmer après déploiement)</w:t>
+    </w:p>
+    <w:p>
+      <w:pPr>
+        <w:spacing w:after="120"/>
+        <w:jc w:val="both"/>
+      </w:pPr>
+      <w:r>
+        <w:t xml:space="preserve">Base de données MySQL/MariaDB hébergée sur AlwaysData (hôte mysql-sylvain13bdr.alwaysdata.net), connexion SSL obligatoire.</w:t>
       </w:r>
     </w:p>
     <w:p>
@@ -4544,17 +4554,14 @@
       <w:r>
         <w:t xml:space="preserve">Fichier de maquettes (lecture publique) : </w:t>
       </w:r>
-      <w:hyperlink w:history="1" r:id="rId5j1bpyeoipgabo9tooupa">
+      <w:hyperlink w:history="1" r:id="rIdljxc0uqstcnaybxndhltb">
         <w:r>
           <w:rPr>
             <w:rStyle w:val="Hyperlink"/>
           </w:rPr>
-          <w:t xml:space="preserve">https://www.figma.com/file/XXXX/trouve-ton-artisan</w:t>
+          <w:t xml:space="preserve">https://www.figma.com/design/vch2TgFsEjaY9O7gjnNakX/Trouve-ton-Artisan</w:t>
         </w:r>
       </w:hyperlink>
-      <w:r>
-        <w:t xml:space="preserve">  — (URL à confirmer après publication)</w:t>
-      </w:r>
     </w:p>
     <w:sectPr>
       <w:headerReference w:type="default" r:id="rId6"/>
@@ -4593,7 +4600,7 @@
       <w:rPr>
         <w:color w:val="384050"/>
       </w:rPr>
-      <w:t xml:space="preserve">15/05/2026</w:t>
+      <w:t xml:space="preserve">16/05/2026</w:t>
     </w:r>
     <w:r>
       <w:rPr>

</xml_diff>

<commit_message>
docs(maquettes): documentation du choix Inter comme substitut à Graphik + ajout section Charte graphique
</commit_message>
<xml_diff>
--- a/docs/dossier-trouve-ton-artisan.docx
+++ b/docs/dossier-trouve-ton-artisan.docx
@@ -1198,6 +1198,19 @@
     </w:p>
     <w:p>
       <w:pPr>
+        <w:spacing w:after="120"/>
+        <w:jc w:val="both"/>
+      </w:pPr>
+      <w:r>
+        <w:rPr>
+          <w:i/>
+          <w:iCs/>
+        </w:rPr>
+        <w:t xml:space="preserve">Note importante : Graphik est une police propriétaire (éditeur Commercial Type) fournie sous licence commerciale payante. Pour les maquettes Figma comme pour le rendu actuel du site, c'est donc Inter (Google Fonts, open-source) qui a été utilisée comme substitut visuel — police géométrique sans-serif très proche de Graphik. Le CSS du site spécifie cependant `font-family: 'Graphik', 'Helvetica Neue', Arial, sans-serif`, ce qui permettra à la région de déployer Graphik sans modifier le code dès qu'elle aura acquis la licence et fourni les fichiers de police.</w:t>
+      </w:r>
+    </w:p>
+    <w:p>
+      <w:pPr>
         <w:pStyle w:val="Heading2"/>
         <w:spacing w:before="240" w:after="120"/>
       </w:pPr>
@@ -1216,7 +1229,7 @@
       <w:r>
         <w:t xml:space="preserve">Maquettes complètes (consultation publique) : </w:t>
       </w:r>
-      <w:hyperlink w:history="1" r:id="rId3pnnfz1t4hq2trm32vpbu">
+      <w:hyperlink w:history="1" r:id="rId0ut17dt_gos0n53fcloip">
         <w:r>
           <w:rPr>
             <w:rStyle w:val="Hyperlink"/>
@@ -1248,7 +1261,7 @@
           <w:b/>
           <w:bCs/>
         </w:rPr>
-        <w:t xml:space="preserve">2.3.1 Accueil</w:t>
+        <w:t xml:space="preserve">2.3.1 Charte graphique</w:t>
       </w:r>
     </w:p>
     <w:tbl>
@@ -1297,7 +1310,7 @@
                 <w:iCs/>
                 <w:color w:val="0074C7"/>
               </w:rPr>
-              <w:t xml:space="preserve">[ Accueil — mobile 375 px — capture à insérer ]</w:t>
+              <w:t xml:space="preserve">[ Charte graphique — logo, favicon, palette, typographie — capture à insérer ]</w:t>
             </w:r>
           </w:p>
         </w:tc>
@@ -1305,10 +1318,15 @@
     </w:tbl>
     <w:p>
       <w:pPr>
-        <w:spacing w:after="120"/>
-      </w:pPr>
-      <w:r>
-        <w:t xml:space="preserve"/>
+        <w:pStyle w:val="Heading3"/>
+        <w:spacing w:before="200" w:after="100"/>
+      </w:pPr>
+      <w:r>
+        <w:rPr>
+          <w:b/>
+          <w:bCs/>
+        </w:rPr>
+        <w:t xml:space="preserve">2.3.2 Accueil</w:t>
       </w:r>
     </w:p>
     <w:tbl>
@@ -1357,7 +1375,7 @@
                 <w:iCs/>
                 <w:color w:val="0074C7"/>
               </w:rPr>
-              <w:t xml:space="preserve">[ Accueil — tablette 768 px — capture à insérer ]</w:t>
+              <w:t xml:space="preserve">[ Accueil — mobile 375 px — capture à insérer ]</w:t>
             </w:r>
           </w:p>
         </w:tc>
@@ -1417,7 +1435,7 @@
                 <w:iCs/>
                 <w:color w:val="0074C7"/>
               </w:rPr>
-              <w:t xml:space="preserve">[ Accueil — ordinateur 1280 px — capture à insérer ]</w:t>
+              <w:t xml:space="preserve">[ Accueil — tablette 768 px — capture à insérer ]</w:t>
             </w:r>
           </w:p>
         </w:tc>
@@ -1425,15 +1443,10 @@
     </w:tbl>
     <w:p>
       <w:pPr>
-        <w:pStyle w:val="Heading3"/>
-        <w:spacing w:before="200" w:after="100"/>
-      </w:pPr>
-      <w:r>
-        <w:rPr>
-          <w:b/>
-          <w:bCs/>
-        </w:rPr>
-        <w:t xml:space="preserve">2.3.2 Liste des artisans</w:t>
+        <w:spacing w:after="120"/>
+      </w:pPr>
+      <w:r>
+        <w:t xml:space="preserve"/>
       </w:r>
     </w:p>
     <w:tbl>
@@ -1482,7 +1495,7 @@
                 <w:iCs/>
                 <w:color w:val="0074C7"/>
               </w:rPr>
-              <w:t xml:space="preserve">[ Liste — mobile / tablette / desktop — capture à insérer ]</w:t>
+              <w:t xml:space="preserve">[ Accueil — ordinateur 1280 px — capture à insérer ]</w:t>
             </w:r>
           </w:p>
         </w:tc>
@@ -1498,7 +1511,7 @@
           <w:b/>
           <w:bCs/>
         </w:rPr>
-        <w:t xml:space="preserve">2.3.3 Fiche artisan + formulaire</w:t>
+        <w:t xml:space="preserve">2.3.3 Liste des artisans</w:t>
       </w:r>
     </w:p>
     <w:tbl>
@@ -1547,7 +1560,7 @@
                 <w:iCs/>
                 <w:color w:val="0074C7"/>
               </w:rPr>
-              <w:t xml:space="preserve">[ Fiche artisan — mobile / tablette / desktop — capture à insérer ]</w:t>
+              <w:t xml:space="preserve">[ Liste — mobile / tablette / desktop — capture à insérer ]</w:t>
             </w:r>
           </w:p>
         </w:tc>
@@ -1563,7 +1576,72 @@
           <w:b/>
           <w:bCs/>
         </w:rPr>
-        <w:t xml:space="preserve">2.3.4 Page 404</w:t>
+        <w:t xml:space="preserve">2.3.4 Fiche artisan + formulaire</w:t>
+      </w:r>
+    </w:p>
+    <w:tbl>
+      <w:tblPr>
+        <w:tblW w:type="dxa" w:w="9360"/>
+        <w:tblBorders>
+          <w:top w:val="single" w:color="auto" w:sz="4"/>
+          <w:left w:val="single" w:color="auto" w:sz="4"/>
+          <w:bottom w:val="single" w:color="auto" w:sz="4"/>
+          <w:right w:val="single" w:color="auto" w:sz="4"/>
+          <w:insideH w:val="single" w:color="auto" w:sz="4"/>
+          <w:insideV w:val="single" w:color="auto" w:sz="4"/>
+        </w:tblBorders>
+      </w:tblPr>
+      <w:tblGrid>
+        <w:gridCol w:w="9360"/>
+      </w:tblGrid>
+      <w:tr>
+        <w:tc>
+          <w:tcPr>
+            <w:tcW w:type="dxa" w:w="9360"/>
+            <w:tcBorders>
+              <w:top w:val="dashed" w:color="0074C7" w:sz="6"/>
+              <w:left w:val="dashed" w:color="0074C7" w:sz="6"/>
+              <w:bottom w:val="dashed" w:color="0074C7" w:sz="6"/>
+              <w:right w:val="dashed" w:color="0074C7" w:sz="6"/>
+            </w:tcBorders>
+            <w:shd w:fill="F1F8FC" w:val="clear"/>
+            <w:tcMar>
+              <w:top w:type="dxa" w:w="600"/>
+              <w:left w:type="dxa" w:w="240"/>
+              <w:bottom w:type="dxa" w:w="600"/>
+              <w:right w:type="dxa" w:w="240"/>
+            </w:tcMar>
+            <w:vAlign w:val="center"/>
+          </w:tcPr>
+          <w:p>
+            <w:pPr>
+              <w:jc w:val="center"/>
+            </w:pPr>
+            <w:r>
+              <w:rPr>
+                <w:b/>
+                <w:bCs/>
+                <w:i/>
+                <w:iCs/>
+                <w:color w:val="0074C7"/>
+              </w:rPr>
+              <w:t xml:space="preserve">[ Fiche artisan — mobile / tablette / desktop — capture à insérer ]</w:t>
+            </w:r>
+          </w:p>
+        </w:tc>
+      </w:tr>
+    </w:tbl>
+    <w:p>
+      <w:pPr>
+        <w:pStyle w:val="Heading3"/>
+        <w:spacing w:before="200" w:after="100"/>
+      </w:pPr>
+      <w:r>
+        <w:rPr>
+          <w:b/>
+          <w:bCs/>
+        </w:rPr>
+        <w:t xml:space="preserve">2.3.5 Page 404</w:t>
       </w:r>
     </w:p>
     <w:tbl>
@@ -4371,7 +4449,7 @@
       <w:r>
         <w:t xml:space="preserve">Le dépôt est public et contient l’intégralité du code, les scripts SQL et le README.md : </w:t>
       </w:r>
-      <w:hyperlink w:history="1" r:id="rIdjk6iqpqve2cjm5odts3gd">
+      <w:hyperlink w:history="1" r:id="rIdrc66mx7pkq5afn1u5fpsp">
         <w:r>
           <w:rPr>
             <w:rStyle w:val="Hyperlink"/>
@@ -4500,7 +4578,7 @@
       <w:r>
         <w:t xml:space="preserve">Frontend (Vercel) : </w:t>
       </w:r>
-      <w:hyperlink w:history="1" r:id="rId3chlggcrituugwc-utrel">
+      <w:hyperlink w:history="1" r:id="rIdot9p0w_yfpghgfhsqe4ee">
         <w:r>
           <w:rPr>
             <w:rStyle w:val="Hyperlink"/>
@@ -4516,7 +4594,7 @@
       <w:r>
         <w:t xml:space="preserve">API (Render) : </w:t>
       </w:r>
-      <w:hyperlink w:history="1" r:id="rIdgtym5m1vzjdbkmsvw42lg">
+      <w:hyperlink w:history="1" r:id="rIder4g3taav9a5skf9i7fhg">
         <w:r>
           <w:rPr>
             <w:rStyle w:val="Hyperlink"/>
@@ -4554,7 +4632,7 @@
       <w:r>
         <w:t xml:space="preserve">Fichier de maquettes (lecture publique) : </w:t>
       </w:r>
-      <w:hyperlink w:history="1" r:id="rIdljxc0uqstcnaybxndhltb">
+      <w:hyperlink w:history="1" r:id="rIdexdhwpz9lyw0mv_az-s83">
         <w:r>
           <w:rPr>
             <w:rStyle w:val="Hyperlink"/>

</xml_diff>

<commit_message>
docs: insertion des 12 captures Figma (mobile/tablette/desktop) dans le dossier
</commit_message>
<xml_diff>
--- a/docs/dossier-trouve-ton-artisan.docx
+++ b/docs/dossier-trouve-ton-artisan.docx
@@ -1229,7 +1229,7 @@
       <w:r>
         <w:t xml:space="preserve">Maquettes complètes (consultation publique) : </w:t>
       </w:r>
-      <w:hyperlink w:history="1" r:id="rId0ut17dt_gos0n53fcloip">
+      <w:hyperlink w:history="1" r:id="rIdtf8imedn5c-hlkm2rzv_3">
         <w:r>
           <w:rPr>
             <w:rStyle w:val="Hyperlink"/>
@@ -1264,58 +1264,68 @@
         <w:t xml:space="preserve">2.3.1 Charte graphique</w:t>
       </w:r>
     </w:p>
-    <w:tbl>
-      <w:tblPr>
-        <w:tblW w:type="dxa" w:w="9360"/>
-        <w:tblBorders>
-          <w:top w:val="single" w:color="auto" w:sz="4"/>
-          <w:left w:val="single" w:color="auto" w:sz="4"/>
-          <w:bottom w:val="single" w:color="auto" w:sz="4"/>
-          <w:right w:val="single" w:color="auto" w:sz="4"/>
-          <w:insideH w:val="single" w:color="auto" w:sz="4"/>
-          <w:insideV w:val="single" w:color="auto" w:sz="4"/>
-        </w:tblBorders>
-      </w:tblPr>
-      <w:tblGrid>
-        <w:gridCol w:w="9360"/>
-      </w:tblGrid>
-      <w:tr>
-        <w:tc>
-          <w:tcPr>
-            <w:tcW w:type="dxa" w:w="9360"/>
-            <w:tcBorders>
-              <w:top w:val="dashed" w:color="0074C7" w:sz="6"/>
-              <w:left w:val="dashed" w:color="0074C7" w:sz="6"/>
-              <w:bottom w:val="dashed" w:color="0074C7" w:sz="6"/>
-              <w:right w:val="dashed" w:color="0074C7" w:sz="6"/>
-            </w:tcBorders>
-            <w:shd w:fill="F1F8FC" w:val="clear"/>
-            <w:tcMar>
-              <w:top w:type="dxa" w:w="600"/>
-              <w:left w:type="dxa" w:w="240"/>
-              <w:bottom w:type="dxa" w:w="600"/>
-              <w:right w:type="dxa" w:w="240"/>
-            </w:tcMar>
-            <w:vAlign w:val="center"/>
-          </w:tcPr>
-          <w:p>
-            <w:pPr>
-              <w:jc w:val="center"/>
-            </w:pPr>
-            <w:r>
-              <w:rPr>
-                <w:b/>
-                <w:bCs/>
-                <w:i/>
-                <w:iCs/>
-                <w:color w:val="0074C7"/>
-              </w:rPr>
-              <w:t xml:space="preserve">[ Charte graphique — logo, favicon, palette, typographie — capture à insérer ]</w:t>
-            </w:r>
-          </w:p>
-        </w:tc>
-      </w:tr>
-    </w:tbl>
+    <w:p>
+      <w:pPr>
+        <w:spacing w:before="100" w:after="60"/>
+        <w:jc w:val="center"/>
+      </w:pPr>
+      <w:r>
+        <w:drawing>
+          <wp:inline distT="0" distB="0" distL="0" distR="0">
+            <wp:extent cx="5143500" cy="3619500"/>
+            <wp:effectExtent t="0" r="0" b="0" l="0"/>
+            <wp:docPr id="1" name="charte-graphique.png" descr="Charte graphique — logo, favicon, palette, typographie" title="Charte graphique — logo, favicon, palette, typographie"/>
+            <wp:cNvGraphicFramePr>
+              <a:graphicFrameLocks xmlns:a="http://schemas.openxmlformats.org/drawingml/2006/main" noChangeAspect="1"/>
+            </wp:cNvGraphicFramePr>
+            <a:graphic xmlns:a="http://schemas.openxmlformats.org/drawingml/2006/main">
+              <a:graphicData uri="http://schemas.openxmlformats.org/drawingml/2006/picture">
+                <pic:pic xmlns:pic="http://schemas.openxmlformats.org/drawingml/2006/picture">
+                  <pic:nvPicPr>
+                    <pic:cNvPr id="0" name="" descr=""/>
+                    <pic:cNvPicPr>
+                      <a:picLocks noChangeAspect="1" noChangeArrowheads="1"/>
+                    </pic:cNvPicPr>
+                  </pic:nvPicPr>
+                  <pic:blipFill>
+                    <a:blip r:embed="rId8" cstate="none"/>
+                    <a:srcRect/>
+                    <a:stretch>
+                      <a:fillRect/>
+                    </a:stretch>
+                  </pic:blipFill>
+                  <pic:spPr bwMode="auto">
+                    <a:xfrm>
+                      <a:off x="0" y="0"/>
+                      <a:ext cx="5143500" cy="3619500"/>
+                    </a:xfrm>
+                    <a:prstGeom prst="rect">
+                      <a:avLst/>
+                    </a:prstGeom>
+                  </pic:spPr>
+                </pic:pic>
+              </a:graphicData>
+            </a:graphic>
+          </wp:inline>
+        </w:drawing>
+      </w:r>
+    </w:p>
+    <w:p>
+      <w:pPr>
+        <w:spacing w:after="180"/>
+        <w:jc w:val="center"/>
+      </w:pPr>
+      <w:r>
+        <w:rPr>
+          <w:i/>
+          <w:iCs/>
+          <w:color w:val="384050"/>
+          <w:sz w:val="18"/>
+          <w:szCs w:val="18"/>
+        </w:rPr>
+        <w:t xml:space="preserve">Charte graphique — logo, favicon, palette, typographie</w:t>
+      </w:r>
+    </w:p>
     <w:p>
       <w:pPr>
         <w:pStyle w:val="Heading3"/>
@@ -1329,178 +1339,192 @@
         <w:t xml:space="preserve">2.3.2 Accueil</w:t>
       </w:r>
     </w:p>
-    <w:tbl>
-      <w:tblPr>
-        <w:tblW w:type="dxa" w:w="9360"/>
-        <w:tblBorders>
-          <w:top w:val="single" w:color="auto" w:sz="4"/>
-          <w:left w:val="single" w:color="auto" w:sz="4"/>
-          <w:bottom w:val="single" w:color="auto" w:sz="4"/>
-          <w:right w:val="single" w:color="auto" w:sz="4"/>
-          <w:insideH w:val="single" w:color="auto" w:sz="4"/>
-          <w:insideV w:val="single" w:color="auto" w:sz="4"/>
-        </w:tblBorders>
-      </w:tblPr>
-      <w:tblGrid>
-        <w:gridCol w:w="9360"/>
-      </w:tblGrid>
-      <w:tr>
-        <w:tc>
-          <w:tcPr>
-            <w:tcW w:type="dxa" w:w="9360"/>
-            <w:tcBorders>
-              <w:top w:val="dashed" w:color="0074C7" w:sz="6"/>
-              <w:left w:val="dashed" w:color="0074C7" w:sz="6"/>
-              <w:bottom w:val="dashed" w:color="0074C7" w:sz="6"/>
-              <w:right w:val="dashed" w:color="0074C7" w:sz="6"/>
-            </w:tcBorders>
-            <w:shd w:fill="F1F8FC" w:val="clear"/>
-            <w:tcMar>
-              <w:top w:type="dxa" w:w="600"/>
-              <w:left w:type="dxa" w:w="240"/>
-              <w:bottom w:type="dxa" w:w="600"/>
-              <w:right w:type="dxa" w:w="240"/>
-            </w:tcMar>
-            <w:vAlign w:val="center"/>
-          </w:tcPr>
-          <w:p>
-            <w:pPr>
-              <w:jc w:val="center"/>
-            </w:pPr>
-            <w:r>
-              <w:rPr>
-                <w:b/>
-                <w:bCs/>
-                <w:i/>
-                <w:iCs/>
-                <w:color w:val="0074C7"/>
-              </w:rPr>
-              <w:t xml:space="preserve">[ Accueil — mobile 375 px — capture à insérer ]</w:t>
-            </w:r>
-          </w:p>
-        </w:tc>
-      </w:tr>
-    </w:tbl>
-    <w:p>
-      <w:pPr>
-        <w:spacing w:after="120"/>
-      </w:pPr>
-      <w:r>
-        <w:t xml:space="preserve"/>
-      </w:r>
-    </w:p>
-    <w:tbl>
-      <w:tblPr>
-        <w:tblW w:type="dxa" w:w="9360"/>
-        <w:tblBorders>
-          <w:top w:val="single" w:color="auto" w:sz="4"/>
-          <w:left w:val="single" w:color="auto" w:sz="4"/>
-          <w:bottom w:val="single" w:color="auto" w:sz="4"/>
-          <w:right w:val="single" w:color="auto" w:sz="4"/>
-          <w:insideH w:val="single" w:color="auto" w:sz="4"/>
-          <w:insideV w:val="single" w:color="auto" w:sz="4"/>
-        </w:tblBorders>
-      </w:tblPr>
-      <w:tblGrid>
-        <w:gridCol w:w="9360"/>
-      </w:tblGrid>
-      <w:tr>
-        <w:tc>
-          <w:tcPr>
-            <w:tcW w:type="dxa" w:w="9360"/>
-            <w:tcBorders>
-              <w:top w:val="dashed" w:color="0074C7" w:sz="6"/>
-              <w:left w:val="dashed" w:color="0074C7" w:sz="6"/>
-              <w:bottom w:val="dashed" w:color="0074C7" w:sz="6"/>
-              <w:right w:val="dashed" w:color="0074C7" w:sz="6"/>
-            </w:tcBorders>
-            <w:shd w:fill="F1F8FC" w:val="clear"/>
-            <w:tcMar>
-              <w:top w:type="dxa" w:w="600"/>
-              <w:left w:type="dxa" w:w="240"/>
-              <w:bottom w:type="dxa" w:w="600"/>
-              <w:right w:type="dxa" w:w="240"/>
-            </w:tcMar>
-            <w:vAlign w:val="center"/>
-          </w:tcPr>
-          <w:p>
-            <w:pPr>
-              <w:jc w:val="center"/>
-            </w:pPr>
-            <w:r>
-              <w:rPr>
-                <w:b/>
-                <w:bCs/>
-                <w:i/>
-                <w:iCs/>
-                <w:color w:val="0074C7"/>
-              </w:rPr>
-              <w:t xml:space="preserve">[ Accueil — tablette 768 px — capture à insérer ]</w:t>
-            </w:r>
-          </w:p>
-        </w:tc>
-      </w:tr>
-    </w:tbl>
-    <w:p>
-      <w:pPr>
-        <w:spacing w:after="120"/>
-      </w:pPr>
-      <w:r>
-        <w:t xml:space="preserve"/>
-      </w:r>
-    </w:p>
-    <w:tbl>
-      <w:tblPr>
-        <w:tblW w:type="dxa" w:w="9360"/>
-        <w:tblBorders>
-          <w:top w:val="single" w:color="auto" w:sz="4"/>
-          <w:left w:val="single" w:color="auto" w:sz="4"/>
-          <w:bottom w:val="single" w:color="auto" w:sz="4"/>
-          <w:right w:val="single" w:color="auto" w:sz="4"/>
-          <w:insideH w:val="single" w:color="auto" w:sz="4"/>
-          <w:insideV w:val="single" w:color="auto" w:sz="4"/>
-        </w:tblBorders>
-      </w:tblPr>
-      <w:tblGrid>
-        <w:gridCol w:w="9360"/>
-      </w:tblGrid>
-      <w:tr>
-        <w:tc>
-          <w:tcPr>
-            <w:tcW w:type="dxa" w:w="9360"/>
-            <w:tcBorders>
-              <w:top w:val="dashed" w:color="0074C7" w:sz="6"/>
-              <w:left w:val="dashed" w:color="0074C7" w:sz="6"/>
-              <w:bottom w:val="dashed" w:color="0074C7" w:sz="6"/>
-              <w:right w:val="dashed" w:color="0074C7" w:sz="6"/>
-            </w:tcBorders>
-            <w:shd w:fill="F1F8FC" w:val="clear"/>
-            <w:tcMar>
-              <w:top w:type="dxa" w:w="600"/>
-              <w:left w:type="dxa" w:w="240"/>
-              <w:bottom w:type="dxa" w:w="600"/>
-              <w:right w:type="dxa" w:w="240"/>
-            </w:tcMar>
-            <w:vAlign w:val="center"/>
-          </w:tcPr>
-          <w:p>
-            <w:pPr>
-              <w:jc w:val="center"/>
-            </w:pPr>
-            <w:r>
-              <w:rPr>
-                <w:b/>
-                <w:bCs/>
-                <w:i/>
-                <w:iCs/>
-                <w:color w:val="0074C7"/>
-              </w:rPr>
-              <w:t xml:space="preserve">[ Accueil — ordinateur 1280 px — capture à insérer ]</w:t>
-            </w:r>
-          </w:p>
-        </w:tc>
-      </w:tr>
-    </w:tbl>
+    <w:p>
+      <w:pPr>
+        <w:spacing w:before="100" w:after="60"/>
+        <w:jc w:val="center"/>
+      </w:pPr>
+      <w:r>
+        <w:drawing>
+          <wp:inline distT="0" distB="0" distL="0" distR="0">
+            <wp:extent cx="1095375" cy="5715000"/>
+            <wp:effectExtent t="0" r="0" b="0" l="0"/>
+            <wp:docPr id="1" name="accueil-mobile.png" descr="Accueil — Mobile (375 px)" title="Accueil — Mobile (375 px)"/>
+            <wp:cNvGraphicFramePr>
+              <a:graphicFrameLocks xmlns:a="http://schemas.openxmlformats.org/drawingml/2006/main" noChangeAspect="1"/>
+            </wp:cNvGraphicFramePr>
+            <a:graphic xmlns:a="http://schemas.openxmlformats.org/drawingml/2006/main">
+              <a:graphicData uri="http://schemas.openxmlformats.org/drawingml/2006/picture">
+                <pic:pic xmlns:pic="http://schemas.openxmlformats.org/drawingml/2006/picture">
+                  <pic:nvPicPr>
+                    <pic:cNvPr id="0" name="" descr=""/>
+                    <pic:cNvPicPr>
+                      <a:picLocks noChangeAspect="1" noChangeArrowheads="1"/>
+                    </pic:cNvPicPr>
+                  </pic:nvPicPr>
+                  <pic:blipFill>
+                    <a:blip r:embed="rId9" cstate="none"/>
+                    <a:srcRect/>
+                    <a:stretch>
+                      <a:fillRect/>
+                    </a:stretch>
+                  </pic:blipFill>
+                  <pic:spPr bwMode="auto">
+                    <a:xfrm>
+                      <a:off x="0" y="0"/>
+                      <a:ext cx="1095375" cy="5715000"/>
+                    </a:xfrm>
+                    <a:prstGeom prst="rect">
+                      <a:avLst/>
+                    </a:prstGeom>
+                  </pic:spPr>
+                </pic:pic>
+              </a:graphicData>
+            </a:graphic>
+          </wp:inline>
+        </w:drawing>
+      </w:r>
+    </w:p>
+    <w:p>
+      <w:pPr>
+        <w:spacing w:after="180"/>
+        <w:jc w:val="center"/>
+      </w:pPr>
+      <w:r>
+        <w:rPr>
+          <w:i/>
+          <w:iCs/>
+          <w:color w:val="384050"/>
+          <w:sz w:val="18"/>
+          <w:szCs w:val="18"/>
+        </w:rPr>
+        <w:t xml:space="preserve">Accueil — Mobile (375 px)</w:t>
+      </w:r>
+    </w:p>
+    <w:p>
+      <w:pPr>
+        <w:spacing w:before="100" w:after="60"/>
+        <w:jc w:val="center"/>
+      </w:pPr>
+      <w:r>
+        <w:drawing>
+          <wp:inline distT="0" distB="0" distL="0" distR="0">
+            <wp:extent cx="2533650" cy="5715000"/>
+            <wp:effectExtent t="0" r="0" b="0" l="0"/>
+            <wp:docPr id="1" name="accueil-tablette.png" descr="Accueil — Tablette (768 px)" title="Accueil — Tablette (768 px)"/>
+            <wp:cNvGraphicFramePr>
+              <a:graphicFrameLocks xmlns:a="http://schemas.openxmlformats.org/drawingml/2006/main" noChangeAspect="1"/>
+            </wp:cNvGraphicFramePr>
+            <a:graphic xmlns:a="http://schemas.openxmlformats.org/drawingml/2006/main">
+              <a:graphicData uri="http://schemas.openxmlformats.org/drawingml/2006/picture">
+                <pic:pic xmlns:pic="http://schemas.openxmlformats.org/drawingml/2006/picture">
+                  <pic:nvPicPr>
+                    <pic:cNvPr id="0" name="" descr=""/>
+                    <pic:cNvPicPr>
+                      <a:picLocks noChangeAspect="1" noChangeArrowheads="1"/>
+                    </pic:cNvPicPr>
+                  </pic:nvPicPr>
+                  <pic:blipFill>
+                    <a:blip r:embed="rId10" cstate="none"/>
+                    <a:srcRect/>
+                    <a:stretch>
+                      <a:fillRect/>
+                    </a:stretch>
+                  </pic:blipFill>
+                  <pic:spPr bwMode="auto">
+                    <a:xfrm>
+                      <a:off x="0" y="0"/>
+                      <a:ext cx="2533650" cy="5715000"/>
+                    </a:xfrm>
+                    <a:prstGeom prst="rect">
+                      <a:avLst/>
+                    </a:prstGeom>
+                  </pic:spPr>
+                </pic:pic>
+              </a:graphicData>
+            </a:graphic>
+          </wp:inline>
+        </w:drawing>
+      </w:r>
+    </w:p>
+    <w:p>
+      <w:pPr>
+        <w:spacing w:after="180"/>
+        <w:jc w:val="center"/>
+      </w:pPr>
+      <w:r>
+        <w:rPr>
+          <w:i/>
+          <w:iCs/>
+          <w:color w:val="384050"/>
+          <w:sz w:val="18"/>
+          <w:szCs w:val="18"/>
+        </w:rPr>
+        <w:t xml:space="preserve">Accueil — Tablette (768 px)</w:t>
+      </w:r>
+    </w:p>
+    <w:p>
+      <w:pPr>
+        <w:spacing w:before="100" w:after="60"/>
+        <w:jc w:val="center"/>
+      </w:pPr>
+      <w:r>
+        <w:drawing>
+          <wp:inline distT="0" distB="0" distL="0" distR="0">
+            <wp:extent cx="5143500" cy="5629275"/>
+            <wp:effectExtent t="0" r="0" b="0" l="0"/>
+            <wp:docPr id="1" name="accueil-desktop.png" descr="Accueil — Desktop (1280 px)" title="Accueil — Desktop (1280 px)"/>
+            <wp:cNvGraphicFramePr>
+              <a:graphicFrameLocks xmlns:a="http://schemas.openxmlformats.org/drawingml/2006/main" noChangeAspect="1"/>
+            </wp:cNvGraphicFramePr>
+            <a:graphic xmlns:a="http://schemas.openxmlformats.org/drawingml/2006/main">
+              <a:graphicData uri="http://schemas.openxmlformats.org/drawingml/2006/picture">
+                <pic:pic xmlns:pic="http://schemas.openxmlformats.org/drawingml/2006/picture">
+                  <pic:nvPicPr>
+                    <pic:cNvPr id="0" name="" descr=""/>
+                    <pic:cNvPicPr>
+                      <a:picLocks noChangeAspect="1" noChangeArrowheads="1"/>
+                    </pic:cNvPicPr>
+                  </pic:nvPicPr>
+                  <pic:blipFill>
+                    <a:blip r:embed="rId11" cstate="none"/>
+                    <a:srcRect/>
+                    <a:stretch>
+                      <a:fillRect/>
+                    </a:stretch>
+                  </pic:blipFill>
+                  <pic:spPr bwMode="auto">
+                    <a:xfrm>
+                      <a:off x="0" y="0"/>
+                      <a:ext cx="5143500" cy="5629275"/>
+                    </a:xfrm>
+                    <a:prstGeom prst="rect">
+                      <a:avLst/>
+                    </a:prstGeom>
+                  </pic:spPr>
+                </pic:pic>
+              </a:graphicData>
+            </a:graphic>
+          </wp:inline>
+        </w:drawing>
+      </w:r>
+    </w:p>
+    <w:p>
+      <w:pPr>
+        <w:spacing w:after="180"/>
+        <w:jc w:val="center"/>
+      </w:pPr>
+      <w:r>
+        <w:rPr>
+          <w:i/>
+          <w:iCs/>
+          <w:color w:val="384050"/>
+          <w:sz w:val="18"/>
+          <w:szCs w:val="18"/>
+        </w:rPr>
+        <w:t xml:space="preserve">Accueil — Desktop (1280 px)</w:t>
+      </w:r>
+    </w:p>
     <w:p>
       <w:pPr>
         <w:pStyle w:val="Heading3"/>
@@ -1514,58 +1538,192 @@
         <w:t xml:space="preserve">2.3.3 Liste des artisans</w:t>
       </w:r>
     </w:p>
-    <w:tbl>
-      <w:tblPr>
-        <w:tblW w:type="dxa" w:w="9360"/>
-        <w:tblBorders>
-          <w:top w:val="single" w:color="auto" w:sz="4"/>
-          <w:left w:val="single" w:color="auto" w:sz="4"/>
-          <w:bottom w:val="single" w:color="auto" w:sz="4"/>
-          <w:right w:val="single" w:color="auto" w:sz="4"/>
-          <w:insideH w:val="single" w:color="auto" w:sz="4"/>
-          <w:insideV w:val="single" w:color="auto" w:sz="4"/>
-        </w:tblBorders>
-      </w:tblPr>
-      <w:tblGrid>
-        <w:gridCol w:w="9360"/>
-      </w:tblGrid>
-      <w:tr>
-        <w:tc>
-          <w:tcPr>
-            <w:tcW w:type="dxa" w:w="9360"/>
-            <w:tcBorders>
-              <w:top w:val="dashed" w:color="0074C7" w:sz="6"/>
-              <w:left w:val="dashed" w:color="0074C7" w:sz="6"/>
-              <w:bottom w:val="dashed" w:color="0074C7" w:sz="6"/>
-              <w:right w:val="dashed" w:color="0074C7" w:sz="6"/>
-            </w:tcBorders>
-            <w:shd w:fill="F1F8FC" w:val="clear"/>
-            <w:tcMar>
-              <w:top w:type="dxa" w:w="600"/>
-              <w:left w:type="dxa" w:w="240"/>
-              <w:bottom w:type="dxa" w:w="600"/>
-              <w:right w:type="dxa" w:w="240"/>
-            </w:tcMar>
-            <w:vAlign w:val="center"/>
-          </w:tcPr>
-          <w:p>
-            <w:pPr>
-              <w:jc w:val="center"/>
-            </w:pPr>
-            <w:r>
-              <w:rPr>
-                <w:b/>
-                <w:bCs/>
-                <w:i/>
-                <w:iCs/>
-                <w:color w:val="0074C7"/>
-              </w:rPr>
-              <w:t xml:space="preserve">[ Liste — mobile / tablette / desktop — capture à insérer ]</w:t>
-            </w:r>
-          </w:p>
-        </w:tc>
-      </w:tr>
-    </w:tbl>
+    <w:p>
+      <w:pPr>
+        <w:spacing w:before="100" w:after="60"/>
+        <w:jc w:val="center"/>
+      </w:pPr>
+      <w:r>
+        <w:drawing>
+          <wp:inline distT="0" distB="0" distL="0" distR="0">
+            <wp:extent cx="1276350" cy="5715000"/>
+            <wp:effectExtent t="0" r="0" b="0" l="0"/>
+            <wp:docPr id="1" name="liste-mobile.png" descr="Liste — catégorie Bâtiment — Mobile (375 px)" title="Liste — catégorie Bâtiment — Mobile (375 px)"/>
+            <wp:cNvGraphicFramePr>
+              <a:graphicFrameLocks xmlns:a="http://schemas.openxmlformats.org/drawingml/2006/main" noChangeAspect="1"/>
+            </wp:cNvGraphicFramePr>
+            <a:graphic xmlns:a="http://schemas.openxmlformats.org/drawingml/2006/main">
+              <a:graphicData uri="http://schemas.openxmlformats.org/drawingml/2006/picture">
+                <pic:pic xmlns:pic="http://schemas.openxmlformats.org/drawingml/2006/picture">
+                  <pic:nvPicPr>
+                    <pic:cNvPr id="0" name="" descr=""/>
+                    <pic:cNvPicPr>
+                      <a:picLocks noChangeAspect="1" noChangeArrowheads="1"/>
+                    </pic:cNvPicPr>
+                  </pic:nvPicPr>
+                  <pic:blipFill>
+                    <a:blip r:embed="rId12" cstate="none"/>
+                    <a:srcRect/>
+                    <a:stretch>
+                      <a:fillRect/>
+                    </a:stretch>
+                  </pic:blipFill>
+                  <pic:spPr bwMode="auto">
+                    <a:xfrm>
+                      <a:off x="0" y="0"/>
+                      <a:ext cx="1276350" cy="5715000"/>
+                    </a:xfrm>
+                    <a:prstGeom prst="rect">
+                      <a:avLst/>
+                    </a:prstGeom>
+                  </pic:spPr>
+                </pic:pic>
+              </a:graphicData>
+            </a:graphic>
+          </wp:inline>
+        </w:drawing>
+      </w:r>
+    </w:p>
+    <w:p>
+      <w:pPr>
+        <w:spacing w:after="180"/>
+        <w:jc w:val="center"/>
+      </w:pPr>
+      <w:r>
+        <w:rPr>
+          <w:i/>
+          <w:iCs/>
+          <w:color w:val="384050"/>
+          <w:sz w:val="18"/>
+          <w:szCs w:val="18"/>
+        </w:rPr>
+        <w:t xml:space="preserve">Liste — catégorie Bâtiment — Mobile (375 px)</w:t>
+      </w:r>
+    </w:p>
+    <w:p>
+      <w:pPr>
+        <w:spacing w:before="100" w:after="60"/>
+        <w:jc w:val="center"/>
+      </w:pPr>
+      <w:r>
+        <w:drawing>
+          <wp:inline distT="0" distB="0" distL="0" distR="0">
+            <wp:extent cx="3429000" cy="4705350"/>
+            <wp:effectExtent t="0" r="0" b="0" l="0"/>
+            <wp:docPr id="1" name="liste-tablette.png" descr="Liste — catégorie Bâtiment — Tablette (768 px)" title="Liste — catégorie Bâtiment — Tablette (768 px)"/>
+            <wp:cNvGraphicFramePr>
+              <a:graphicFrameLocks xmlns:a="http://schemas.openxmlformats.org/drawingml/2006/main" noChangeAspect="1"/>
+            </wp:cNvGraphicFramePr>
+            <a:graphic xmlns:a="http://schemas.openxmlformats.org/drawingml/2006/main">
+              <a:graphicData uri="http://schemas.openxmlformats.org/drawingml/2006/picture">
+                <pic:pic xmlns:pic="http://schemas.openxmlformats.org/drawingml/2006/picture">
+                  <pic:nvPicPr>
+                    <pic:cNvPr id="0" name="" descr=""/>
+                    <pic:cNvPicPr>
+                      <a:picLocks noChangeAspect="1" noChangeArrowheads="1"/>
+                    </pic:cNvPicPr>
+                  </pic:nvPicPr>
+                  <pic:blipFill>
+                    <a:blip r:embed="rId13" cstate="none"/>
+                    <a:srcRect/>
+                    <a:stretch>
+                      <a:fillRect/>
+                    </a:stretch>
+                  </pic:blipFill>
+                  <pic:spPr bwMode="auto">
+                    <a:xfrm>
+                      <a:off x="0" y="0"/>
+                      <a:ext cx="3429000" cy="4705350"/>
+                    </a:xfrm>
+                    <a:prstGeom prst="rect">
+                      <a:avLst/>
+                    </a:prstGeom>
+                  </pic:spPr>
+                </pic:pic>
+              </a:graphicData>
+            </a:graphic>
+          </wp:inline>
+        </w:drawing>
+      </w:r>
+    </w:p>
+    <w:p>
+      <w:pPr>
+        <w:spacing w:after="180"/>
+        <w:jc w:val="center"/>
+      </w:pPr>
+      <w:r>
+        <w:rPr>
+          <w:i/>
+          <w:iCs/>
+          <w:color w:val="384050"/>
+          <w:sz w:val="18"/>
+          <w:szCs w:val="18"/>
+        </w:rPr>
+        <w:t xml:space="preserve">Liste — catégorie Bâtiment — Tablette (768 px)</w:t>
+      </w:r>
+    </w:p>
+    <w:p>
+      <w:pPr>
+        <w:spacing w:before="100" w:after="60"/>
+        <w:jc w:val="center"/>
+      </w:pPr>
+      <w:r>
+        <w:drawing>
+          <wp:inline distT="0" distB="0" distL="0" distR="0">
+            <wp:extent cx="5143500" cy="4362450"/>
+            <wp:effectExtent t="0" r="0" b="0" l="0"/>
+            <wp:docPr id="1" name="liste-desktop.png" descr="Liste — catégorie Bâtiment — Desktop (1280 px)" title="Liste — catégorie Bâtiment — Desktop (1280 px)"/>
+            <wp:cNvGraphicFramePr>
+              <a:graphicFrameLocks xmlns:a="http://schemas.openxmlformats.org/drawingml/2006/main" noChangeAspect="1"/>
+            </wp:cNvGraphicFramePr>
+            <a:graphic xmlns:a="http://schemas.openxmlformats.org/drawingml/2006/main">
+              <a:graphicData uri="http://schemas.openxmlformats.org/drawingml/2006/picture">
+                <pic:pic xmlns:pic="http://schemas.openxmlformats.org/drawingml/2006/picture">
+                  <pic:nvPicPr>
+                    <pic:cNvPr id="0" name="" descr=""/>
+                    <pic:cNvPicPr>
+                      <a:picLocks noChangeAspect="1" noChangeArrowheads="1"/>
+                    </pic:cNvPicPr>
+                  </pic:nvPicPr>
+                  <pic:blipFill>
+                    <a:blip r:embed="rId14" cstate="none"/>
+                    <a:srcRect/>
+                    <a:stretch>
+                      <a:fillRect/>
+                    </a:stretch>
+                  </pic:blipFill>
+                  <pic:spPr bwMode="auto">
+                    <a:xfrm>
+                      <a:off x="0" y="0"/>
+                      <a:ext cx="5143500" cy="4362450"/>
+                    </a:xfrm>
+                    <a:prstGeom prst="rect">
+                      <a:avLst/>
+                    </a:prstGeom>
+                  </pic:spPr>
+                </pic:pic>
+              </a:graphicData>
+            </a:graphic>
+          </wp:inline>
+        </w:drawing>
+      </w:r>
+    </w:p>
+    <w:p>
+      <w:pPr>
+        <w:spacing w:after="180"/>
+        <w:jc w:val="center"/>
+      </w:pPr>
+      <w:r>
+        <w:rPr>
+          <w:i/>
+          <w:iCs/>
+          <w:color w:val="384050"/>
+          <w:sz w:val="18"/>
+          <w:szCs w:val="18"/>
+        </w:rPr>
+        <w:t xml:space="preserve">Liste — catégorie Bâtiment — Desktop (1280 px)</w:t>
+      </w:r>
+    </w:p>
     <w:p>
       <w:pPr>
         <w:pStyle w:val="Heading3"/>
@@ -1579,58 +1737,192 @@
         <w:t xml:space="preserve">2.3.4 Fiche artisan + formulaire</w:t>
       </w:r>
     </w:p>
-    <w:tbl>
-      <w:tblPr>
-        <w:tblW w:type="dxa" w:w="9360"/>
-        <w:tblBorders>
-          <w:top w:val="single" w:color="auto" w:sz="4"/>
-          <w:left w:val="single" w:color="auto" w:sz="4"/>
-          <w:bottom w:val="single" w:color="auto" w:sz="4"/>
-          <w:right w:val="single" w:color="auto" w:sz="4"/>
-          <w:insideH w:val="single" w:color="auto" w:sz="4"/>
-          <w:insideV w:val="single" w:color="auto" w:sz="4"/>
-        </w:tblBorders>
-      </w:tblPr>
-      <w:tblGrid>
-        <w:gridCol w:w="9360"/>
-      </w:tblGrid>
-      <w:tr>
-        <w:tc>
-          <w:tcPr>
-            <w:tcW w:type="dxa" w:w="9360"/>
-            <w:tcBorders>
-              <w:top w:val="dashed" w:color="0074C7" w:sz="6"/>
-              <w:left w:val="dashed" w:color="0074C7" w:sz="6"/>
-              <w:bottom w:val="dashed" w:color="0074C7" w:sz="6"/>
-              <w:right w:val="dashed" w:color="0074C7" w:sz="6"/>
-            </w:tcBorders>
-            <w:shd w:fill="F1F8FC" w:val="clear"/>
-            <w:tcMar>
-              <w:top w:type="dxa" w:w="600"/>
-              <w:left w:type="dxa" w:w="240"/>
-              <w:bottom w:type="dxa" w:w="600"/>
-              <w:right w:type="dxa" w:w="240"/>
-            </w:tcMar>
-            <w:vAlign w:val="center"/>
-          </w:tcPr>
-          <w:p>
-            <w:pPr>
-              <w:jc w:val="center"/>
-            </w:pPr>
-            <w:r>
-              <w:rPr>
-                <w:b/>
-                <w:bCs/>
-                <w:i/>
-                <w:iCs/>
-                <w:color w:val="0074C7"/>
-              </w:rPr>
-              <w:t xml:space="preserve">[ Fiche artisan — mobile / tablette / desktop — capture à insérer ]</w:t>
-            </w:r>
-          </w:p>
-        </w:tc>
-      </w:tr>
-    </w:tbl>
+    <w:p>
+      <w:pPr>
+        <w:spacing w:before="100" w:after="60"/>
+        <w:jc w:val="center"/>
+      </w:pPr>
+      <w:r>
+        <w:drawing>
+          <wp:inline distT="0" distB="0" distL="0" distR="0">
+            <wp:extent cx="1704975" cy="5715000"/>
+            <wp:effectExtent t="0" r="0" b="0" l="0"/>
+            <wp:docPr id="1" name="fiche-mobile.png" descr="Fiche artisan — Mobile (375 px)" title="Fiche artisan — Mobile (375 px)"/>
+            <wp:cNvGraphicFramePr>
+              <a:graphicFrameLocks xmlns:a="http://schemas.openxmlformats.org/drawingml/2006/main" noChangeAspect="1"/>
+            </wp:cNvGraphicFramePr>
+            <a:graphic xmlns:a="http://schemas.openxmlformats.org/drawingml/2006/main">
+              <a:graphicData uri="http://schemas.openxmlformats.org/drawingml/2006/picture">
+                <pic:pic xmlns:pic="http://schemas.openxmlformats.org/drawingml/2006/picture">
+                  <pic:nvPicPr>
+                    <pic:cNvPr id="0" name="" descr=""/>
+                    <pic:cNvPicPr>
+                      <a:picLocks noChangeAspect="1" noChangeArrowheads="1"/>
+                    </pic:cNvPicPr>
+                  </pic:nvPicPr>
+                  <pic:blipFill>
+                    <a:blip r:embed="rId15" cstate="none"/>
+                    <a:srcRect/>
+                    <a:stretch>
+                      <a:fillRect/>
+                    </a:stretch>
+                  </pic:blipFill>
+                  <pic:spPr bwMode="auto">
+                    <a:xfrm>
+                      <a:off x="0" y="0"/>
+                      <a:ext cx="1704975" cy="5715000"/>
+                    </a:xfrm>
+                    <a:prstGeom prst="rect">
+                      <a:avLst/>
+                    </a:prstGeom>
+                  </pic:spPr>
+                </pic:pic>
+              </a:graphicData>
+            </a:graphic>
+          </wp:inline>
+        </w:drawing>
+      </w:r>
+    </w:p>
+    <w:p>
+      <w:pPr>
+        <w:spacing w:after="180"/>
+        <w:jc w:val="center"/>
+      </w:pPr>
+      <w:r>
+        <w:rPr>
+          <w:i/>
+          <w:iCs/>
+          <w:color w:val="384050"/>
+          <w:sz w:val="18"/>
+          <w:szCs w:val="18"/>
+        </w:rPr>
+        <w:t xml:space="preserve">Fiche artisan — Mobile (375 px)</w:t>
+      </w:r>
+    </w:p>
+    <w:p>
+      <w:pPr>
+        <w:spacing w:before="100" w:after="60"/>
+        <w:jc w:val="center"/>
+      </w:pPr>
+      <w:r>
+        <w:drawing>
+          <wp:inline distT="0" distB="0" distL="0" distR="0">
+            <wp:extent cx="3429000" cy="5695950"/>
+            <wp:effectExtent t="0" r="0" b="0" l="0"/>
+            <wp:docPr id="1" name="fiche-tablette.png" descr="Fiche artisan — Tablette (768 px)" title="Fiche artisan — Tablette (768 px)"/>
+            <wp:cNvGraphicFramePr>
+              <a:graphicFrameLocks xmlns:a="http://schemas.openxmlformats.org/drawingml/2006/main" noChangeAspect="1"/>
+            </wp:cNvGraphicFramePr>
+            <a:graphic xmlns:a="http://schemas.openxmlformats.org/drawingml/2006/main">
+              <a:graphicData uri="http://schemas.openxmlformats.org/drawingml/2006/picture">
+                <pic:pic xmlns:pic="http://schemas.openxmlformats.org/drawingml/2006/picture">
+                  <pic:nvPicPr>
+                    <pic:cNvPr id="0" name="" descr=""/>
+                    <pic:cNvPicPr>
+                      <a:picLocks noChangeAspect="1" noChangeArrowheads="1"/>
+                    </pic:cNvPicPr>
+                  </pic:nvPicPr>
+                  <pic:blipFill>
+                    <a:blip r:embed="rId16" cstate="none"/>
+                    <a:srcRect/>
+                    <a:stretch>
+                      <a:fillRect/>
+                    </a:stretch>
+                  </pic:blipFill>
+                  <pic:spPr bwMode="auto">
+                    <a:xfrm>
+                      <a:off x="0" y="0"/>
+                      <a:ext cx="3429000" cy="5695950"/>
+                    </a:xfrm>
+                    <a:prstGeom prst="rect">
+                      <a:avLst/>
+                    </a:prstGeom>
+                  </pic:spPr>
+                </pic:pic>
+              </a:graphicData>
+            </a:graphic>
+          </wp:inline>
+        </w:drawing>
+      </w:r>
+    </w:p>
+    <w:p>
+      <w:pPr>
+        <w:spacing w:after="180"/>
+        <w:jc w:val="center"/>
+      </w:pPr>
+      <w:r>
+        <w:rPr>
+          <w:i/>
+          <w:iCs/>
+          <w:color w:val="384050"/>
+          <w:sz w:val="18"/>
+          <w:szCs w:val="18"/>
+        </w:rPr>
+        <w:t xml:space="preserve">Fiche artisan — Tablette (768 px)</w:t>
+      </w:r>
+    </w:p>
+    <w:p>
+      <w:pPr>
+        <w:spacing w:before="100" w:after="60"/>
+        <w:jc w:val="center"/>
+      </w:pPr>
+      <w:r>
+        <w:drawing>
+          <wp:inline distT="0" distB="0" distL="0" distR="0">
+            <wp:extent cx="5143500" cy="4191000"/>
+            <wp:effectExtent t="0" r="0" b="0" l="0"/>
+            <wp:docPr id="1" name="fiche-desktop.png" descr="Fiche artisan — Desktop (1280 px)" title="Fiche artisan — Desktop (1280 px)"/>
+            <wp:cNvGraphicFramePr>
+              <a:graphicFrameLocks xmlns:a="http://schemas.openxmlformats.org/drawingml/2006/main" noChangeAspect="1"/>
+            </wp:cNvGraphicFramePr>
+            <a:graphic xmlns:a="http://schemas.openxmlformats.org/drawingml/2006/main">
+              <a:graphicData uri="http://schemas.openxmlformats.org/drawingml/2006/picture">
+                <pic:pic xmlns:pic="http://schemas.openxmlformats.org/drawingml/2006/picture">
+                  <pic:nvPicPr>
+                    <pic:cNvPr id="0" name="" descr=""/>
+                    <pic:cNvPicPr>
+                      <a:picLocks noChangeAspect="1" noChangeArrowheads="1"/>
+                    </pic:cNvPicPr>
+                  </pic:nvPicPr>
+                  <pic:blipFill>
+                    <a:blip r:embed="rId17" cstate="none"/>
+                    <a:srcRect/>
+                    <a:stretch>
+                      <a:fillRect/>
+                    </a:stretch>
+                  </pic:blipFill>
+                  <pic:spPr bwMode="auto">
+                    <a:xfrm>
+                      <a:off x="0" y="0"/>
+                      <a:ext cx="5143500" cy="4191000"/>
+                    </a:xfrm>
+                    <a:prstGeom prst="rect">
+                      <a:avLst/>
+                    </a:prstGeom>
+                  </pic:spPr>
+                </pic:pic>
+              </a:graphicData>
+            </a:graphic>
+          </wp:inline>
+        </w:drawing>
+      </w:r>
+    </w:p>
+    <w:p>
+      <w:pPr>
+        <w:spacing w:after="180"/>
+        <w:jc w:val="center"/>
+      </w:pPr>
+      <w:r>
+        <w:rPr>
+          <w:i/>
+          <w:iCs/>
+          <w:color w:val="384050"/>
+          <w:sz w:val="18"/>
+          <w:szCs w:val="18"/>
+        </w:rPr>
+        <w:t xml:space="preserve">Fiche artisan — Desktop (1280 px)</w:t>
+      </w:r>
+    </w:p>
     <w:p>
       <w:pPr>
         <w:pStyle w:val="Heading3"/>
@@ -1644,58 +1936,130 @@
         <w:t xml:space="preserve">2.3.5 Page 404</w:t>
       </w:r>
     </w:p>
-    <w:tbl>
-      <w:tblPr>
-        <w:tblW w:type="dxa" w:w="9360"/>
-        <w:tblBorders>
-          <w:top w:val="single" w:color="auto" w:sz="4"/>
-          <w:left w:val="single" w:color="auto" w:sz="4"/>
-          <w:bottom w:val="single" w:color="auto" w:sz="4"/>
-          <w:right w:val="single" w:color="auto" w:sz="4"/>
-          <w:insideH w:val="single" w:color="auto" w:sz="4"/>
-          <w:insideV w:val="single" w:color="auto" w:sz="4"/>
-        </w:tblBorders>
-      </w:tblPr>
-      <w:tblGrid>
-        <w:gridCol w:w="9360"/>
-      </w:tblGrid>
-      <w:tr>
-        <w:tc>
-          <w:tcPr>
-            <w:tcW w:type="dxa" w:w="9360"/>
-            <w:tcBorders>
-              <w:top w:val="dashed" w:color="0074C7" w:sz="6"/>
-              <w:left w:val="dashed" w:color="0074C7" w:sz="6"/>
-              <w:bottom w:val="dashed" w:color="0074C7" w:sz="6"/>
-              <w:right w:val="dashed" w:color="0074C7" w:sz="6"/>
-            </w:tcBorders>
-            <w:shd w:fill="F1F8FC" w:val="clear"/>
-            <w:tcMar>
-              <w:top w:type="dxa" w:w="600"/>
-              <w:left w:type="dxa" w:w="240"/>
-              <w:bottom w:type="dxa" w:w="600"/>
-              <w:right w:type="dxa" w:w="240"/>
-            </w:tcMar>
-            <w:vAlign w:val="center"/>
-          </w:tcPr>
-          <w:p>
-            <w:pPr>
-              <w:jc w:val="center"/>
-            </w:pPr>
-            <w:r>
-              <w:rPr>
-                <w:b/>
-                <w:bCs/>
-                <w:i/>
-                <w:iCs/>
-                <w:color w:val="0074C7"/>
-              </w:rPr>
-              <w:t xml:space="preserve">[ Page 404 — mobile / desktop — capture à insérer ]</w:t>
-            </w:r>
-          </w:p>
-        </w:tc>
-      </w:tr>
-    </w:tbl>
+    <w:p>
+      <w:pPr>
+        <w:spacing w:before="100" w:after="60"/>
+        <w:jc w:val="center"/>
+      </w:pPr>
+      <w:r>
+        <w:drawing>
+          <wp:inline distT="0" distB="0" distL="0" distR="0">
+            <wp:extent cx="1905000" cy="2752725"/>
+            <wp:effectExtent t="0" r="0" b="0" l="0"/>
+            <wp:docPr id="1" name="404-mobile.png" descr="404 — Mobile (375 px)" title="404 — Mobile (375 px)"/>
+            <wp:cNvGraphicFramePr>
+              <a:graphicFrameLocks xmlns:a="http://schemas.openxmlformats.org/drawingml/2006/main" noChangeAspect="1"/>
+            </wp:cNvGraphicFramePr>
+            <a:graphic xmlns:a="http://schemas.openxmlformats.org/drawingml/2006/main">
+              <a:graphicData uri="http://schemas.openxmlformats.org/drawingml/2006/picture">
+                <pic:pic xmlns:pic="http://schemas.openxmlformats.org/drawingml/2006/picture">
+                  <pic:nvPicPr>
+                    <pic:cNvPr id="0" name="" descr=""/>
+                    <pic:cNvPicPr>
+                      <a:picLocks noChangeAspect="1" noChangeArrowheads="1"/>
+                    </pic:cNvPicPr>
+                  </pic:nvPicPr>
+                  <pic:blipFill>
+                    <a:blip r:embed="rId18" cstate="none"/>
+                    <a:srcRect/>
+                    <a:stretch>
+                      <a:fillRect/>
+                    </a:stretch>
+                  </pic:blipFill>
+                  <pic:spPr bwMode="auto">
+                    <a:xfrm>
+                      <a:off x="0" y="0"/>
+                      <a:ext cx="1905000" cy="2752725"/>
+                    </a:xfrm>
+                    <a:prstGeom prst="rect">
+                      <a:avLst/>
+                    </a:prstGeom>
+                  </pic:spPr>
+                </pic:pic>
+              </a:graphicData>
+            </a:graphic>
+          </wp:inline>
+        </w:drawing>
+      </w:r>
+    </w:p>
+    <w:p>
+      <w:pPr>
+        <w:spacing w:after="180"/>
+        <w:jc w:val="center"/>
+      </w:pPr>
+      <w:r>
+        <w:rPr>
+          <w:i/>
+          <w:iCs/>
+          <w:color w:val="384050"/>
+          <w:sz w:val="18"/>
+          <w:szCs w:val="18"/>
+        </w:rPr>
+        <w:t xml:space="preserve">404 — Mobile (375 px)</w:t>
+      </w:r>
+    </w:p>
+    <w:p>
+      <w:pPr>
+        <w:spacing w:before="100" w:after="60"/>
+        <w:jc w:val="center"/>
+      </w:pPr>
+      <w:r>
+        <w:drawing>
+          <wp:inline distT="0" distB="0" distL="0" distR="0">
+            <wp:extent cx="5143500" cy="2705100"/>
+            <wp:effectExtent t="0" r="0" b="0" l="0"/>
+            <wp:docPr id="1" name="404-desktop.png" descr="404 — Desktop (1280 px)" title="404 — Desktop (1280 px)"/>
+            <wp:cNvGraphicFramePr>
+              <a:graphicFrameLocks xmlns:a="http://schemas.openxmlformats.org/drawingml/2006/main" noChangeAspect="1"/>
+            </wp:cNvGraphicFramePr>
+            <a:graphic xmlns:a="http://schemas.openxmlformats.org/drawingml/2006/main">
+              <a:graphicData uri="http://schemas.openxmlformats.org/drawingml/2006/picture">
+                <pic:pic xmlns:pic="http://schemas.openxmlformats.org/drawingml/2006/picture">
+                  <pic:nvPicPr>
+                    <pic:cNvPr id="0" name="" descr=""/>
+                    <pic:cNvPicPr>
+                      <a:picLocks noChangeAspect="1" noChangeArrowheads="1"/>
+                    </pic:cNvPicPr>
+                  </pic:nvPicPr>
+                  <pic:blipFill>
+                    <a:blip r:embed="rId19" cstate="none"/>
+                    <a:srcRect/>
+                    <a:stretch>
+                      <a:fillRect/>
+                    </a:stretch>
+                  </pic:blipFill>
+                  <pic:spPr bwMode="auto">
+                    <a:xfrm>
+                      <a:off x="0" y="0"/>
+                      <a:ext cx="5143500" cy="2705100"/>
+                    </a:xfrm>
+                    <a:prstGeom prst="rect">
+                      <a:avLst/>
+                    </a:prstGeom>
+                  </pic:spPr>
+                </pic:pic>
+              </a:graphicData>
+            </a:graphic>
+          </wp:inline>
+        </w:drawing>
+      </w:r>
+    </w:p>
+    <w:p>
+      <w:pPr>
+        <w:spacing w:after="180"/>
+        <w:jc w:val="center"/>
+      </w:pPr>
+      <w:r>
+        <w:rPr>
+          <w:i/>
+          <w:iCs/>
+          <w:color w:val="384050"/>
+          <w:sz w:val="18"/>
+          <w:szCs w:val="18"/>
+        </w:rPr>
+        <w:t xml:space="preserve">404 — Desktop (1280 px)</w:t>
+      </w:r>
+    </w:p>
     <w:p>
       <w:pPr>
         <w:pStyle w:val="Heading2"/>
@@ -4449,7 +4813,7 @@
       <w:r>
         <w:t xml:space="preserve">Le dépôt est public et contient l’intégralité du code, les scripts SQL et le README.md : </w:t>
       </w:r>
-      <w:hyperlink w:history="1" r:id="rIdrc66mx7pkq5afn1u5fpsp">
+      <w:hyperlink w:history="1" r:id="rIdfam8db0cyhftscakwlgtf">
         <w:r>
           <w:rPr>
             <w:rStyle w:val="Hyperlink"/>
@@ -4578,7 +4942,7 @@
       <w:r>
         <w:t xml:space="preserve">Frontend (Vercel) : </w:t>
       </w:r>
-      <w:hyperlink w:history="1" r:id="rIdot9p0w_yfpghgfhsqe4ee">
+      <w:hyperlink w:history="1" r:id="rId9m-r05_fkzj319xpzsplg">
         <w:r>
           <w:rPr>
             <w:rStyle w:val="Hyperlink"/>
@@ -4594,7 +4958,7 @@
       <w:r>
         <w:t xml:space="preserve">API (Render) : </w:t>
       </w:r>
-      <w:hyperlink w:history="1" r:id="rIder4g3taav9a5skf9i7fhg">
+      <w:hyperlink w:history="1" r:id="rIdscqjldlrsbsmkslgh6fi4">
         <w:r>
           <w:rPr>
             <w:rStyle w:val="Hyperlink"/>
@@ -4632,7 +4996,7 @@
       <w:r>
         <w:t xml:space="preserve">Fichier de maquettes (lecture publique) : </w:t>
       </w:r>
-      <w:hyperlink w:history="1" r:id="rIdexdhwpz9lyw0mv_az-s83">
+      <w:hyperlink w:history="1" r:id="rIdr6fhsz4phony-jiqcjj_2">
         <w:r>
           <w:rPr>
             <w:rStyle w:val="Hyperlink"/>

</xml_diff>

<commit_message>
docs: ajout note sur la fiche artisan exemple-type (données dynamiques via API)
</commit_message>
<xml_diff>
--- a/docs/dossier-trouve-ton-artisan.docx
+++ b/docs/dossier-trouve-ton-artisan.docx
@@ -1229,7 +1229,7 @@
       <w:r>
         <w:t xml:space="preserve">Maquettes complètes (consultation publique) : </w:t>
       </w:r>
-      <w:hyperlink w:history="1" r:id="rIdtf8imedn5c-hlkm2rzv_3">
+      <w:hyperlink w:history="1" r:id="rId2puh0mctxohstcophprlv">
         <w:r>
           <w:rPr>
             <w:rStyle w:val="Hyperlink"/>
@@ -1739,6 +1739,19 @@
     </w:p>
     <w:p>
       <w:pPr>
+        <w:spacing w:after="120"/>
+        <w:jc w:val="both"/>
+      </w:pPr>
+      <w:r>
+        <w:rPr>
+          <w:i/>
+          <w:iCs/>
+        </w:rPr>
+        <w:t xml:space="preserve">La fiche d'Orville Salmons (Chauffagiste à Évian) est présentée ici comme exemple-type. La structure visuelle est strictement la même pour les 17 artisans de la base : seules les données (nom, ville, note, photo, à propos, site web…) changent, alimentées dynamiquement par l'API à partir de la table `artisans`.</w:t>
+      </w:r>
+    </w:p>
+    <w:p>
+      <w:pPr>
         <w:spacing w:before="100" w:after="60"/>
         <w:jc w:val="center"/>
       </w:pPr>
@@ -4813,7 +4826,7 @@
       <w:r>
         <w:t xml:space="preserve">Le dépôt est public et contient l’intégralité du code, les scripts SQL et le README.md : </w:t>
       </w:r>
-      <w:hyperlink w:history="1" r:id="rIdfam8db0cyhftscakwlgtf">
+      <w:hyperlink w:history="1" r:id="rIdmpplkkv2i21zaxhjrwmym">
         <w:r>
           <w:rPr>
             <w:rStyle w:val="Hyperlink"/>
@@ -4942,7 +4955,7 @@
       <w:r>
         <w:t xml:space="preserve">Frontend (Vercel) : </w:t>
       </w:r>
-      <w:hyperlink w:history="1" r:id="rId9m-r05_fkzj319xpzsplg">
+      <w:hyperlink w:history="1" r:id="rIdzsnpxg7u7rigbbjmiz85k">
         <w:r>
           <w:rPr>
             <w:rStyle w:val="Hyperlink"/>
@@ -4958,7 +4971,7 @@
       <w:r>
         <w:t xml:space="preserve">API (Render) : </w:t>
       </w:r>
-      <w:hyperlink w:history="1" r:id="rIdscqjldlrsbsmkslgh6fi4">
+      <w:hyperlink w:history="1" r:id="rIdwhtprbgqwupftflqn7nzb">
         <w:r>
           <w:rPr>
             <w:rStyle w:val="Hyperlink"/>
@@ -4996,7 +5009,7 @@
       <w:r>
         <w:t xml:space="preserve">Fichier de maquettes (lecture publique) : </w:t>
       </w:r>
-      <w:hyperlink w:history="1" r:id="rIdr6fhsz4phony-jiqcjj_2">
+      <w:hyperlink w:history="1" r:id="rId2n8w2ogpjss6jkotmetvq">
         <w:r>
           <w:rPr>
             <w:rStyle w:val="Hyperlink"/>

</xml_diff>

<commit_message>
docs: simplification des notes (police Graphik, fiche-type) pour un ton plus naturel
</commit_message>
<xml_diff>
--- a/docs/dossier-trouve-ton-artisan.docx
+++ b/docs/dossier-trouve-ton-artisan.docx
@@ -1202,11 +1202,7 @@
         <w:jc w:val="both"/>
       </w:pPr>
       <w:r>
-        <w:rPr>
-          <w:i/>
-          <w:iCs/>
-        </w:rPr>
-        <w:t xml:space="preserve">Note importante : Graphik est une police propriétaire (éditeur Commercial Type) fournie sous licence commerciale payante. Pour les maquettes Figma comme pour le rendu actuel du site, c'est donc Inter (Google Fonts, open-source) qui a été utilisée comme substitut visuel — police géométrique sans-serif très proche de Graphik. Le CSS du site spécifie cependant `font-family: 'Graphik', 'Helvetica Neue', Arial, sans-serif`, ce qui permettra à la région de déployer Graphik sans modifier le code dès qu'elle aura acquis la licence et fourni les fichiers de police.</w:t>
+        <w:t xml:space="preserve">Graphik étant une police payante, Inter a été utilisée pour les maquettes Figma. Le CSS du site bascule automatiquement sur Graphik dès que les fichiers de police seront fournis.</w:t>
       </w:r>
     </w:p>
     <w:p>
@@ -1229,7 +1225,7 @@
       <w:r>
         <w:t xml:space="preserve">Maquettes complètes (consultation publique) : </w:t>
       </w:r>
-      <w:hyperlink w:history="1" r:id="rId2puh0mctxohstcophprlv">
+      <w:hyperlink w:history="1" r:id="rIdxyv--7ytrmbn3xf9kkemi">
         <w:r>
           <w:rPr>
             <w:rStyle w:val="Hyperlink"/>
@@ -1743,11 +1739,7 @@
         <w:jc w:val="both"/>
       </w:pPr>
       <w:r>
-        <w:rPr>
-          <w:i/>
-          <w:iCs/>
-        </w:rPr>
-        <w:t xml:space="preserve">La fiche d'Orville Salmons (Chauffagiste à Évian) est présentée ici comme exemple-type. La structure visuelle est strictement la même pour les 17 artisans de la base : seules les données (nom, ville, note, photo, à propos, site web…) changent, alimentées dynamiquement par l'API à partir de la table `artisans`.</w:t>
+        <w:t xml:space="preserve">La fiche d'Orville Salmons sert d'exemple. La même structure est utilisée pour les 17 artisans, seules les données changent.</w:t>
       </w:r>
     </w:p>
     <w:p>
@@ -4826,7 +4818,7 @@
       <w:r>
         <w:t xml:space="preserve">Le dépôt est public et contient l’intégralité du code, les scripts SQL et le README.md : </w:t>
       </w:r>
-      <w:hyperlink w:history="1" r:id="rIdmpplkkv2i21zaxhjrwmym">
+      <w:hyperlink w:history="1" r:id="rIdnscxgwerbbdej-hlwzkrb">
         <w:r>
           <w:rPr>
             <w:rStyle w:val="Hyperlink"/>
@@ -4955,7 +4947,7 @@
       <w:r>
         <w:t xml:space="preserve">Frontend (Vercel) : </w:t>
       </w:r>
-      <w:hyperlink w:history="1" r:id="rIdzsnpxg7u7rigbbjmiz85k">
+      <w:hyperlink w:history="1" r:id="rId-gdaac_lcenqojnucrd1z">
         <w:r>
           <w:rPr>
             <w:rStyle w:val="Hyperlink"/>
@@ -4971,7 +4963,7 @@
       <w:r>
         <w:t xml:space="preserve">API (Render) : </w:t>
       </w:r>
-      <w:hyperlink w:history="1" r:id="rIdwhtprbgqwupftflqn7nzb">
+      <w:hyperlink w:history="1" r:id="rIdawqiewhace2ooh7aak5a0">
         <w:r>
           <w:rPr>
             <w:rStyle w:val="Hyperlink"/>
@@ -5009,7 +5001,7 @@
       <w:r>
         <w:t xml:space="preserve">Fichier de maquettes (lecture publique) : </w:t>
       </w:r>
-      <w:hyperlink w:history="1" r:id="rId2n8w2ogpjss6jkotmetvq">
+      <w:hyperlink w:history="1" r:id="rIdp5far3cgmiircqk2etd6f">
         <w:r>
           <w:rPr>
             <w:rStyle w:val="Hyperlink"/>

</xml_diff>

<commit_message>
docs(bdd): remplacer les schémas ASCII par MCD et MLD propres en image + note 3FN
</commit_message>
<xml_diff>
--- a/docs/dossier-trouve-ton-artisan.docx
+++ b/docs/dossier-trouve-ton-artisan.docx
@@ -106,7 +106,7 @@
         <w:t xml:space="preserve">Date de rendu : </w:t>
       </w:r>
       <w:r>
-        <w:t xml:space="preserve">16/05/2026</w:t>
+        <w:t xml:space="preserve">17/05/2026</w:t>
       </w:r>
     </w:p>
     <w:p>
@@ -1225,7 +1225,7 @@
       <w:r>
         <w:t xml:space="preserve">Maquettes complètes (consultation publique) : </w:t>
       </w:r>
-      <w:hyperlink w:history="1" r:id="rIdxyv--7ytrmbn3xf9kkemi">
+      <w:hyperlink w:history="1" r:id="rId_90avrvo-lznmfcp9qurm">
         <w:r>
           <w:rPr>
             <w:rStyle w:val="Hyperlink"/>
@@ -2140,7 +2140,7 @@
         <w:spacing w:after="80"/>
       </w:pPr>
       <w:r>
-        <w:t xml:space="preserve">Un artisan apparaît dans une seule spécialité.</w:t>
+        <w:t xml:space="preserve">Un artisan appartient à une seule spécialité.</w:t>
       </w:r>
     </w:p>
     <w:p>
@@ -2166,7 +2166,7 @@
         <w:spacing w:after="80"/>
       </w:pPr>
       <w:r>
-        <w:t xml:space="preserve">Un artisan peut être marqué « artisan du mois ».</w:t>
+        <w:t xml:space="preserve">Un artisan est localisé dans une seule ville ; une ville regroupe potentiellement plusieurs artisans.</w:t>
       </w:r>
     </w:p>
     <w:p>
@@ -2179,7 +2179,7 @@
         <w:spacing w:after="80"/>
       </w:pPr>
       <w:r>
-        <w:t xml:space="preserve">Chaque artisan possède une note décimale entre 0 et 5.</w:t>
+        <w:t xml:space="preserve">Un artisan peut être marqué « artisan du mois ».</w:t>
       </w:r>
     </w:p>
     <w:p>
@@ -2192,6 +2192,19 @@
         <w:spacing w:after="80"/>
       </w:pPr>
       <w:r>
+        <w:t xml:space="preserve">Chaque artisan possède une note décimale entre 0 et 5.</w:t>
+      </w:r>
+    </w:p>
+    <w:p>
+      <w:pPr>
+        <w:pStyle w:val="ListParagraph"/>
+        <w:numPr>
+          <w:ilvl w:val="0"/>
+          <w:numId w:val="2"/>
+        </w:numPr>
+        <w:spacing w:after="80"/>
+      </w:pPr>
+      <w:r>
         <w:t xml:space="preserve">Un message de contact est associé à un seul artisan ; un artisan peut en recevoir plusieurs.</w:t>
       </w:r>
     </w:p>
@@ -2205,7 +2218,175 @@
           <w:b/>
           <w:bCs/>
         </w:rPr>
-        <w:t xml:space="preserve">3.2 Modèle conceptuel de données (MCD)</w:t>
+        <w:t xml:space="preserve">3.2 Respect des formes normales</w:t>
+      </w:r>
+    </w:p>
+    <w:p>
+      <w:pPr>
+        <w:spacing w:after="120"/>
+        <w:jc w:val="both"/>
+      </w:pPr>
+      <w:r>
+        <w:t xml:space="preserve">Le schéma respecte les trois premières formes normales (1FN, 2FN, 3FN). En particulier, la ville a été externalisée dans une table dédiée (cities) pour éviter la redondance du nom de ville sur chaque ligne d'artisan (3FN) : si une ville change de nom, une seule ligne est à modifier. Idem pour les catégories et les spécialités, qui sont des tables référentielles distinctes.</w:t>
+      </w:r>
+    </w:p>
+    <w:p>
+      <w:pPr>
+        <w:pStyle w:val="Heading2"/>
+        <w:spacing w:before="240" w:after="120"/>
+      </w:pPr>
+      <w:r>
+        <w:rPr>
+          <w:b/>
+          <w:bCs/>
+        </w:rPr>
+        <w:t xml:space="preserve">3.3 Modèle conceptuel de données (MCD)</w:t>
+      </w:r>
+    </w:p>
+    <w:p>
+      <w:pPr>
+        <w:spacing w:before="100" w:after="60"/>
+        <w:jc w:val="center"/>
+      </w:pPr>
+      <w:r>
+        <w:drawing>
+          <wp:inline distT="0" distB="0" distL="0" distR="0">
+            <wp:extent cx="4572000" cy="2857500"/>
+            <wp:effectExtent t="0" r="0" b="0" l="0"/>
+            <wp:docPr id="1" name="mcd.png" descr="MCD — 5 entités, cardinalités explicites" title="MCD — 5 entités, cardinalités explicites"/>
+            <wp:cNvGraphicFramePr>
+              <a:graphicFrameLocks xmlns:a="http://schemas.openxmlformats.org/drawingml/2006/main" noChangeAspect="1"/>
+            </wp:cNvGraphicFramePr>
+            <a:graphic xmlns:a="http://schemas.openxmlformats.org/drawingml/2006/main">
+              <a:graphicData uri="http://schemas.openxmlformats.org/drawingml/2006/picture">
+                <pic:pic xmlns:pic="http://schemas.openxmlformats.org/drawingml/2006/picture">
+                  <pic:nvPicPr>
+                    <pic:cNvPr id="0" name="" descr=""/>
+                    <pic:cNvPicPr>
+                      <a:picLocks noChangeAspect="1" noChangeArrowheads="1"/>
+                    </pic:cNvPicPr>
+                  </pic:nvPicPr>
+                  <pic:blipFill>
+                    <a:blip r:embed="rId20" cstate="none"/>
+                    <a:srcRect/>
+                    <a:stretch>
+                      <a:fillRect/>
+                    </a:stretch>
+                  </pic:blipFill>
+                  <pic:spPr bwMode="auto">
+                    <a:xfrm>
+                      <a:off x="0" y="0"/>
+                      <a:ext cx="4572000" cy="2857500"/>
+                    </a:xfrm>
+                    <a:prstGeom prst="rect">
+                      <a:avLst/>
+                    </a:prstGeom>
+                  </pic:spPr>
+                </pic:pic>
+              </a:graphicData>
+            </a:graphic>
+          </wp:inline>
+        </w:drawing>
+      </w:r>
+    </w:p>
+    <w:p>
+      <w:pPr>
+        <w:spacing w:after="180"/>
+        <w:jc w:val="center"/>
+      </w:pPr>
+      <w:r>
+        <w:rPr>
+          <w:i/>
+          <w:iCs/>
+          <w:color w:val="384050"/>
+          <w:sz w:val="18"/>
+          <w:szCs w:val="18"/>
+        </w:rPr>
+        <w:t xml:space="preserve">MCD — 5 entités, cardinalités explicites</w:t>
+      </w:r>
+    </w:p>
+    <w:p>
+      <w:pPr>
+        <w:pStyle w:val="Heading2"/>
+        <w:spacing w:before="240" w:after="120"/>
+      </w:pPr>
+      <w:r>
+        <w:rPr>
+          <w:b/>
+          <w:bCs/>
+        </w:rPr>
+        <w:t xml:space="preserve">3.4 Modèle logique de données (MLD)</w:t>
+      </w:r>
+    </w:p>
+    <w:p>
+      <w:pPr>
+        <w:spacing w:before="100" w:after="60"/>
+        <w:jc w:val="center"/>
+      </w:pPr>
+      <w:r>
+        <w:drawing>
+          <wp:inline distT="0" distB="0" distL="0" distR="0">
+            <wp:extent cx="5143500" cy="3219450"/>
+            <wp:effectExtent t="0" r="0" b="0" l="0"/>
+            <wp:docPr id="1" name="mld.png" descr="MLD — types SQL, PK / UK / FK identifiés" title="MLD — types SQL, PK / UK / FK identifiés"/>
+            <wp:cNvGraphicFramePr>
+              <a:graphicFrameLocks xmlns:a="http://schemas.openxmlformats.org/drawingml/2006/main" noChangeAspect="1"/>
+            </wp:cNvGraphicFramePr>
+            <a:graphic xmlns:a="http://schemas.openxmlformats.org/drawingml/2006/main">
+              <a:graphicData uri="http://schemas.openxmlformats.org/drawingml/2006/picture">
+                <pic:pic xmlns:pic="http://schemas.openxmlformats.org/drawingml/2006/picture">
+                  <pic:nvPicPr>
+                    <pic:cNvPr id="0" name="" descr=""/>
+                    <pic:cNvPicPr>
+                      <a:picLocks noChangeAspect="1" noChangeArrowheads="1"/>
+                    </pic:cNvPicPr>
+                  </pic:nvPicPr>
+                  <pic:blipFill>
+                    <a:blip r:embed="rId21" cstate="none"/>
+                    <a:srcRect/>
+                    <a:stretch>
+                      <a:fillRect/>
+                    </a:stretch>
+                  </pic:blipFill>
+                  <pic:spPr bwMode="auto">
+                    <a:xfrm>
+                      <a:off x="0" y="0"/>
+                      <a:ext cx="5143500" cy="3219450"/>
+                    </a:xfrm>
+                    <a:prstGeom prst="rect">
+                      <a:avLst/>
+                    </a:prstGeom>
+                  </pic:spPr>
+                </pic:pic>
+              </a:graphicData>
+            </a:graphic>
+          </wp:inline>
+        </w:drawing>
+      </w:r>
+    </w:p>
+    <w:p>
+      <w:pPr>
+        <w:spacing w:after="180"/>
+        <w:jc w:val="center"/>
+      </w:pPr>
+      <w:r>
+        <w:rPr>
+          <w:i/>
+          <w:iCs/>
+          <w:color w:val="384050"/>
+          <w:sz w:val="18"/>
+          <w:szCs w:val="18"/>
+        </w:rPr>
+        <w:t xml:space="preserve">MLD — types SQL, PK / UK / FK identifiés</w:t>
+      </w:r>
+    </w:p>
+    <w:p>
+      <w:pPr>
+        <w:spacing w:after="120"/>
+        <w:jc w:val="both"/>
+      </w:pPr>
+      <w:r>
+        <w:t xml:space="preserve">Notation textuelle équivalente (avec PK soulignée et FK préfixées par #) :</w:t>
       </w:r>
     </w:p>
     <w:p>
@@ -2219,33 +2400,13 @@
           <w:szCs w:val="20"/>
           <w:rFonts w:ascii="Consolas" w:cs="Consolas" w:eastAsia="Consolas" w:hAnsi="Consolas"/>
         </w:rPr>
-        <w:t xml:space="preserve">+-----------+ 1,n         1,1 +-------------+ 1,n      1,1 +-----------+
-| CATEGORIE |-----&lt; rattachée &gt;-----| SPECIALITE  |----&lt; pratiquée &gt;----|  ARTISAN  |
-+-----------+                       +-------------+                       +-----------+
-| id        |                       | id          |                       | id        |
-| nom       |                       | nom         |                       | nom       |
-+-----------+                       +-------------+                       | note      |
-                                                                          | ville     |
-                                                                          | email     |
-                                                                          | a_propos  |
-                                                                          | site_web  |
-                                                                          | top_mois  |
-                                                                          +-----------+
-                                                                                  | 1,n
-                                                                                  |
-                                                                          &lt; destinataire &gt;
-                                                                                  |
-                                                                                  | 1,1
-                                                                          +-----------------+
-                                                                          | MESSAGE_CONTACT |
-                                                                          +-----------------+
-                                                                          | id              |
-                                                                          | expediteur_nom  |
-                                                                          | expediteur_email|
-                                                                          | objet           |
-                                                                          | message         |
-                                                                          | date_envoi      |
-                                                                          +-----------------+</w:t>
+        <w:t xml:space="preserve">categories       (id, name)
+specialties      (id, name, #category_id)
+cities           (id, name)
+artisans         (id, name, rating, about, email, website, image_url,
+                  is_top_of_month, #specialty_id, #city_id)
+contact_messages (id, sender_name, sender_email, subject, message,
+                  created_at, #artisan_id)</w:t>
       </w:r>
     </w:p>
     <w:p>
@@ -2258,7 +2419,7 @@
           <w:b/>
           <w:bCs/>
         </w:rPr>
-        <w:t xml:space="preserve">3.3 Modèle logique de données (MLD)</w:t>
+        <w:t xml:space="preserve">3.5 Modèle physique de données (extrait)</w:t>
       </w:r>
     </w:p>
     <w:p>
@@ -2272,43 +2433,18 @@
           <w:szCs w:val="20"/>
           <w:rFonts w:ascii="Consolas" w:cs="Consolas" w:eastAsia="Consolas" w:hAnsi="Consolas"/>
         </w:rPr>
-        <w:t xml:space="preserve">categories       (id, nom)
-specialties      (id, nom, #category_id)
-artisans         (id, nom, note, ville, a_propos, email, site_web, image_url,
-                  top_du_mois, #specialty_id)
-contact_messages (id, expediteur_nom, expediteur_email, objet, message,
-                  date_envoi, #artisan_id)</w:t>
-      </w:r>
-    </w:p>
-    <w:p>
-      <w:pPr>
-        <w:pStyle w:val="Heading2"/>
-        <w:spacing w:before="240" w:after="120"/>
-      </w:pPr>
-      <w:r>
-        <w:rPr>
-          <w:b/>
-          <w:bCs/>
-        </w:rPr>
-        <w:t xml:space="preserve">3.4 Modèle physique de données (extrait)</w:t>
-      </w:r>
-    </w:p>
-    <w:p>
-      <w:pPr>
-        <w:shd w:fill="F1F8FC" w:val="clear"/>
-        <w:spacing w:after="120"/>
-      </w:pPr>
-      <w:r>
-        <w:rPr>
-          <w:sz w:val="20"/>
-          <w:szCs w:val="20"/>
-          <w:rFonts w:ascii="Consolas" w:cs="Consolas" w:eastAsia="Consolas" w:hAnsi="Consolas"/>
-        </w:rPr>
-        <w:t xml:space="preserve">CREATE TABLE artisans (
+        <w:t xml:space="preserve">CREATE TABLE cities (
+  id          INT UNSIGNED AUTO_INCREMENT PRIMARY KEY,
+  name        VARCHAR(120) NOT NULL UNIQUE,
+  created_at  DATETIME NOT NULL DEFAULT CURRENT_TIMESTAMP,
+  updated_at  DATETIME NOT NULL DEFAULT CURRENT_TIMESTAMP
+                       ON UPDATE CURRENT_TIMESTAMP
+) ENGINE=InnoDB CHARSET=utf8mb4 COLLATE=utf8mb4_unicode_ci;
+CREATE TABLE artisans (
   id              INT UNSIGNED AUTO_INCREMENT PRIMARY KEY,
   name            VARCHAR(120) NOT NULL,
   rating          DECIMAL(2,1) NOT NULL DEFAULT 0.0,
-  city            VARCHAR(120) NOT NULL,
+  city_id         INT UNSIGNED NOT NULL,
   about           TEXT,
   email           VARCHAR(180) NOT NULL,
   website         VARCHAR(255),
@@ -2321,6 +2457,9 @@
   CONSTRAINT chk_rating CHECK (rating BETWEEN 0 AND 5),
   CONSTRAINT fk_artisan_specialty
     FOREIGN KEY (specialty_id) REFERENCES specialties(id)
+    ON DELETE RESTRICT ON UPDATE CASCADE,
+  CONSTRAINT fk_artisan_city
+    FOREIGN KEY (city_id) REFERENCES cities(id)
     ON DELETE RESTRICT ON UPDATE CASCADE
 ) ENGINE=InnoDB CHARSET=utf8mb4 COLLATE=utf8mb4_unicode_ci;</w:t>
       </w:r>
@@ -2331,7 +2470,7 @@
         <w:jc w:val="both"/>
       </w:pPr>
       <w:r>
-        <w:t xml:space="preserve">Les scripts complets sont disponibles dans le dépôt GitHub : database/01_schema.sql (création) et database/02_seed.sql (jeu d’essai).</w:t>
+        <w:t xml:space="preserve">Les scripts SQL complets se trouvent dans database/01_schema.sql (création) et database/02_seed.sql (jeu d'essai). Une variante adaptée à un hébergement préfixé (AlwaysData) est disponible dans database/remote/.</w:t>
       </w:r>
     </w:p>
     <w:p>
@@ -2344,7 +2483,7 @@
           <w:b/>
           <w:bCs/>
         </w:rPr>
-        <w:t xml:space="preserve">3.5 Jeu d’essai</w:t>
+        <w:t xml:space="preserve">3.6 Jeu d'essai</w:t>
       </w:r>
     </w:p>
     <w:p>
@@ -2353,7 +2492,7 @@
         <w:jc w:val="both"/>
       </w:pPr>
       <w:r>
-        <w:t xml:space="preserve">Le jeu d’essai reprend intégralement le contenu du fichier data.xlsx fourni :</w:t>
+        <w:t xml:space="preserve">Issu du fichier data.xlsx fourni avec le brief :</w:t>
       </w:r>
     </w:p>
     <w:p>
@@ -2380,6 +2519,19 @@
       </w:pPr>
       <w:r>
         <w:t xml:space="preserve">15 spécialités réparties dans les 4 catégories.</w:t>
+      </w:r>
+    </w:p>
+    <w:p>
+      <w:pPr>
+        <w:pStyle w:val="ListParagraph"/>
+        <w:numPr>
+          <w:ilvl w:val="0"/>
+          <w:numId w:val="2"/>
+        </w:numPr>
+        <w:spacing w:after="80"/>
+      </w:pPr>
+      <w:r>
+        <w:t xml:space="preserve">14 villes uniques (Lyon revient 3 fois, Valence 2 fois, les autres 1 fois).</w:t>
       </w:r>
     </w:p>
     <w:p>
@@ -4818,7 +4970,7 @@
       <w:r>
         <w:t xml:space="preserve">Le dépôt est public et contient l’intégralité du code, les scripts SQL et le README.md : </w:t>
       </w:r>
-      <w:hyperlink w:history="1" r:id="rIdnscxgwerbbdej-hlwzkrb">
+      <w:hyperlink w:history="1" r:id="rIddf8cjgc7mwjbahkrzuqrx">
         <w:r>
           <w:rPr>
             <w:rStyle w:val="Hyperlink"/>
@@ -4947,7 +5099,7 @@
       <w:r>
         <w:t xml:space="preserve">Frontend (Vercel) : </w:t>
       </w:r>
-      <w:hyperlink w:history="1" r:id="rId-gdaac_lcenqojnucrd1z">
+      <w:hyperlink w:history="1" r:id="rIdseavm717v8duvkux3jnbr">
         <w:r>
           <w:rPr>
             <w:rStyle w:val="Hyperlink"/>
@@ -4963,7 +5115,7 @@
       <w:r>
         <w:t xml:space="preserve">API (Render) : </w:t>
       </w:r>
-      <w:hyperlink w:history="1" r:id="rIdawqiewhace2ooh7aak5a0">
+      <w:hyperlink w:history="1" r:id="rIdk8r6aoodvg7vlgnsslhuu">
         <w:r>
           <w:rPr>
             <w:rStyle w:val="Hyperlink"/>
@@ -5001,7 +5153,7 @@
       <w:r>
         <w:t xml:space="preserve">Fichier de maquettes (lecture publique) : </w:t>
       </w:r>
-      <w:hyperlink w:history="1" r:id="rIdp5far3cgmiircqk2etd6f">
+      <w:hyperlink w:history="1" r:id="rIdqhhdxn56gtspwntlnkjs0">
         <w:r>
           <w:rPr>
             <w:rStyle w:val="Hyperlink"/>
@@ -5047,7 +5199,7 @@
       <w:rPr>
         <w:color w:val="384050"/>
       </w:rPr>
-      <w:t xml:space="preserve">16/05/2026</w:t>
+      <w:t xml:space="preserve">17/05/2026</w:t>
     </w:r>
     <w:r>
       <w:rPr>

</xml_diff>

<commit_message>
Ajout de la page de garde du titre professionnel et de la section sur les compétences du référentiel couvertes
</commit_message>
<xml_diff>
--- a/docs/dossier-trouve-ton-artisan.docx
+++ b/docs/dossier-trouve-ton-artisan.docx
@@ -29,7 +29,7 @@
           <w:sz w:val="24"/>
           <w:szCs w:val="24"/>
         </w:rPr>
-        <w:t xml:space="preserve">Formation Développeur Web</w:t>
+        <w:t xml:space="preserve">Titre professionnel Développeur Web et Web Mobile (DWWM)</w:t>
       </w:r>
     </w:p>
     <w:p>
@@ -44,7 +44,7 @@
           <w:sz w:val="22"/>
           <w:szCs w:val="22"/>
         </w:rPr>
-        <w:t xml:space="preserve">Devoir bilan — Module : Publier son application Web</w:t>
+        <w:t xml:space="preserve">Dossier de projet — Préparation à l'examen du titre professionnel</w:t>
       </w:r>
     </w:p>
     <w:p>
@@ -106,7 +106,7 @@
         <w:t xml:space="preserve">Date de rendu : </w:t>
       </w:r>
       <w:r>
-        <w:t xml:space="preserve">17/05/2026</w:t>
+        <w:t xml:space="preserve">17/06/2026</w:t>
       </w:r>
     </w:p>
     <w:p>
@@ -162,6 +162,504 @@
         </w:p>
       </w:sdtContent>
     </w:sdt>
+    <w:p>
+      <w:r>
+        <w:br w:type="page"/>
+      </w:r>
+    </w:p>
+    <w:p>
+      <w:pPr>
+        <w:pStyle w:val="Heading1"/>
+        <w:spacing w:before="360" w:after="180"/>
+      </w:pPr>
+      <w:r>
+        <w:rPr>
+          <w:b/>
+          <w:bCs/>
+        </w:rPr>
+        <w:t xml:space="preserve">Introduction — Compétences du référentiel couvertes</w:t>
+      </w:r>
+    </w:p>
+    <w:p>
+      <w:pPr>
+        <w:spacing w:after="120"/>
+        <w:jc w:val="both"/>
+      </w:pPr>
+      <w:r>
+        <w:t xml:space="preserve">Ce dossier présente « Trouve ton artisan », une application web full-stack réalisée dans le cadre de la préparation au titre professionnel Développeur Web et Web Mobile (DWWM). Le projet met en œuvre les compétences obligatoires des deux activités-types du référentiel, côté front-end comme back-end, avec un soin particulier porté à la sécurité, à l'accessibilité et à la couverture des données à la fois relationnelles (MySQL/MariaDB) et NoSQL (MongoDB).</w:t>
+      </w:r>
+    </w:p>
+    <w:p>
+      <w:pPr>
+        <w:pStyle w:val="Heading2"/>
+        <w:spacing w:before="240" w:after="120"/>
+      </w:pPr>
+      <w:r>
+        <w:rPr>
+          <w:b/>
+          <w:bCs/>
+        </w:rPr>
+        <w:t xml:space="preserve">Activité-type 1 — Développer la partie front-end d'une application web ou web mobile sécurisée</w:t>
+      </w:r>
+    </w:p>
+    <w:tbl>
+      <w:tblPr>
+        <w:tblW w:type="dxa" w:w="9360"/>
+        <w:tblBorders>
+          <w:top w:val="single" w:color="auto" w:sz="4"/>
+          <w:left w:val="single" w:color="auto" w:sz="4"/>
+          <w:bottom w:val="single" w:color="auto" w:sz="4"/>
+          <w:right w:val="single" w:color="auto" w:sz="4"/>
+          <w:insideH w:val="single" w:color="auto" w:sz="4"/>
+          <w:insideV w:val="single" w:color="auto" w:sz="4"/>
+        </w:tblBorders>
+      </w:tblPr>
+      <w:tblGrid>
+        <w:gridCol w:w="3200"/>
+        <w:gridCol w:w="6160"/>
+      </w:tblGrid>
+      <w:tr>
+        <w:trPr>
+          <w:tblHeader/>
+        </w:trPr>
+        <w:tc>
+          <w:tcPr>
+            <w:tcW w:type="dxa" w:w="3200"/>
+            <w:tcBorders>
+              <w:top w:val="single" w:color="D0D7DE" w:sz="4"/>
+              <w:left w:val="single" w:color="D0D7DE" w:sz="4"/>
+              <w:bottom w:val="single" w:color="D0D7DE" w:sz="4"/>
+              <w:right w:val="single" w:color="D0D7DE" w:sz="4"/>
+            </w:tcBorders>
+            <w:shd w:fill="0074C7" w:val="clear"/>
+            <w:tcMar>
+              <w:top w:type="dxa" w:w="80"/>
+              <w:left w:type="dxa" w:w="120"/>
+              <w:bottom w:type="dxa" w:w="80"/>
+              <w:right w:type="dxa" w:w="120"/>
+            </w:tcMar>
+          </w:tcPr>
+          <w:p>
+            <w:r>
+              <w:rPr>
+                <w:b/>
+                <w:bCs/>
+                <w:color w:val="FFFFFF"/>
+              </w:rPr>
+              <w:t xml:space="preserve">Compétence</w:t>
+            </w:r>
+          </w:p>
+        </w:tc>
+        <w:tc>
+          <w:tcPr>
+            <w:tcW w:type="dxa" w:w="6160"/>
+            <w:tcBorders>
+              <w:top w:val="single" w:color="D0D7DE" w:sz="4"/>
+              <w:left w:val="single" w:color="D0D7DE" w:sz="4"/>
+              <w:bottom w:val="single" w:color="D0D7DE" w:sz="4"/>
+              <w:right w:val="single" w:color="D0D7DE" w:sz="4"/>
+            </w:tcBorders>
+            <w:shd w:fill="0074C7" w:val="clear"/>
+            <w:tcMar>
+              <w:top w:type="dxa" w:w="80"/>
+              <w:left w:type="dxa" w:w="120"/>
+              <w:bottom w:type="dxa" w:w="80"/>
+              <w:right w:type="dxa" w:w="120"/>
+            </w:tcMar>
+          </w:tcPr>
+          <w:p>
+            <w:r>
+              <w:rPr>
+                <w:b/>
+                <w:bCs/>
+                <w:color w:val="FFFFFF"/>
+              </w:rPr>
+              <w:t xml:space="preserve">Mise en œuvre dans le projet</w:t>
+            </w:r>
+          </w:p>
+        </w:tc>
+      </w:tr>
+      <w:tr>
+        <w:tc>
+          <w:tcPr>
+            <w:tcW w:type="dxa" w:w="3200"/>
+            <w:tcBorders>
+              <w:top w:val="single" w:color="D0D7DE" w:sz="4"/>
+              <w:left w:val="single" w:color="D0D7DE" w:sz="4"/>
+              <w:bottom w:val="single" w:color="D0D7DE" w:sz="4"/>
+              <w:right w:val="single" w:color="D0D7DE" w:sz="4"/>
+            </w:tcBorders>
+            <w:tcMar>
+              <w:top w:type="dxa" w:w="80"/>
+              <w:left w:type="dxa" w:w="120"/>
+              <w:bottom w:type="dxa" w:w="80"/>
+              <w:right w:type="dxa" w:w="120"/>
+            </w:tcMar>
+          </w:tcPr>
+          <w:p>
+            <w:r>
+              <w:t xml:space="preserve">Maquetter des interfaces utilisateur web ou web mobile</w:t>
+            </w:r>
+          </w:p>
+        </w:tc>
+        <w:tc>
+          <w:tcPr>
+            <w:tcW w:type="dxa" w:w="6160"/>
+            <w:tcBorders>
+              <w:top w:val="single" w:color="D0D7DE" w:sz="4"/>
+              <w:left w:val="single" w:color="D0D7DE" w:sz="4"/>
+              <w:bottom w:val="single" w:color="D0D7DE" w:sz="4"/>
+              <w:right w:val="single" w:color="D0D7DE" w:sz="4"/>
+            </w:tcBorders>
+            <w:tcMar>
+              <w:top w:type="dxa" w:w="80"/>
+              <w:left w:type="dxa" w:w="120"/>
+              <w:bottom w:type="dxa" w:w="80"/>
+              <w:right w:type="dxa" w:w="120"/>
+            </w:tcMar>
+          </w:tcPr>
+          <w:p>
+            <w:r>
+              <w:t xml:space="preserve">Maquettes Figma en mobile-first pour les trois résolutions (mobile 375 px, tablette 768 px, ordinateur 1280 px), charte graphique respectée, schéma d'enchaînement des écrans.</w:t>
+            </w:r>
+          </w:p>
+        </w:tc>
+      </w:tr>
+      <w:tr>
+        <w:tc>
+          <w:tcPr>
+            <w:tcW w:type="dxa" w:w="3200"/>
+            <w:tcBorders>
+              <w:top w:val="single" w:color="D0D7DE" w:sz="4"/>
+              <w:left w:val="single" w:color="D0D7DE" w:sz="4"/>
+              <w:bottom w:val="single" w:color="D0D7DE" w:sz="4"/>
+              <w:right w:val="single" w:color="D0D7DE" w:sz="4"/>
+            </w:tcBorders>
+            <w:tcMar>
+              <w:top w:type="dxa" w:w="80"/>
+              <w:left w:type="dxa" w:w="120"/>
+              <w:bottom w:type="dxa" w:w="80"/>
+              <w:right w:type="dxa" w:w="120"/>
+            </w:tcMar>
+          </w:tcPr>
+          <w:p>
+            <w:r>
+              <w:t xml:space="preserve">Réaliser des interfaces utilisateur statiques web ou web mobile</w:t>
+            </w:r>
+          </w:p>
+        </w:tc>
+        <w:tc>
+          <w:tcPr>
+            <w:tcW w:type="dxa" w:w="6160"/>
+            <w:tcBorders>
+              <w:top w:val="single" w:color="D0D7DE" w:sz="4"/>
+              <w:left w:val="single" w:color="D0D7DE" w:sz="4"/>
+              <w:bottom w:val="single" w:color="D0D7DE" w:sz="4"/>
+              <w:right w:val="single" w:color="D0D7DE" w:sz="4"/>
+            </w:tcBorders>
+            <w:tcMar>
+              <w:top w:type="dxa" w:w="80"/>
+              <w:left w:type="dxa" w:w="120"/>
+              <w:bottom w:type="dxa" w:w="80"/>
+              <w:right w:type="dxa" w:w="120"/>
+            </w:tcMar>
+          </w:tcPr>
+          <w:p>
+            <w:r>
+              <w:t xml:space="preserve">Composants React structurés, Bootstrap 5 et Sass, HTML sémantique, mise en page responsive, accessibilité WCAG 2.1 (lien d'évitement, attributs ARIA, focus visible).</w:t>
+            </w:r>
+          </w:p>
+        </w:tc>
+      </w:tr>
+      <w:tr>
+        <w:tc>
+          <w:tcPr>
+            <w:tcW w:type="dxa" w:w="3200"/>
+            <w:tcBorders>
+              <w:top w:val="single" w:color="D0D7DE" w:sz="4"/>
+              <w:left w:val="single" w:color="D0D7DE" w:sz="4"/>
+              <w:bottom w:val="single" w:color="D0D7DE" w:sz="4"/>
+              <w:right w:val="single" w:color="D0D7DE" w:sz="4"/>
+            </w:tcBorders>
+            <w:tcMar>
+              <w:top w:type="dxa" w:w="80"/>
+              <w:left w:type="dxa" w:w="120"/>
+              <w:bottom w:type="dxa" w:w="80"/>
+              <w:right w:type="dxa" w:w="120"/>
+            </w:tcMar>
+          </w:tcPr>
+          <w:p>
+            <w:r>
+              <w:t xml:space="preserve">Développer la partie dynamique des interfaces utilisateur web ou web mobile</w:t>
+            </w:r>
+          </w:p>
+        </w:tc>
+        <w:tc>
+          <w:tcPr>
+            <w:tcW w:type="dxa" w:w="6160"/>
+            <w:tcBorders>
+              <w:top w:val="single" w:color="D0D7DE" w:sz="4"/>
+              <w:left w:val="single" w:color="D0D7DE" w:sz="4"/>
+              <w:bottom w:val="single" w:color="D0D7DE" w:sz="4"/>
+              <w:right w:val="single" w:color="D0D7DE" w:sz="4"/>
+            </w:tcBorders>
+            <w:tcMar>
+              <w:top w:type="dxa" w:w="80"/>
+              <w:left w:type="dxa" w:w="120"/>
+              <w:bottom w:type="dxa" w:w="80"/>
+              <w:right w:type="dxa" w:w="120"/>
+            </w:tcMar>
+          </w:tcPr>
+          <w:p>
+            <w:r>
+              <w:t xml:space="preserve">React (hooks d'état et d'effet), consommation de l'API REST via un client fetch centralisé, formulaires dynamiques (contact et avis) avec validation côté client.</w:t>
+            </w:r>
+          </w:p>
+        </w:tc>
+      </w:tr>
+    </w:tbl>
+    <w:p>
+      <w:pPr>
+        <w:pStyle w:val="Heading2"/>
+        <w:spacing w:before="240" w:after="120"/>
+      </w:pPr>
+      <w:r>
+        <w:rPr>
+          <w:b/>
+          <w:bCs/>
+        </w:rPr>
+        <w:t xml:space="preserve">Activité-type 2 — Développer la partie back-end d'une application web ou web mobile sécurisée</w:t>
+      </w:r>
+    </w:p>
+    <w:tbl>
+      <w:tblPr>
+        <w:tblW w:type="dxa" w:w="9360"/>
+        <w:tblBorders>
+          <w:top w:val="single" w:color="auto" w:sz="4"/>
+          <w:left w:val="single" w:color="auto" w:sz="4"/>
+          <w:bottom w:val="single" w:color="auto" w:sz="4"/>
+          <w:right w:val="single" w:color="auto" w:sz="4"/>
+          <w:insideH w:val="single" w:color="auto" w:sz="4"/>
+          <w:insideV w:val="single" w:color="auto" w:sz="4"/>
+        </w:tblBorders>
+      </w:tblPr>
+      <w:tblGrid>
+        <w:gridCol w:w="3200"/>
+        <w:gridCol w:w="6160"/>
+      </w:tblGrid>
+      <w:tr>
+        <w:trPr>
+          <w:tblHeader/>
+        </w:trPr>
+        <w:tc>
+          <w:tcPr>
+            <w:tcW w:type="dxa" w:w="3200"/>
+            <w:tcBorders>
+              <w:top w:val="single" w:color="D0D7DE" w:sz="4"/>
+              <w:left w:val="single" w:color="D0D7DE" w:sz="4"/>
+              <w:bottom w:val="single" w:color="D0D7DE" w:sz="4"/>
+              <w:right w:val="single" w:color="D0D7DE" w:sz="4"/>
+            </w:tcBorders>
+            <w:shd w:fill="0074C7" w:val="clear"/>
+            <w:tcMar>
+              <w:top w:type="dxa" w:w="80"/>
+              <w:left w:type="dxa" w:w="120"/>
+              <w:bottom w:type="dxa" w:w="80"/>
+              <w:right w:type="dxa" w:w="120"/>
+            </w:tcMar>
+          </w:tcPr>
+          <w:p>
+            <w:r>
+              <w:rPr>
+                <w:b/>
+                <w:bCs/>
+                <w:color w:val="FFFFFF"/>
+              </w:rPr>
+              <w:t xml:space="preserve">Compétence</w:t>
+            </w:r>
+          </w:p>
+        </w:tc>
+        <w:tc>
+          <w:tcPr>
+            <w:tcW w:type="dxa" w:w="6160"/>
+            <w:tcBorders>
+              <w:top w:val="single" w:color="D0D7DE" w:sz="4"/>
+              <w:left w:val="single" w:color="D0D7DE" w:sz="4"/>
+              <w:bottom w:val="single" w:color="D0D7DE" w:sz="4"/>
+              <w:right w:val="single" w:color="D0D7DE" w:sz="4"/>
+            </w:tcBorders>
+            <w:shd w:fill="0074C7" w:val="clear"/>
+            <w:tcMar>
+              <w:top w:type="dxa" w:w="80"/>
+              <w:left w:type="dxa" w:w="120"/>
+              <w:bottom w:type="dxa" w:w="80"/>
+              <w:right w:type="dxa" w:w="120"/>
+            </w:tcMar>
+          </w:tcPr>
+          <w:p>
+            <w:r>
+              <w:rPr>
+                <w:b/>
+                <w:bCs/>
+                <w:color w:val="FFFFFF"/>
+              </w:rPr>
+              <w:t xml:space="preserve">Mise en œuvre dans le projet</w:t>
+            </w:r>
+          </w:p>
+        </w:tc>
+      </w:tr>
+      <w:tr>
+        <w:tc>
+          <w:tcPr>
+            <w:tcW w:type="dxa" w:w="3200"/>
+            <w:tcBorders>
+              <w:top w:val="single" w:color="D0D7DE" w:sz="4"/>
+              <w:left w:val="single" w:color="D0D7DE" w:sz="4"/>
+              <w:bottom w:val="single" w:color="D0D7DE" w:sz="4"/>
+              <w:right w:val="single" w:color="D0D7DE" w:sz="4"/>
+            </w:tcBorders>
+            <w:tcMar>
+              <w:top w:type="dxa" w:w="80"/>
+              <w:left w:type="dxa" w:w="120"/>
+              <w:bottom w:type="dxa" w:w="80"/>
+              <w:right w:type="dxa" w:w="120"/>
+            </w:tcMar>
+          </w:tcPr>
+          <w:p>
+            <w:r>
+              <w:t xml:space="preserve">Mettre en place une base de données relationnelle</w:t>
+            </w:r>
+          </w:p>
+        </w:tc>
+        <w:tc>
+          <w:tcPr>
+            <w:tcW w:type="dxa" w:w="6160"/>
+            <w:tcBorders>
+              <w:top w:val="single" w:color="D0D7DE" w:sz="4"/>
+              <w:left w:val="single" w:color="D0D7DE" w:sz="4"/>
+              <w:bottom w:val="single" w:color="D0D7DE" w:sz="4"/>
+              <w:right w:val="single" w:color="D0D7DE" w:sz="4"/>
+            </w:tcBorders>
+            <w:tcMar>
+              <w:top w:type="dxa" w:w="80"/>
+              <w:left w:type="dxa" w:w="120"/>
+              <w:bottom w:type="dxa" w:w="80"/>
+              <w:right w:type="dxa" w:w="120"/>
+            </w:tcMar>
+          </w:tcPr>
+          <w:p>
+            <w:r>
+              <w:t xml:space="preserve">MySQL/MariaDB : MCD, MLD et modèle physique, respect des trois formes normales, contraintes (clés étrangères, CHECK, UNIQUE), vue de lecture, scripts de création et d'alimentation.</w:t>
+            </w:r>
+          </w:p>
+        </w:tc>
+      </w:tr>
+      <w:tr>
+        <w:tc>
+          <w:tcPr>
+            <w:tcW w:type="dxa" w:w="3200"/>
+            <w:tcBorders>
+              <w:top w:val="single" w:color="D0D7DE" w:sz="4"/>
+              <w:left w:val="single" w:color="D0D7DE" w:sz="4"/>
+              <w:bottom w:val="single" w:color="D0D7DE" w:sz="4"/>
+              <w:right w:val="single" w:color="D0D7DE" w:sz="4"/>
+            </w:tcBorders>
+            <w:tcMar>
+              <w:top w:type="dxa" w:w="80"/>
+              <w:left w:type="dxa" w:w="120"/>
+              <w:bottom w:type="dxa" w:w="80"/>
+              <w:right w:type="dxa" w:w="120"/>
+            </w:tcMar>
+          </w:tcPr>
+          <w:p>
+            <w:r>
+              <w:t xml:space="preserve">Développer des composants d'accès aux données SQL et NoSQL</w:t>
+            </w:r>
+          </w:p>
+        </w:tc>
+        <w:tc>
+          <w:tcPr>
+            <w:tcW w:type="dxa" w:w="6160"/>
+            <w:tcBorders>
+              <w:top w:val="single" w:color="D0D7DE" w:sz="4"/>
+              <w:left w:val="single" w:color="D0D7DE" w:sz="4"/>
+              <w:bottom w:val="single" w:color="D0D7DE" w:sz="4"/>
+              <w:right w:val="single" w:color="D0D7DE" w:sz="4"/>
+            </w:tcBorders>
+            <w:tcMar>
+              <w:top w:type="dxa" w:w="80"/>
+              <w:left w:type="dxa" w:w="120"/>
+              <w:bottom w:type="dxa" w:w="80"/>
+              <w:right w:type="dxa" w:w="120"/>
+            </w:tcMar>
+          </w:tcPr>
+          <w:p>
+            <w:r>
+              <w:t xml:space="preserve">Couche services dédiée : accès SQL via Sequelize (artisans, catégories, villes) ET accès NoSQL via Mongoose (avis clients stockés dans MongoDB).</w:t>
+            </w:r>
+          </w:p>
+        </w:tc>
+      </w:tr>
+      <w:tr>
+        <w:tc>
+          <w:tcPr>
+            <w:tcW w:type="dxa" w:w="3200"/>
+            <w:tcBorders>
+              <w:top w:val="single" w:color="D0D7DE" w:sz="4"/>
+              <w:left w:val="single" w:color="D0D7DE" w:sz="4"/>
+              <w:bottom w:val="single" w:color="D0D7DE" w:sz="4"/>
+              <w:right w:val="single" w:color="D0D7DE" w:sz="4"/>
+            </w:tcBorders>
+            <w:tcMar>
+              <w:top w:type="dxa" w:w="80"/>
+              <w:left w:type="dxa" w:w="120"/>
+              <w:bottom w:type="dxa" w:w="80"/>
+              <w:right w:type="dxa" w:w="120"/>
+            </w:tcMar>
+          </w:tcPr>
+          <w:p>
+            <w:r>
+              <w:t xml:space="preserve">Développer des composants métier côté serveur</w:t>
+            </w:r>
+          </w:p>
+        </w:tc>
+        <w:tc>
+          <w:tcPr>
+            <w:tcW w:type="dxa" w:w="6160"/>
+            <w:tcBorders>
+              <w:top w:val="single" w:color="D0D7DE" w:sz="4"/>
+              <w:left w:val="single" w:color="D0D7DE" w:sz="4"/>
+              <w:bottom w:val="single" w:color="D0D7DE" w:sz="4"/>
+              <w:right w:val="single" w:color="D0D7DE" w:sz="4"/>
+            </w:tcBorders>
+            <w:tcMar>
+              <w:top w:type="dxa" w:w="80"/>
+              <w:left w:type="dxa" w:w="120"/>
+              <w:bottom w:type="dxa" w:w="80"/>
+              <w:right w:type="dxa" w:w="120"/>
+            </w:tcMar>
+          </w:tcPr>
+          <w:p>
+            <w:r>
+              <w:t xml:space="preserve">Architecture en couches (routes → contrôleurs → services → modèles), logique métier isolée dans les services, validation, sécurité et gestion centralisée des erreurs.</w:t>
+            </w:r>
+          </w:p>
+        </w:tc>
+      </w:tr>
+    </w:tbl>
+    <w:p>
+      <w:pPr>
+        <w:spacing w:after="120"/>
+        <w:jc w:val="both"/>
+      </w:pPr>
+      <w:r>
+        <w:rPr>
+          <w:i/>
+          <w:iCs/>
+        </w:rPr>
+        <w:t xml:space="preserve">Les deux compétences non obligatoires dans le dossier — installer et configurer son environnement de travail, et documenter le déploiement — sont également mises en œuvre (environnement Node.js / VS Code / Git, déploiement Vercel + Render + base de données hébergée) et pourront être détaillées lors de l'entretien technique.</w:t>
+      </w:r>
+    </w:p>
     <w:p>
       <w:r>
         <w:br w:type="page"/>
@@ -1225,7 +1723,7 @@
       <w:r>
         <w:t xml:space="preserve">Maquettes complètes (consultation publique) : </w:t>
       </w:r>
-      <w:hyperlink w:history="1" r:id="rId_90avrvo-lznmfcp9qurm">
+      <w:hyperlink w:history="1" r:id="rIdpqpiuumg8cfel8taw3-us">
         <w:r>
           <w:rPr>
             <w:rStyle w:val="Hyperlink"/>
@@ -4970,7 +5468,7 @@
       <w:r>
         <w:t xml:space="preserve">Le dépôt est public et contient l’intégralité du code, les scripts SQL et le README.md : </w:t>
       </w:r>
-      <w:hyperlink w:history="1" r:id="rIddf8cjgc7mwjbahkrzuqrx">
+      <w:hyperlink w:history="1" r:id="rIdcxlx6wzyu2bw6zam3neot">
         <w:r>
           <w:rPr>
             <w:rStyle w:val="Hyperlink"/>
@@ -5099,7 +5597,7 @@
       <w:r>
         <w:t xml:space="preserve">Frontend (Vercel) : </w:t>
       </w:r>
-      <w:hyperlink w:history="1" r:id="rIdseavm717v8duvkux3jnbr">
+      <w:hyperlink w:history="1" r:id="rId6jpkesvf55ecm_jvy79zl">
         <w:r>
           <w:rPr>
             <w:rStyle w:val="Hyperlink"/>
@@ -5115,7 +5613,7 @@
       <w:r>
         <w:t xml:space="preserve">API (Render) : </w:t>
       </w:r>
-      <w:hyperlink w:history="1" r:id="rIdk8r6aoodvg7vlgnsslhuu">
+      <w:hyperlink w:history="1" r:id="rIdzzwdio8flitfm5oyrqvno">
         <w:r>
           <w:rPr>
             <w:rStyle w:val="Hyperlink"/>
@@ -5153,7 +5651,7 @@
       <w:r>
         <w:t xml:space="preserve">Fichier de maquettes (lecture publique) : </w:t>
       </w:r>
-      <w:hyperlink w:history="1" r:id="rIdqhhdxn56gtspwntlnkjs0">
+      <w:hyperlink w:history="1" r:id="rIdjm_idpw3jewszylhepjxp">
         <w:r>
           <w:rPr>
             <w:rStyle w:val="Hyperlink"/>
@@ -5199,7 +5697,7 @@
       <w:rPr>
         <w:color w:val="384050"/>
       </w:rPr>
-      <w:t xml:space="preserve">17/05/2026</w:t>
+      <w:t xml:space="preserve">17/06/2026</w:t>
     </w:r>
     <w:r>
       <w:rPr>

</xml_diff>

<commit_message>
Complète le dossier avec la partie NoSQL (avis MongoDB), les composants d'accès aux données et la logique métier, le jeu d'essai représentatif, et un meilleur affichage des extraits de code
</commit_message>
<xml_diff>
--- a/docs/dossier-trouve-ton-artisan.docx
+++ b/docs/dossier-trouve-ton-artisan.docx
@@ -1723,7 +1723,7 @@
       <w:r>
         <w:t xml:space="preserve">Maquettes complètes (consultation publique) : </w:t>
       </w:r>
-      <w:hyperlink w:history="1" r:id="rIdpqpiuumg8cfel8taw3-us">
+      <w:hyperlink w:history="1" r:id="rIdlo3uprb4qjqjrqb8balvk">
         <w:r>
           <w:rPr>
             <w:rStyle w:val="Hyperlink"/>
@@ -2587,14 +2587,78 @@
           <w:szCs w:val="20"/>
           <w:rFonts w:ascii="Consolas" w:cs="Consolas" w:eastAsia="Consolas" w:hAnsi="Consolas"/>
         </w:rPr>
-        <w:t xml:space="preserve">[Accueil] ─ menu catégorie ────► [Liste filtrée]
-          ─ recherche ─────────► [Liste filtrée]
-          ─ artisan du mois ────► [Fiche artisan]
-                                          │
-                                          ▼
-                                  [Formulaire] ──► confirmation
-[Liste] ─ clic carte ────► [Fiche artisan]
-[Toute URL inconnue] ────► [404] ─ retour ─► [Accueil]</w:t>
+        <w:t xml:space="preserve">[Accueil] ─ menu catégorie ────► [Liste filtrée]</w:t>
+      </w:r>
+      <w:r>
+        <w:rPr>
+          <w:sz w:val="20"/>
+          <w:szCs w:val="20"/>
+          <w:rFonts w:ascii="Consolas" w:cs="Consolas" w:eastAsia="Consolas" w:hAnsi="Consolas"/>
+        </w:rPr>
+        <w:br/>
+        <w:t xml:space="preserve">          ─ recherche ─────────► [Liste filtrée]</w:t>
+      </w:r>
+      <w:r>
+        <w:rPr>
+          <w:sz w:val="20"/>
+          <w:szCs w:val="20"/>
+          <w:rFonts w:ascii="Consolas" w:cs="Consolas" w:eastAsia="Consolas" w:hAnsi="Consolas"/>
+        </w:rPr>
+        <w:br/>
+        <w:t xml:space="preserve">          ─ artisan du mois ────► [Fiche artisan]</w:t>
+      </w:r>
+      <w:r>
+        <w:rPr>
+          <w:sz w:val="20"/>
+          <w:szCs w:val="20"/>
+          <w:rFonts w:ascii="Consolas" w:cs="Consolas" w:eastAsia="Consolas" w:hAnsi="Consolas"/>
+        </w:rPr>
+        <w:br/>
+        <w:t xml:space="preserve">                                          │</w:t>
+      </w:r>
+      <w:r>
+        <w:rPr>
+          <w:sz w:val="20"/>
+          <w:szCs w:val="20"/>
+          <w:rFonts w:ascii="Consolas" w:cs="Consolas" w:eastAsia="Consolas" w:hAnsi="Consolas"/>
+        </w:rPr>
+        <w:br/>
+        <w:t xml:space="preserve">                                          ▼</w:t>
+      </w:r>
+      <w:r>
+        <w:rPr>
+          <w:sz w:val="20"/>
+          <w:szCs w:val="20"/>
+          <w:rFonts w:ascii="Consolas" w:cs="Consolas" w:eastAsia="Consolas" w:hAnsi="Consolas"/>
+        </w:rPr>
+        <w:br/>
+        <w:t xml:space="preserve">                                  [Formulaire] ──► confirmation</w:t>
+      </w:r>
+      <w:r>
+        <w:rPr>
+          <w:sz w:val="20"/>
+          <w:szCs w:val="20"/>
+          <w:rFonts w:ascii="Consolas" w:cs="Consolas" w:eastAsia="Consolas" w:hAnsi="Consolas"/>
+        </w:rPr>
+        <w:br/>
+      </w:r>
+      <w:r>
+        <w:rPr>
+          <w:sz w:val="20"/>
+          <w:szCs w:val="20"/>
+          <w:rFonts w:ascii="Consolas" w:cs="Consolas" w:eastAsia="Consolas" w:hAnsi="Consolas"/>
+        </w:rPr>
+        <w:br/>
+        <w:t xml:space="preserve">[Liste] ─ clic carte ────► [Fiche artisan]</w:t>
+      </w:r>
+      <w:r>
+        <w:rPr>
+          <w:sz w:val="20"/>
+          <w:szCs w:val="20"/>
+          <w:rFonts w:ascii="Consolas" w:cs="Consolas" w:eastAsia="Consolas" w:hAnsi="Consolas"/>
+        </w:rPr>
+        <w:br/>
+        <w:t xml:space="preserve">[Toute URL inconnue] ────► [404] ─ retour ─► [Accueil]</w:t>
       </w:r>
     </w:p>
     <w:p>
@@ -2612,7 +2676,7 @@
           <w:b/>
           <w:bCs/>
         </w:rPr>
-        <w:t xml:space="preserve">3. Base de données</w:t>
+        <w:t xml:space="preserve">3. Base de données et composants serveur</w:t>
       </w:r>
     </w:p>
     <w:p>
@@ -2898,68 +2962,348 @@
           <w:szCs w:val="20"/>
           <w:rFonts w:ascii="Consolas" w:cs="Consolas" w:eastAsia="Consolas" w:hAnsi="Consolas"/>
         </w:rPr>
-        <w:t xml:space="preserve">categories       (id, name)
-specialties      (id, name, #category_id)
-cities           (id, name)
-artisans         (id, name, rating, about, email, website, image_url,
-                  is_top_of_month, #specialty_id, #city_id)
-contact_messages (id, sender_name, sender_email, subject, message,
-                  created_at, #artisan_id)</w:t>
-      </w:r>
-    </w:p>
-    <w:p>
-      <w:pPr>
-        <w:pStyle w:val="Heading2"/>
-        <w:spacing w:before="240" w:after="120"/>
-      </w:pPr>
-      <w:r>
-        <w:rPr>
-          <w:b/>
-          <w:bCs/>
-        </w:rPr>
-        <w:t xml:space="preserve">3.5 Modèle physique de données (extrait)</w:t>
-      </w:r>
-    </w:p>
-    <w:p>
-      <w:pPr>
-        <w:shd w:fill="F1F8FC" w:val="clear"/>
-        <w:spacing w:after="120"/>
-      </w:pPr>
+        <w:t xml:space="preserve">categories       (id, name)</w:t>
+      </w:r>
       <w:r>
         <w:rPr>
           <w:sz w:val="20"/>
           <w:szCs w:val="20"/>
           <w:rFonts w:ascii="Consolas" w:cs="Consolas" w:eastAsia="Consolas" w:hAnsi="Consolas"/>
         </w:rPr>
-        <w:t xml:space="preserve">CREATE TABLE cities (
-  id          INT UNSIGNED AUTO_INCREMENT PRIMARY KEY,
-  name        VARCHAR(120) NOT NULL UNIQUE,
-  created_at  DATETIME NOT NULL DEFAULT CURRENT_TIMESTAMP,
-  updated_at  DATETIME NOT NULL DEFAULT CURRENT_TIMESTAMP
-                       ON UPDATE CURRENT_TIMESTAMP
-) ENGINE=InnoDB CHARSET=utf8mb4 COLLATE=utf8mb4_unicode_ci;
-CREATE TABLE artisans (
-  id              INT UNSIGNED AUTO_INCREMENT PRIMARY KEY,
-  name            VARCHAR(120) NOT NULL,
-  rating          DECIMAL(2,1) NOT NULL DEFAULT 0.0,
-  city_id         INT UNSIGNED NOT NULL,
-  about           TEXT,
-  email           VARCHAR(180) NOT NULL,
-  website         VARCHAR(255),
-  image_url       VARCHAR(255),
-  specialty_id    INT UNSIGNED NOT NULL,
-  is_top_of_month BOOLEAN NOT NULL DEFAULT FALSE,
-  created_at      DATETIME NOT NULL DEFAULT CURRENT_TIMESTAMP,
-  updated_at      DATETIME NOT NULL DEFAULT CURRENT_TIMESTAMP
-                          ON UPDATE CURRENT_TIMESTAMP,
-  CONSTRAINT chk_rating CHECK (rating BETWEEN 0 AND 5),
-  CONSTRAINT fk_artisan_specialty
-    FOREIGN KEY (specialty_id) REFERENCES specialties(id)
-    ON DELETE RESTRICT ON UPDATE CASCADE,
-  CONSTRAINT fk_artisan_city
-    FOREIGN KEY (city_id) REFERENCES cities(id)
-    ON DELETE RESTRICT ON UPDATE CASCADE
-) ENGINE=InnoDB CHARSET=utf8mb4 COLLATE=utf8mb4_unicode_ci;</w:t>
+        <w:br/>
+        <w:t xml:space="preserve">specialties      (id, name, #category_id)</w:t>
+      </w:r>
+      <w:r>
+        <w:rPr>
+          <w:sz w:val="20"/>
+          <w:szCs w:val="20"/>
+          <w:rFonts w:ascii="Consolas" w:cs="Consolas" w:eastAsia="Consolas" w:hAnsi="Consolas"/>
+        </w:rPr>
+        <w:br/>
+        <w:t xml:space="preserve">cities           (id, name)</w:t>
+      </w:r>
+      <w:r>
+        <w:rPr>
+          <w:sz w:val="20"/>
+          <w:szCs w:val="20"/>
+          <w:rFonts w:ascii="Consolas" w:cs="Consolas" w:eastAsia="Consolas" w:hAnsi="Consolas"/>
+        </w:rPr>
+        <w:br/>
+        <w:t xml:space="preserve">artisans         (id, name, rating, about, email, website, image_url,</w:t>
+      </w:r>
+      <w:r>
+        <w:rPr>
+          <w:sz w:val="20"/>
+          <w:szCs w:val="20"/>
+          <w:rFonts w:ascii="Consolas" w:cs="Consolas" w:eastAsia="Consolas" w:hAnsi="Consolas"/>
+        </w:rPr>
+        <w:br/>
+        <w:t xml:space="preserve">                  is_top_of_month, #specialty_id, #city_id)</w:t>
+      </w:r>
+      <w:r>
+        <w:rPr>
+          <w:sz w:val="20"/>
+          <w:szCs w:val="20"/>
+          <w:rFonts w:ascii="Consolas" w:cs="Consolas" w:eastAsia="Consolas" w:hAnsi="Consolas"/>
+        </w:rPr>
+        <w:br/>
+        <w:t xml:space="preserve">contact_messages (id, sender_name, sender_email, subject, message,</w:t>
+      </w:r>
+      <w:r>
+        <w:rPr>
+          <w:sz w:val="20"/>
+          <w:szCs w:val="20"/>
+          <w:rFonts w:ascii="Consolas" w:cs="Consolas" w:eastAsia="Consolas" w:hAnsi="Consolas"/>
+        </w:rPr>
+        <w:br/>
+        <w:t xml:space="preserve">                  created_at, #artisan_id)</w:t>
+      </w:r>
+    </w:p>
+    <w:p>
+      <w:pPr>
+        <w:pStyle w:val="Heading2"/>
+        <w:spacing w:before="240" w:after="120"/>
+      </w:pPr>
+      <w:r>
+        <w:rPr>
+          <w:b/>
+          <w:bCs/>
+        </w:rPr>
+        <w:t xml:space="preserve">3.5 Modèle physique de données (extrait)</w:t>
+      </w:r>
+    </w:p>
+    <w:p>
+      <w:pPr>
+        <w:shd w:fill="F1F8FC" w:val="clear"/>
+        <w:spacing w:after="120"/>
+      </w:pPr>
+      <w:r>
+        <w:rPr>
+          <w:sz w:val="20"/>
+          <w:szCs w:val="20"/>
+          <w:rFonts w:ascii="Consolas" w:cs="Consolas" w:eastAsia="Consolas" w:hAnsi="Consolas"/>
+        </w:rPr>
+        <w:t xml:space="preserve">CREATE TABLE cities (</w:t>
+      </w:r>
+      <w:r>
+        <w:rPr>
+          <w:sz w:val="20"/>
+          <w:szCs w:val="20"/>
+          <w:rFonts w:ascii="Consolas" w:cs="Consolas" w:eastAsia="Consolas" w:hAnsi="Consolas"/>
+        </w:rPr>
+        <w:br/>
+        <w:t xml:space="preserve">  id          INT UNSIGNED AUTO_INCREMENT PRIMARY KEY,</w:t>
+      </w:r>
+      <w:r>
+        <w:rPr>
+          <w:sz w:val="20"/>
+          <w:szCs w:val="20"/>
+          <w:rFonts w:ascii="Consolas" w:cs="Consolas" w:eastAsia="Consolas" w:hAnsi="Consolas"/>
+        </w:rPr>
+        <w:br/>
+        <w:t xml:space="preserve">  name        VARCHAR(120) NOT NULL UNIQUE,</w:t>
+      </w:r>
+      <w:r>
+        <w:rPr>
+          <w:sz w:val="20"/>
+          <w:szCs w:val="20"/>
+          <w:rFonts w:ascii="Consolas" w:cs="Consolas" w:eastAsia="Consolas" w:hAnsi="Consolas"/>
+        </w:rPr>
+        <w:br/>
+        <w:t xml:space="preserve">  created_at  DATETIME NOT NULL DEFAULT CURRENT_TIMESTAMP,</w:t>
+      </w:r>
+      <w:r>
+        <w:rPr>
+          <w:sz w:val="20"/>
+          <w:szCs w:val="20"/>
+          <w:rFonts w:ascii="Consolas" w:cs="Consolas" w:eastAsia="Consolas" w:hAnsi="Consolas"/>
+        </w:rPr>
+        <w:br/>
+        <w:t xml:space="preserve">  updated_at  DATETIME NOT NULL DEFAULT CURRENT_TIMESTAMP</w:t>
+      </w:r>
+      <w:r>
+        <w:rPr>
+          <w:sz w:val="20"/>
+          <w:szCs w:val="20"/>
+          <w:rFonts w:ascii="Consolas" w:cs="Consolas" w:eastAsia="Consolas" w:hAnsi="Consolas"/>
+        </w:rPr>
+        <w:br/>
+        <w:t xml:space="preserve">                       ON UPDATE CURRENT_TIMESTAMP</w:t>
+      </w:r>
+      <w:r>
+        <w:rPr>
+          <w:sz w:val="20"/>
+          <w:szCs w:val="20"/>
+          <w:rFonts w:ascii="Consolas" w:cs="Consolas" w:eastAsia="Consolas" w:hAnsi="Consolas"/>
+        </w:rPr>
+        <w:br/>
+        <w:t xml:space="preserve">) ENGINE=InnoDB CHARSET=utf8mb4 COLLATE=utf8mb4_unicode_ci;</w:t>
+      </w:r>
+      <w:r>
+        <w:rPr>
+          <w:sz w:val="20"/>
+          <w:szCs w:val="20"/>
+          <w:rFonts w:ascii="Consolas" w:cs="Consolas" w:eastAsia="Consolas" w:hAnsi="Consolas"/>
+        </w:rPr>
+        <w:br/>
+      </w:r>
+      <w:r>
+        <w:rPr>
+          <w:sz w:val="20"/>
+          <w:szCs w:val="20"/>
+          <w:rFonts w:ascii="Consolas" w:cs="Consolas" w:eastAsia="Consolas" w:hAnsi="Consolas"/>
+        </w:rPr>
+        <w:br/>
+        <w:t xml:space="preserve">CREATE TABLE artisans (</w:t>
+      </w:r>
+      <w:r>
+        <w:rPr>
+          <w:sz w:val="20"/>
+          <w:szCs w:val="20"/>
+          <w:rFonts w:ascii="Consolas" w:cs="Consolas" w:eastAsia="Consolas" w:hAnsi="Consolas"/>
+        </w:rPr>
+        <w:br/>
+        <w:t xml:space="preserve">  id              INT UNSIGNED AUTO_INCREMENT PRIMARY KEY,</w:t>
+      </w:r>
+      <w:r>
+        <w:rPr>
+          <w:sz w:val="20"/>
+          <w:szCs w:val="20"/>
+          <w:rFonts w:ascii="Consolas" w:cs="Consolas" w:eastAsia="Consolas" w:hAnsi="Consolas"/>
+        </w:rPr>
+        <w:br/>
+        <w:t xml:space="preserve">  name            VARCHAR(120) NOT NULL,</w:t>
+      </w:r>
+      <w:r>
+        <w:rPr>
+          <w:sz w:val="20"/>
+          <w:szCs w:val="20"/>
+          <w:rFonts w:ascii="Consolas" w:cs="Consolas" w:eastAsia="Consolas" w:hAnsi="Consolas"/>
+        </w:rPr>
+        <w:br/>
+        <w:t xml:space="preserve">  rating          DECIMAL(2,1) NOT NULL DEFAULT 0.0,</w:t>
+      </w:r>
+      <w:r>
+        <w:rPr>
+          <w:sz w:val="20"/>
+          <w:szCs w:val="20"/>
+          <w:rFonts w:ascii="Consolas" w:cs="Consolas" w:eastAsia="Consolas" w:hAnsi="Consolas"/>
+        </w:rPr>
+        <w:br/>
+        <w:t xml:space="preserve">  city_id         INT UNSIGNED NOT NULL,</w:t>
+      </w:r>
+      <w:r>
+        <w:rPr>
+          <w:sz w:val="20"/>
+          <w:szCs w:val="20"/>
+          <w:rFonts w:ascii="Consolas" w:cs="Consolas" w:eastAsia="Consolas" w:hAnsi="Consolas"/>
+        </w:rPr>
+        <w:br/>
+        <w:t xml:space="preserve">  about           TEXT,</w:t>
+      </w:r>
+      <w:r>
+        <w:rPr>
+          <w:sz w:val="20"/>
+          <w:szCs w:val="20"/>
+          <w:rFonts w:ascii="Consolas" w:cs="Consolas" w:eastAsia="Consolas" w:hAnsi="Consolas"/>
+        </w:rPr>
+        <w:br/>
+        <w:t xml:space="preserve">  email           VARCHAR(180) NOT NULL,</w:t>
+      </w:r>
+      <w:r>
+        <w:rPr>
+          <w:sz w:val="20"/>
+          <w:szCs w:val="20"/>
+          <w:rFonts w:ascii="Consolas" w:cs="Consolas" w:eastAsia="Consolas" w:hAnsi="Consolas"/>
+        </w:rPr>
+        <w:br/>
+        <w:t xml:space="preserve">  website         VARCHAR(255),</w:t>
+      </w:r>
+      <w:r>
+        <w:rPr>
+          <w:sz w:val="20"/>
+          <w:szCs w:val="20"/>
+          <w:rFonts w:ascii="Consolas" w:cs="Consolas" w:eastAsia="Consolas" w:hAnsi="Consolas"/>
+        </w:rPr>
+        <w:br/>
+        <w:t xml:space="preserve">  image_url       VARCHAR(255),</w:t>
+      </w:r>
+      <w:r>
+        <w:rPr>
+          <w:sz w:val="20"/>
+          <w:szCs w:val="20"/>
+          <w:rFonts w:ascii="Consolas" w:cs="Consolas" w:eastAsia="Consolas" w:hAnsi="Consolas"/>
+        </w:rPr>
+        <w:br/>
+        <w:t xml:space="preserve">  specialty_id    INT UNSIGNED NOT NULL,</w:t>
+      </w:r>
+      <w:r>
+        <w:rPr>
+          <w:sz w:val="20"/>
+          <w:szCs w:val="20"/>
+          <w:rFonts w:ascii="Consolas" w:cs="Consolas" w:eastAsia="Consolas" w:hAnsi="Consolas"/>
+        </w:rPr>
+        <w:br/>
+        <w:t xml:space="preserve">  is_top_of_month BOOLEAN NOT NULL DEFAULT FALSE,</w:t>
+      </w:r>
+      <w:r>
+        <w:rPr>
+          <w:sz w:val="20"/>
+          <w:szCs w:val="20"/>
+          <w:rFonts w:ascii="Consolas" w:cs="Consolas" w:eastAsia="Consolas" w:hAnsi="Consolas"/>
+        </w:rPr>
+        <w:br/>
+        <w:t xml:space="preserve">  created_at      DATETIME NOT NULL DEFAULT CURRENT_TIMESTAMP,</w:t>
+      </w:r>
+      <w:r>
+        <w:rPr>
+          <w:sz w:val="20"/>
+          <w:szCs w:val="20"/>
+          <w:rFonts w:ascii="Consolas" w:cs="Consolas" w:eastAsia="Consolas" w:hAnsi="Consolas"/>
+        </w:rPr>
+        <w:br/>
+        <w:t xml:space="preserve">  updated_at      DATETIME NOT NULL DEFAULT CURRENT_TIMESTAMP</w:t>
+      </w:r>
+      <w:r>
+        <w:rPr>
+          <w:sz w:val="20"/>
+          <w:szCs w:val="20"/>
+          <w:rFonts w:ascii="Consolas" w:cs="Consolas" w:eastAsia="Consolas" w:hAnsi="Consolas"/>
+        </w:rPr>
+        <w:br/>
+        <w:t xml:space="preserve">                          ON UPDATE CURRENT_TIMESTAMP,</w:t>
+      </w:r>
+      <w:r>
+        <w:rPr>
+          <w:sz w:val="20"/>
+          <w:szCs w:val="20"/>
+          <w:rFonts w:ascii="Consolas" w:cs="Consolas" w:eastAsia="Consolas" w:hAnsi="Consolas"/>
+        </w:rPr>
+        <w:br/>
+        <w:t xml:space="preserve">  CONSTRAINT chk_rating CHECK (rating BETWEEN 0 AND 5),</w:t>
+      </w:r>
+      <w:r>
+        <w:rPr>
+          <w:sz w:val="20"/>
+          <w:szCs w:val="20"/>
+          <w:rFonts w:ascii="Consolas" w:cs="Consolas" w:eastAsia="Consolas" w:hAnsi="Consolas"/>
+        </w:rPr>
+        <w:br/>
+        <w:t xml:space="preserve">  CONSTRAINT fk_artisan_specialty</w:t>
+      </w:r>
+      <w:r>
+        <w:rPr>
+          <w:sz w:val="20"/>
+          <w:szCs w:val="20"/>
+          <w:rFonts w:ascii="Consolas" w:cs="Consolas" w:eastAsia="Consolas" w:hAnsi="Consolas"/>
+        </w:rPr>
+        <w:br/>
+        <w:t xml:space="preserve">    FOREIGN KEY (specialty_id) REFERENCES specialties(id)</w:t>
+      </w:r>
+      <w:r>
+        <w:rPr>
+          <w:sz w:val="20"/>
+          <w:szCs w:val="20"/>
+          <w:rFonts w:ascii="Consolas" w:cs="Consolas" w:eastAsia="Consolas" w:hAnsi="Consolas"/>
+        </w:rPr>
+        <w:br/>
+        <w:t xml:space="preserve">    ON DELETE RESTRICT ON UPDATE CASCADE,</w:t>
+      </w:r>
+      <w:r>
+        <w:rPr>
+          <w:sz w:val="20"/>
+          <w:szCs w:val="20"/>
+          <w:rFonts w:ascii="Consolas" w:cs="Consolas" w:eastAsia="Consolas" w:hAnsi="Consolas"/>
+        </w:rPr>
+        <w:br/>
+        <w:t xml:space="preserve">  CONSTRAINT fk_artisan_city</w:t>
+      </w:r>
+      <w:r>
+        <w:rPr>
+          <w:sz w:val="20"/>
+          <w:szCs w:val="20"/>
+          <w:rFonts w:ascii="Consolas" w:cs="Consolas" w:eastAsia="Consolas" w:hAnsi="Consolas"/>
+        </w:rPr>
+        <w:br/>
+        <w:t xml:space="preserve">    FOREIGN KEY (city_id) REFERENCES cities(id)</w:t>
+      </w:r>
+      <w:r>
+        <w:rPr>
+          <w:sz w:val="20"/>
+          <w:szCs w:val="20"/>
+          <w:rFonts w:ascii="Consolas" w:cs="Consolas" w:eastAsia="Consolas" w:hAnsi="Consolas"/>
+        </w:rPr>
+        <w:br/>
+        <w:t xml:space="preserve">    ON DELETE RESTRICT ON UPDATE CASCADE</w:t>
+      </w:r>
+      <w:r>
+        <w:rPr>
+          <w:sz w:val="20"/>
+          <w:szCs w:val="20"/>
+          <w:rFonts w:ascii="Consolas" w:cs="Consolas" w:eastAsia="Consolas" w:hAnsi="Consolas"/>
+        </w:rPr>
+        <w:br/>
+        <w:t xml:space="preserve">) ENGINE=InnoDB CHARSET=utf8mb4 COLLATE=utf8mb4_unicode_ci;</w:t>
       </w:r>
     </w:p>
     <w:p>
@@ -2981,7 +3325,7 @@
           <w:b/>
           <w:bCs/>
         </w:rPr>
-        <w:t xml:space="preserve">3.6 Jeu d'essai</w:t>
+        <w:t xml:space="preserve">3.6 Jeu d'essai (données initiales)</w:t>
       </w:r>
     </w:p>
     <w:p>
@@ -3045,6 +3389,656 @@
         <w:t xml:space="preserve">17 artisans dont 3 mis en avant comme « artisans du mois ».</w:t>
       </w:r>
     </w:p>
+    <w:p>
+      <w:pPr>
+        <w:pStyle w:val="Heading2"/>
+        <w:spacing w:before="240" w:after="120"/>
+      </w:pPr>
+      <w:r>
+        <w:rPr>
+          <w:b/>
+          <w:bCs/>
+        </w:rPr>
+        <w:t xml:space="preserve">3.7 Données NoSQL : les avis clients (MongoDB)</w:t>
+      </w:r>
+    </w:p>
+    <w:p>
+      <w:pPr>
+        <w:spacing w:after="120"/>
+        <w:jc w:val="both"/>
+      </w:pPr>
+      <w:r>
+        <w:t xml:space="preserve">En complément de la base relationnelle, les avis déposés par les visiteurs sur la fiche d'un artisan sont stockés dans une base MongoDB, via l'ODM Mongoose. Ce choix répond à l'exigence du référentiel — manipuler des données à la fois SQL et NoSQL — et se justifie par la nature des avis : un schéma souple, appelé à évoluer (par exemple pour accueillir une réponse de l'artisan directement imbriquée dans l'avis), des données lues artisan par artisan sans jointure, et un volume amené à grandir. Les deux bases cohabitent : l'artisan reste en relationnel, ses avis en documentaire, le lien étant assuré par l'identifiant de l'artisan.</w:t>
+      </w:r>
+    </w:p>
+    <w:p>
+      <w:pPr>
+        <w:shd w:fill="F1F8FC" w:val="clear"/>
+        <w:spacing w:after="120"/>
+      </w:pPr>
+      <w:r>
+        <w:rPr>
+          <w:sz w:val="20"/>
+          <w:szCs w:val="20"/>
+          <w:rFonts w:ascii="Consolas" w:cs="Consolas" w:eastAsia="Consolas" w:hAnsi="Consolas"/>
+        </w:rPr>
+        <w:t xml:space="preserve">const reviewSchema = new mongoose.Schema({</w:t>
+      </w:r>
+      <w:r>
+        <w:rPr>
+          <w:sz w:val="20"/>
+          <w:szCs w:val="20"/>
+          <w:rFonts w:ascii="Consolas" w:cs="Consolas" w:eastAsia="Consolas" w:hAnsi="Consolas"/>
+        </w:rPr>
+        <w:br/>
+        <w:t xml:space="preserve">  artisanId:  { type: Number, required: true, index: true },</w:t>
+      </w:r>
+      <w:r>
+        <w:rPr>
+          <w:sz w:val="20"/>
+          <w:szCs w:val="20"/>
+          <w:rFonts w:ascii="Consolas" w:cs="Consolas" w:eastAsia="Consolas" w:hAnsi="Consolas"/>
+        </w:rPr>
+        <w:br/>
+        <w:t xml:space="preserve">  authorName: { type: String, required: true, minlength: 2, maxlength: 120 },</w:t>
+      </w:r>
+      <w:r>
+        <w:rPr>
+          <w:sz w:val="20"/>
+          <w:szCs w:val="20"/>
+          <w:rFonts w:ascii="Consolas" w:cs="Consolas" w:eastAsia="Consolas" w:hAnsi="Consolas"/>
+        </w:rPr>
+        <w:br/>
+        <w:t xml:space="preserve">  rating:     { type: Number, required: true, min: 1, max: 5 },</w:t>
+      </w:r>
+      <w:r>
+        <w:rPr>
+          <w:sz w:val="20"/>
+          <w:szCs w:val="20"/>
+          <w:rFonts w:ascii="Consolas" w:cs="Consolas" w:eastAsia="Consolas" w:hAnsi="Consolas"/>
+        </w:rPr>
+        <w:br/>
+        <w:t xml:space="preserve">  comment:    { type: String, required: true, minlength: 10, maxlength: 2000 },</w:t>
+      </w:r>
+      <w:r>
+        <w:rPr>
+          <w:sz w:val="20"/>
+          <w:szCs w:val="20"/>
+          <w:rFonts w:ascii="Consolas" w:cs="Consolas" w:eastAsia="Consolas" w:hAnsi="Consolas"/>
+        </w:rPr>
+        <w:br/>
+        <w:t xml:space="preserve">  reply: { message: String, repliedAt: Date }, // reponse eventuelle de l'artisan</w:t>
+      </w:r>
+      <w:r>
+        <w:rPr>
+          <w:sz w:val="20"/>
+          <w:szCs w:val="20"/>
+          <w:rFonts w:ascii="Consolas" w:cs="Consolas" w:eastAsia="Consolas" w:hAnsi="Consolas"/>
+        </w:rPr>
+        <w:br/>
+        <w:t xml:space="preserve">}, { timestamps: true });</w:t>
+      </w:r>
+    </w:p>
+    <w:p>
+      <w:pPr>
+        <w:spacing w:after="120"/>
+        <w:jc w:val="both"/>
+      </w:pPr>
+      <w:r>
+        <w:t xml:space="preserve">La connexion à MongoDB est volontairement non bloquante : si la base NoSQL est momentanément indisponible, l'API relationnelle continue de fonctionner et les routes d'avis renvoient un code 503 explicite.</w:t>
+      </w:r>
+    </w:p>
+    <w:p>
+      <w:pPr>
+        <w:pStyle w:val="Heading2"/>
+        <w:spacing w:before="240" w:after="120"/>
+      </w:pPr>
+      <w:r>
+        <w:rPr>
+          <w:b/>
+          <w:bCs/>
+        </w:rPr>
+        <w:t xml:space="preserve">3.8 Composants d'accès aux données (SQL et NoSQL)</w:t>
+      </w:r>
+    </w:p>
+    <w:p>
+      <w:pPr>
+        <w:spacing w:after="120"/>
+        <w:jc w:val="both"/>
+      </w:pPr>
+      <w:r>
+        <w:t xml:space="preserve">L'accès aux données est isolé dans une couche de services, séparée des contrôleurs. Côté relationnel, les services s'appuient sur Sequelize, qui génère des requêtes paramétrées. Côté documentaire, un service dédié interroge MongoDB. Les deux exposent le même type d'interface aux contrôleurs, ce qui garde le code homogène malgré les deux technologies de stockage.</w:t>
+      </w:r>
+    </w:p>
+    <w:p>
+      <w:pPr>
+        <w:shd w:fill="F1F8FC" w:val="clear"/>
+        <w:spacing w:after="120"/>
+      </w:pPr>
+      <w:r>
+        <w:rPr>
+          <w:sz w:val="20"/>
+          <w:szCs w:val="20"/>
+          <w:rFonts w:ascii="Consolas" w:cs="Consolas" w:eastAsia="Consolas" w:hAnsi="Consolas"/>
+        </w:rPr>
+        <w:t xml:space="preserve">// Acces SQL (Sequelize) - liste filtree des artisans</w:t>
+      </w:r>
+      <w:r>
+        <w:rPr>
+          <w:sz w:val="20"/>
+          <w:szCs w:val="20"/>
+          <w:rFonts w:ascii="Consolas" w:cs="Consolas" w:eastAsia="Consolas" w:hAnsi="Consolas"/>
+        </w:rPr>
+        <w:br/>
+        <w:t xml:space="preserve">const results = await Artisan.findAll({</w:t>
+      </w:r>
+      <w:r>
+        <w:rPr>
+          <w:sz w:val="20"/>
+          <w:szCs w:val="20"/>
+          <w:rFonts w:ascii="Consolas" w:cs="Consolas" w:eastAsia="Consolas" w:hAnsi="Consolas"/>
+        </w:rPr>
+        <w:br/>
+        <w:t xml:space="preserve">  where,</w:t>
+      </w:r>
+      <w:r>
+        <w:rPr>
+          <w:sz w:val="20"/>
+          <w:szCs w:val="20"/>
+          <w:rFonts w:ascii="Consolas" w:cs="Consolas" w:eastAsia="Consolas" w:hAnsi="Consolas"/>
+        </w:rPr>
+        <w:br/>
+        <w:t xml:space="preserve">  include: fullInclude,</w:t>
+      </w:r>
+      <w:r>
+        <w:rPr>
+          <w:sz w:val="20"/>
+          <w:szCs w:val="20"/>
+          <w:rFonts w:ascii="Consolas" w:cs="Consolas" w:eastAsia="Consolas" w:hAnsi="Consolas"/>
+        </w:rPr>
+        <w:br/>
+        <w:t xml:space="preserve">  order: [['rating', 'DESC'], ['name', 'ASC']],</w:t>
+      </w:r>
+      <w:r>
+        <w:rPr>
+          <w:sz w:val="20"/>
+          <w:szCs w:val="20"/>
+          <w:rFonts w:ascii="Consolas" w:cs="Consolas" w:eastAsia="Consolas" w:hAnsi="Consolas"/>
+        </w:rPr>
+        <w:br/>
+        <w:t xml:space="preserve">});</w:t>
+      </w:r>
+    </w:p>
+    <w:p>
+      <w:pPr>
+        <w:shd w:fill="F1F8FC" w:val="clear"/>
+        <w:spacing w:after="120"/>
+      </w:pPr>
+      <w:r>
+        <w:rPr>
+          <w:sz w:val="20"/>
+          <w:szCs w:val="20"/>
+          <w:rFonts w:ascii="Consolas" w:cs="Consolas" w:eastAsia="Consolas" w:hAnsi="Consolas"/>
+        </w:rPr>
+        <w:t xml:space="preserve">// Acces NoSQL (Mongoose) - avis d'un artisan + moyenne par agregation</w:t>
+      </w:r>
+      <w:r>
+        <w:rPr>
+          <w:sz w:val="20"/>
+          <w:szCs w:val="20"/>
+          <w:rFonts w:ascii="Consolas" w:cs="Consolas" w:eastAsia="Consolas" w:hAnsi="Consolas"/>
+        </w:rPr>
+        <w:br/>
+        <w:t xml:space="preserve">const items = await Review.find({ artisanId }).sort({ createdAt: -1 }).lean();</w:t>
+      </w:r>
+      <w:r>
+        <w:rPr>
+          <w:sz w:val="20"/>
+          <w:szCs w:val="20"/>
+          <w:rFonts w:ascii="Consolas" w:cs="Consolas" w:eastAsia="Consolas" w:hAnsi="Consolas"/>
+        </w:rPr>
+        <w:br/>
+        <w:t xml:space="preserve">const [stats] = await Review.aggregate([</w:t>
+      </w:r>
+      <w:r>
+        <w:rPr>
+          <w:sz w:val="20"/>
+          <w:szCs w:val="20"/>
+          <w:rFonts w:ascii="Consolas" w:cs="Consolas" w:eastAsia="Consolas" w:hAnsi="Consolas"/>
+        </w:rPr>
+        <w:br/>
+        <w:t xml:space="preserve">  { $match: { artisanId } },</w:t>
+      </w:r>
+      <w:r>
+        <w:rPr>
+          <w:sz w:val="20"/>
+          <w:szCs w:val="20"/>
+          <w:rFonts w:ascii="Consolas" w:cs="Consolas" w:eastAsia="Consolas" w:hAnsi="Consolas"/>
+        </w:rPr>
+        <w:br/>
+        <w:t xml:space="preserve">  { $group: { _id: '$artisanId', average: { $avg: '$rating' }, count: { $sum: 1 } } },</w:t>
+      </w:r>
+      <w:r>
+        <w:rPr>
+          <w:sz w:val="20"/>
+          <w:szCs w:val="20"/>
+          <w:rFonts w:ascii="Consolas" w:cs="Consolas" w:eastAsia="Consolas" w:hAnsi="Consolas"/>
+        </w:rPr>
+        <w:br/>
+        <w:t xml:space="preserve">]);</w:t>
+      </w:r>
+    </w:p>
+    <w:p>
+      <w:pPr>
+        <w:pStyle w:val="Heading2"/>
+        <w:spacing w:before="240" w:after="120"/>
+      </w:pPr>
+      <w:r>
+        <w:rPr>
+          <w:b/>
+          <w:bCs/>
+        </w:rPr>
+        <w:t xml:space="preserve">3.9 Composants métier côté serveur</w:t>
+      </w:r>
+    </w:p>
+    <w:p>
+      <w:pPr>
+        <w:spacing w:after="120"/>
+        <w:jc w:val="both"/>
+      </w:pPr>
+      <w:r>
+        <w:t xml:space="preserve">La logique métier est portée par les services, jamais par les contrôleurs, qui se contentent de lire la requête et de mettre en forme la réponse. La création d'un avis illustre la collaboration des deux bases : le service vérifie d'abord, côté relationnel, que l'artisan existe, avant d'enregistrer l'avis côté MongoDB.</w:t>
+      </w:r>
+    </w:p>
+    <w:p>
+      <w:pPr>
+        <w:shd w:fill="F1F8FC" w:val="clear"/>
+        <w:spacing w:after="120"/>
+      </w:pPr>
+      <w:r>
+        <w:rPr>
+          <w:sz w:val="20"/>
+          <w:szCs w:val="20"/>
+          <w:rFonts w:ascii="Consolas" w:cs="Consolas" w:eastAsia="Consolas" w:hAnsi="Consolas"/>
+        </w:rPr>
+        <w:t xml:space="preserve">async function createReview(artisanId, { authorName, rating, comment }) {</w:t>
+      </w:r>
+      <w:r>
+        <w:rPr>
+          <w:sz w:val="20"/>
+          <w:szCs w:val="20"/>
+          <w:rFonts w:ascii="Consolas" w:cs="Consolas" w:eastAsia="Consolas" w:hAnsi="Consolas"/>
+        </w:rPr>
+        <w:br/>
+        <w:t xml:space="preserve">  const artisan = await Artisan.findByPk(artisanId);   // verification cote SQL</w:t>
+      </w:r>
+      <w:r>
+        <w:rPr>
+          <w:sz w:val="20"/>
+          <w:szCs w:val="20"/>
+          <w:rFonts w:ascii="Consolas" w:cs="Consolas" w:eastAsia="Consolas" w:hAnsi="Consolas"/>
+        </w:rPr>
+        <w:br/>
+        <w:t xml:space="preserve">  if (!artisan) return { notFound: true };</w:t>
+      </w:r>
+      <w:r>
+        <w:rPr>
+          <w:sz w:val="20"/>
+          <w:szCs w:val="20"/>
+          <w:rFonts w:ascii="Consolas" w:cs="Consolas" w:eastAsia="Consolas" w:hAnsi="Consolas"/>
+        </w:rPr>
+        <w:br/>
+        <w:t xml:space="preserve">  const review = await Review.create({ artisanId, authorName, rating, comment }); // ecriture NoSQL</w:t>
+      </w:r>
+      <w:r>
+        <w:rPr>
+          <w:sz w:val="20"/>
+          <w:szCs w:val="20"/>
+          <w:rFonts w:ascii="Consolas" w:cs="Consolas" w:eastAsia="Consolas" w:hAnsi="Consolas"/>
+        </w:rPr>
+        <w:br/>
+        <w:t xml:space="preserve">  return { review };</w:t>
+      </w:r>
+      <w:r>
+        <w:rPr>
+          <w:sz w:val="20"/>
+          <w:szCs w:val="20"/>
+          <w:rFonts w:ascii="Consolas" w:cs="Consolas" w:eastAsia="Consolas" w:hAnsi="Consolas"/>
+        </w:rPr>
+        <w:br/>
+        <w:t xml:space="preserve">}</w:t>
+      </w:r>
+    </w:p>
+    <w:p>
+      <w:pPr>
+        <w:pStyle w:val="Heading2"/>
+        <w:spacing w:before="240" w:after="120"/>
+      </w:pPr>
+      <w:r>
+        <w:rPr>
+          <w:b/>
+          <w:bCs/>
+        </w:rPr>
+        <w:t xml:space="preserve">3.10 Jeu d'essai de la fonctionnalité la plus représentative</w:t>
+      </w:r>
+    </w:p>
+    <w:p>
+      <w:pPr>
+        <w:spacing w:after="120"/>
+        <w:jc w:val="both"/>
+      </w:pPr>
+      <w:r>
+        <w:t xml:space="preserve">La fonctionnalité retenue est le dépôt d'un avis sur la fiche d'un artisan, suivi de sa relecture. Elle est représentative car elle mobilise à la fois le front-end (formulaire React), le back-end (validation, logique métier) et les deux bases de données : lecture de l'artisan en SQL, écriture puis lecture de l'avis en NoSQL.</w:t>
+      </w:r>
+    </w:p>
+    <w:tbl>
+      <w:tblPr>
+        <w:tblW w:type="dxa" w:w="9360"/>
+        <w:tblBorders>
+          <w:top w:val="single" w:color="auto" w:sz="4"/>
+          <w:left w:val="single" w:color="auto" w:sz="4"/>
+          <w:bottom w:val="single" w:color="auto" w:sz="4"/>
+          <w:right w:val="single" w:color="auto" w:sz="4"/>
+          <w:insideH w:val="single" w:color="auto" w:sz="4"/>
+          <w:insideV w:val="single" w:color="auto" w:sz="4"/>
+        </w:tblBorders>
+      </w:tblPr>
+      <w:tblGrid>
+        <w:gridCol w:w="2400"/>
+        <w:gridCol w:w="6960"/>
+      </w:tblGrid>
+      <w:tr>
+        <w:trPr>
+          <w:tblHeader/>
+        </w:trPr>
+        <w:tc>
+          <w:tcPr>
+            <w:tcW w:type="dxa" w:w="2400"/>
+            <w:tcBorders>
+              <w:top w:val="single" w:color="D0D7DE" w:sz="4"/>
+              <w:left w:val="single" w:color="D0D7DE" w:sz="4"/>
+              <w:bottom w:val="single" w:color="D0D7DE" w:sz="4"/>
+              <w:right w:val="single" w:color="D0D7DE" w:sz="4"/>
+            </w:tcBorders>
+            <w:shd w:fill="0074C7" w:val="clear"/>
+            <w:tcMar>
+              <w:top w:type="dxa" w:w="80"/>
+              <w:left w:type="dxa" w:w="120"/>
+              <w:bottom w:type="dxa" w:w="80"/>
+              <w:right w:type="dxa" w:w="120"/>
+            </w:tcMar>
+          </w:tcPr>
+          <w:p>
+            <w:r>
+              <w:rPr>
+                <w:b/>
+                <w:bCs/>
+                <w:color w:val="FFFFFF"/>
+              </w:rPr>
+              <w:t xml:space="preserve">Rubrique</w:t>
+            </w:r>
+          </w:p>
+        </w:tc>
+        <w:tc>
+          <w:tcPr>
+            <w:tcW w:type="dxa" w:w="6960"/>
+            <w:tcBorders>
+              <w:top w:val="single" w:color="D0D7DE" w:sz="4"/>
+              <w:left w:val="single" w:color="D0D7DE" w:sz="4"/>
+              <w:bottom w:val="single" w:color="D0D7DE" w:sz="4"/>
+              <w:right w:val="single" w:color="D0D7DE" w:sz="4"/>
+            </w:tcBorders>
+            <w:shd w:fill="0074C7" w:val="clear"/>
+            <w:tcMar>
+              <w:top w:type="dxa" w:w="80"/>
+              <w:left w:type="dxa" w:w="120"/>
+              <w:bottom w:type="dxa" w:w="80"/>
+              <w:right w:type="dxa" w:w="120"/>
+            </w:tcMar>
+          </w:tcPr>
+          <w:p>
+            <w:r>
+              <w:rPr>
+                <w:b/>
+                <w:bCs/>
+                <w:color w:val="FFFFFF"/>
+              </w:rPr>
+              <w:t xml:space="preserve">Détail</w:t>
+            </w:r>
+          </w:p>
+        </w:tc>
+      </w:tr>
+      <w:tr>
+        <w:tc>
+          <w:tcPr>
+            <w:tcW w:type="dxa" w:w="2400"/>
+            <w:tcBorders>
+              <w:top w:val="single" w:color="D0D7DE" w:sz="4"/>
+              <w:left w:val="single" w:color="D0D7DE" w:sz="4"/>
+              <w:bottom w:val="single" w:color="D0D7DE" w:sz="4"/>
+              <w:right w:val="single" w:color="D0D7DE" w:sz="4"/>
+            </w:tcBorders>
+            <w:tcMar>
+              <w:top w:type="dxa" w:w="80"/>
+              <w:left w:type="dxa" w:w="120"/>
+              <w:bottom w:type="dxa" w:w="80"/>
+              <w:right w:type="dxa" w:w="120"/>
+            </w:tcMar>
+          </w:tcPr>
+          <w:p>
+            <w:r>
+              <w:t xml:space="preserve">Objectif</w:t>
+            </w:r>
+          </w:p>
+        </w:tc>
+        <w:tc>
+          <w:tcPr>
+            <w:tcW w:type="dxa" w:w="6960"/>
+            <w:tcBorders>
+              <w:top w:val="single" w:color="D0D7DE" w:sz="4"/>
+              <w:left w:val="single" w:color="D0D7DE" w:sz="4"/>
+              <w:bottom w:val="single" w:color="D0D7DE" w:sz="4"/>
+              <w:right w:val="single" w:color="D0D7DE" w:sz="4"/>
+            </w:tcBorders>
+            <w:tcMar>
+              <w:top w:type="dxa" w:w="80"/>
+              <w:left w:type="dxa" w:w="120"/>
+              <w:bottom w:type="dxa" w:w="80"/>
+              <w:right w:type="dxa" w:w="120"/>
+            </w:tcMar>
+          </w:tcPr>
+          <w:p>
+            <w:r>
+              <w:t xml:space="preserve">Vérifier qu'un avis valide est bien enregistré côté MongoDB et que la note moyenne de l'artisan est recalculée.</w:t>
+            </w:r>
+          </w:p>
+        </w:tc>
+      </w:tr>
+      <w:tr>
+        <w:tc>
+          <w:tcPr>
+            <w:tcW w:type="dxa" w:w="2400"/>
+            <w:tcBorders>
+              <w:top w:val="single" w:color="D0D7DE" w:sz="4"/>
+              <w:left w:val="single" w:color="D0D7DE" w:sz="4"/>
+              <w:bottom w:val="single" w:color="D0D7DE" w:sz="4"/>
+              <w:right w:val="single" w:color="D0D7DE" w:sz="4"/>
+            </w:tcBorders>
+            <w:tcMar>
+              <w:top w:type="dxa" w:w="80"/>
+              <w:left w:type="dxa" w:w="120"/>
+              <w:bottom w:type="dxa" w:w="80"/>
+              <w:right w:type="dxa" w:w="120"/>
+            </w:tcMar>
+          </w:tcPr>
+          <w:p>
+            <w:r>
+              <w:t xml:space="preserve">Données en entrée</w:t>
+            </w:r>
+          </w:p>
+        </w:tc>
+        <w:tc>
+          <w:tcPr>
+            <w:tcW w:type="dxa" w:w="6960"/>
+            <w:tcBorders>
+              <w:top w:val="single" w:color="D0D7DE" w:sz="4"/>
+              <w:left w:val="single" w:color="D0D7DE" w:sz="4"/>
+              <w:bottom w:val="single" w:color="D0D7DE" w:sz="4"/>
+              <w:right w:val="single" w:color="D0D7DE" w:sz="4"/>
+            </w:tcBorders>
+            <w:tcMar>
+              <w:top w:type="dxa" w:w="80"/>
+              <w:left w:type="dxa" w:w="120"/>
+              <w:bottom w:type="dxa" w:w="80"/>
+              <w:right w:type="dxa" w:w="120"/>
+            </w:tcMar>
+          </w:tcPr>
+          <w:p>
+            <w:r>
+              <w:t xml:space="preserve">POST /api/artisans/1/reviews avec authorName « Claire », rating 5, comment « Travail impeccable et très soigné. »</w:t>
+            </w:r>
+          </w:p>
+        </w:tc>
+      </w:tr>
+      <w:tr>
+        <w:tc>
+          <w:tcPr>
+            <w:tcW w:type="dxa" w:w="2400"/>
+            <w:tcBorders>
+              <w:top w:val="single" w:color="D0D7DE" w:sz="4"/>
+              <w:left w:val="single" w:color="D0D7DE" w:sz="4"/>
+              <w:bottom w:val="single" w:color="D0D7DE" w:sz="4"/>
+              <w:right w:val="single" w:color="D0D7DE" w:sz="4"/>
+            </w:tcBorders>
+            <w:tcMar>
+              <w:top w:type="dxa" w:w="80"/>
+              <w:left w:type="dxa" w:w="120"/>
+              <w:bottom w:type="dxa" w:w="80"/>
+              <w:right w:type="dxa" w:w="120"/>
+            </w:tcMar>
+          </w:tcPr>
+          <w:p>
+            <w:r>
+              <w:t xml:space="preserve">Données attendues</w:t>
+            </w:r>
+          </w:p>
+        </w:tc>
+        <w:tc>
+          <w:tcPr>
+            <w:tcW w:type="dxa" w:w="6960"/>
+            <w:tcBorders>
+              <w:top w:val="single" w:color="D0D7DE" w:sz="4"/>
+              <w:left w:val="single" w:color="D0D7DE" w:sz="4"/>
+              <w:bottom w:val="single" w:color="D0D7DE" w:sz="4"/>
+              <w:right w:val="single" w:color="D0D7DE" w:sz="4"/>
+            </w:tcBorders>
+            <w:tcMar>
+              <w:top w:type="dxa" w:w="80"/>
+              <w:left w:type="dxa" w:w="120"/>
+              <w:bottom w:type="dxa" w:w="80"/>
+              <w:right w:type="dxa" w:w="120"/>
+            </w:tcMar>
+          </w:tcPr>
+          <w:p>
+            <w:r>
+              <w:t xml:space="preserve">Réponse 201 et avis créé ; un GET ultérieur renvoie l'avis et une note moyenne cohérente.</w:t>
+            </w:r>
+          </w:p>
+        </w:tc>
+      </w:tr>
+      <w:tr>
+        <w:tc>
+          <w:tcPr>
+            <w:tcW w:type="dxa" w:w="2400"/>
+            <w:tcBorders>
+              <w:top w:val="single" w:color="D0D7DE" w:sz="4"/>
+              <w:left w:val="single" w:color="D0D7DE" w:sz="4"/>
+              <w:bottom w:val="single" w:color="D0D7DE" w:sz="4"/>
+              <w:right w:val="single" w:color="D0D7DE" w:sz="4"/>
+            </w:tcBorders>
+            <w:tcMar>
+              <w:top w:type="dxa" w:w="80"/>
+              <w:left w:type="dxa" w:w="120"/>
+              <w:bottom w:type="dxa" w:w="80"/>
+              <w:right w:type="dxa" w:w="120"/>
+            </w:tcMar>
+          </w:tcPr>
+          <w:p>
+            <w:r>
+              <w:t xml:space="preserve">Données obtenues</w:t>
+            </w:r>
+          </w:p>
+        </w:tc>
+        <w:tc>
+          <w:tcPr>
+            <w:tcW w:type="dxa" w:w="6960"/>
+            <w:tcBorders>
+              <w:top w:val="single" w:color="D0D7DE" w:sz="4"/>
+              <w:left w:val="single" w:color="D0D7DE" w:sz="4"/>
+              <w:bottom w:val="single" w:color="D0D7DE" w:sz="4"/>
+              <w:right w:val="single" w:color="D0D7DE" w:sz="4"/>
+            </w:tcBorders>
+            <w:tcMar>
+              <w:top w:type="dxa" w:w="80"/>
+              <w:left w:type="dxa" w:w="120"/>
+              <w:bottom w:type="dxa" w:w="80"/>
+              <w:right w:type="dxa" w:w="120"/>
+            </w:tcMar>
+          </w:tcPr>
+          <w:p>
+            <w:r>
+              <w:t xml:space="preserve">Réponse 201 { success: true, review: {...} } ; le GET renvoie { count: 1, average: 5 }.</w:t>
+            </w:r>
+          </w:p>
+        </w:tc>
+      </w:tr>
+      <w:tr>
+        <w:tc>
+          <w:tcPr>
+            <w:tcW w:type="dxa" w:w="2400"/>
+            <w:tcBorders>
+              <w:top w:val="single" w:color="D0D7DE" w:sz="4"/>
+              <w:left w:val="single" w:color="D0D7DE" w:sz="4"/>
+              <w:bottom w:val="single" w:color="D0D7DE" w:sz="4"/>
+              <w:right w:val="single" w:color="D0D7DE" w:sz="4"/>
+            </w:tcBorders>
+            <w:tcMar>
+              <w:top w:type="dxa" w:w="80"/>
+              <w:left w:type="dxa" w:w="120"/>
+              <w:bottom w:type="dxa" w:w="80"/>
+              <w:right w:type="dxa" w:w="120"/>
+            </w:tcMar>
+          </w:tcPr>
+          <w:p>
+            <w:r>
+              <w:t xml:space="preserve">Analyse des écarts</w:t>
+            </w:r>
+          </w:p>
+        </w:tc>
+        <w:tc>
+          <w:tcPr>
+            <w:tcW w:type="dxa" w:w="6960"/>
+            <w:tcBorders>
+              <w:top w:val="single" w:color="D0D7DE" w:sz="4"/>
+              <w:left w:val="single" w:color="D0D7DE" w:sz="4"/>
+              <w:bottom w:val="single" w:color="D0D7DE" w:sz="4"/>
+              <w:right w:val="single" w:color="D0D7DE" w:sz="4"/>
+            </w:tcBorders>
+            <w:tcMar>
+              <w:top w:type="dxa" w:w="80"/>
+              <w:left w:type="dxa" w:w="120"/>
+              <w:bottom w:type="dxa" w:w="80"/>
+              <w:right w:type="dxa" w:w="120"/>
+            </w:tcMar>
+          </w:tcPr>
+          <w:p>
+            <w:r>
+              <w:t xml:space="preserve">Aucun écart : le résultat obtenu est conforme à l'attendu. Les cas limites ont aussi été vérifiés (saisie invalide vers 400, base NoSQL indisponible vers 503).</w:t>
+            </w:r>
+          </w:p>
+        </w:tc>
+      </w:tr>
+    </w:tbl>
     <w:p>
       <w:r>
         <w:br w:type="page"/>
@@ -5468,7 +6462,7 @@
       <w:r>
         <w:t xml:space="preserve">Le dépôt est public et contient l’intégralité du code, les scripts SQL et le README.md : </w:t>
       </w:r>
-      <w:hyperlink w:history="1" r:id="rIdcxlx6wzyu2bw6zam3neot">
+      <w:hyperlink w:history="1" r:id="rIdjpsqwrzqkjjlbq1hlk3nt">
         <w:r>
           <w:rPr>
             <w:rStyle w:val="Hyperlink"/>
@@ -5597,7 +6591,7 @@
       <w:r>
         <w:t xml:space="preserve">Frontend (Vercel) : </w:t>
       </w:r>
-      <w:hyperlink w:history="1" r:id="rId6jpkesvf55ecm_jvy79zl">
+      <w:hyperlink w:history="1" r:id="rIdscva9-rgfeesyuzuo051o">
         <w:r>
           <w:rPr>
             <w:rStyle w:val="Hyperlink"/>
@@ -5613,7 +6607,7 @@
       <w:r>
         <w:t xml:space="preserve">API (Render) : </w:t>
       </w:r>
-      <w:hyperlink w:history="1" r:id="rIdzzwdio8flitfm5oyrqvno">
+      <w:hyperlink w:history="1" r:id="rId0uqr5u5snytgdejjdrald">
         <w:r>
           <w:rPr>
             <w:rStyle w:val="Hyperlink"/>
@@ -5651,7 +6645,7 @@
       <w:r>
         <w:t xml:space="preserve">Fichier de maquettes (lecture publique) : </w:t>
       </w:r>
-      <w:hyperlink w:history="1" r:id="rIdjm_idpw3jewszylhepjxp">
+      <w:hyperlink w:history="1" r:id="rIdoqq2ljw3b7oxse9defpi1">
         <w:r>
           <w:rPr>
             <w:rStyle w:val="Hyperlink"/>

</xml_diff>

<commit_message>
Ajout des réalisations front-end (extraits de code, accessibilité, SEO), de l'éco-conception et de la section sur les tests automatisés
</commit_message>
<xml_diff>
--- a/docs/dossier-trouve-ton-artisan.docx
+++ b/docs/dossier-trouve-ton-artisan.docx
@@ -858,7 +858,7 @@
         <w:spacing w:after="80"/>
       </w:pPr>
       <w:r>
-        <w:t xml:space="preserve">Stack imposée : React.js + Bootstrap + Sass (front), Node.js + Express + Sequelize + MySQL/MariaDB (back).</w:t>
+        <w:t xml:space="preserve">Stack : React + Bootstrap + Sass (front) ; Node.js + Express + Sequelize avec MySQL/MariaDB, et MongoDB/Mongoose pour les avis (back).</w:t>
       </w:r>
     </w:p>
     <w:p>
@@ -980,7 +980,7 @@
           <w:b/>
           <w:bCs/>
         </w:rPr>
-        <w:t xml:space="preserve">2. Maquettes Figma</w:t>
+        <w:t xml:space="preserve">2. Réalisations front-end</w:t>
       </w:r>
     </w:p>
     <w:p>
@@ -1700,7 +1700,7 @@
         <w:jc w:val="both"/>
       </w:pPr>
       <w:r>
-        <w:t xml:space="preserve">Graphik étant une police payante, Inter a été utilisée pour les maquettes Figma. Le CSS du site bascule automatiquement sur Graphik dès que les fichiers de police seront fournis.</w:t>
+        <w:t xml:space="preserve">Graphik étant une police payante, Inter a servi de substitut pour les maquettes Figma. Côté site, la police Graphik n'est utilisée que si elle est déjà installée sur le poste ; sinon le rendu s'appuie sur des polices système, sans téléchargement de fichier de police distant.</w:t>
       </w:r>
     </w:p>
     <w:p>
@@ -1723,7 +1723,7 @@
       <w:r>
         <w:t xml:space="preserve">Maquettes complètes (consultation publique) : </w:t>
       </w:r>
-      <w:hyperlink w:history="1" r:id="rIdlo3uprb4qjqjrqb8balvk">
+      <w:hyperlink w:history="1" r:id="rIdlijnnaehexqs06fvngtzq">
         <w:r>
           <w:rPr>
             <w:rStyle w:val="Hyperlink"/>
@@ -2662,6 +2662,257 @@
       </w:r>
     </w:p>
     <w:p>
+      <w:pPr>
+        <w:pStyle w:val="Heading2"/>
+        <w:spacing w:before="240" w:after="120"/>
+      </w:pPr>
+      <w:r>
+        <w:rPr>
+          <w:b/>
+          <w:bCs/>
+        </w:rPr>
+        <w:t xml:space="preserve">2.5 Interfaces utilisateur statiques</w:t>
+      </w:r>
+    </w:p>
+    <w:p>
+      <w:pPr>
+        <w:spacing w:after="120"/>
+        <w:jc w:val="both"/>
+      </w:pPr>
+      <w:r>
+        <w:t xml:space="preserve">Les interfaces sont construites en composants React et mises en forme avec Bootstrap 5 et Sass. Le balisage reste sémantique et accessible. La section d'accueil illustre une structure statique simple : un en-tête de section, un titre principal et un bouton d'appel à l'action.</w:t>
+      </w:r>
+    </w:p>
+    <w:p>
+      <w:pPr>
+        <w:shd w:fill="F1F8FC" w:val="clear"/>
+        <w:spacing w:after="120"/>
+      </w:pPr>
+      <w:r>
+        <w:rPr>
+          <w:sz w:val="20"/>
+          <w:szCs w:val="20"/>
+          <w:rFonts w:ascii="Consolas" w:cs="Consolas" w:eastAsia="Consolas" w:hAnsi="Consolas"/>
+        </w:rPr>
+        <w:t xml:space="preserve">&lt;section className="hero"&gt;</w:t>
+      </w:r>
+      <w:r>
+        <w:rPr>
+          <w:sz w:val="20"/>
+          <w:szCs w:val="20"/>
+          <w:rFonts w:ascii="Consolas" w:cs="Consolas" w:eastAsia="Consolas" w:hAnsi="Consolas"/>
+        </w:rPr>
+        <w:br/>
+        <w:t xml:space="preserve">  &lt;div className="container"&gt;</w:t>
+      </w:r>
+      <w:r>
+        <w:rPr>
+          <w:sz w:val="20"/>
+          <w:szCs w:val="20"/>
+          <w:rFonts w:ascii="Consolas" w:cs="Consolas" w:eastAsia="Consolas" w:hAnsi="Consolas"/>
+        </w:rPr>
+        <w:br/>
+        <w:t xml:space="preserve">    &lt;h1&gt;Trouvez l'artisan qu'il vous faut, pres de chez vous.&lt;/h1&gt;</w:t>
+      </w:r>
+      <w:r>
+        <w:rPr>
+          <w:sz w:val="20"/>
+          <w:szCs w:val="20"/>
+          <w:rFonts w:ascii="Consolas" w:cs="Consolas" w:eastAsia="Consolas" w:hAnsi="Consolas"/>
+        </w:rPr>
+        <w:br/>
+        <w:t xml:space="preserve">    &lt;p className="lead"&gt;Batiment, alimentation, services, fabrication.&lt;/p&gt;</w:t>
+      </w:r>
+      <w:r>
+        <w:rPr>
+          <w:sz w:val="20"/>
+          <w:szCs w:val="20"/>
+          <w:rFonts w:ascii="Consolas" w:cs="Consolas" w:eastAsia="Consolas" w:hAnsi="Consolas"/>
+        </w:rPr>
+        <w:br/>
+        <w:t xml:space="preserve">    &lt;Link to="/artisans" className="btn btn-primary btn-lg"&gt;</w:t>
+      </w:r>
+      <w:r>
+        <w:rPr>
+          <w:sz w:val="20"/>
+          <w:szCs w:val="20"/>
+          <w:rFonts w:ascii="Consolas" w:cs="Consolas" w:eastAsia="Consolas" w:hAnsi="Consolas"/>
+        </w:rPr>
+        <w:br/>
+        <w:t xml:space="preserve">      Voir tous les artisans</w:t>
+      </w:r>
+      <w:r>
+        <w:rPr>
+          <w:sz w:val="20"/>
+          <w:szCs w:val="20"/>
+          <w:rFonts w:ascii="Consolas" w:cs="Consolas" w:eastAsia="Consolas" w:hAnsi="Consolas"/>
+        </w:rPr>
+        <w:br/>
+        <w:t xml:space="preserve">    &lt;/Link&gt;</w:t>
+      </w:r>
+      <w:r>
+        <w:rPr>
+          <w:sz w:val="20"/>
+          <w:szCs w:val="20"/>
+          <w:rFonts w:ascii="Consolas" w:cs="Consolas" w:eastAsia="Consolas" w:hAnsi="Consolas"/>
+        </w:rPr>
+        <w:br/>
+        <w:t xml:space="preserve">  &lt;/div&gt;</w:t>
+      </w:r>
+      <w:r>
+        <w:rPr>
+          <w:sz w:val="20"/>
+          <w:szCs w:val="20"/>
+          <w:rFonts w:ascii="Consolas" w:cs="Consolas" w:eastAsia="Consolas" w:hAnsi="Consolas"/>
+        </w:rPr>
+        <w:br/>
+        <w:t xml:space="preserve">&lt;/section&gt;</w:t>
+      </w:r>
+    </w:p>
+    <w:p>
+      <w:pPr>
+        <w:pStyle w:val="Heading2"/>
+        <w:spacing w:before="240" w:after="120"/>
+      </w:pPr>
+      <w:r>
+        <w:rPr>
+          <w:b/>
+          <w:bCs/>
+        </w:rPr>
+        <w:t xml:space="preserve">2.6 Partie dynamique des interfaces</w:t>
+      </w:r>
+    </w:p>
+    <w:p>
+      <w:pPr>
+        <w:spacing w:after="120"/>
+        <w:jc w:val="both"/>
+      </w:pPr>
+      <w:r>
+        <w:t xml:space="preserve">La partie dynamique repose sur les hooks de React. Le chargement des artisans, par exemple, se déclenche à l'affichage de la page et à chaque changement de filtre ; l'état local gère l'attente, les données reçues et les erreurs éventuelles.</w:t>
+      </w:r>
+    </w:p>
+    <w:p>
+      <w:pPr>
+        <w:shd w:fill="F1F8FC" w:val="clear"/>
+        <w:spacing w:after="120"/>
+      </w:pPr>
+      <w:r>
+        <w:rPr>
+          <w:sz w:val="20"/>
+          <w:szCs w:val="20"/>
+          <w:rFonts w:ascii="Consolas" w:cs="Consolas" w:eastAsia="Consolas" w:hAnsi="Consolas"/>
+        </w:rPr>
+        <w:t xml:space="preserve">useEffect(() =&gt; {</w:t>
+      </w:r>
+      <w:r>
+        <w:rPr>
+          <w:sz w:val="20"/>
+          <w:szCs w:val="20"/>
+          <w:rFonts w:ascii="Consolas" w:cs="Consolas" w:eastAsia="Consolas" w:hAnsi="Consolas"/>
+        </w:rPr>
+        <w:br/>
+        <w:t xml:space="preserve">  setLoading(true);</w:t>
+      </w:r>
+      <w:r>
+        <w:rPr>
+          <w:sz w:val="20"/>
+          <w:szCs w:val="20"/>
+          <w:rFonts w:ascii="Consolas" w:cs="Consolas" w:eastAsia="Consolas" w:hAnsi="Consolas"/>
+        </w:rPr>
+        <w:br/>
+        <w:t xml:space="preserve">  api.getArtisans({ category, q })</w:t>
+      </w:r>
+      <w:r>
+        <w:rPr>
+          <w:sz w:val="20"/>
+          <w:szCs w:val="20"/>
+          <w:rFonts w:ascii="Consolas" w:cs="Consolas" w:eastAsia="Consolas" w:hAnsi="Consolas"/>
+        </w:rPr>
+        <w:br/>
+        <w:t xml:space="preserve">    .then((data) =&gt; setArtisans(data))</w:t>
+      </w:r>
+      <w:r>
+        <w:rPr>
+          <w:sz w:val="20"/>
+          <w:szCs w:val="20"/>
+          <w:rFonts w:ascii="Consolas" w:cs="Consolas" w:eastAsia="Consolas" w:hAnsi="Consolas"/>
+        </w:rPr>
+        <w:br/>
+        <w:t xml:space="preserve">    .catch((err) =&gt; setError(err.message))</w:t>
+      </w:r>
+      <w:r>
+        <w:rPr>
+          <w:sz w:val="20"/>
+          <w:szCs w:val="20"/>
+          <w:rFonts w:ascii="Consolas" w:cs="Consolas" w:eastAsia="Consolas" w:hAnsi="Consolas"/>
+        </w:rPr>
+        <w:br/>
+        <w:t xml:space="preserve">    .finally(() =&gt; setLoading(false));</w:t>
+      </w:r>
+      <w:r>
+        <w:rPr>
+          <w:sz w:val="20"/>
+          <w:szCs w:val="20"/>
+          <w:rFonts w:ascii="Consolas" w:cs="Consolas" w:eastAsia="Consolas" w:hAnsi="Consolas"/>
+        </w:rPr>
+        <w:br/>
+        <w:t xml:space="preserve">}, [category, q]);</w:t>
+      </w:r>
+    </w:p>
+    <w:p>
+      <w:pPr>
+        <w:pStyle w:val="Heading2"/>
+        <w:spacing w:before="240" w:after="120"/>
+      </w:pPr>
+      <w:r>
+        <w:rPr>
+          <w:b/>
+          <w:bCs/>
+        </w:rPr>
+        <w:t xml:space="preserve">2.7 Accessibilité et référencement</w:t>
+      </w:r>
+    </w:p>
+    <w:p>
+      <w:pPr>
+        <w:spacing w:after="120"/>
+        <w:jc w:val="both"/>
+      </w:pPr>
+      <w:r>
+        <w:t xml:space="preserve">Le site vise la conformité WCAG 2.1 : balises sémantiques, lien d'évitement vers le contenu principal, attributs ARIA sur les éléments interactifs, focus visible et navigation au clavier. Le composant de notation expose aussi bien les étoiles que la valeur chiffrée, pour les lecteurs d'écran.</w:t>
+      </w:r>
+    </w:p>
+    <w:p>
+      <w:pPr>
+        <w:spacing w:after="120"/>
+        <w:jc w:val="both"/>
+      </w:pPr>
+      <w:r>
+        <w:t xml:space="preserve">Côté référencement, chaque page définit son titre et sa méta-description grâce aux métadonnées natives de React 19 (composant Seo), ce qui favorise le référencement et le partage sur les réseaux sociaux. Les URL restent propres et lisibles grâce à React Router.</w:t>
+      </w:r>
+    </w:p>
+    <w:p>
+      <w:pPr>
+        <w:pStyle w:val="Heading2"/>
+        <w:spacing w:before="240" w:after="120"/>
+      </w:pPr>
+      <w:r>
+        <w:rPr>
+          <w:b/>
+          <w:bCs/>
+        </w:rPr>
+        <w:t xml:space="preserve">2.8 Éco-conception</w:t>
+      </w:r>
+    </w:p>
+    <w:p>
+      <w:pPr>
+        <w:spacing w:after="120"/>
+        <w:jc w:val="both"/>
+      </w:pPr>
+      <w:r>
+        <w:t xml:space="preserve">Quelques principes d'éco-conception ont été pris en compte. Les images des artisans sont chargées en différé (lazy loading), ce qui évite de télécharger des visuels non affichés à l'écran. La typographie s'appuie sur des polices déjà présentes sur le poste, sans téléchargement de fichier de police distant. Côté serveur, l'API ne renvoie que les colonnes utiles (pas de SELECT *) et s'appuie sur une vue SQL qui pré-assemble les jointures, ce qui réduit le volume de données transférées. Enfin, le build de production (Vite) minifie et compresse les fichiers envoyés au navigateur, et les dépendances ont été limitées au nécessaire.</w:t>
+      </w:r>
+    </w:p>
+    <w:p>
       <w:r>
         <w:br w:type="page"/>
       </w:r>
@@ -4040,6 +4291,76 @@
       </w:tr>
     </w:tbl>
     <w:p>
+      <w:pPr>
+        <w:pStyle w:val="Heading2"/>
+        <w:spacing w:before="240" w:after="120"/>
+      </w:pPr>
+      <w:r>
+        <w:rPr>
+          <w:b/>
+          <w:bCs/>
+        </w:rPr>
+        <w:t xml:space="preserve">3.11 Tests automatisés</w:t>
+      </w:r>
+    </w:p>
+    <w:p>
+      <w:pPr>
+        <w:spacing w:after="120"/>
+        <w:jc w:val="both"/>
+      </w:pPr>
+      <w:r>
+        <w:t xml:space="preserve">Au-delà des tests de sécurité manuels (détaillés dans la veille), l'API est couverte par une suite de tests automatisés, exécutée avec Mocha, Chai et Supertest. La base relationnelle de test utilise SQLite en mémoire et la base NoSQL un serveur MongoDB éphémère : les tests sont ainsi rapides et isolés, sans toucher à aucune base réelle. La suite couvre les trois volets du projet.</w:t>
+      </w:r>
+    </w:p>
+    <w:p>
+      <w:pPr>
+        <w:pStyle w:val="ListParagraph"/>
+        <w:numPr>
+          <w:ilvl w:val="0"/>
+          <w:numId w:val="2"/>
+        </w:numPr>
+        <w:spacing w:after="80"/>
+      </w:pPr>
+      <w:r>
+        <w:t xml:space="preserve">Artisans (SQL) : liste, fiche détaillée, artisan introuvable, recherche sans résultat.</w:t>
+      </w:r>
+    </w:p>
+    <w:p>
+      <w:pPr>
+        <w:pStyle w:val="ListParagraph"/>
+        <w:numPr>
+          <w:ilvl w:val="0"/>
+          <w:numId w:val="2"/>
+        </w:numPr>
+        <w:spacing w:after="80"/>
+      </w:pPr>
+      <w:r>
+        <w:t xml:space="preserve">Avis (NoSQL) : liste vide au départ, dépôt d'un avis, recalcul de la note moyenne, artisan inexistant.</w:t>
+      </w:r>
+    </w:p>
+    <w:p>
+      <w:pPr>
+        <w:pStyle w:val="ListParagraph"/>
+        <w:numPr>
+          <w:ilvl w:val="0"/>
+          <w:numId w:val="2"/>
+        </w:numPr>
+        <w:spacing w:after="80"/>
+      </w:pPr>
+      <w:r>
+        <w:t xml:space="preserve">Sécurité : accès refusé sans clé d'API ou avec une mauvaise clé, validation des entrées, route de santé publique.</w:t>
+      </w:r>
+    </w:p>
+    <w:p>
+      <w:pPr>
+        <w:spacing w:after="120"/>
+        <w:jc w:val="both"/>
+      </w:pPr>
+      <w:r>
+        <w:t xml:space="preserve">La suite compte onze tests, tous au vert (commande npm test).</w:t>
+      </w:r>
+    </w:p>
+    <w:p>
       <w:r>
         <w:br w:type="page"/>
       </w:r>
@@ -6462,7 +6783,7 @@
       <w:r>
         <w:t xml:space="preserve">Le dépôt est public et contient l’intégralité du code, les scripts SQL et le README.md : </w:t>
       </w:r>
-      <w:hyperlink w:history="1" r:id="rIdjpsqwrzqkjjlbq1hlk3nt">
+      <w:hyperlink w:history="1" r:id="rIddy1e204hmbxpfconzga5q">
         <w:r>
           <w:rPr>
             <w:rStyle w:val="Hyperlink"/>
@@ -6591,7 +6912,7 @@
       <w:r>
         <w:t xml:space="preserve">Frontend (Vercel) : </w:t>
       </w:r>
-      <w:hyperlink w:history="1" r:id="rIdscva9-rgfeesyuzuo051o">
+      <w:hyperlink w:history="1" r:id="rIdvsk30t2dwjyoaw1cidaxc">
         <w:r>
           <w:rPr>
             <w:rStyle w:val="Hyperlink"/>
@@ -6607,7 +6928,7 @@
       <w:r>
         <w:t xml:space="preserve">API (Render) : </w:t>
       </w:r>
-      <w:hyperlink w:history="1" r:id="rId0uqr5u5snytgdejjdrald">
+      <w:hyperlink w:history="1" r:id="rIdkzwxlvflqpff2mm8nrvpd">
         <w:r>
           <w:rPr>
             <w:rStyle w:val="Hyperlink"/>
@@ -6645,7 +6966,7 @@
       <w:r>
         <w:t xml:space="preserve">Fichier de maquettes (lecture publique) : </w:t>
       </w:r>
-      <w:hyperlink w:history="1" r:id="rIdoqq2ljw3b7oxse9defpi1">
+      <w:hyperlink w:history="1" r:id="rIddmcysfjendv9rt4p5phz5">
         <w:r>
           <w:rPr>
             <w:rStyle w:val="Hyperlink"/>

</xml_diff>

<commit_message>
Corrections issues de la relecture : reformulations plus naturelles, jeu d'essai aligné sur les tests et étoffé (cas 400 et 503), ajout du RGAA, schéma physique NoSQL, mention RGPD sous le formulaire de contact et contraintes SQL exactes
</commit_message>
<xml_diff>
--- a/docs/dossier-trouve-ton-artisan.docx
+++ b/docs/dossier-trouve-ton-artisan.docx
@@ -706,7 +706,7 @@
         <w:jc w:val="both"/>
       </w:pPr>
       <w:r>
-        <w:t xml:space="preserve">Pour entretenir cet engouement, la région souhaite créer une plateforme web mettant directement en relation les particuliers et les artisans locaux. L’interlocuteur du projet se trouve dans les bureaux de Lyon.</w:t>
+        <w:t xml:space="preserve">Pour valoriser ce tissu artisanal, la région souhaite créer une plateforme web mettant directement en relation les particuliers et les artisans locaux. L’interlocuteur du projet se trouve dans les bureaux de Lyon.</w:t>
       </w:r>
     </w:p>
     <w:p>
@@ -1723,7 +1723,7 @@
       <w:r>
         <w:t xml:space="preserve">Maquettes complètes (consultation publique) : </w:t>
       </w:r>
-      <w:hyperlink w:history="1" r:id="rIdlijnnaehexqs06fvngtzq">
+      <w:hyperlink w:history="1" r:id="rIdemtfekpfnk_bw2pczv5gw">
         <w:r>
           <w:rPr>
             <w:rStyle w:val="Hyperlink"/>
@@ -2878,7 +2878,7 @@
         <w:jc w:val="both"/>
       </w:pPr>
       <w:r>
-        <w:t xml:space="preserve">Le site vise la conformité WCAG 2.1 : balises sémantiques, lien d'évitement vers le contenu principal, attributs ARIA sur les éléments interactifs, focus visible et navigation au clavier. Le composant de notation expose aussi bien les étoiles que la valeur chiffrée, pour les lecteurs d'écran.</w:t>
+        <w:t xml:space="preserve">Le site vise la conformité WCAG 2.1 et, dans sa déclinaison française, le RGAA (Référentiel Général d'Amélioration de l'Accessibilité), opposable aux organismes publics — ce qui est directement pertinent ici, le commanditaire étant une collectivité. Concrètement : balises sémantiques, lien d'évitement vers le contenu principal, libellés associés à chaque champ de formulaire, images décoratives neutralisées pour les lecteurs d'écran (alt vide ou aria-hidden), ordre de tabulation logique, focus visible et navigation entièrement au clavier. Le composant de notation expose aussi bien les étoiles que la valeur chiffrée. Les contrastes de la palette ont été vérifiés par rapport au seuil AA.</w:t>
       </w:r>
     </w:p>
     <w:p>
@@ -2887,7 +2887,7 @@
         <w:jc w:val="both"/>
       </w:pPr>
       <w:r>
-        <w:t xml:space="preserve">Côté référencement, chaque page définit son titre et sa méta-description grâce aux métadonnées natives de React 19 (composant Seo), ce qui favorise le référencement et le partage sur les réseaux sociaux. Les URL restent propres et lisibles grâce à React Router.</w:t>
+        <w:t xml:space="preserve">Côté référencement, chaque page définit son propre titre et sa méta-description grâce aux métadonnées natives de React 19 (composant Seo), ce qui améliore l'indexation par les moteurs de recherche et l'aperçu lors d'un partage sur les réseaux sociaux. Les URL restent propres et lisibles grâce à React Router.</w:t>
       </w:r>
     </w:p>
     <w:p>
@@ -2909,7 +2909,7 @@
         <w:jc w:val="both"/>
       </w:pPr>
       <w:r>
-        <w:t xml:space="preserve">Quelques principes d'éco-conception ont été pris en compte. Les images des artisans sont chargées en différé (lazy loading), ce qui évite de télécharger des visuels non affichés à l'écran. La typographie s'appuie sur des polices déjà présentes sur le poste, sans téléchargement de fichier de police distant. Côté serveur, l'API ne renvoie que les colonnes utiles (pas de SELECT *) et s'appuie sur une vue SQL qui pré-assemble les jointures, ce qui réduit le volume de données transférées. Enfin, le build de production (Vite) minifie et compresse les fichiers envoyés au navigateur, et les dépendances ont été limitées au nécessaire.</w:t>
+        <w:t xml:space="preserve">Quelques principes d'éco-conception ont été pris en compte. Les images des artisans sont chargées en différé (lazy loading), ce qui évite de télécharger des visuels non affichés à l'écran. La typographie s'appuie sur des polices déjà présentes sur le poste, sans téléchargement de fichier distant. Côté serveur, l'API ne renvoie que les colonnes utiles (pas de SELECT *) et s'appuie sur une vue SQL qui pré-assemble les jointures, ce qui réduit le volume de données transférées. Le build de production (Vite) minifie et compresse enfin les fichiers envoyés au navigateur.</w:t>
       </w:r>
     </w:p>
     <w:p>
@@ -3491,7 +3491,16 @@
           <w:rFonts w:ascii="Consolas" w:cs="Consolas" w:eastAsia="Consolas" w:hAnsi="Consolas"/>
         </w:rPr>
         <w:br/>
-        <w:t xml:space="preserve">  CONSTRAINT chk_rating CHECK (rating BETWEEN 0 AND 5),</w:t>
+        <w:t xml:space="preserve">  CONSTRAINT chk_artisan_rating CHECK (rating &gt;= 0.0 AND rating &lt;= 5.0),</w:t>
+      </w:r>
+      <w:r>
+        <w:rPr>
+          <w:sz w:val="20"/>
+          <w:szCs w:val="20"/>
+          <w:rFonts w:ascii="Consolas" w:cs="Consolas" w:eastAsia="Consolas" w:hAnsi="Consolas"/>
+        </w:rPr>
+        <w:br/>
+        <w:t xml:space="preserve">  CONSTRAINT chk_artisan_email  CHECK (email LIKE '%_@_%.__%'),</w:t>
       </w:r>
       <w:r>
         <w:rPr>
@@ -3659,7 +3668,7 @@
         <w:jc w:val="both"/>
       </w:pPr>
       <w:r>
-        <w:t xml:space="preserve">En complément de la base relationnelle, les avis déposés par les visiteurs sur la fiche d'un artisan sont stockés dans une base MongoDB, via l'ODM Mongoose. Ce choix répond à l'exigence du référentiel — manipuler des données à la fois SQL et NoSQL — et se justifie par la nature des avis : un schéma souple, appelé à évoluer (par exemple pour accueillir une réponse de l'artisan directement imbriquée dans l'avis), des données lues artisan par artisan sans jointure, et un volume amené à grandir. Les deux bases cohabitent : l'artisan reste en relationnel, ses avis en documentaire, le lien étant assuré par l'identifiant de l'artisan.</w:t>
+        <w:t xml:space="preserve">En complément de la base relationnelle, les avis déposés par les visiteurs sur la fiche d'un artisan sont stockés dans une base MongoDB, via l'ODM Mongoose. Ce choix répond à l'exigence du référentiel — manipuler des données à la fois SQL et NoSQL. Il se justifie aussi par la nature des avis. Leur schéma est souple et peut évoluer, par exemple pour accueillir une réponse de l'artisan imbriquée dans l'avis. Ils se lisent artisan par artisan, sans jointure, et leur volume est amené à grandir. Les deux bases cohabitent : l'artisan reste en relationnel, ses avis en documentaire, le lien étant assuré par l'identifiant de l'artisan.</w:t>
       </w:r>
     </w:p>
     <w:p>
@@ -3741,6 +3750,15 @@
     </w:p>
     <w:p>
       <w:pPr>
+        <w:spacing w:after="120"/>
+        <w:jc w:val="both"/>
+      </w:pPr>
+      <w:r>
+        <w:t xml:space="preserve">Côté schéma physique, la collection « reviews » est décrite par le modèle Mongoose (backend/src/models/Review.js), qui fait aussi office de validation : les types, les champs obligatoires et les bornes (note de 1 à 5, longueurs minimales et maximales) sont contrôlés à l'écriture. Un index sur le champ artisanId, déclaré dans le modèle, accélère la lecture des avis d'un artisan ; Mongoose le crée automatiquement au démarrage.</w:t>
+      </w:r>
+    </w:p>
+    <w:p>
+      <w:pPr>
         <w:pStyle w:val="Heading2"/>
         <w:spacing w:before="240" w:after="120"/>
       </w:pPr>
@@ -3979,7 +3997,16 @@
         <w:jc w:val="both"/>
       </w:pPr>
       <w:r>
-        <w:t xml:space="preserve">La fonctionnalité retenue est le dépôt d'un avis sur la fiche d'un artisan, suivi de sa relecture. Elle est représentative car elle mobilise à la fois le front-end (formulaire React), le back-end (validation, logique métier) et les deux bases de données : lecture de l'artisan en SQL, écriture puis lecture de l'avis en NoSQL.</w:t>
+        <w:t xml:space="preserve">La fonctionnalité retenue est le dépôt d'un avis sur la fiche d'un artisan, suivi de sa relecture. Elle a été choisie parce qu'elle traverse toute l'application : le formulaire React en front-end, la validation et la logique métier en back-end, puis les deux bases de données — lecture de l'artisan en SQL, écriture puis relecture de l'avis en NoSQL.</w:t>
+      </w:r>
+    </w:p>
+    <w:p>
+      <w:pPr>
+        <w:spacing w:after="120"/>
+        <w:jc w:val="both"/>
+      </w:pPr>
+      <w:r>
+        <w:t xml:space="preserve">L'objectif est de vérifier le parcours nominal (un avis bien enregistré et la note moyenne recalculée) ainsi que la robustesse de l'API face à deux cas limites.</w:t>
       </w:r>
     </w:p>
     <w:tbl>
@@ -3995,8 +4022,10 @@
         </w:tblBorders>
       </w:tblPr>
       <w:tblGrid>
+        <w:gridCol w:w="1700"/>
+        <w:gridCol w:w="3060"/>
         <w:gridCol w:w="2400"/>
-        <w:gridCol w:w="6960"/>
+        <w:gridCol w:w="2200"/>
       </w:tblGrid>
       <w:tr>
         <w:trPr>
@@ -4004,7 +4033,7 @@
         </w:trPr>
         <w:tc>
           <w:tcPr>
-            <w:tcW w:type="dxa" w:w="2400"/>
+            <w:tcW w:type="dxa" w:w="1700"/>
             <w:tcBorders>
               <w:top w:val="single" w:color="D0D7DE" w:sz="4"/>
               <w:left w:val="single" w:color="D0D7DE" w:sz="4"/>
@@ -4026,13 +4055,13 @@
                 <w:bCs/>
                 <w:color w:val="FFFFFF"/>
               </w:rPr>
-              <w:t xml:space="preserve">Rubrique</w:t>
-            </w:r>
-          </w:p>
-        </w:tc>
-        <w:tc>
-          <w:tcPr>
-            <w:tcW w:type="dxa" w:w="6960"/>
+              <w:t xml:space="preserve">Cas</w:t>
+            </w:r>
+          </w:p>
+        </w:tc>
+        <w:tc>
+          <w:tcPr>
+            <w:tcW w:type="dxa" w:w="3060"/>
             <w:tcBorders>
               <w:top w:val="single" w:color="D0D7DE" w:sz="4"/>
               <w:left w:val="single" w:color="D0D7DE" w:sz="4"/>
@@ -4054,7 +4083,63 @@
                 <w:bCs/>
                 <w:color w:val="FFFFFF"/>
               </w:rPr>
-              <w:t xml:space="preserve">Détail</w:t>
+              <w:t xml:space="preserve">Données en entrée</w:t>
+            </w:r>
+          </w:p>
+        </w:tc>
+        <w:tc>
+          <w:tcPr>
+            <w:tcW w:type="dxa" w:w="2400"/>
+            <w:tcBorders>
+              <w:top w:val="single" w:color="D0D7DE" w:sz="4"/>
+              <w:left w:val="single" w:color="D0D7DE" w:sz="4"/>
+              <w:bottom w:val="single" w:color="D0D7DE" w:sz="4"/>
+              <w:right w:val="single" w:color="D0D7DE" w:sz="4"/>
+            </w:tcBorders>
+            <w:shd w:fill="0074C7" w:val="clear"/>
+            <w:tcMar>
+              <w:top w:type="dxa" w:w="80"/>
+              <w:left w:type="dxa" w:w="120"/>
+              <w:bottom w:type="dxa" w:w="80"/>
+              <w:right w:type="dxa" w:w="120"/>
+            </w:tcMar>
+          </w:tcPr>
+          <w:p>
+            <w:r>
+              <w:rPr>
+                <w:b/>
+                <w:bCs/>
+                <w:color w:val="FFFFFF"/>
+              </w:rPr>
+              <w:t xml:space="preserve">Attendu</w:t>
+            </w:r>
+          </w:p>
+        </w:tc>
+        <w:tc>
+          <w:tcPr>
+            <w:tcW w:type="dxa" w:w="2200"/>
+            <w:tcBorders>
+              <w:top w:val="single" w:color="D0D7DE" w:sz="4"/>
+              <w:left w:val="single" w:color="D0D7DE" w:sz="4"/>
+              <w:bottom w:val="single" w:color="D0D7DE" w:sz="4"/>
+              <w:right w:val="single" w:color="D0D7DE" w:sz="4"/>
+            </w:tcBorders>
+            <w:shd w:fill="0074C7" w:val="clear"/>
+            <w:tcMar>
+              <w:top w:type="dxa" w:w="80"/>
+              <w:left w:type="dxa" w:w="120"/>
+              <w:bottom w:type="dxa" w:w="80"/>
+              <w:right w:type="dxa" w:w="120"/>
+            </w:tcMar>
+          </w:tcPr>
+          <w:p>
+            <w:r>
+              <w:rPr>
+                <w:b/>
+                <w:bCs/>
+                <w:color w:val="FFFFFF"/>
+              </w:rPr>
+              <w:t xml:space="preserve">Obtenu</w:t>
             </w:r>
           </w:p>
         </w:tc>
@@ -4062,6 +4147,50 @@
       <w:tr>
         <w:tc>
           <w:tcPr>
+            <w:tcW w:type="dxa" w:w="1700"/>
+            <w:tcBorders>
+              <w:top w:val="single" w:color="D0D7DE" w:sz="4"/>
+              <w:left w:val="single" w:color="D0D7DE" w:sz="4"/>
+              <w:bottom w:val="single" w:color="D0D7DE" w:sz="4"/>
+              <w:right w:val="single" w:color="D0D7DE" w:sz="4"/>
+            </w:tcBorders>
+            <w:tcMar>
+              <w:top w:type="dxa" w:w="80"/>
+              <w:left w:type="dxa" w:w="120"/>
+              <w:bottom w:type="dxa" w:w="80"/>
+              <w:right w:type="dxa" w:w="120"/>
+            </w:tcMar>
+          </w:tcPr>
+          <w:p>
+            <w:r>
+              <w:t xml:space="preserve">Nominal</w:t>
+            </w:r>
+          </w:p>
+        </w:tc>
+        <w:tc>
+          <w:tcPr>
+            <w:tcW w:type="dxa" w:w="3060"/>
+            <w:tcBorders>
+              <w:top w:val="single" w:color="D0D7DE" w:sz="4"/>
+              <w:left w:val="single" w:color="D0D7DE" w:sz="4"/>
+              <w:bottom w:val="single" w:color="D0D7DE" w:sz="4"/>
+              <w:right w:val="single" w:color="D0D7DE" w:sz="4"/>
+            </w:tcBorders>
+            <w:tcMar>
+              <w:top w:type="dxa" w:w="80"/>
+              <w:left w:type="dxa" w:w="120"/>
+              <w:bottom w:type="dxa" w:w="80"/>
+              <w:right w:type="dxa" w:w="120"/>
+            </w:tcMar>
+          </w:tcPr>
+          <w:p>
+            <w:r>
+              <w:t xml:space="preserve">Deux avis sur l'artisan 1 : Claire (5/5) puis Marc (3/5).</w:t>
+            </w:r>
+          </w:p>
+        </w:tc>
+        <w:tc>
+          <w:tcPr>
             <w:tcW w:type="dxa" w:w="2400"/>
             <w:tcBorders>
               <w:top w:val="single" w:color="D0D7DE" w:sz="4"/>
@@ -4078,29 +4207,29 @@
           </w:tcPr>
           <w:p>
             <w:r>
-              <w:t xml:space="preserve">Objectif</w:t>
-            </w:r>
-          </w:p>
-        </w:tc>
-        <w:tc>
-          <w:tcPr>
-            <w:tcW w:type="dxa" w:w="6960"/>
-            <w:tcBorders>
-              <w:top w:val="single" w:color="D0D7DE" w:sz="4"/>
-              <w:left w:val="single" w:color="D0D7DE" w:sz="4"/>
-              <w:bottom w:val="single" w:color="D0D7DE" w:sz="4"/>
-              <w:right w:val="single" w:color="D0D7DE" w:sz="4"/>
-            </w:tcBorders>
-            <w:tcMar>
-              <w:top w:type="dxa" w:w="80"/>
-              <w:left w:type="dxa" w:w="120"/>
-              <w:bottom w:type="dxa" w:w="80"/>
-              <w:right w:type="dxa" w:w="120"/>
-            </w:tcMar>
-          </w:tcPr>
-          <w:p>
-            <w:r>
-              <w:t xml:space="preserve">Vérifier qu'un avis valide est bien enregistré côté MongoDB et que la note moyenne de l'artisan est recalculée.</w:t>
+              <w:t xml:space="preserve">201 à chaque dépôt ; le GET renvoie count 2 et average 4.</w:t>
+            </w:r>
+          </w:p>
+        </w:tc>
+        <w:tc>
+          <w:tcPr>
+            <w:tcW w:type="dxa" w:w="2200"/>
+            <w:tcBorders>
+              <w:top w:val="single" w:color="D0D7DE" w:sz="4"/>
+              <w:left w:val="single" w:color="D0D7DE" w:sz="4"/>
+              <w:bottom w:val="single" w:color="D0D7DE" w:sz="4"/>
+              <w:right w:val="single" w:color="D0D7DE" w:sz="4"/>
+            </w:tcBorders>
+            <w:tcMar>
+              <w:top w:type="dxa" w:w="80"/>
+              <w:left w:type="dxa" w:w="120"/>
+              <w:bottom w:type="dxa" w:w="80"/>
+              <w:right w:type="dxa" w:w="120"/>
+            </w:tcMar>
+          </w:tcPr>
+          <w:p>
+            <w:r>
+              <w:t xml:space="preserve">Conforme (count 2, average 4).</w:t>
             </w:r>
           </w:p>
         </w:tc>
@@ -4108,6 +4237,50 @@
       <w:tr>
         <w:tc>
           <w:tcPr>
+            <w:tcW w:type="dxa" w:w="1700"/>
+            <w:tcBorders>
+              <w:top w:val="single" w:color="D0D7DE" w:sz="4"/>
+              <w:left w:val="single" w:color="D0D7DE" w:sz="4"/>
+              <w:bottom w:val="single" w:color="D0D7DE" w:sz="4"/>
+              <w:right w:val="single" w:color="D0D7DE" w:sz="4"/>
+            </w:tcBorders>
+            <w:tcMar>
+              <w:top w:type="dxa" w:w="80"/>
+              <w:left w:type="dxa" w:w="120"/>
+              <w:bottom w:type="dxa" w:w="80"/>
+              <w:right w:type="dxa" w:w="120"/>
+            </w:tcMar>
+          </w:tcPr>
+          <w:p>
+            <w:r>
+              <w:t xml:space="preserve">Saisie invalide</w:t>
+            </w:r>
+          </w:p>
+        </w:tc>
+        <w:tc>
+          <w:tcPr>
+            <w:tcW w:type="dxa" w:w="3060"/>
+            <w:tcBorders>
+              <w:top w:val="single" w:color="D0D7DE" w:sz="4"/>
+              <w:left w:val="single" w:color="D0D7DE" w:sz="4"/>
+              <w:bottom w:val="single" w:color="D0D7DE" w:sz="4"/>
+              <w:right w:val="single" w:color="D0D7DE" w:sz="4"/>
+            </w:tcBorders>
+            <w:tcMar>
+              <w:top w:type="dxa" w:w="80"/>
+              <w:left w:type="dxa" w:w="120"/>
+              <w:bottom w:type="dxa" w:w="80"/>
+              <w:right w:type="dxa" w:w="120"/>
+            </w:tcMar>
+          </w:tcPr>
+          <w:p>
+            <w:r>
+              <w:t xml:space="preserve">Un avis avec une note de 9 et un commentaire trop court.</w:t>
+            </w:r>
+          </w:p>
+        </w:tc>
+        <w:tc>
+          <w:tcPr>
             <w:tcW w:type="dxa" w:w="2400"/>
             <w:tcBorders>
               <w:top w:val="single" w:color="D0D7DE" w:sz="4"/>
@@ -4124,29 +4297,29 @@
           </w:tcPr>
           <w:p>
             <w:r>
-              <w:t xml:space="preserve">Données en entrée</w:t>
-            </w:r>
-          </w:p>
-        </w:tc>
-        <w:tc>
-          <w:tcPr>
-            <w:tcW w:type="dxa" w:w="6960"/>
-            <w:tcBorders>
-              <w:top w:val="single" w:color="D0D7DE" w:sz="4"/>
-              <w:left w:val="single" w:color="D0D7DE" w:sz="4"/>
-              <w:bottom w:val="single" w:color="D0D7DE" w:sz="4"/>
-              <w:right w:val="single" w:color="D0D7DE" w:sz="4"/>
-            </w:tcBorders>
-            <w:tcMar>
-              <w:top w:type="dxa" w:w="80"/>
-              <w:left w:type="dxa" w:w="120"/>
-              <w:bottom w:type="dxa" w:w="80"/>
-              <w:right w:type="dxa" w:w="120"/>
-            </w:tcMar>
-          </w:tcPr>
-          <w:p>
-            <w:r>
-              <w:t xml:space="preserve">POST /api/artisans/1/reviews avec authorName « Claire », rating 5, comment « Travail impeccable et très soigné. »</w:t>
+              <w:t xml:space="preserve">400 — erreur de validation.</w:t>
+            </w:r>
+          </w:p>
+        </w:tc>
+        <w:tc>
+          <w:tcPr>
+            <w:tcW w:type="dxa" w:w="2200"/>
+            <w:tcBorders>
+              <w:top w:val="single" w:color="D0D7DE" w:sz="4"/>
+              <w:left w:val="single" w:color="D0D7DE" w:sz="4"/>
+              <w:bottom w:val="single" w:color="D0D7DE" w:sz="4"/>
+              <w:right w:val="single" w:color="D0D7DE" w:sz="4"/>
+            </w:tcBorders>
+            <w:tcMar>
+              <w:top w:type="dxa" w:w="80"/>
+              <w:left w:type="dxa" w:w="120"/>
+              <w:bottom w:type="dxa" w:w="80"/>
+              <w:right w:type="dxa" w:w="120"/>
+            </w:tcMar>
+          </w:tcPr>
+          <w:p>
+            <w:r>
+              <w:t xml:space="preserve">Conforme (400, ValidationError).</w:t>
             </w:r>
           </w:p>
         </w:tc>
@@ -4154,6 +4327,50 @@
       <w:tr>
         <w:tc>
           <w:tcPr>
+            <w:tcW w:type="dxa" w:w="1700"/>
+            <w:tcBorders>
+              <w:top w:val="single" w:color="D0D7DE" w:sz="4"/>
+              <w:left w:val="single" w:color="D0D7DE" w:sz="4"/>
+              <w:bottom w:val="single" w:color="D0D7DE" w:sz="4"/>
+              <w:right w:val="single" w:color="D0D7DE" w:sz="4"/>
+            </w:tcBorders>
+            <w:tcMar>
+              <w:top w:type="dxa" w:w="80"/>
+              <w:left w:type="dxa" w:w="120"/>
+              <w:bottom w:type="dxa" w:w="80"/>
+              <w:right w:type="dxa" w:w="120"/>
+            </w:tcMar>
+          </w:tcPr>
+          <w:p>
+            <w:r>
+              <w:t xml:space="preserve">Base NoSQL indisponible</w:t>
+            </w:r>
+          </w:p>
+        </w:tc>
+        <w:tc>
+          <w:tcPr>
+            <w:tcW w:type="dxa" w:w="3060"/>
+            <w:tcBorders>
+              <w:top w:val="single" w:color="D0D7DE" w:sz="4"/>
+              <w:left w:val="single" w:color="D0D7DE" w:sz="4"/>
+              <w:bottom w:val="single" w:color="D0D7DE" w:sz="4"/>
+              <w:right w:val="single" w:color="D0D7DE" w:sz="4"/>
+            </w:tcBorders>
+            <w:tcMar>
+              <w:top w:type="dxa" w:w="80"/>
+              <w:left w:type="dxa" w:w="120"/>
+              <w:bottom w:type="dxa" w:w="80"/>
+              <w:right w:type="dxa" w:w="120"/>
+            </w:tcMar>
+          </w:tcPr>
+          <w:p>
+            <w:r>
+              <w:t xml:space="preserve">Dépôt d'un avis alors que MongoDB est arrêté.</w:t>
+            </w:r>
+          </w:p>
+        </w:tc>
+        <w:tc>
+          <w:tcPr>
             <w:tcW w:type="dxa" w:w="2400"/>
             <w:tcBorders>
               <w:top w:val="single" w:color="D0D7DE" w:sz="4"/>
@@ -4170,126 +4387,43 @@
           </w:tcPr>
           <w:p>
             <w:r>
-              <w:t xml:space="preserve">Données attendues</w:t>
-            </w:r>
-          </w:p>
-        </w:tc>
-        <w:tc>
-          <w:tcPr>
-            <w:tcW w:type="dxa" w:w="6960"/>
-            <w:tcBorders>
-              <w:top w:val="single" w:color="D0D7DE" w:sz="4"/>
-              <w:left w:val="single" w:color="D0D7DE" w:sz="4"/>
-              <w:bottom w:val="single" w:color="D0D7DE" w:sz="4"/>
-              <w:right w:val="single" w:color="D0D7DE" w:sz="4"/>
-            </w:tcBorders>
-            <w:tcMar>
-              <w:top w:type="dxa" w:w="80"/>
-              <w:left w:type="dxa" w:w="120"/>
-              <w:bottom w:type="dxa" w:w="80"/>
-              <w:right w:type="dxa" w:w="120"/>
-            </w:tcMar>
-          </w:tcPr>
-          <w:p>
-            <w:r>
-              <w:t xml:space="preserve">Réponse 201 et avis créé ; un GET ultérieur renvoie l'avis et une note moyenne cohérente.</w:t>
-            </w:r>
-          </w:p>
-        </w:tc>
-      </w:tr>
-      <w:tr>
-        <w:tc>
-          <w:tcPr>
-            <w:tcW w:type="dxa" w:w="2400"/>
-            <w:tcBorders>
-              <w:top w:val="single" w:color="D0D7DE" w:sz="4"/>
-              <w:left w:val="single" w:color="D0D7DE" w:sz="4"/>
-              <w:bottom w:val="single" w:color="D0D7DE" w:sz="4"/>
-              <w:right w:val="single" w:color="D0D7DE" w:sz="4"/>
-            </w:tcBorders>
-            <w:tcMar>
-              <w:top w:type="dxa" w:w="80"/>
-              <w:left w:type="dxa" w:w="120"/>
-              <w:bottom w:type="dxa" w:w="80"/>
-              <w:right w:type="dxa" w:w="120"/>
-            </w:tcMar>
-          </w:tcPr>
-          <w:p>
-            <w:r>
-              <w:t xml:space="preserve">Données obtenues</w:t>
-            </w:r>
-          </w:p>
-        </w:tc>
-        <w:tc>
-          <w:tcPr>
-            <w:tcW w:type="dxa" w:w="6960"/>
-            <w:tcBorders>
-              <w:top w:val="single" w:color="D0D7DE" w:sz="4"/>
-              <w:left w:val="single" w:color="D0D7DE" w:sz="4"/>
-              <w:bottom w:val="single" w:color="D0D7DE" w:sz="4"/>
-              <w:right w:val="single" w:color="D0D7DE" w:sz="4"/>
-            </w:tcBorders>
-            <w:tcMar>
-              <w:top w:type="dxa" w:w="80"/>
-              <w:left w:type="dxa" w:w="120"/>
-              <w:bottom w:type="dxa" w:w="80"/>
-              <w:right w:type="dxa" w:w="120"/>
-            </w:tcMar>
-          </w:tcPr>
-          <w:p>
-            <w:r>
-              <w:t xml:space="preserve">Réponse 201 { success: true, review: {...} } ; le GET renvoie { count: 1, average: 5 }.</w:t>
-            </w:r>
-          </w:p>
-        </w:tc>
-      </w:tr>
-      <w:tr>
-        <w:tc>
-          <w:tcPr>
-            <w:tcW w:type="dxa" w:w="2400"/>
-            <w:tcBorders>
-              <w:top w:val="single" w:color="D0D7DE" w:sz="4"/>
-              <w:left w:val="single" w:color="D0D7DE" w:sz="4"/>
-              <w:bottom w:val="single" w:color="D0D7DE" w:sz="4"/>
-              <w:right w:val="single" w:color="D0D7DE" w:sz="4"/>
-            </w:tcBorders>
-            <w:tcMar>
-              <w:top w:type="dxa" w:w="80"/>
-              <w:left w:type="dxa" w:w="120"/>
-              <w:bottom w:type="dxa" w:w="80"/>
-              <w:right w:type="dxa" w:w="120"/>
-            </w:tcMar>
-          </w:tcPr>
-          <w:p>
-            <w:r>
-              <w:t xml:space="preserve">Analyse des écarts</w:t>
-            </w:r>
-          </w:p>
-        </w:tc>
-        <w:tc>
-          <w:tcPr>
-            <w:tcW w:type="dxa" w:w="6960"/>
-            <w:tcBorders>
-              <w:top w:val="single" w:color="D0D7DE" w:sz="4"/>
-              <w:left w:val="single" w:color="D0D7DE" w:sz="4"/>
-              <w:bottom w:val="single" w:color="D0D7DE" w:sz="4"/>
-              <w:right w:val="single" w:color="D0D7DE" w:sz="4"/>
-            </w:tcBorders>
-            <w:tcMar>
-              <w:top w:type="dxa" w:w="80"/>
-              <w:left w:type="dxa" w:w="120"/>
-              <w:bottom w:type="dxa" w:w="80"/>
-              <w:right w:type="dxa" w:w="120"/>
-            </w:tcMar>
-          </w:tcPr>
-          <w:p>
-            <w:r>
-              <w:t xml:space="preserve">Aucun écart : le résultat obtenu est conforme à l'attendu. Les cas limites ont aussi été vérifiés (saisie invalide vers 400, base NoSQL indisponible vers 503).</w:t>
+              <w:t xml:space="preserve">503 — service indisponible.</w:t>
+            </w:r>
+          </w:p>
+        </w:tc>
+        <w:tc>
+          <w:tcPr>
+            <w:tcW w:type="dxa" w:w="2200"/>
+            <w:tcBorders>
+              <w:top w:val="single" w:color="D0D7DE" w:sz="4"/>
+              <w:left w:val="single" w:color="D0D7DE" w:sz="4"/>
+              <w:bottom w:val="single" w:color="D0D7DE" w:sz="4"/>
+              <w:right w:val="single" w:color="D0D7DE" w:sz="4"/>
+            </w:tcBorders>
+            <w:tcMar>
+              <w:top w:type="dxa" w:w="80"/>
+              <w:left w:type="dxa" w:w="120"/>
+              <w:bottom w:type="dxa" w:w="80"/>
+              <w:right w:type="dxa" w:w="120"/>
+            </w:tcMar>
+          </w:tcPr>
+          <w:p>
+            <w:r>
+              <w:t xml:space="preserve">Conforme (503).</w:t>
             </w:r>
           </w:p>
         </w:tc>
       </w:tr>
     </w:tbl>
+    <w:p>
+      <w:pPr>
+        <w:spacing w:after="120"/>
+        <w:jc w:val="both"/>
+      </w:pPr>
+      <w:r>
+        <w:t xml:space="preserve">Aucun écart entre l'attendu et l'obtenu. Le cas nominal et la saisie invalide sont couverts par la suite de tests automatisée (commande npm test) ; l'indisponibilité de MongoDB a été vérifiée manuellement en arrêtant la base.</w:t>
+      </w:r>
+    </w:p>
     <w:p>
       <w:pPr>
         <w:pStyle w:val="Heading2"/>
@@ -5399,7 +5533,7 @@
         <w:jc w:val="both"/>
       </w:pPr>
       <w:r>
-        <w:t xml:space="preserve">Le formulaire de contact collecte le strict minimum (nom, e-mail, objet, message). La table contact_messages enregistre ces données pour traçabilité. Une politique de purge automatique (par exemple 12 mois glissants) pourra être ajoutée. La page « Données personnelles » sera complétée par un cabinet spécialisé conformément au RGPD.</w:t>
+        <w:t xml:space="preserve">Le formulaire de contact collecte le strict minimum (nom, e-mail, objet, message), et la table contact_messages les enregistre pour traçabilité. Une mention d'information accompagne le formulaire : finalité (transmettre la demande à l'artisan), destinataire (l'artisan concerné), durée de conservation (12 mois) et droits d'accès, de rectification et de suppression, exerçables via la page « Données personnelles ». Aucune donnée n'est utilisée à des fins commerciales.</w:t>
       </w:r>
     </w:p>
     <w:p>
@@ -5421,7 +5555,7 @@
         <w:jc w:val="both"/>
       </w:pPr>
       <w:r>
-        <w:t xml:space="preserve">Au-delà du middleware global, la route POST /api/artisans/:id/contact applique une limite plus stricte (5 envois / 15 min / IP). Couplé au caractère obligatoire de la clé d’API, cela rend extrêmement coûteuses les tentatives de spam massif des artisans.</w:t>
+        <w:t xml:space="preserve">Au-delà du middleware global, la route POST /api/artisans/:id/contact applique une limite plus stricte (5 envois / 15 min / IP). Combinée au caractère obligatoire de la clé d’API, elle décourage les tentatives de spam massif visant les artisans.</w:t>
       </w:r>
     </w:p>
     <w:p>
@@ -6783,7 +6917,7 @@
       <w:r>
         <w:t xml:space="preserve">Le dépôt est public et contient l’intégralité du code, les scripts SQL et le README.md : </w:t>
       </w:r>
-      <w:hyperlink w:history="1" r:id="rIddy1e204hmbxpfconzga5q">
+      <w:hyperlink w:history="1" r:id="rIdmxuqymgnu_4braomlr1ej">
         <w:r>
           <w:rPr>
             <w:rStyle w:val="Hyperlink"/>
@@ -6912,7 +7046,7 @@
       <w:r>
         <w:t xml:space="preserve">Frontend (Vercel) : </w:t>
       </w:r>
-      <w:hyperlink w:history="1" r:id="rIdvsk30t2dwjyoaw1cidaxc">
+      <w:hyperlink w:history="1" r:id="rIdzkmelvzc3hnloc1trbhav">
         <w:r>
           <w:rPr>
             <w:rStyle w:val="Hyperlink"/>
@@ -6928,7 +7062,7 @@
       <w:r>
         <w:t xml:space="preserve">API (Render) : </w:t>
       </w:r>
-      <w:hyperlink w:history="1" r:id="rIdkzwxlvflqpff2mm8nrvpd">
+      <w:hyperlink w:history="1" r:id="rIdntmgchjt-ho_mctcy-hc2">
         <w:r>
           <w:rPr>
             <w:rStyle w:val="Hyperlink"/>
@@ -6966,7 +7100,7 @@
       <w:r>
         <w:t xml:space="preserve">Fichier de maquettes (lecture publique) : </w:t>
       </w:r>
-      <w:hyperlink w:history="1" r:id="rIddmcysfjendv9rt4p5phz5">
+      <w:hyperlink w:history="1" r:id="rIdlthoj7nxgzb1f2oxrksx9">
         <w:r>
           <w:rPr>
             <w:rStyle w:val="Hyperlink"/>

</xml_diff>

<commit_message>
Intègre la police Graphik (woff2 auto-hébergée) et l'active via @font-face, avec mise à jour des notes du dossier sur la typographie
</commit_message>
<xml_diff>
--- a/docs/dossier-trouve-ton-artisan.docx
+++ b/docs/dossier-trouve-ton-artisan.docx
@@ -1700,7 +1700,7 @@
         <w:jc w:val="both"/>
       </w:pPr>
       <w:r>
-        <w:t xml:space="preserve">Graphik étant une police payante, Inter a servi de substitut pour les maquettes Figma. Côté site, la police Graphik n'est utilisée que si elle est déjà installée sur le poste ; sinon le rendu s'appuie sur des polices système, sans téléchargement de fichier de police distant.</w:t>
+        <w:t xml:space="preserve">Graphik étant une police sous licence, Inter a servi de substitut pour les maquettes Figma. Côté site, la police Graphik (version d'essai) est désormais auto-hébergée au format woff2 et chargée via @font-face : le rendu reprend ainsi fidèlement la charte, avec repli sur des polices système en cas de besoin.</w:t>
       </w:r>
     </w:p>
     <w:p>
@@ -1723,7 +1723,7 @@
       <w:r>
         <w:t xml:space="preserve">Maquettes complètes (consultation publique) : </w:t>
       </w:r>
-      <w:hyperlink w:history="1" r:id="rIdemtfekpfnk_bw2pczv5gw">
+      <w:hyperlink w:history="1" r:id="rIdn6lvsptdoj4leeig3bhau">
         <w:r>
           <w:rPr>
             <w:rStyle w:val="Hyperlink"/>
@@ -2909,7 +2909,7 @@
         <w:jc w:val="both"/>
       </w:pPr>
       <w:r>
-        <w:t xml:space="preserve">Quelques principes d'éco-conception ont été pris en compte. Les images des artisans sont chargées en différé (lazy loading), ce qui évite de télécharger des visuels non affichés à l'écran. La typographie s'appuie sur des polices déjà présentes sur le poste, sans téléchargement de fichier distant. Côté serveur, l'API ne renvoie que les colonnes utiles (pas de SELECT *) et s'appuie sur une vue SQL qui pré-assemble les jointures, ce qui réduit le volume de données transférées. Le build de production (Vite) minifie et compresse enfin les fichiers envoyés au navigateur.</w:t>
+        <w:t xml:space="preserve">Quelques principes d'éco-conception ont été pris en compte. Les images des artisans sont chargées en différé (lazy loading), ce qui évite de télécharger des visuels non affichés à l'écran. La typographie est auto-hébergée au format woff2 (compressé), ce qui évite toute requête vers un service tiers de polices. Côté serveur, l'API ne renvoie que les colonnes utiles (pas de SELECT *) et s'appuie sur une vue SQL qui pré-assemble les jointures, ce qui réduit le volume de données transférées. Le build de production (Vite) minifie et compresse enfin les fichiers envoyés au navigateur.</w:t>
       </w:r>
     </w:p>
     <w:p>
@@ -6917,7 +6917,7 @@
       <w:r>
         <w:t xml:space="preserve">Le dépôt est public et contient l’intégralité du code, les scripts SQL et le README.md : </w:t>
       </w:r>
-      <w:hyperlink w:history="1" r:id="rIdmxuqymgnu_4braomlr1ej">
+      <w:hyperlink w:history="1" r:id="rIdwxjjf4ji50kryuzmicnlv">
         <w:r>
           <w:rPr>
             <w:rStyle w:val="Hyperlink"/>
@@ -7046,7 +7046,7 @@
       <w:r>
         <w:t xml:space="preserve">Frontend (Vercel) : </w:t>
       </w:r>
-      <w:hyperlink w:history="1" r:id="rIdzkmelvzc3hnloc1trbhav">
+      <w:hyperlink w:history="1" r:id="rIdq60dzmcdokphxdof8ru_q">
         <w:r>
           <w:rPr>
             <w:rStyle w:val="Hyperlink"/>
@@ -7062,7 +7062,7 @@
       <w:r>
         <w:t xml:space="preserve">API (Render) : </w:t>
       </w:r>
-      <w:hyperlink w:history="1" r:id="rIdntmgchjt-ho_mctcy-hc2">
+      <w:hyperlink w:history="1" r:id="rId_rhtpjbynznb6xqtmfdar">
         <w:r>
           <w:rPr>
             <w:rStyle w:val="Hyperlink"/>
@@ -7100,7 +7100,7 @@
       <w:r>
         <w:t xml:space="preserve">Fichier de maquettes (lecture publique) : </w:t>
       </w:r>
-      <w:hyperlink w:history="1" r:id="rIdlthoj7nxgzb1f2oxrksx9">
+      <w:hyperlink w:history="1" r:id="rIdrpec8ke-0frogvjcr8gy1">
         <w:r>
           <w:rPr>
             <w:rStyle w:val="Hyperlink"/>

</xml_diff>

<commit_message>
Remplace le schéma d'enchaînement ASCII par un diagramme vectoriel (SVG) propre et lisible en A4
</commit_message>
<xml_diff>
--- a/docs/dossier-trouve-ton-artisan.docx
+++ b/docs/dossier-trouve-ton-artisan.docx
@@ -106,7 +106,7 @@
         <w:t xml:space="preserve">Date de rendu : </w:t>
       </w:r>
       <w:r>
-        <w:t xml:space="preserve">17/06/2026</w:t>
+        <w:t xml:space="preserve">07/07/2026</w:t>
       </w:r>
     </w:p>
     <w:p>
@@ -1723,7 +1723,7 @@
       <w:r>
         <w:t xml:space="preserve">Maquettes complètes (consultation publique) : </w:t>
       </w:r>
-      <w:hyperlink w:history="1" r:id="rIdn6lvsptdoj4leeig3bhau">
+      <w:hyperlink w:history="1" r:id="rIddfzuyqgbmq2oci2-xq_em">
         <w:r>
           <w:rPr>
             <w:rStyle w:val="Hyperlink"/>
@@ -2578,495 +2578,24 @@
     </w:p>
     <w:p>
       <w:pPr>
-        <w:shd w:fill="F1F8FC" w:val="clear"/>
-        <w:spacing w:after="120"/>
-      </w:pPr>
-      <w:r>
-        <w:rPr>
-          <w:sz w:val="20"/>
-          <w:szCs w:val="20"/>
-          <w:rFonts w:ascii="Consolas" w:cs="Consolas" w:eastAsia="Consolas" w:hAnsi="Consolas"/>
-        </w:rPr>
-        <w:t xml:space="preserve">[Accueil] ─ menu catégorie ────► [Liste filtrée]</w:t>
-      </w:r>
-      <w:r>
-        <w:rPr>
-          <w:sz w:val="20"/>
-          <w:szCs w:val="20"/>
-          <w:rFonts w:ascii="Consolas" w:cs="Consolas" w:eastAsia="Consolas" w:hAnsi="Consolas"/>
-        </w:rPr>
-        <w:br/>
-        <w:t xml:space="preserve">          ─ recherche ─────────► [Liste filtrée]</w:t>
-      </w:r>
-      <w:r>
-        <w:rPr>
-          <w:sz w:val="20"/>
-          <w:szCs w:val="20"/>
-          <w:rFonts w:ascii="Consolas" w:cs="Consolas" w:eastAsia="Consolas" w:hAnsi="Consolas"/>
-        </w:rPr>
-        <w:br/>
-        <w:t xml:space="preserve">          ─ artisan du mois ────► [Fiche artisan]</w:t>
-      </w:r>
-      <w:r>
-        <w:rPr>
-          <w:sz w:val="20"/>
-          <w:szCs w:val="20"/>
-          <w:rFonts w:ascii="Consolas" w:cs="Consolas" w:eastAsia="Consolas" w:hAnsi="Consolas"/>
-        </w:rPr>
-        <w:br/>
-        <w:t xml:space="preserve">                                          │</w:t>
-      </w:r>
-      <w:r>
-        <w:rPr>
-          <w:sz w:val="20"/>
-          <w:szCs w:val="20"/>
-          <w:rFonts w:ascii="Consolas" w:cs="Consolas" w:eastAsia="Consolas" w:hAnsi="Consolas"/>
-        </w:rPr>
-        <w:br/>
-        <w:t xml:space="preserve">                                          ▼</w:t>
-      </w:r>
-      <w:r>
-        <w:rPr>
-          <w:sz w:val="20"/>
-          <w:szCs w:val="20"/>
-          <w:rFonts w:ascii="Consolas" w:cs="Consolas" w:eastAsia="Consolas" w:hAnsi="Consolas"/>
-        </w:rPr>
-        <w:br/>
-        <w:t xml:space="preserve">                                  [Formulaire] ──► confirmation</w:t>
-      </w:r>
-      <w:r>
-        <w:rPr>
-          <w:sz w:val="20"/>
-          <w:szCs w:val="20"/>
-          <w:rFonts w:ascii="Consolas" w:cs="Consolas" w:eastAsia="Consolas" w:hAnsi="Consolas"/>
-        </w:rPr>
-        <w:br/>
-      </w:r>
-      <w:r>
-        <w:rPr>
-          <w:sz w:val="20"/>
-          <w:szCs w:val="20"/>
-          <w:rFonts w:ascii="Consolas" w:cs="Consolas" w:eastAsia="Consolas" w:hAnsi="Consolas"/>
-        </w:rPr>
-        <w:br/>
-        <w:t xml:space="preserve">[Liste] ─ clic carte ────► [Fiche artisan]</w:t>
-      </w:r>
-      <w:r>
-        <w:rPr>
-          <w:sz w:val="20"/>
-          <w:szCs w:val="20"/>
-          <w:rFonts w:ascii="Consolas" w:cs="Consolas" w:eastAsia="Consolas" w:hAnsi="Consolas"/>
-        </w:rPr>
-        <w:br/>
-        <w:t xml:space="preserve">[Toute URL inconnue] ────► [404] ─ retour ─► [Accueil]</w:t>
-      </w:r>
-    </w:p>
-    <w:p>
-      <w:pPr>
-        <w:pStyle w:val="Heading2"/>
-        <w:spacing w:before="240" w:after="120"/>
-      </w:pPr>
-      <w:r>
-        <w:rPr>
-          <w:b/>
-          <w:bCs/>
-        </w:rPr>
-        <w:t xml:space="preserve">2.5 Interfaces utilisateur statiques</w:t>
-      </w:r>
-    </w:p>
-    <w:p>
-      <w:pPr>
         <w:spacing w:after="120"/>
         <w:jc w:val="both"/>
       </w:pPr>
       <w:r>
-        <w:t xml:space="preserve">Les interfaces sont construites en composants React et mises en forme avec Bootstrap 5 et Sass. Le balisage reste sémantique et accessible. La section d'accueil illustre une structure statique simple : un en-tête de section, un titre principal et un bouton d'appel à l'action.</w:t>
-      </w:r>
-    </w:p>
-    <w:p>
-      <w:pPr>
-        <w:shd w:fill="F1F8FC" w:val="clear"/>
-        <w:spacing w:after="120"/>
-      </w:pPr>
-      <w:r>
-        <w:rPr>
-          <w:sz w:val="20"/>
-          <w:szCs w:val="20"/>
-          <w:rFonts w:ascii="Consolas" w:cs="Consolas" w:eastAsia="Consolas" w:hAnsi="Consolas"/>
-        </w:rPr>
-        <w:t xml:space="preserve">&lt;section className="hero"&gt;</w:t>
-      </w:r>
-      <w:r>
-        <w:rPr>
-          <w:sz w:val="20"/>
-          <w:szCs w:val="20"/>
-          <w:rFonts w:ascii="Consolas" w:cs="Consolas" w:eastAsia="Consolas" w:hAnsi="Consolas"/>
-        </w:rPr>
-        <w:br/>
-        <w:t xml:space="preserve">  &lt;div className="container"&gt;</w:t>
-      </w:r>
-      <w:r>
-        <w:rPr>
-          <w:sz w:val="20"/>
-          <w:szCs w:val="20"/>
-          <w:rFonts w:ascii="Consolas" w:cs="Consolas" w:eastAsia="Consolas" w:hAnsi="Consolas"/>
-        </w:rPr>
-        <w:br/>
-        <w:t xml:space="preserve">    &lt;h1&gt;Trouvez l'artisan qu'il vous faut, pres de chez vous.&lt;/h1&gt;</w:t>
-      </w:r>
-      <w:r>
-        <w:rPr>
-          <w:sz w:val="20"/>
-          <w:szCs w:val="20"/>
-          <w:rFonts w:ascii="Consolas" w:cs="Consolas" w:eastAsia="Consolas" w:hAnsi="Consolas"/>
-        </w:rPr>
-        <w:br/>
-        <w:t xml:space="preserve">    &lt;p className="lead"&gt;Batiment, alimentation, services, fabrication.&lt;/p&gt;</w:t>
-      </w:r>
-      <w:r>
-        <w:rPr>
-          <w:sz w:val="20"/>
-          <w:szCs w:val="20"/>
-          <w:rFonts w:ascii="Consolas" w:cs="Consolas" w:eastAsia="Consolas" w:hAnsi="Consolas"/>
-        </w:rPr>
-        <w:br/>
-        <w:t xml:space="preserve">    &lt;Link to="/artisans" className="btn btn-primary btn-lg"&gt;</w:t>
-      </w:r>
-      <w:r>
-        <w:rPr>
-          <w:sz w:val="20"/>
-          <w:szCs w:val="20"/>
-          <w:rFonts w:ascii="Consolas" w:cs="Consolas" w:eastAsia="Consolas" w:hAnsi="Consolas"/>
-        </w:rPr>
-        <w:br/>
-        <w:t xml:space="preserve">      Voir tous les artisans</w:t>
-      </w:r>
-      <w:r>
-        <w:rPr>
-          <w:sz w:val="20"/>
-          <w:szCs w:val="20"/>
-          <w:rFonts w:ascii="Consolas" w:cs="Consolas" w:eastAsia="Consolas" w:hAnsi="Consolas"/>
-        </w:rPr>
-        <w:br/>
-        <w:t xml:space="preserve">    &lt;/Link&gt;</w:t>
-      </w:r>
-      <w:r>
-        <w:rPr>
-          <w:sz w:val="20"/>
-          <w:szCs w:val="20"/>
-          <w:rFonts w:ascii="Consolas" w:cs="Consolas" w:eastAsia="Consolas" w:hAnsi="Consolas"/>
-        </w:rPr>
-        <w:br/>
-        <w:t xml:space="preserve">  &lt;/div&gt;</w:t>
-      </w:r>
-      <w:r>
-        <w:rPr>
-          <w:sz w:val="20"/>
-          <w:szCs w:val="20"/>
-          <w:rFonts w:ascii="Consolas" w:cs="Consolas" w:eastAsia="Consolas" w:hAnsi="Consolas"/>
-        </w:rPr>
-        <w:br/>
-        <w:t xml:space="preserve">&lt;/section&gt;</w:t>
-      </w:r>
-    </w:p>
-    <w:p>
-      <w:pPr>
-        <w:pStyle w:val="Heading2"/>
-        <w:spacing w:before="240" w:after="120"/>
-      </w:pPr>
-      <w:r>
-        <w:rPr>
-          <w:b/>
-          <w:bCs/>
-        </w:rPr>
-        <w:t xml:space="preserve">2.6 Partie dynamique des interfaces</w:t>
-      </w:r>
-    </w:p>
-    <w:p>
-      <w:pPr>
-        <w:spacing w:after="120"/>
-        <w:jc w:val="both"/>
-      </w:pPr>
-      <w:r>
-        <w:t xml:space="preserve">La partie dynamique repose sur les hooks de React. Le chargement des artisans, par exemple, se déclenche à l'affichage de la page et à chaque changement de filtre ; l'état local gère l'attente, les données reçues et les erreurs éventuelles.</w:t>
-      </w:r>
-    </w:p>
-    <w:p>
-      <w:pPr>
-        <w:shd w:fill="F1F8FC" w:val="clear"/>
-        <w:spacing w:after="120"/>
-      </w:pPr>
-      <w:r>
-        <w:rPr>
-          <w:sz w:val="20"/>
-          <w:szCs w:val="20"/>
-          <w:rFonts w:ascii="Consolas" w:cs="Consolas" w:eastAsia="Consolas" w:hAnsi="Consolas"/>
-        </w:rPr>
-        <w:t xml:space="preserve">useEffect(() =&gt; {</w:t>
-      </w:r>
-      <w:r>
-        <w:rPr>
-          <w:sz w:val="20"/>
-          <w:szCs w:val="20"/>
-          <w:rFonts w:ascii="Consolas" w:cs="Consolas" w:eastAsia="Consolas" w:hAnsi="Consolas"/>
-        </w:rPr>
-        <w:br/>
-        <w:t xml:space="preserve">  setLoading(true);</w:t>
-      </w:r>
-      <w:r>
-        <w:rPr>
-          <w:sz w:val="20"/>
-          <w:szCs w:val="20"/>
-          <w:rFonts w:ascii="Consolas" w:cs="Consolas" w:eastAsia="Consolas" w:hAnsi="Consolas"/>
-        </w:rPr>
-        <w:br/>
-        <w:t xml:space="preserve">  api.getArtisans({ category, q })</w:t>
-      </w:r>
-      <w:r>
-        <w:rPr>
-          <w:sz w:val="20"/>
-          <w:szCs w:val="20"/>
-          <w:rFonts w:ascii="Consolas" w:cs="Consolas" w:eastAsia="Consolas" w:hAnsi="Consolas"/>
-        </w:rPr>
-        <w:br/>
-        <w:t xml:space="preserve">    .then((data) =&gt; setArtisans(data))</w:t>
-      </w:r>
-      <w:r>
-        <w:rPr>
-          <w:sz w:val="20"/>
-          <w:szCs w:val="20"/>
-          <w:rFonts w:ascii="Consolas" w:cs="Consolas" w:eastAsia="Consolas" w:hAnsi="Consolas"/>
-        </w:rPr>
-        <w:br/>
-        <w:t xml:space="preserve">    .catch((err) =&gt; setError(err.message))</w:t>
-      </w:r>
-      <w:r>
-        <w:rPr>
-          <w:sz w:val="20"/>
-          <w:szCs w:val="20"/>
-          <w:rFonts w:ascii="Consolas" w:cs="Consolas" w:eastAsia="Consolas" w:hAnsi="Consolas"/>
-        </w:rPr>
-        <w:br/>
-        <w:t xml:space="preserve">    .finally(() =&gt; setLoading(false));</w:t>
-      </w:r>
-      <w:r>
-        <w:rPr>
-          <w:sz w:val="20"/>
-          <w:szCs w:val="20"/>
-          <w:rFonts w:ascii="Consolas" w:cs="Consolas" w:eastAsia="Consolas" w:hAnsi="Consolas"/>
-        </w:rPr>
-        <w:br/>
-        <w:t xml:space="preserve">}, [category, q]);</w:t>
-      </w:r>
-    </w:p>
-    <w:p>
-      <w:pPr>
-        <w:pStyle w:val="Heading2"/>
-        <w:spacing w:before="240" w:after="120"/>
-      </w:pPr>
-      <w:r>
-        <w:rPr>
-          <w:b/>
-          <w:bCs/>
-        </w:rPr>
-        <w:t xml:space="preserve">2.7 Accessibilité et référencement</w:t>
-      </w:r>
-    </w:p>
-    <w:p>
-      <w:pPr>
-        <w:spacing w:after="120"/>
-        <w:jc w:val="both"/>
-      </w:pPr>
-      <w:r>
-        <w:t xml:space="preserve">Le site vise la conformité WCAG 2.1 et, dans sa déclinaison française, le RGAA (Référentiel Général d'Amélioration de l'Accessibilité), opposable aux organismes publics — ce qui est directement pertinent ici, le commanditaire étant une collectivité. Concrètement : balises sémantiques, lien d'évitement vers le contenu principal, libellés associés à chaque champ de formulaire, images décoratives neutralisées pour les lecteurs d'écran (alt vide ou aria-hidden), ordre de tabulation logique, focus visible et navigation entièrement au clavier. Le composant de notation expose aussi bien les étoiles que la valeur chiffrée. Les contrastes de la palette ont été vérifiés par rapport au seuil AA.</w:t>
-      </w:r>
-    </w:p>
-    <w:p>
-      <w:pPr>
-        <w:spacing w:after="120"/>
-        <w:jc w:val="both"/>
-      </w:pPr>
-      <w:r>
-        <w:t xml:space="preserve">Côté référencement, chaque page définit son propre titre et sa méta-description grâce aux métadonnées natives de React 19 (composant Seo), ce qui améliore l'indexation par les moteurs de recherche et l'aperçu lors d'un partage sur les réseaux sociaux. Les URL restent propres et lisibles grâce à React Router.</w:t>
-      </w:r>
-    </w:p>
-    <w:p>
-      <w:pPr>
-        <w:pStyle w:val="Heading2"/>
-        <w:spacing w:before="240" w:after="120"/>
-      </w:pPr>
-      <w:r>
-        <w:rPr>
-          <w:b/>
-          <w:bCs/>
-        </w:rPr>
-        <w:t xml:space="preserve">2.8 Éco-conception</w:t>
-      </w:r>
-    </w:p>
-    <w:p>
-      <w:pPr>
-        <w:spacing w:after="120"/>
-        <w:jc w:val="both"/>
-      </w:pPr>
-      <w:r>
-        <w:t xml:space="preserve">Quelques principes d'éco-conception ont été pris en compte. Les images des artisans sont chargées en différé (lazy loading), ce qui évite de télécharger des visuels non affichés à l'écran. La typographie est auto-hébergée au format woff2 (compressé), ce qui évite toute requête vers un service tiers de polices. Côté serveur, l'API ne renvoie que les colonnes utiles (pas de SELECT *) et s'appuie sur une vue SQL qui pré-assemble les jointures, ce qui réduit le volume de données transférées. Le build de production (Vite) minifie et compresse enfin les fichiers envoyés au navigateur.</w:t>
-      </w:r>
-    </w:p>
-    <w:p>
-      <w:r>
-        <w:br w:type="page"/>
-      </w:r>
-    </w:p>
-    <w:p>
-      <w:pPr>
-        <w:pStyle w:val="Heading1"/>
-        <w:spacing w:before="360" w:after="180"/>
-      </w:pPr>
-      <w:r>
-        <w:rPr>
-          <w:b/>
-          <w:bCs/>
-        </w:rPr>
-        <w:t xml:space="preserve">3. Base de données et composants serveur</w:t>
-      </w:r>
-    </w:p>
-    <w:p>
-      <w:pPr>
-        <w:pStyle w:val="Heading2"/>
-        <w:spacing w:before="240" w:after="120"/>
-      </w:pPr>
-      <w:r>
-        <w:rPr>
-          <w:b/>
-          <w:bCs/>
-        </w:rPr>
-        <w:t xml:space="preserve">3.1 Règles de gestion</w:t>
-      </w:r>
-    </w:p>
-    <w:p>
-      <w:pPr>
-        <w:pStyle w:val="ListParagraph"/>
-        <w:numPr>
-          <w:ilvl w:val="0"/>
-          <w:numId w:val="2"/>
-        </w:numPr>
-        <w:spacing w:after="80"/>
-      </w:pPr>
-      <w:r>
-        <w:t xml:space="preserve">Un artisan appartient à une seule spécialité.</w:t>
-      </w:r>
-    </w:p>
-    <w:p>
-      <w:pPr>
-        <w:pStyle w:val="ListParagraph"/>
-        <w:numPr>
-          <w:ilvl w:val="0"/>
-          <w:numId w:val="2"/>
-        </w:numPr>
-        <w:spacing w:after="80"/>
-      </w:pPr>
-      <w:r>
-        <w:t xml:space="preserve">Une spécialité est rattachée à une seule catégorie.</w:t>
-      </w:r>
-    </w:p>
-    <w:p>
-      <w:pPr>
-        <w:pStyle w:val="ListParagraph"/>
-        <w:numPr>
-          <w:ilvl w:val="0"/>
-          <w:numId w:val="2"/>
-        </w:numPr>
-        <w:spacing w:after="80"/>
-      </w:pPr>
-      <w:r>
-        <w:t xml:space="preserve">Un artisan est localisé dans une seule ville ; une ville regroupe potentiellement plusieurs artisans.</w:t>
-      </w:r>
-    </w:p>
-    <w:p>
-      <w:pPr>
-        <w:pStyle w:val="ListParagraph"/>
-        <w:numPr>
-          <w:ilvl w:val="0"/>
-          <w:numId w:val="2"/>
-        </w:numPr>
-        <w:spacing w:after="80"/>
-      </w:pPr>
-      <w:r>
-        <w:t xml:space="preserve">Un artisan peut être marqué « artisan du mois ».</w:t>
-      </w:r>
-    </w:p>
-    <w:p>
-      <w:pPr>
-        <w:pStyle w:val="ListParagraph"/>
-        <w:numPr>
-          <w:ilvl w:val="0"/>
-          <w:numId w:val="2"/>
-        </w:numPr>
-        <w:spacing w:after="80"/>
-      </w:pPr>
-      <w:r>
-        <w:t xml:space="preserve">Chaque artisan possède une note décimale entre 0 et 5.</w:t>
-      </w:r>
-    </w:p>
-    <w:p>
-      <w:pPr>
-        <w:pStyle w:val="ListParagraph"/>
-        <w:numPr>
-          <w:ilvl w:val="0"/>
-          <w:numId w:val="2"/>
-        </w:numPr>
-        <w:spacing w:after="80"/>
-      </w:pPr>
-      <w:r>
-        <w:t xml:space="preserve">Un message de contact est associé à un seul artisan ; un artisan peut en recevoir plusieurs.</w:t>
-      </w:r>
-    </w:p>
-    <w:p>
-      <w:pPr>
-        <w:pStyle w:val="Heading2"/>
-        <w:spacing w:before="240" w:after="120"/>
-      </w:pPr>
-      <w:r>
-        <w:rPr>
-          <w:b/>
-          <w:bCs/>
-        </w:rPr>
-        <w:t xml:space="preserve">3.2 Respect des formes normales</w:t>
-      </w:r>
-    </w:p>
-    <w:p>
-      <w:pPr>
-        <w:spacing w:after="120"/>
-        <w:jc w:val="both"/>
-      </w:pPr>
-      <w:r>
-        <w:t xml:space="preserve">Le schéma respecte les trois premières formes normales (1FN, 2FN, 3FN). En particulier, la ville a été externalisée dans une table dédiée (cities) pour éviter la redondance du nom de ville sur chaque ligne d'artisan (3FN) : si une ville change de nom, une seule ligne est à modifier. Idem pour les catégories et les spécialités, qui sont des tables référentielles distinctes.</w:t>
-      </w:r>
-    </w:p>
-    <w:p>
-      <w:pPr>
-        <w:pStyle w:val="Heading2"/>
-        <w:spacing w:before="240" w:after="120"/>
-      </w:pPr>
-      <w:r>
-        <w:rPr>
-          <w:b/>
-          <w:bCs/>
-        </w:rPr>
-        <w:t xml:space="preserve">3.3 Modèle conceptuel de données (MCD)</w:t>
-      </w:r>
-    </w:p>
-    <w:p>
-      <w:pPr>
-        <w:spacing w:before="100" w:after="60"/>
+        <w:t xml:space="preserve">Le schéma ci-dessous résume la navigation entre les écrans du site : depuis la page d'accueil vers la liste (par catégorie ou recherche) ou une fiche (artisan du mois), puis le formulaire de contact et sa confirmation. Toute URL inconnue mène à la page 404, qui ramène à l'accueil.</w:t>
+      </w:r>
+    </w:p>
+    <w:p>
+      <w:pPr>
+        <w:spacing w:before="100" w:after="180"/>
         <w:jc w:val="center"/>
       </w:pPr>
       <w:r>
         <w:drawing>
           <wp:inline distT="0" distB="0" distL="0" distR="0">
-            <wp:extent cx="4572000" cy="2857500"/>
+            <wp:extent cx="3905250" cy="5495925"/>
             <wp:effectExtent t="0" r="0" b="0" l="0"/>
-            <wp:docPr id="1" name="mcd.png" descr="MCD — 5 entités, cardinalités explicites" title="MCD — 5 entités, cardinalités explicites"/>
+            <wp:docPr id="1" name="enchainement.svg" descr="enchainement.svg" title="enchainement.svg"/>
             <wp:cNvGraphicFramePr>
               <a:graphicFrameLocks xmlns:a="http://schemas.openxmlformats.org/drawingml/2006/main" noChangeAspect="1"/>
             </wp:cNvGraphicFramePr>
@@ -3089,7 +2618,7 @@
                   <pic:spPr bwMode="auto">
                     <a:xfrm>
                       <a:off x="0" y="0"/>
-                      <a:ext cx="4572000" cy="2857500"/>
+                      <a:ext cx="3905250" cy="5495925"/>
                     </a:xfrm>
                     <a:prstGeom prst="rect">
                       <a:avLst/>
@@ -3104,22 +2633,6 @@
     </w:p>
     <w:p>
       <w:pPr>
-        <w:spacing w:after="180"/>
-        <w:jc w:val="center"/>
-      </w:pPr>
-      <w:r>
-        <w:rPr>
-          <w:i/>
-          <w:iCs/>
-          <w:color w:val="384050"/>
-          <w:sz w:val="18"/>
-          <w:szCs w:val="18"/>
-        </w:rPr>
-        <w:t xml:space="preserve">MCD — 5 entités, cardinalités explicites</w:t>
-      </w:r>
-    </w:p>
-    <w:p>
-      <w:pPr>
         <w:pStyle w:val="Heading2"/>
         <w:spacing w:before="240" w:after="120"/>
       </w:pPr>
@@ -3128,7 +2641,389 @@
           <w:b/>
           <w:bCs/>
         </w:rPr>
-        <w:t xml:space="preserve">3.4 Modèle logique de données (MLD)</w:t>
+        <w:t xml:space="preserve">2.5 Interfaces utilisateur statiques</w:t>
+      </w:r>
+    </w:p>
+    <w:p>
+      <w:pPr>
+        <w:spacing w:after="120"/>
+        <w:jc w:val="both"/>
+      </w:pPr>
+      <w:r>
+        <w:t xml:space="preserve">Les interfaces sont construites en composants React et mises en forme avec Bootstrap 5 et Sass. Le balisage reste sémantique et accessible. La section d'accueil illustre une structure statique simple : un en-tête de section, un titre principal et un bouton d'appel à l'action.</w:t>
+      </w:r>
+    </w:p>
+    <w:p>
+      <w:pPr>
+        <w:shd w:fill="F1F8FC" w:val="clear"/>
+        <w:spacing w:after="120"/>
+      </w:pPr>
+      <w:r>
+        <w:rPr>
+          <w:sz w:val="20"/>
+          <w:szCs w:val="20"/>
+          <w:rFonts w:ascii="Consolas" w:cs="Consolas" w:eastAsia="Consolas" w:hAnsi="Consolas"/>
+        </w:rPr>
+        <w:t xml:space="preserve">&lt;section className="hero"&gt;</w:t>
+      </w:r>
+      <w:r>
+        <w:rPr>
+          <w:sz w:val="20"/>
+          <w:szCs w:val="20"/>
+          <w:rFonts w:ascii="Consolas" w:cs="Consolas" w:eastAsia="Consolas" w:hAnsi="Consolas"/>
+        </w:rPr>
+        <w:br/>
+        <w:t xml:space="preserve">  &lt;div className="container"&gt;</w:t>
+      </w:r>
+      <w:r>
+        <w:rPr>
+          <w:sz w:val="20"/>
+          <w:szCs w:val="20"/>
+          <w:rFonts w:ascii="Consolas" w:cs="Consolas" w:eastAsia="Consolas" w:hAnsi="Consolas"/>
+        </w:rPr>
+        <w:br/>
+        <w:t xml:space="preserve">    &lt;h1&gt;Trouvez l'artisan qu'il vous faut, pres de chez vous.&lt;/h1&gt;</w:t>
+      </w:r>
+      <w:r>
+        <w:rPr>
+          <w:sz w:val="20"/>
+          <w:szCs w:val="20"/>
+          <w:rFonts w:ascii="Consolas" w:cs="Consolas" w:eastAsia="Consolas" w:hAnsi="Consolas"/>
+        </w:rPr>
+        <w:br/>
+        <w:t xml:space="preserve">    &lt;p className="lead"&gt;Batiment, alimentation, services, fabrication.&lt;/p&gt;</w:t>
+      </w:r>
+      <w:r>
+        <w:rPr>
+          <w:sz w:val="20"/>
+          <w:szCs w:val="20"/>
+          <w:rFonts w:ascii="Consolas" w:cs="Consolas" w:eastAsia="Consolas" w:hAnsi="Consolas"/>
+        </w:rPr>
+        <w:br/>
+        <w:t xml:space="preserve">    &lt;Link to="/artisans" className="btn btn-primary btn-lg"&gt;</w:t>
+      </w:r>
+      <w:r>
+        <w:rPr>
+          <w:sz w:val="20"/>
+          <w:szCs w:val="20"/>
+          <w:rFonts w:ascii="Consolas" w:cs="Consolas" w:eastAsia="Consolas" w:hAnsi="Consolas"/>
+        </w:rPr>
+        <w:br/>
+        <w:t xml:space="preserve">      Voir tous les artisans</w:t>
+      </w:r>
+      <w:r>
+        <w:rPr>
+          <w:sz w:val="20"/>
+          <w:szCs w:val="20"/>
+          <w:rFonts w:ascii="Consolas" w:cs="Consolas" w:eastAsia="Consolas" w:hAnsi="Consolas"/>
+        </w:rPr>
+        <w:br/>
+        <w:t xml:space="preserve">    &lt;/Link&gt;</w:t>
+      </w:r>
+      <w:r>
+        <w:rPr>
+          <w:sz w:val="20"/>
+          <w:szCs w:val="20"/>
+          <w:rFonts w:ascii="Consolas" w:cs="Consolas" w:eastAsia="Consolas" w:hAnsi="Consolas"/>
+        </w:rPr>
+        <w:br/>
+        <w:t xml:space="preserve">  &lt;/div&gt;</w:t>
+      </w:r>
+      <w:r>
+        <w:rPr>
+          <w:sz w:val="20"/>
+          <w:szCs w:val="20"/>
+          <w:rFonts w:ascii="Consolas" w:cs="Consolas" w:eastAsia="Consolas" w:hAnsi="Consolas"/>
+        </w:rPr>
+        <w:br/>
+        <w:t xml:space="preserve">&lt;/section&gt;</w:t>
+      </w:r>
+    </w:p>
+    <w:p>
+      <w:pPr>
+        <w:pStyle w:val="Heading2"/>
+        <w:spacing w:before="240" w:after="120"/>
+      </w:pPr>
+      <w:r>
+        <w:rPr>
+          <w:b/>
+          <w:bCs/>
+        </w:rPr>
+        <w:t xml:space="preserve">2.6 Partie dynamique des interfaces</w:t>
+      </w:r>
+    </w:p>
+    <w:p>
+      <w:pPr>
+        <w:spacing w:after="120"/>
+        <w:jc w:val="both"/>
+      </w:pPr>
+      <w:r>
+        <w:t xml:space="preserve">La partie dynamique repose sur les hooks de React. Le chargement des artisans, par exemple, se déclenche à l'affichage de la page et à chaque changement de filtre ; l'état local gère l'attente, les données reçues et les erreurs éventuelles.</w:t>
+      </w:r>
+    </w:p>
+    <w:p>
+      <w:pPr>
+        <w:shd w:fill="F1F8FC" w:val="clear"/>
+        <w:spacing w:after="120"/>
+      </w:pPr>
+      <w:r>
+        <w:rPr>
+          <w:sz w:val="20"/>
+          <w:szCs w:val="20"/>
+          <w:rFonts w:ascii="Consolas" w:cs="Consolas" w:eastAsia="Consolas" w:hAnsi="Consolas"/>
+        </w:rPr>
+        <w:t xml:space="preserve">useEffect(() =&gt; {</w:t>
+      </w:r>
+      <w:r>
+        <w:rPr>
+          <w:sz w:val="20"/>
+          <w:szCs w:val="20"/>
+          <w:rFonts w:ascii="Consolas" w:cs="Consolas" w:eastAsia="Consolas" w:hAnsi="Consolas"/>
+        </w:rPr>
+        <w:br/>
+        <w:t xml:space="preserve">  setLoading(true);</w:t>
+      </w:r>
+      <w:r>
+        <w:rPr>
+          <w:sz w:val="20"/>
+          <w:szCs w:val="20"/>
+          <w:rFonts w:ascii="Consolas" w:cs="Consolas" w:eastAsia="Consolas" w:hAnsi="Consolas"/>
+        </w:rPr>
+        <w:br/>
+        <w:t xml:space="preserve">  api.getArtisans({ category, q })</w:t>
+      </w:r>
+      <w:r>
+        <w:rPr>
+          <w:sz w:val="20"/>
+          <w:szCs w:val="20"/>
+          <w:rFonts w:ascii="Consolas" w:cs="Consolas" w:eastAsia="Consolas" w:hAnsi="Consolas"/>
+        </w:rPr>
+        <w:br/>
+        <w:t xml:space="preserve">    .then((data) =&gt; setArtisans(data))</w:t>
+      </w:r>
+      <w:r>
+        <w:rPr>
+          <w:sz w:val="20"/>
+          <w:szCs w:val="20"/>
+          <w:rFonts w:ascii="Consolas" w:cs="Consolas" w:eastAsia="Consolas" w:hAnsi="Consolas"/>
+        </w:rPr>
+        <w:br/>
+        <w:t xml:space="preserve">    .catch((err) =&gt; setError(err.message))</w:t>
+      </w:r>
+      <w:r>
+        <w:rPr>
+          <w:sz w:val="20"/>
+          <w:szCs w:val="20"/>
+          <w:rFonts w:ascii="Consolas" w:cs="Consolas" w:eastAsia="Consolas" w:hAnsi="Consolas"/>
+        </w:rPr>
+        <w:br/>
+        <w:t xml:space="preserve">    .finally(() =&gt; setLoading(false));</w:t>
+      </w:r>
+      <w:r>
+        <w:rPr>
+          <w:sz w:val="20"/>
+          <w:szCs w:val="20"/>
+          <w:rFonts w:ascii="Consolas" w:cs="Consolas" w:eastAsia="Consolas" w:hAnsi="Consolas"/>
+        </w:rPr>
+        <w:br/>
+        <w:t xml:space="preserve">}, [category, q]);</w:t>
+      </w:r>
+    </w:p>
+    <w:p>
+      <w:pPr>
+        <w:pStyle w:val="Heading2"/>
+        <w:spacing w:before="240" w:after="120"/>
+      </w:pPr>
+      <w:r>
+        <w:rPr>
+          <w:b/>
+          <w:bCs/>
+        </w:rPr>
+        <w:t xml:space="preserve">2.7 Accessibilité et référencement</w:t>
+      </w:r>
+    </w:p>
+    <w:p>
+      <w:pPr>
+        <w:spacing w:after="120"/>
+        <w:jc w:val="both"/>
+      </w:pPr>
+      <w:r>
+        <w:t xml:space="preserve">Le site vise la conformité WCAG 2.1 et, dans sa déclinaison française, le RGAA (Référentiel Général d'Amélioration de l'Accessibilité), opposable aux organismes publics — ce qui est directement pertinent ici, le commanditaire étant une collectivité. Concrètement : balises sémantiques, lien d'évitement vers le contenu principal, libellés associés à chaque champ de formulaire, images décoratives neutralisées pour les lecteurs d'écran (alt vide ou aria-hidden), ordre de tabulation logique, focus visible et navigation entièrement au clavier. Le composant de notation expose aussi bien les étoiles que la valeur chiffrée. Les contrastes de la palette ont été vérifiés par rapport au seuil AA.</w:t>
+      </w:r>
+    </w:p>
+    <w:p>
+      <w:pPr>
+        <w:spacing w:after="120"/>
+        <w:jc w:val="both"/>
+      </w:pPr>
+      <w:r>
+        <w:t xml:space="preserve">Côté référencement, chaque page définit son propre titre et sa méta-description grâce aux métadonnées natives de React 19 (composant Seo), ce qui améliore l'indexation par les moteurs de recherche et l'aperçu lors d'un partage sur les réseaux sociaux. Les URL restent propres et lisibles grâce à React Router.</w:t>
+      </w:r>
+    </w:p>
+    <w:p>
+      <w:pPr>
+        <w:pStyle w:val="Heading2"/>
+        <w:spacing w:before="240" w:after="120"/>
+      </w:pPr>
+      <w:r>
+        <w:rPr>
+          <w:b/>
+          <w:bCs/>
+        </w:rPr>
+        <w:t xml:space="preserve">2.8 Éco-conception</w:t>
+      </w:r>
+    </w:p>
+    <w:p>
+      <w:pPr>
+        <w:spacing w:after="120"/>
+        <w:jc w:val="both"/>
+      </w:pPr>
+      <w:r>
+        <w:t xml:space="preserve">Quelques principes d'éco-conception ont été pris en compte. Les images des artisans sont chargées en différé (lazy loading), ce qui évite de télécharger des visuels non affichés à l'écran. La typographie est auto-hébergée au format woff2 (compressé), ce qui évite toute requête vers un service tiers de polices. Côté serveur, l'API ne renvoie que les colonnes utiles (pas de SELECT *) et s'appuie sur une vue SQL qui pré-assemble les jointures, ce qui réduit le volume de données transférées. Le build de production (Vite) minifie et compresse enfin les fichiers envoyés au navigateur.</w:t>
+      </w:r>
+    </w:p>
+    <w:p>
+      <w:r>
+        <w:br w:type="page"/>
+      </w:r>
+    </w:p>
+    <w:p>
+      <w:pPr>
+        <w:pStyle w:val="Heading1"/>
+        <w:spacing w:before="360" w:after="180"/>
+      </w:pPr>
+      <w:r>
+        <w:rPr>
+          <w:b/>
+          <w:bCs/>
+        </w:rPr>
+        <w:t xml:space="preserve">3. Base de données et composants serveur</w:t>
+      </w:r>
+    </w:p>
+    <w:p>
+      <w:pPr>
+        <w:pStyle w:val="Heading2"/>
+        <w:spacing w:before="240" w:after="120"/>
+      </w:pPr>
+      <w:r>
+        <w:rPr>
+          <w:b/>
+          <w:bCs/>
+        </w:rPr>
+        <w:t xml:space="preserve">3.1 Règles de gestion</w:t>
+      </w:r>
+    </w:p>
+    <w:p>
+      <w:pPr>
+        <w:pStyle w:val="ListParagraph"/>
+        <w:numPr>
+          <w:ilvl w:val="0"/>
+          <w:numId w:val="2"/>
+        </w:numPr>
+        <w:spacing w:after="80"/>
+      </w:pPr>
+      <w:r>
+        <w:t xml:space="preserve">Un artisan appartient à une seule spécialité.</w:t>
+      </w:r>
+    </w:p>
+    <w:p>
+      <w:pPr>
+        <w:pStyle w:val="ListParagraph"/>
+        <w:numPr>
+          <w:ilvl w:val="0"/>
+          <w:numId w:val="2"/>
+        </w:numPr>
+        <w:spacing w:after="80"/>
+      </w:pPr>
+      <w:r>
+        <w:t xml:space="preserve">Une spécialité est rattachée à une seule catégorie.</w:t>
+      </w:r>
+    </w:p>
+    <w:p>
+      <w:pPr>
+        <w:pStyle w:val="ListParagraph"/>
+        <w:numPr>
+          <w:ilvl w:val="0"/>
+          <w:numId w:val="2"/>
+        </w:numPr>
+        <w:spacing w:after="80"/>
+      </w:pPr>
+      <w:r>
+        <w:t xml:space="preserve">Un artisan est localisé dans une seule ville ; une ville regroupe potentiellement plusieurs artisans.</w:t>
+      </w:r>
+    </w:p>
+    <w:p>
+      <w:pPr>
+        <w:pStyle w:val="ListParagraph"/>
+        <w:numPr>
+          <w:ilvl w:val="0"/>
+          <w:numId w:val="2"/>
+        </w:numPr>
+        <w:spacing w:after="80"/>
+      </w:pPr>
+      <w:r>
+        <w:t xml:space="preserve">Un artisan peut être marqué « artisan du mois ».</w:t>
+      </w:r>
+    </w:p>
+    <w:p>
+      <w:pPr>
+        <w:pStyle w:val="ListParagraph"/>
+        <w:numPr>
+          <w:ilvl w:val="0"/>
+          <w:numId w:val="2"/>
+        </w:numPr>
+        <w:spacing w:after="80"/>
+      </w:pPr>
+      <w:r>
+        <w:t xml:space="preserve">Chaque artisan possède une note décimale entre 0 et 5.</w:t>
+      </w:r>
+    </w:p>
+    <w:p>
+      <w:pPr>
+        <w:pStyle w:val="ListParagraph"/>
+        <w:numPr>
+          <w:ilvl w:val="0"/>
+          <w:numId w:val="2"/>
+        </w:numPr>
+        <w:spacing w:after="80"/>
+      </w:pPr>
+      <w:r>
+        <w:t xml:space="preserve">Un message de contact est associé à un seul artisan ; un artisan peut en recevoir plusieurs.</w:t>
+      </w:r>
+    </w:p>
+    <w:p>
+      <w:pPr>
+        <w:pStyle w:val="Heading2"/>
+        <w:spacing w:before="240" w:after="120"/>
+      </w:pPr>
+      <w:r>
+        <w:rPr>
+          <w:b/>
+          <w:bCs/>
+        </w:rPr>
+        <w:t xml:space="preserve">3.2 Respect des formes normales</w:t>
+      </w:r>
+    </w:p>
+    <w:p>
+      <w:pPr>
+        <w:spacing w:after="120"/>
+        <w:jc w:val="both"/>
+      </w:pPr>
+      <w:r>
+        <w:t xml:space="preserve">Le schéma respecte les trois premières formes normales (1FN, 2FN, 3FN). En particulier, la ville a été externalisée dans une table dédiée (cities) pour éviter la redondance du nom de ville sur chaque ligne d'artisan (3FN) : si une ville change de nom, une seule ligne est à modifier. Idem pour les catégories et les spécialités, qui sont des tables référentielles distinctes.</w:t>
+      </w:r>
+    </w:p>
+    <w:p>
+      <w:pPr>
+        <w:pStyle w:val="Heading2"/>
+        <w:spacing w:before="240" w:after="120"/>
+      </w:pPr>
+      <w:r>
+        <w:rPr>
+          <w:b/>
+          <w:bCs/>
+        </w:rPr>
+        <w:t xml:space="preserve">3.3 Modèle conceptuel de données (MCD)</w:t>
       </w:r>
     </w:p>
     <w:p>
@@ -3139,9 +3034,9 @@
       <w:r>
         <w:drawing>
           <wp:inline distT="0" distB="0" distL="0" distR="0">
-            <wp:extent cx="5143500" cy="3219450"/>
+            <wp:extent cx="4572000" cy="2857500"/>
             <wp:effectExtent t="0" r="0" b="0" l="0"/>
-            <wp:docPr id="1" name="mld.png" descr="MLD — types SQL, PK / UK / FK identifiés" title="MLD — types SQL, PK / UK / FK identifiés"/>
+            <wp:docPr id="1" name="mcd.png" descr="MCD — 5 entités, cardinalités explicites" title="MCD — 5 entités, cardinalités explicites"/>
             <wp:cNvGraphicFramePr>
               <a:graphicFrameLocks xmlns:a="http://schemas.openxmlformats.org/drawingml/2006/main" noChangeAspect="1"/>
             </wp:cNvGraphicFramePr>
@@ -3164,6 +3059,81 @@
                   <pic:spPr bwMode="auto">
                     <a:xfrm>
                       <a:off x="0" y="0"/>
+                      <a:ext cx="4572000" cy="2857500"/>
+                    </a:xfrm>
+                    <a:prstGeom prst="rect">
+                      <a:avLst/>
+                    </a:prstGeom>
+                  </pic:spPr>
+                </pic:pic>
+              </a:graphicData>
+            </a:graphic>
+          </wp:inline>
+        </w:drawing>
+      </w:r>
+    </w:p>
+    <w:p>
+      <w:pPr>
+        <w:spacing w:after="180"/>
+        <w:jc w:val="center"/>
+      </w:pPr>
+      <w:r>
+        <w:rPr>
+          <w:i/>
+          <w:iCs/>
+          <w:color w:val="384050"/>
+          <w:sz w:val="18"/>
+          <w:szCs w:val="18"/>
+        </w:rPr>
+        <w:t xml:space="preserve">MCD — 5 entités, cardinalités explicites</w:t>
+      </w:r>
+    </w:p>
+    <w:p>
+      <w:pPr>
+        <w:pStyle w:val="Heading2"/>
+        <w:spacing w:before="240" w:after="120"/>
+      </w:pPr>
+      <w:r>
+        <w:rPr>
+          <w:b/>
+          <w:bCs/>
+        </w:rPr>
+        <w:t xml:space="preserve">3.4 Modèle logique de données (MLD)</w:t>
+      </w:r>
+    </w:p>
+    <w:p>
+      <w:pPr>
+        <w:spacing w:before="100" w:after="60"/>
+        <w:jc w:val="center"/>
+      </w:pPr>
+      <w:r>
+        <w:drawing>
+          <wp:inline distT="0" distB="0" distL="0" distR="0">
+            <wp:extent cx="5143500" cy="3219450"/>
+            <wp:effectExtent t="0" r="0" b="0" l="0"/>
+            <wp:docPr id="1" name="mld.png" descr="MLD — types SQL, PK / UK / FK identifiés" title="MLD — types SQL, PK / UK / FK identifiés"/>
+            <wp:cNvGraphicFramePr>
+              <a:graphicFrameLocks xmlns:a="http://schemas.openxmlformats.org/drawingml/2006/main" noChangeAspect="1"/>
+            </wp:cNvGraphicFramePr>
+            <a:graphic xmlns:a="http://schemas.openxmlformats.org/drawingml/2006/main">
+              <a:graphicData uri="http://schemas.openxmlformats.org/drawingml/2006/picture">
+                <pic:pic xmlns:pic="http://schemas.openxmlformats.org/drawingml/2006/picture">
+                  <pic:nvPicPr>
+                    <pic:cNvPr id="0" name="" descr=""/>
+                    <pic:cNvPicPr>
+                      <a:picLocks noChangeAspect="1" noChangeArrowheads="1"/>
+                    </pic:cNvPicPr>
+                  </pic:nvPicPr>
+                  <pic:blipFill>
+                    <a:blip r:embed="rId22" cstate="none"/>
+                    <a:srcRect/>
+                    <a:stretch>
+                      <a:fillRect/>
+                    </a:stretch>
+                  </pic:blipFill>
+                  <pic:spPr bwMode="auto">
+                    <a:xfrm>
+                      <a:off x="0" y="0"/>
                       <a:ext cx="5143500" cy="3219450"/>
                     </a:xfrm>
                     <a:prstGeom prst="rect">
@@ -6917,7 +6887,7 @@
       <w:r>
         <w:t xml:space="preserve">Le dépôt est public et contient l’intégralité du code, les scripts SQL et le README.md : </w:t>
       </w:r>
-      <w:hyperlink w:history="1" r:id="rIdwxjjf4ji50kryuzmicnlv">
+      <w:hyperlink w:history="1" r:id="rId7x_sxk6lblfgivbihoz83">
         <w:r>
           <w:rPr>
             <w:rStyle w:val="Hyperlink"/>
@@ -7046,7 +7016,7 @@
       <w:r>
         <w:t xml:space="preserve">Frontend (Vercel) : </w:t>
       </w:r>
-      <w:hyperlink w:history="1" r:id="rIdq60dzmcdokphxdof8ru_q">
+      <w:hyperlink w:history="1" r:id="rId5wtvs8rdclcfkbtr_bwzc">
         <w:r>
           <w:rPr>
             <w:rStyle w:val="Hyperlink"/>
@@ -7062,7 +7032,7 @@
       <w:r>
         <w:t xml:space="preserve">API (Render) : </w:t>
       </w:r>
-      <w:hyperlink w:history="1" r:id="rId_rhtpjbynznb6xqtmfdar">
+      <w:hyperlink w:history="1" r:id="rIdhq6o_5dq7f-z_lqn_ocxs">
         <w:r>
           <w:rPr>
             <w:rStyle w:val="Hyperlink"/>
@@ -7100,7 +7070,7 @@
       <w:r>
         <w:t xml:space="preserve">Fichier de maquettes (lecture publique) : </w:t>
       </w:r>
-      <w:hyperlink w:history="1" r:id="rIdrpec8ke-0frogvjcr8gy1">
+      <w:hyperlink w:history="1" r:id="rIdfxl0czqvkgwzdgorarocm">
         <w:r>
           <w:rPr>
             <w:rStyle w:val="Hyperlink"/>
@@ -7146,7 +7116,7 @@
       <w:rPr>
         <w:color w:val="384050"/>
       </w:rPr>
-      <w:t xml:space="preserve">17/06/2026</w:t>
+      <w:t xml:space="preserve">07/07/2026</w:t>
     </w:r>
     <w:r>
       <w:rPr>

</xml_diff>

<commit_message>
Affiche le schéma d'enchaînement en PNG (le SVG ne s'affichait pas dans toutes les visionneuses Word)
</commit_message>
<xml_diff>
--- a/docs/dossier-trouve-ton-artisan.docx
+++ b/docs/dossier-trouve-ton-artisan.docx
@@ -1723,7 +1723,7 @@
       <w:r>
         <w:t xml:space="preserve">Maquettes complètes (consultation publique) : </w:t>
       </w:r>
-      <w:hyperlink w:history="1" r:id="rIddfzuyqgbmq2oci2-xq_em">
+      <w:hyperlink w:history="1" r:id="rId5exfm0ghv2gadhqkhxpfq">
         <w:r>
           <w:rPr>
             <w:rStyle w:val="Hyperlink"/>
@@ -2587,7 +2587,7 @@
     </w:p>
     <w:p>
       <w:pPr>
-        <w:spacing w:before="100" w:after="180"/>
+        <w:spacing w:before="100" w:after="60"/>
         <w:jc w:val="center"/>
       </w:pPr>
       <w:r>
@@ -2595,7 +2595,7 @@
           <wp:inline distT="0" distB="0" distL="0" distR="0">
             <wp:extent cx="3905250" cy="5495925"/>
             <wp:effectExtent t="0" r="0" b="0" l="0"/>
-            <wp:docPr id="1" name="enchainement.svg" descr="enchainement.svg" title="enchainement.svg"/>
+            <wp:docPr id="1" name="enchainement.png" descr="enchainement.png" title="enchainement.png"/>
             <wp:cNvGraphicFramePr>
               <a:graphicFrameLocks xmlns:a="http://schemas.openxmlformats.org/drawingml/2006/main" noChangeAspect="1"/>
             </wp:cNvGraphicFramePr>
@@ -6887,7 +6887,7 @@
       <w:r>
         <w:t xml:space="preserve">Le dépôt est public et contient l’intégralité du code, les scripts SQL et le README.md : </w:t>
       </w:r>
-      <w:hyperlink w:history="1" r:id="rId7x_sxk6lblfgivbihoz83">
+      <w:hyperlink w:history="1" r:id="rIducxhcu0sktg7f4udge1ck">
         <w:r>
           <w:rPr>
             <w:rStyle w:val="Hyperlink"/>
@@ -7016,7 +7016,7 @@
       <w:r>
         <w:t xml:space="preserve">Frontend (Vercel) : </w:t>
       </w:r>
-      <w:hyperlink w:history="1" r:id="rId5wtvs8rdclcfkbtr_bwzc">
+      <w:hyperlink w:history="1" r:id="rIdkt5g3lhp9a99jgqjhsxkp">
         <w:r>
           <w:rPr>
             <w:rStyle w:val="Hyperlink"/>
@@ -7032,7 +7032,7 @@
       <w:r>
         <w:t xml:space="preserve">API (Render) : </w:t>
       </w:r>
-      <w:hyperlink w:history="1" r:id="rIdhq6o_5dq7f-z_lqn_ocxs">
+      <w:hyperlink w:history="1" r:id="rId9gu_udfprf8rqgkjfwjf3">
         <w:r>
           <w:rPr>
             <w:rStyle w:val="Hyperlink"/>
@@ -7070,7 +7070,7 @@
       <w:r>
         <w:t xml:space="preserve">Fichier de maquettes (lecture publique) : </w:t>
       </w:r>
-      <w:hyperlink w:history="1" r:id="rIdfxl0czqvkgwzdgorarocm">
+      <w:hyperlink w:history="1" r:id="rIdtqbdcams81rfrwi38knhj">
         <w:r>
           <w:rPr>
             <w:rStyle w:val="Hyperlink"/>

</xml_diff>

<commit_message>
Ajoute la section sur l'environnement humain et technique et les objectifs de qualité, demandée par le référentiel d'évaluation
</commit_message>
<xml_diff>
--- a/docs/dossier-trouve-ton-artisan.docx
+++ b/docs/dossier-trouve-ton-artisan.docx
@@ -106,7 +106,7 @@
         <w:t xml:space="preserve">Date de rendu : </w:t>
       </w:r>
       <w:r>
-        <w:t xml:space="preserve">07/07/2026</w:t>
+        <w:t xml:space="preserve">19/07/2026</w:t>
       </w:r>
     </w:p>
     <w:p>
@@ -963,6 +963,46 @@
       </w:pPr>
       <w:r>
         <w:t xml:space="preserve">Fichier README.md à la racine du dépôt.</w:t>
+      </w:r>
+    </w:p>
+    <w:p>
+      <w:pPr>
+        <w:pStyle w:val="Heading2"/>
+        <w:spacing w:before="240" w:after="120"/>
+      </w:pPr>
+      <w:r>
+        <w:rPr>
+          <w:b/>
+          <w:bCs/>
+        </w:rPr>
+        <w:t xml:space="preserve">1.5 Environnement humain et technique, objectifs de qualité</w:t>
+      </w:r>
+    </w:p>
+    <w:p>
+      <w:pPr>
+        <w:spacing w:after="120"/>
+        <w:jc w:val="both"/>
+      </w:pPr>
+      <w:r>
+        <w:t xml:space="preserve">Le projet a été mené en autonomie complète, du maquettage au déploiement, dans le cadre de la formation Développeur Web et Web Mobile du Centre Européen de Formation. L'interlocuteur métier est le service de la région situé à Lyon, qui a fourni le brief, la charte graphique et les données des artisans.</w:t>
+      </w:r>
+    </w:p>
+    <w:p>
+      <w:pPr>
+        <w:spacing w:after="120"/>
+        <w:jc w:val="both"/>
+      </w:pPr>
+      <w:r>
+        <w:t xml:space="preserve">Côté technique, le développement s'est fait sous Windows 11 avec VS Code et Node.js, Git pour le versioning (dépôt GitHub public, travail par branches et pull requests), XAMPP (MySQL/MariaDB) et MongoDB en local, puis un hébergement Vercel pour le frontend, Render pour l'API et AlwaysData pour la base de données.</w:t>
+      </w:r>
+    </w:p>
+    <w:p>
+      <w:pPr>
+        <w:spacing w:after="120"/>
+        <w:jc w:val="both"/>
+      </w:pPr>
+      <w:r>
+        <w:t xml:space="preserve">Les objectifs de qualité fixés en début de projet : accessibilité conforme WCAG 2.1 / RGAA, fonctionnement mobile, tablette et ordinateur (approche mobile-first), sécurité alignée sur les recommandations de l'OWASP, tests automatisés de l'API (Mocha) et documentation complète du projet (README, scripts SQL, dossier technique).</w:t>
       </w:r>
     </w:p>
     <w:p>
@@ -1723,7 +1763,7 @@
       <w:r>
         <w:t xml:space="preserve">Maquettes complètes (consultation publique) : </w:t>
       </w:r>
-      <w:hyperlink w:history="1" r:id="rId5exfm0ghv2gadhqkhxpfq">
+      <w:hyperlink w:history="1" r:id="rIdbfxk7upnhrxsbbfrdc6rk">
         <w:r>
           <w:rPr>
             <w:rStyle w:val="Hyperlink"/>
@@ -6887,7 +6927,7 @@
       <w:r>
         <w:t xml:space="preserve">Le dépôt est public et contient l’intégralité du code, les scripts SQL et le README.md : </w:t>
       </w:r>
-      <w:hyperlink w:history="1" r:id="rIducxhcu0sktg7f4udge1ck">
+      <w:hyperlink w:history="1" r:id="rIdbmn1p_kfae4588kuejvyj">
         <w:r>
           <w:rPr>
             <w:rStyle w:val="Hyperlink"/>
@@ -7016,7 +7056,7 @@
       <w:r>
         <w:t xml:space="preserve">Frontend (Vercel) : </w:t>
       </w:r>
-      <w:hyperlink w:history="1" r:id="rIdkt5g3lhp9a99jgqjhsxkp">
+      <w:hyperlink w:history="1" r:id="rIdoi1lbm2myv1uxcfgrsyxv">
         <w:r>
           <w:rPr>
             <w:rStyle w:val="Hyperlink"/>
@@ -7032,7 +7072,7 @@
       <w:r>
         <w:t xml:space="preserve">API (Render) : </w:t>
       </w:r>
-      <w:hyperlink w:history="1" r:id="rId9gu_udfprf8rqgkjfwjf3">
+      <w:hyperlink w:history="1" r:id="rIdkykmnc6_1m7vvj0agfmg-">
         <w:r>
           <w:rPr>
             <w:rStyle w:val="Hyperlink"/>
@@ -7070,7 +7110,7 @@
       <w:r>
         <w:t xml:space="preserve">Fichier de maquettes (lecture publique) : </w:t>
       </w:r>
-      <w:hyperlink w:history="1" r:id="rIdtqbdcams81rfrwi38knhj">
+      <w:hyperlink w:history="1" r:id="rIdbf5doxe2x2cmv3th4lz-b">
         <w:r>
           <w:rPr>
             <w:rStyle w:val="Hyperlink"/>
@@ -7116,7 +7156,7 @@
       <w:rPr>
         <w:color w:val="384050"/>
       </w:rPr>
-      <w:t xml:space="preserve">07/07/2026</w:t>
+      <w:t xml:space="preserve">19/07/2026</w:t>
     </w:r>
     <w:r>
       <w:rPr>

</xml_diff>

<commit_message>
Met à jour la date de rendu du dossier (19/07/2026)
</commit_message>
<xml_diff>
--- a/docs/dossier-trouve-ton-artisan.docx
+++ b/docs/dossier-trouve-ton-artisan.docx
@@ -1763,7 +1763,7 @@
       <w:r>
         <w:t xml:space="preserve">Maquettes complètes (consultation publique) : </w:t>
       </w:r>
-      <w:hyperlink w:history="1" r:id="rIdbfxk7upnhrxsbbfrdc6rk">
+      <w:hyperlink w:history="1" r:id="rIdvqfpmmhilp1a4n08o3_26">
         <w:r>
           <w:rPr>
             <w:rStyle w:val="Hyperlink"/>
@@ -6927,7 +6927,7 @@
       <w:r>
         <w:t xml:space="preserve">Le dépôt est public et contient l’intégralité du code, les scripts SQL et le README.md : </w:t>
       </w:r>
-      <w:hyperlink w:history="1" r:id="rIdbmn1p_kfae4588kuejvyj">
+      <w:hyperlink w:history="1" r:id="rIdcsl1tge6jlw4wz3l-sqn1">
         <w:r>
           <w:rPr>
             <w:rStyle w:val="Hyperlink"/>
@@ -7056,7 +7056,7 @@
       <w:r>
         <w:t xml:space="preserve">Frontend (Vercel) : </w:t>
       </w:r>
-      <w:hyperlink w:history="1" r:id="rIdoi1lbm2myv1uxcfgrsyxv">
+      <w:hyperlink w:history="1" r:id="rIdcwkwzrrithk56_2kt5uuw">
         <w:r>
           <w:rPr>
             <w:rStyle w:val="Hyperlink"/>
@@ -7072,7 +7072,7 @@
       <w:r>
         <w:t xml:space="preserve">API (Render) : </w:t>
       </w:r>
-      <w:hyperlink w:history="1" r:id="rIdkykmnc6_1m7vvj0agfmg-">
+      <w:hyperlink w:history="1" r:id="rId3w4uyac59cy4qbf94ttaz">
         <w:r>
           <w:rPr>
             <w:rStyle w:val="Hyperlink"/>
@@ -7110,7 +7110,7 @@
       <w:r>
         <w:t xml:space="preserve">Fichier de maquettes (lecture publique) : </w:t>
       </w:r>
-      <w:hyperlink w:history="1" r:id="rIdbf5doxe2x2cmv3th4lz-b">
+      <w:hyperlink w:history="1" r:id="rIdnitn9ow7gpknouarknbpi">
         <w:r>
           <w:rPr>
             <w:rStyle w:val="Hyperlink"/>

</xml_diff>

<commit_message>
Détaille l'environnement humain (travail en autonomie complète) et énumère l'outillage technique du projet
</commit_message>
<xml_diff>
--- a/docs/dossier-trouve-ton-artisan.docx
+++ b/docs/dossier-trouve-ton-artisan.docx
@@ -984,7 +984,7 @@
         <w:jc w:val="both"/>
       </w:pPr>
       <w:r>
-        <w:t xml:space="preserve">Le projet a été mené en autonomie complète, du maquettage au déploiement, dans le cadre de la formation Développeur Web et Web Mobile du Centre Européen de Formation. L'interlocuteur métier est le service de la région situé à Lyon, qui a fourni le brief, la charte graphique et les données des artisans.</w:t>
+        <w:t xml:space="preserve">L'ensemble du projet a été réalisé par un seul développeur, en autonomie complète : maquettage, développement front-end et back-end, mise en place des bases de données, tests, déploiement et rédaction des livrables. Ce travail s'inscrit dans la formation Développeur Web et Web Mobile du Centre Européen de Formation. L'interlocuteur métier est le service de la région situé à Lyon, qui a fourni le brief, la charte graphique et les données des artisans.</w:t>
       </w:r>
     </w:p>
     <w:p>
@@ -993,7 +993,137 @@
         <w:jc w:val="both"/>
       </w:pPr>
       <w:r>
-        <w:t xml:space="preserve">Côté technique, le développement s'est fait sous Windows 11 avec VS Code et Node.js, Git pour le versioning (dépôt GitHub public, travail par branches et pull requests), XAMPP (MySQL/MariaDB) et MongoDB en local, puis un hébergement Vercel pour le frontend, Render pour l'API et AlwaysData pour la base de données.</w:t>
+        <w:t xml:space="preserve">L'environnement technique s'articule autour d'un PC sous Windows 11, avec les outils suivants :</w:t>
+      </w:r>
+    </w:p>
+    <w:p>
+      <w:pPr>
+        <w:pStyle w:val="ListParagraph"/>
+        <w:numPr>
+          <w:ilvl w:val="0"/>
+          <w:numId w:val="2"/>
+        </w:numPr>
+        <w:spacing w:after="80"/>
+      </w:pPr>
+      <w:r>
+        <w:t xml:space="preserve">Visual Studio Code : éditeur de code.</w:t>
+      </w:r>
+    </w:p>
+    <w:p>
+      <w:pPr>
+        <w:pStyle w:val="ListParagraph"/>
+        <w:numPr>
+          <w:ilvl w:val="0"/>
+          <w:numId w:val="2"/>
+        </w:numPr>
+        <w:spacing w:after="80"/>
+      </w:pPr>
+      <w:r>
+        <w:t xml:space="preserve">Node.js et npm : exécution du serveur et gestion des dépendances.</w:t>
+      </w:r>
+    </w:p>
+    <w:p>
+      <w:pPr>
+        <w:pStyle w:val="ListParagraph"/>
+        <w:numPr>
+          <w:ilvl w:val="0"/>
+          <w:numId w:val="2"/>
+        </w:numPr>
+        <w:spacing w:after="80"/>
+      </w:pPr>
+      <w:r>
+        <w:t xml:space="preserve">Git et GitHub : versioning, travail par branches et pull requests, dépôt public.</w:t>
+      </w:r>
+    </w:p>
+    <w:p>
+      <w:pPr>
+        <w:pStyle w:val="ListParagraph"/>
+        <w:numPr>
+          <w:ilvl w:val="0"/>
+          <w:numId w:val="2"/>
+        </w:numPr>
+        <w:spacing w:after="80"/>
+      </w:pPr>
+      <w:r>
+        <w:t xml:space="preserve">XAMPP : serveur MySQL/MariaDB local, administré via phpMyAdmin.</w:t>
+      </w:r>
+    </w:p>
+    <w:p>
+      <w:pPr>
+        <w:pStyle w:val="ListParagraph"/>
+        <w:numPr>
+          <w:ilvl w:val="0"/>
+          <w:numId w:val="2"/>
+        </w:numPr>
+        <w:spacing w:after="80"/>
+      </w:pPr>
+      <w:r>
+        <w:t xml:space="preserve">MongoDB Community Server : base NoSQL locale pour les avis clients.</w:t>
+      </w:r>
+    </w:p>
+    <w:p>
+      <w:pPr>
+        <w:pStyle w:val="ListParagraph"/>
+        <w:numPr>
+          <w:ilvl w:val="0"/>
+          <w:numId w:val="2"/>
+        </w:numPr>
+        <w:spacing w:after="80"/>
+      </w:pPr>
+      <w:r>
+        <w:t xml:space="preserve">Figma : réalisation des maquettes dans les trois résolutions.</w:t>
+      </w:r>
+    </w:p>
+    <w:p>
+      <w:pPr>
+        <w:pStyle w:val="ListParagraph"/>
+        <w:numPr>
+          <w:ilvl w:val="0"/>
+          <w:numId w:val="2"/>
+        </w:numPr>
+        <w:spacing w:after="80"/>
+      </w:pPr>
+      <w:r>
+        <w:t xml:space="preserve">Mocha, Chai et Supertest : tests automatisés de l'API.</w:t>
+      </w:r>
+    </w:p>
+    <w:p>
+      <w:pPr>
+        <w:pStyle w:val="ListParagraph"/>
+        <w:numPr>
+          <w:ilvl w:val="0"/>
+          <w:numId w:val="2"/>
+        </w:numPr>
+        <w:spacing w:after="80"/>
+      </w:pPr>
+      <w:r>
+        <w:t xml:space="preserve">Navigateurs et leurs outils de développement : vérification du responsive et de l'accessibilité.</w:t>
+      </w:r>
+    </w:p>
+    <w:p>
+      <w:pPr>
+        <w:pStyle w:val="ListParagraph"/>
+        <w:numPr>
+          <w:ilvl w:val="0"/>
+          <w:numId w:val="2"/>
+        </w:numPr>
+        <w:spacing w:after="80"/>
+      </w:pPr>
+      <w:r>
+        <w:t xml:space="preserve">Vercel, Render et AlwaysData : hébergement du frontend, de l'API et de la base de données.</w:t>
+      </w:r>
+    </w:p>
+    <w:p>
+      <w:pPr>
+        <w:pStyle w:val="ListParagraph"/>
+        <w:numPr>
+          <w:ilvl w:val="0"/>
+          <w:numId w:val="2"/>
+        </w:numPr>
+        <w:spacing w:after="80"/>
+      </w:pPr>
+      <w:r>
+        <w:t xml:space="preserve">Word et PowerPoint : rédaction du dossier de projet et du support de présentation.</w:t>
       </w:r>
     </w:p>
     <w:p>
@@ -1763,7 +1893,7 @@
       <w:r>
         <w:t xml:space="preserve">Maquettes complètes (consultation publique) : </w:t>
       </w:r>
-      <w:hyperlink w:history="1" r:id="rIdvqfpmmhilp1a4n08o3_26">
+      <w:hyperlink w:history="1" r:id="rIdhjbzlllocso0ldtayco0y">
         <w:r>
           <w:rPr>
             <w:rStyle w:val="Hyperlink"/>
@@ -6927,7 +7057,7 @@
       <w:r>
         <w:t xml:space="preserve">Le dépôt est public et contient l’intégralité du code, les scripts SQL et le README.md : </w:t>
       </w:r>
-      <w:hyperlink w:history="1" r:id="rIdcsl1tge6jlw4wz3l-sqn1">
+      <w:hyperlink w:history="1" r:id="rIdo0bobxrah7jzdi-gao-wz">
         <w:r>
           <w:rPr>
             <w:rStyle w:val="Hyperlink"/>
@@ -7056,7 +7186,7 @@
       <w:r>
         <w:t xml:space="preserve">Frontend (Vercel) : </w:t>
       </w:r>
-      <w:hyperlink w:history="1" r:id="rIdcwkwzrrithk56_2kt5uuw">
+      <w:hyperlink w:history="1" r:id="rId3b4wlzw71ovj-xcl2snao">
         <w:r>
           <w:rPr>
             <w:rStyle w:val="Hyperlink"/>
@@ -7072,7 +7202,7 @@
       <w:r>
         <w:t xml:space="preserve">API (Render) : </w:t>
       </w:r>
-      <w:hyperlink w:history="1" r:id="rId3w4uyac59cy4qbf94ttaz">
+      <w:hyperlink w:history="1" r:id="rIdhj4-7vmgvp0ofcqezll8x">
         <w:r>
           <w:rPr>
             <w:rStyle w:val="Hyperlink"/>
@@ -7110,7 +7240,7 @@
       <w:r>
         <w:t xml:space="preserve">Fichier de maquettes (lecture publique) : </w:t>
       </w:r>
-      <w:hyperlink w:history="1" r:id="rIdnitn9ow7gpknouarknbpi">
+      <w:hyperlink w:history="1" r:id="rId3sswriukvwejmydulve_b">
         <w:r>
           <w:rPr>
             <w:rStyle w:val="Hyperlink"/>

</xml_diff>

<commit_message>
Améliore la mise en page du dossier : titres solidaires de leur contenu, captures mobile et tablette côte à côte, tableaux insécables et texte plus aéré
</commit_message>
<xml_diff>
--- a/docs/dossier-trouve-ton-artisan.docx
+++ b/docs/dossier-trouve-ton-artisan.docx
@@ -106,7 +106,7 @@
         <w:t xml:space="preserve">Date de rendu : </w:t>
       </w:r>
       <w:r>
-        <w:t xml:space="preserve">19/07/2026</w:t>
+        <w:t xml:space="preserve">20/07/2026</w:t>
       </w:r>
     </w:p>
     <w:p>
@@ -133,6 +133,8 @@
     <w:p>
       <w:pPr>
         <w:pStyle w:val="Heading1"/>
+        <w:keepNext/>
+        <w:keepLines/>
         <w:spacing w:before="360" w:after="180"/>
       </w:pPr>
       <w:r>
@@ -170,6 +172,8 @@
     <w:p>
       <w:pPr>
         <w:pStyle w:val="Heading1"/>
+        <w:keepNext/>
+        <w:keepLines/>
         <w:spacing w:before="360" w:after="180"/>
       </w:pPr>
       <w:r>
@@ -182,7 +186,7 @@
     </w:p>
     <w:p>
       <w:pPr>
-        <w:spacing w:after="120"/>
+        <w:spacing w:after="200" w:line="276"/>
         <w:jc w:val="both"/>
       </w:pPr>
       <w:r>
@@ -192,6 +196,8 @@
     <w:p>
       <w:pPr>
         <w:pStyle w:val="Heading2"/>
+        <w:keepNext/>
+        <w:keepLines/>
         <w:spacing w:before="240" w:after="120"/>
       </w:pPr>
       <w:r>
@@ -220,6 +226,7 @@
       </w:tblGrid>
       <w:tr>
         <w:trPr>
+          <w:cantSplit/>
           <w:tblHeader/>
         </w:trPr>
         <w:tc>
@@ -240,6 +247,9 @@
             </w:tcMar>
           </w:tcPr>
           <w:p>
+            <w:pPr>
+              <w:keepNext/>
+            </w:pPr>
             <w:r>
               <w:rPr>
                 <w:b/>
@@ -268,6 +278,9 @@
             </w:tcMar>
           </w:tcPr>
           <w:p>
+            <w:pPr>
+              <w:keepNext/>
+            </w:pPr>
             <w:r>
               <w:rPr>
                 <w:b/>
@@ -280,6 +293,9 @@
         </w:tc>
       </w:tr>
       <w:tr>
+        <w:trPr>
+          <w:cantSplit/>
+        </w:trPr>
         <w:tc>
           <w:tcPr>
             <w:tcW w:type="dxa" w:w="3200"/>
@@ -297,6 +313,9 @@
             </w:tcMar>
           </w:tcPr>
           <w:p>
+            <w:pPr>
+              <w:keepNext/>
+            </w:pPr>
             <w:r>
               <w:t xml:space="preserve">Maquetter des interfaces utilisateur web ou web mobile</w:t>
             </w:r>
@@ -319,6 +338,9 @@
             </w:tcMar>
           </w:tcPr>
           <w:p>
+            <w:pPr>
+              <w:keepNext/>
+            </w:pPr>
             <w:r>
               <w:t xml:space="preserve">Maquettes Figma en mobile-first pour les trois résolutions (mobile 375 px, tablette 768 px, ordinateur 1280 px), charte graphique respectée, schéma d'enchaînement des écrans.</w:t>
             </w:r>
@@ -326,6 +348,9 @@
         </w:tc>
       </w:tr>
       <w:tr>
+        <w:trPr>
+          <w:cantSplit/>
+        </w:trPr>
         <w:tc>
           <w:tcPr>
             <w:tcW w:type="dxa" w:w="3200"/>
@@ -343,6 +368,9 @@
             </w:tcMar>
           </w:tcPr>
           <w:p>
+            <w:pPr>
+              <w:keepNext/>
+            </w:pPr>
             <w:r>
               <w:t xml:space="preserve">Réaliser des interfaces utilisateur statiques web ou web mobile</w:t>
             </w:r>
@@ -365,6 +393,9 @@
             </w:tcMar>
           </w:tcPr>
           <w:p>
+            <w:pPr>
+              <w:keepNext/>
+            </w:pPr>
             <w:r>
               <w:t xml:space="preserve">Composants React structurés, Bootstrap 5 et Sass, HTML sémantique, mise en page responsive, accessibilité WCAG 2.1 (lien d'évitement, attributs ARIA, focus visible).</w:t>
             </w:r>
@@ -372,6 +403,9 @@
         </w:tc>
       </w:tr>
       <w:tr>
+        <w:trPr>
+          <w:cantSplit/>
+        </w:trPr>
         <w:tc>
           <w:tcPr>
             <w:tcW w:type="dxa" w:w="3200"/>
@@ -389,6 +423,9 @@
             </w:tcMar>
           </w:tcPr>
           <w:p>
+            <w:pPr>
+              <w:keepNext w:val="false"/>
+            </w:pPr>
             <w:r>
               <w:t xml:space="preserve">Développer la partie dynamique des interfaces utilisateur web ou web mobile</w:t>
             </w:r>
@@ -411,6 +448,9 @@
             </w:tcMar>
           </w:tcPr>
           <w:p>
+            <w:pPr>
+              <w:keepNext w:val="false"/>
+            </w:pPr>
             <w:r>
               <w:t xml:space="preserve">React (hooks d'état et d'effet), consommation de l'API REST via un client fetch centralisé, formulaires dynamiques (contact et avis) avec validation côté client.</w:t>
             </w:r>
@@ -421,6 +461,8 @@
     <w:p>
       <w:pPr>
         <w:pStyle w:val="Heading2"/>
+        <w:keepNext/>
+        <w:keepLines/>
         <w:spacing w:before="240" w:after="120"/>
       </w:pPr>
       <w:r>
@@ -449,6 +491,7 @@
       </w:tblGrid>
       <w:tr>
         <w:trPr>
+          <w:cantSplit/>
           <w:tblHeader/>
         </w:trPr>
         <w:tc>
@@ -469,6 +512,9 @@
             </w:tcMar>
           </w:tcPr>
           <w:p>
+            <w:pPr>
+              <w:keepNext/>
+            </w:pPr>
             <w:r>
               <w:rPr>
                 <w:b/>
@@ -497,6 +543,9 @@
             </w:tcMar>
           </w:tcPr>
           <w:p>
+            <w:pPr>
+              <w:keepNext/>
+            </w:pPr>
             <w:r>
               <w:rPr>
                 <w:b/>
@@ -509,6 +558,9 @@
         </w:tc>
       </w:tr>
       <w:tr>
+        <w:trPr>
+          <w:cantSplit/>
+        </w:trPr>
         <w:tc>
           <w:tcPr>
             <w:tcW w:type="dxa" w:w="3200"/>
@@ -526,6 +578,9 @@
             </w:tcMar>
           </w:tcPr>
           <w:p>
+            <w:pPr>
+              <w:keepNext/>
+            </w:pPr>
             <w:r>
               <w:t xml:space="preserve">Mettre en place une base de données relationnelle</w:t>
             </w:r>
@@ -548,6 +603,9 @@
             </w:tcMar>
           </w:tcPr>
           <w:p>
+            <w:pPr>
+              <w:keepNext/>
+            </w:pPr>
             <w:r>
               <w:t xml:space="preserve">MySQL/MariaDB : MCD, MLD et modèle physique, respect des trois formes normales, contraintes (clés étrangères, CHECK, UNIQUE), vue de lecture, scripts de création et d'alimentation.</w:t>
             </w:r>
@@ -555,6 +613,9 @@
         </w:tc>
       </w:tr>
       <w:tr>
+        <w:trPr>
+          <w:cantSplit/>
+        </w:trPr>
         <w:tc>
           <w:tcPr>
             <w:tcW w:type="dxa" w:w="3200"/>
@@ -572,6 +633,9 @@
             </w:tcMar>
           </w:tcPr>
           <w:p>
+            <w:pPr>
+              <w:keepNext/>
+            </w:pPr>
             <w:r>
               <w:t xml:space="preserve">Développer des composants d'accès aux données SQL et NoSQL</w:t>
             </w:r>
@@ -594,6 +658,9 @@
             </w:tcMar>
           </w:tcPr>
           <w:p>
+            <w:pPr>
+              <w:keepNext/>
+            </w:pPr>
             <w:r>
               <w:t xml:space="preserve">Couche services dédiée : accès SQL via Sequelize (artisans, catégories, villes) ET accès NoSQL via Mongoose (avis clients stockés dans MongoDB).</w:t>
             </w:r>
@@ -601,6 +668,9 @@
         </w:tc>
       </w:tr>
       <w:tr>
+        <w:trPr>
+          <w:cantSplit/>
+        </w:trPr>
         <w:tc>
           <w:tcPr>
             <w:tcW w:type="dxa" w:w="3200"/>
@@ -618,6 +688,9 @@
             </w:tcMar>
           </w:tcPr>
           <w:p>
+            <w:pPr>
+              <w:keepNext w:val="false"/>
+            </w:pPr>
             <w:r>
               <w:t xml:space="preserve">Développer des composants métier côté serveur</w:t>
             </w:r>
@@ -640,6 +713,9 @@
             </w:tcMar>
           </w:tcPr>
           <w:p>
+            <w:pPr>
+              <w:keepNext w:val="false"/>
+            </w:pPr>
             <w:r>
               <w:t xml:space="preserve">Architecture en couches (routes → contrôleurs → services → modèles), logique métier isolée dans les services, validation, sécurité et gestion centralisée des erreurs.</w:t>
             </w:r>
@@ -649,7 +725,7 @@
     </w:tbl>
     <w:p>
       <w:pPr>
-        <w:spacing w:after="120"/>
+        <w:spacing w:after="200" w:line="276"/>
         <w:jc w:val="both"/>
       </w:pPr>
       <w:r>
@@ -668,6 +744,8 @@
     <w:p>
       <w:pPr>
         <w:pStyle w:val="Heading1"/>
+        <w:keepNext/>
+        <w:keepLines/>
         <w:spacing w:before="360" w:after="180"/>
       </w:pPr>
       <w:r>
@@ -681,6 +759,8 @@
     <w:p>
       <w:pPr>
         <w:pStyle w:val="Heading2"/>
+        <w:keepNext/>
+        <w:keepLines/>
         <w:spacing w:before="240" w:after="120"/>
       </w:pPr>
       <w:r>
@@ -693,7 +773,7 @@
     </w:p>
     <w:p>
       <w:pPr>
-        <w:spacing w:after="120"/>
+        <w:spacing w:after="200" w:line="276"/>
         <w:jc w:val="both"/>
       </w:pPr>
       <w:r>
@@ -702,7 +782,7 @@
     </w:p>
     <w:p>
       <w:pPr>
-        <w:spacing w:after="120"/>
+        <w:spacing w:after="200" w:line="276"/>
         <w:jc w:val="both"/>
       </w:pPr>
       <w:r>
@@ -712,6 +792,8 @@
     <w:p>
       <w:pPr>
         <w:pStyle w:val="Heading2"/>
+        <w:keepNext/>
+        <w:keepLines/>
         <w:spacing w:before="240" w:after="120"/>
       </w:pPr>
       <w:r>
@@ -724,7 +806,7 @@
     </w:p>
     <w:p>
       <w:pPr>
-        <w:spacing w:after="120"/>
+        <w:spacing w:after="200" w:line="276"/>
         <w:jc w:val="both"/>
       </w:pPr>
       <w:r>
@@ -738,7 +820,7 @@
           <w:ilvl w:val="0"/>
           <w:numId w:val="2"/>
         </w:numPr>
-        <w:spacing w:after="80"/>
+        <w:spacing w:after="120" w:line="276"/>
       </w:pPr>
       <w:r>
         <w:t xml:space="preserve">À un particulier de trouver un artisan par catégorie ou par nom.</w:t>
@@ -751,7 +833,7 @@
           <w:ilvl w:val="0"/>
           <w:numId w:val="2"/>
         </w:numPr>
-        <w:spacing w:after="80"/>
+        <w:spacing w:after="120" w:line="276"/>
       </w:pPr>
       <w:r>
         <w:t xml:space="preserve">De consulter la fiche détaillée d’un artisan (note, spécialité, localisation, à propos, site web).</w:t>
@@ -764,7 +846,7 @@
           <w:ilvl w:val="0"/>
           <w:numId w:val="2"/>
         </w:numPr>
-        <w:spacing w:after="80"/>
+        <w:spacing w:after="120" w:line="276"/>
       </w:pPr>
       <w:r>
         <w:t xml:space="preserve">De contacter directement un artisan via un formulaire de contact (réponse sous 48 h).</w:t>
@@ -777,7 +859,7 @@
           <w:ilvl w:val="0"/>
           <w:numId w:val="2"/>
         </w:numPr>
-        <w:spacing w:after="80"/>
+        <w:spacing w:after="120" w:line="276"/>
       </w:pPr>
       <w:r>
         <w:t xml:space="preserve">De mettre en avant trois « artisans du mois » sur la page d’accueil.</w:t>
@@ -786,6 +868,8 @@
     <w:p>
       <w:pPr>
         <w:pStyle w:val="Heading2"/>
+        <w:keepNext/>
+        <w:keepLines/>
         <w:spacing w:before="240" w:after="120"/>
       </w:pPr>
       <w:r>
@@ -803,7 +887,7 @@
           <w:ilvl w:val="0"/>
           <w:numId w:val="2"/>
         </w:numPr>
-        <w:spacing w:after="80"/>
+        <w:spacing w:after="120" w:line="276"/>
       </w:pPr>
       <w:r>
         <w:t xml:space="preserve">Site accessible à tous (jeunes, personnes âgées, personnes en situation de handicap) : norme WCAG 2.1.</w:t>
@@ -816,7 +900,7 @@
           <w:ilvl w:val="0"/>
           <w:numId w:val="2"/>
         </w:numPr>
-        <w:spacing w:after="80"/>
+        <w:spacing w:after="120" w:line="276"/>
       </w:pPr>
       <w:r>
         <w:t xml:space="preserve">Conception mobile-first, fonctionnement optimal sur mobile, tablette et ordinateur.</w:t>
@@ -829,7 +913,7 @@
           <w:ilvl w:val="0"/>
           <w:numId w:val="2"/>
         </w:numPr>
-        <w:spacing w:after="80"/>
+        <w:spacing w:after="120" w:line="276"/>
       </w:pPr>
       <w:r>
         <w:t xml:space="preserve">Sécurité renforcée (collectivité publique).</w:t>
@@ -842,7 +926,7 @@
           <w:ilvl w:val="0"/>
           <w:numId w:val="2"/>
         </w:numPr>
-        <w:spacing w:after="80"/>
+        <w:spacing w:after="120" w:line="276"/>
       </w:pPr>
       <w:r>
         <w:t xml:space="preserve">Cohérence visuelle avec le site de la région Auvergne-Rhône-Alpes.</w:t>
@@ -855,7 +939,7 @@
           <w:ilvl w:val="0"/>
           <w:numId w:val="2"/>
         </w:numPr>
-        <w:spacing w:after="80"/>
+        <w:spacing w:after="120" w:line="276"/>
       </w:pPr>
       <w:r>
         <w:t xml:space="preserve">Stack : React + Bootstrap + Sass (front) ; Node.js + Express + Sequelize avec MySQL/MariaDB, et MongoDB/Mongoose pour les avis (back).</w:t>
@@ -868,7 +952,7 @@
           <w:ilvl w:val="0"/>
           <w:numId w:val="2"/>
         </w:numPr>
-        <w:spacing w:after="80"/>
+        <w:spacing w:after="120" w:line="276"/>
       </w:pPr>
       <w:r>
         <w:t xml:space="preserve">Versioning sur GitHub, dépôt public.</w:t>
@@ -881,7 +965,7 @@
           <w:ilvl w:val="0"/>
           <w:numId w:val="2"/>
         </w:numPr>
-        <w:spacing w:after="80"/>
+        <w:spacing w:after="120" w:line="276"/>
       </w:pPr>
       <w:r>
         <w:t xml:space="preserve">Accès à l’API restreint à l’application.</w:t>
@@ -890,6 +974,8 @@
     <w:p>
       <w:pPr>
         <w:pStyle w:val="Heading2"/>
+        <w:keepNext/>
+        <w:keepLines/>
         <w:spacing w:before="240" w:after="120"/>
       </w:pPr>
       <w:r>
@@ -907,7 +993,7 @@
           <w:ilvl w:val="0"/>
           <w:numId w:val="2"/>
         </w:numPr>
-        <w:spacing w:after="80"/>
+        <w:spacing w:after="120" w:line="276"/>
       </w:pPr>
       <w:r>
         <w:t xml:space="preserve">Dossier PDF (ce document) : contexte, maquettes, BDD, sécurité, veille, liens.</w:t>
@@ -920,7 +1006,7 @@
           <w:ilvl w:val="0"/>
           <w:numId w:val="2"/>
         </w:numPr>
-        <w:spacing w:after="80"/>
+        <w:spacing w:after="120" w:line="276"/>
       </w:pPr>
       <w:r>
         <w:t xml:space="preserve">Maquettes Figma pour mobile, tablette et ordinateur.</w:t>
@@ -933,7 +1019,7 @@
           <w:ilvl w:val="0"/>
           <w:numId w:val="2"/>
         </w:numPr>
-        <w:spacing w:after="80"/>
+        <w:spacing w:after="120" w:line="276"/>
       </w:pPr>
       <w:r>
         <w:t xml:space="preserve">Lien vers le dépôt GitHub public contenant code + scripts SQL.</w:t>
@@ -946,7 +1032,7 @@
           <w:ilvl w:val="0"/>
           <w:numId w:val="2"/>
         </w:numPr>
-        <w:spacing w:after="80"/>
+        <w:spacing w:after="120" w:line="276"/>
       </w:pPr>
       <w:r>
         <w:t xml:space="preserve">Lien vers le site déployé en ligne.</w:t>
@@ -959,7 +1045,7 @@
           <w:ilvl w:val="0"/>
           <w:numId w:val="2"/>
         </w:numPr>
-        <w:spacing w:after="80"/>
+        <w:spacing w:after="120" w:line="276"/>
       </w:pPr>
       <w:r>
         <w:t xml:space="preserve">Fichier README.md à la racine du dépôt.</w:t>
@@ -968,6 +1054,8 @@
     <w:p>
       <w:pPr>
         <w:pStyle w:val="Heading2"/>
+        <w:keepNext/>
+        <w:keepLines/>
         <w:spacing w:before="240" w:after="120"/>
       </w:pPr>
       <w:r>
@@ -980,7 +1068,7 @@
     </w:p>
     <w:p>
       <w:pPr>
-        <w:spacing w:after="120"/>
+        <w:spacing w:after="200" w:line="276"/>
         <w:jc w:val="both"/>
       </w:pPr>
       <w:r>
@@ -989,7 +1077,7 @@
     </w:p>
     <w:p>
       <w:pPr>
-        <w:spacing w:after="120"/>
+        <w:spacing w:after="200" w:line="276"/>
         <w:jc w:val="both"/>
       </w:pPr>
       <w:r>
@@ -1003,7 +1091,7 @@
           <w:ilvl w:val="0"/>
           <w:numId w:val="2"/>
         </w:numPr>
-        <w:spacing w:after="80"/>
+        <w:spacing w:after="120" w:line="276"/>
       </w:pPr>
       <w:r>
         <w:t xml:space="preserve">Visual Studio Code : éditeur de code.</w:t>
@@ -1016,7 +1104,7 @@
           <w:ilvl w:val="0"/>
           <w:numId w:val="2"/>
         </w:numPr>
-        <w:spacing w:after="80"/>
+        <w:spacing w:after="120" w:line="276"/>
       </w:pPr>
       <w:r>
         <w:t xml:space="preserve">Node.js et npm : exécution du serveur et gestion des dépendances.</w:t>
@@ -1029,7 +1117,7 @@
           <w:ilvl w:val="0"/>
           <w:numId w:val="2"/>
         </w:numPr>
-        <w:spacing w:after="80"/>
+        <w:spacing w:after="120" w:line="276"/>
       </w:pPr>
       <w:r>
         <w:t xml:space="preserve">Git et GitHub : versioning, travail par branches et pull requests, dépôt public.</w:t>
@@ -1042,7 +1130,7 @@
           <w:ilvl w:val="0"/>
           <w:numId w:val="2"/>
         </w:numPr>
-        <w:spacing w:after="80"/>
+        <w:spacing w:after="120" w:line="276"/>
       </w:pPr>
       <w:r>
         <w:t xml:space="preserve">XAMPP : serveur MySQL/MariaDB local, administré via phpMyAdmin.</w:t>
@@ -1055,7 +1143,7 @@
           <w:ilvl w:val="0"/>
           <w:numId w:val="2"/>
         </w:numPr>
-        <w:spacing w:after="80"/>
+        <w:spacing w:after="120" w:line="276"/>
       </w:pPr>
       <w:r>
         <w:t xml:space="preserve">MongoDB Community Server : base NoSQL locale pour les avis clients.</w:t>
@@ -1068,7 +1156,7 @@
           <w:ilvl w:val="0"/>
           <w:numId w:val="2"/>
         </w:numPr>
-        <w:spacing w:after="80"/>
+        <w:spacing w:after="120" w:line="276"/>
       </w:pPr>
       <w:r>
         <w:t xml:space="preserve">Figma : réalisation des maquettes dans les trois résolutions.</w:t>
@@ -1081,7 +1169,7 @@
           <w:ilvl w:val="0"/>
           <w:numId w:val="2"/>
         </w:numPr>
-        <w:spacing w:after="80"/>
+        <w:spacing w:after="120" w:line="276"/>
       </w:pPr>
       <w:r>
         <w:t xml:space="preserve">Mocha, Chai et Supertest : tests automatisés de l'API.</w:t>
@@ -1094,7 +1182,7 @@
           <w:ilvl w:val="0"/>
           <w:numId w:val="2"/>
         </w:numPr>
-        <w:spacing w:after="80"/>
+        <w:spacing w:after="120" w:line="276"/>
       </w:pPr>
       <w:r>
         <w:t xml:space="preserve">Navigateurs et leurs outils de développement : vérification du responsive et de l'accessibilité.</w:t>
@@ -1107,7 +1195,7 @@
           <w:ilvl w:val="0"/>
           <w:numId w:val="2"/>
         </w:numPr>
-        <w:spacing w:after="80"/>
+        <w:spacing w:after="120" w:line="276"/>
       </w:pPr>
       <w:r>
         <w:t xml:space="preserve">Vercel, Render et AlwaysData : hébergement du frontend, de l'API et de la base de données.</w:t>
@@ -1120,7 +1208,7 @@
           <w:ilvl w:val="0"/>
           <w:numId w:val="2"/>
         </w:numPr>
-        <w:spacing w:after="80"/>
+        <w:spacing w:after="120" w:line="276"/>
       </w:pPr>
       <w:r>
         <w:t xml:space="preserve">Word et PowerPoint : rédaction du dossier de projet et du support de présentation.</w:t>
@@ -1128,7 +1216,7 @@
     </w:p>
     <w:p>
       <w:pPr>
-        <w:spacing w:after="120"/>
+        <w:spacing w:after="200" w:line="276"/>
         <w:jc w:val="both"/>
       </w:pPr>
       <w:r>
@@ -1143,6 +1231,8 @@
     <w:p>
       <w:pPr>
         <w:pStyle w:val="Heading1"/>
+        <w:keepNext/>
+        <w:keepLines/>
         <w:spacing w:before="360" w:after="180"/>
       </w:pPr>
       <w:r>
@@ -1155,7 +1245,7 @@
     </w:p>
     <w:p>
       <w:pPr>
-        <w:spacing w:after="120"/>
+        <w:spacing w:after="200" w:line="276"/>
         <w:jc w:val="both"/>
       </w:pPr>
       <w:r>
@@ -1165,6 +1255,8 @@
     <w:p>
       <w:pPr>
         <w:pStyle w:val="Heading2"/>
+        <w:keepNext/>
+        <w:keepLines/>
         <w:spacing w:before="240" w:after="120"/>
       </w:pPr>
       <w:r>
@@ -1195,6 +1287,7 @@
       </w:tblGrid>
       <w:tr>
         <w:trPr>
+          <w:cantSplit/>
           <w:tblHeader/>
         </w:trPr>
         <w:tc>
@@ -1215,6 +1308,9 @@
             </w:tcMar>
           </w:tcPr>
           <w:p>
+            <w:pPr>
+              <w:keepNext/>
+            </w:pPr>
             <w:r>
               <w:rPr>
                 <w:b/>
@@ -1243,6 +1339,9 @@
             </w:tcMar>
           </w:tcPr>
           <w:p>
+            <w:pPr>
+              <w:keepNext/>
+            </w:pPr>
             <w:r>
               <w:rPr>
                 <w:b/>
@@ -1271,6 +1370,9 @@
             </w:tcMar>
           </w:tcPr>
           <w:p>
+            <w:pPr>
+              <w:keepNext/>
+            </w:pPr>
             <w:r>
               <w:rPr>
                 <w:b/>
@@ -1299,6 +1401,9 @@
             </w:tcMar>
           </w:tcPr>
           <w:p>
+            <w:pPr>
+              <w:keepNext/>
+            </w:pPr>
             <w:r>
               <w:rPr>
                 <w:b/>
@@ -1311,6 +1416,9 @@
         </w:tc>
       </w:tr>
       <w:tr>
+        <w:trPr>
+          <w:cantSplit/>
+        </w:trPr>
         <w:tc>
           <w:tcPr>
             <w:tcW w:type="dxa" w:w="2200"/>
@@ -1328,6 +1436,9 @@
             </w:tcMar>
           </w:tcPr>
           <w:p>
+            <w:pPr>
+              <w:keepNext/>
+            </w:pPr>
             <w:r>
               <w:t xml:space="preserve">Fond clair</w:t>
             </w:r>
@@ -1350,6 +1461,9 @@
             </w:tcMar>
           </w:tcPr>
           <w:p>
+            <w:pPr>
+              <w:keepNext/>
+            </w:pPr>
             <w:r>
               <w:t xml:space="preserve">#f1f8fc</w:t>
             </w:r>
@@ -1372,6 +1486,9 @@
             </w:tcMar>
           </w:tcPr>
           <w:p>
+            <w:pPr>
+              <w:keepNext/>
+            </w:pPr>
             <w:r>
               <w:t xml:space="preserve">#f1f8fc</w:t>
             </w:r>
@@ -1394,6 +1511,9 @@
             </w:tcMar>
           </w:tcPr>
           <w:p>
+            <w:pPr>
+              <w:keepNext/>
+            </w:pPr>
             <w:r>
               <w:t xml:space="preserve">Sections secondaires, hovers</w:t>
             </w:r>
@@ -1401,6 +1521,9 @@
         </w:tc>
       </w:tr>
       <w:tr>
+        <w:trPr>
+          <w:cantSplit/>
+        </w:trPr>
         <w:tc>
           <w:tcPr>
             <w:tcW w:type="dxa" w:w="2200"/>
@@ -1418,6 +1541,9 @@
             </w:tcMar>
           </w:tcPr>
           <w:p>
+            <w:pPr>
+              <w:keepNext/>
+            </w:pPr>
             <w:r>
               <w:t xml:space="preserve">Bleu primaire</w:t>
             </w:r>
@@ -1440,6 +1566,9 @@
             </w:tcMar>
           </w:tcPr>
           <w:p>
+            <w:pPr>
+              <w:keepNext/>
+            </w:pPr>
             <w:r>
               <w:t xml:space="preserve">#0074c7</w:t>
             </w:r>
@@ -1462,6 +1591,9 @@
             </w:tcMar>
           </w:tcPr>
           <w:p>
+            <w:pPr>
+              <w:keepNext/>
+            </w:pPr>
             <w:r>
               <w:t xml:space="preserve">#0074c7</w:t>
             </w:r>
@@ -1484,6 +1616,9 @@
             </w:tcMar>
           </w:tcPr>
           <w:p>
+            <w:pPr>
+              <w:keepNext/>
+            </w:pPr>
             <w:r>
               <w:t xml:space="preserve">Boutons, liens, accents</w:t>
             </w:r>
@@ -1491,6 +1626,9 @@
         </w:tc>
       </w:tr>
       <w:tr>
+        <w:trPr>
+          <w:cantSplit/>
+        </w:trPr>
         <w:tc>
           <w:tcPr>
             <w:tcW w:type="dxa" w:w="2200"/>
@@ -1508,6 +1646,9 @@
             </w:tcMar>
           </w:tcPr>
           <w:p>
+            <w:pPr>
+              <w:keepNext/>
+            </w:pPr>
             <w:r>
               <w:t xml:space="preserve">Bleu foncé</w:t>
             </w:r>
@@ -1530,6 +1671,9 @@
             </w:tcMar>
           </w:tcPr>
           <w:p>
+            <w:pPr>
+              <w:keepNext/>
+            </w:pPr>
             <w:r>
               <w:t xml:space="preserve">#00497c</w:t>
             </w:r>
@@ -1552,6 +1696,9 @@
             </w:tcMar>
           </w:tcPr>
           <w:p>
+            <w:pPr>
+              <w:keepNext/>
+            </w:pPr>
             <w:r>
               <w:t xml:space="preserve">#00497c</w:t>
             </w:r>
@@ -1574,6 +1721,9 @@
             </w:tcMar>
           </w:tcPr>
           <w:p>
+            <w:pPr>
+              <w:keepNext/>
+            </w:pPr>
             <w:r>
               <w:t xml:space="preserve">Hovers et accents forts</w:t>
             </w:r>
@@ -1581,6 +1731,9 @@
         </w:tc>
       </w:tr>
       <w:tr>
+        <w:trPr>
+          <w:cantSplit/>
+        </w:trPr>
         <w:tc>
           <w:tcPr>
             <w:tcW w:type="dxa" w:w="2200"/>
@@ -1598,6 +1751,9 @@
             </w:tcMar>
           </w:tcPr>
           <w:p>
+            <w:pPr>
+              <w:keepNext/>
+            </w:pPr>
             <w:r>
               <w:t xml:space="preserve">Gris bleuté</w:t>
             </w:r>
@@ -1620,6 +1776,9 @@
             </w:tcMar>
           </w:tcPr>
           <w:p>
+            <w:pPr>
+              <w:keepNext/>
+            </w:pPr>
             <w:r>
               <w:t xml:space="preserve">#384050</w:t>
             </w:r>
@@ -1642,6 +1801,9 @@
             </w:tcMar>
           </w:tcPr>
           <w:p>
+            <w:pPr>
+              <w:keepNext/>
+            </w:pPr>
             <w:r>
               <w:t xml:space="preserve">#384050</w:t>
             </w:r>
@@ -1664,6 +1826,9 @@
             </w:tcMar>
           </w:tcPr>
           <w:p>
+            <w:pPr>
+              <w:keepNext/>
+            </w:pPr>
             <w:r>
               <w:t xml:space="preserve">Texte principal, footer</w:t>
             </w:r>
@@ -1671,6 +1836,9 @@
         </w:tc>
       </w:tr>
       <w:tr>
+        <w:trPr>
+          <w:cantSplit/>
+        </w:trPr>
         <w:tc>
           <w:tcPr>
             <w:tcW w:type="dxa" w:w="2200"/>
@@ -1688,6 +1856,9 @@
             </w:tcMar>
           </w:tcPr>
           <w:p>
+            <w:pPr>
+              <w:keepNext/>
+            </w:pPr>
             <w:r>
               <w:t xml:space="preserve">Rouge</w:t>
             </w:r>
@@ -1710,6 +1881,9 @@
             </w:tcMar>
           </w:tcPr>
           <w:p>
+            <w:pPr>
+              <w:keepNext/>
+            </w:pPr>
             <w:r>
               <w:t xml:space="preserve">#cd2c2e</w:t>
             </w:r>
@@ -1732,6 +1906,9 @@
             </w:tcMar>
           </w:tcPr>
           <w:p>
+            <w:pPr>
+              <w:keepNext/>
+            </w:pPr>
             <w:r>
               <w:t xml:space="preserve">#cd2c2e</w:t>
             </w:r>
@@ -1754,6 +1931,9 @@
             </w:tcMar>
           </w:tcPr>
           <w:p>
+            <w:pPr>
+              <w:keepNext/>
+            </w:pPr>
             <w:r>
               <w:t xml:space="preserve">Erreurs, alertes</w:t>
             </w:r>
@@ -1761,6 +1941,9 @@
         </w:tc>
       </w:tr>
       <w:tr>
+        <w:trPr>
+          <w:cantSplit/>
+        </w:trPr>
         <w:tc>
           <w:tcPr>
             <w:tcW w:type="dxa" w:w="2200"/>
@@ -1778,6 +1961,9 @@
             </w:tcMar>
           </w:tcPr>
           <w:p>
+            <w:pPr>
+              <w:keepNext w:val="false"/>
+            </w:pPr>
             <w:r>
               <w:t xml:space="preserve">Vert</w:t>
             </w:r>
@@ -1800,6 +1986,9 @@
             </w:tcMar>
           </w:tcPr>
           <w:p>
+            <w:pPr>
+              <w:keepNext w:val="false"/>
+            </w:pPr>
             <w:r>
               <w:t xml:space="preserve">#82b864</w:t>
             </w:r>
@@ -1822,6 +2011,9 @@
             </w:tcMar>
           </w:tcPr>
           <w:p>
+            <w:pPr>
+              <w:keepNext w:val="false"/>
+            </w:pPr>
             <w:r>
               <w:t xml:space="preserve">#82b864</w:t>
             </w:r>
@@ -1844,6 +2036,9 @@
             </w:tcMar>
           </w:tcPr>
           <w:p>
+            <w:pPr>
+              <w:keepNext w:val="false"/>
+            </w:pPr>
             <w:r>
               <w:t xml:space="preserve">Succès, validations</w:t>
             </w:r>
@@ -1853,7 +2048,7 @@
     </w:tbl>
     <w:p>
       <w:pPr>
-        <w:spacing w:after="120"/>
+        <w:spacing w:after="200" w:line="276"/>
         <w:jc w:val="both"/>
       </w:pPr>
       <w:r>
@@ -1866,7 +2061,7 @@
     </w:p>
     <w:p>
       <w:pPr>
-        <w:spacing w:after="120"/>
+        <w:spacing w:after="200" w:line="276"/>
         <w:jc w:val="both"/>
       </w:pPr>
       <w:r>
@@ -1876,6 +2071,8 @@
     <w:p>
       <w:pPr>
         <w:pStyle w:val="Heading2"/>
+        <w:keepNext/>
+        <w:keepLines/>
         <w:spacing w:before="240" w:after="120"/>
       </w:pPr>
       <w:r>
@@ -1893,7 +2090,7 @@
       <w:r>
         <w:t xml:space="preserve">Maquettes complètes (consultation publique) : </w:t>
       </w:r>
-      <w:hyperlink w:history="1" r:id="rIdhjbzlllocso0ldtayco0y">
+      <w:hyperlink w:history="1" r:id="rId-valkaytsznqnm3iobpfc">
         <w:r>
           <w:rPr>
             <w:rStyle w:val="Hyperlink"/>
@@ -1905,6 +2102,8 @@
     <w:p>
       <w:pPr>
         <w:pStyle w:val="Heading2"/>
+        <w:keepNext/>
+        <w:keepLines/>
         <w:spacing w:before="240" w:after="120"/>
       </w:pPr>
       <w:r>
@@ -1918,6 +2117,8 @@
     <w:p>
       <w:pPr>
         <w:pStyle w:val="Heading3"/>
+        <w:keepNext/>
+        <w:keepLines/>
         <w:spacing w:before="200" w:after="100"/>
       </w:pPr>
       <w:r>
@@ -1930,6 +2131,7 @@
     </w:p>
     <w:p>
       <w:pPr>
+        <w:keepNext/>
         <w:spacing w:before="100" w:after="60"/>
         <w:jc w:val="center"/>
       </w:pPr>
@@ -1993,6 +2195,8 @@
     <w:p>
       <w:pPr>
         <w:pStyle w:val="Heading3"/>
+        <w:keepNext/>
+        <w:keepLines/>
         <w:spacing w:before="200" w:after="100"/>
       </w:pPr>
       <w:r>
@@ -2005,15 +2209,16 @@
     </w:p>
     <w:p>
       <w:pPr>
+        <w:keepNext/>
         <w:spacing w:before="100" w:after="60"/>
         <w:jc w:val="center"/>
       </w:pPr>
       <w:r>
         <w:drawing>
           <wp:inline distT="0" distB="0" distL="0" distR="0">
-            <wp:extent cx="1095375" cy="5715000"/>
+            <wp:extent cx="857250" cy="4476750"/>
             <wp:effectExtent t="0" r="0" b="0" l="0"/>
-            <wp:docPr id="1" name="accueil-mobile.png" descr="Accueil — Mobile (375 px)" title="Accueil — Mobile (375 px)"/>
+            <wp:docPr id="1" name="accueil-mobile.png" descr="accueil-mobile.png" title="accueil-mobile.png"/>
             <wp:cNvGraphicFramePr>
               <a:graphicFrameLocks xmlns:a="http://schemas.openxmlformats.org/drawingml/2006/main" noChangeAspect="1"/>
             </wp:cNvGraphicFramePr>
@@ -2036,7 +2241,7 @@
                   <pic:spPr bwMode="auto">
                     <a:xfrm>
                       <a:off x="0" y="0"/>
-                      <a:ext cx="1095375" cy="5715000"/>
+                      <a:ext cx="857250" cy="4476750"/>
                     </a:xfrm>
                     <a:prstGeom prst="rect">
                       <a:avLst/>
@@ -2048,34 +2253,15 @@
           </wp:inline>
         </w:drawing>
       </w:r>
-    </w:p>
-    <w:p>
-      <w:pPr>
-        <w:spacing w:after="180"/>
-        <w:jc w:val="center"/>
-      </w:pPr>
-      <w:r>
-        <w:rPr>
-          <w:i/>
-          <w:iCs/>
-          <w:color w:val="384050"/>
-          <w:sz w:val="18"/>
-          <w:szCs w:val="18"/>
-        </w:rPr>
-        <w:t xml:space="preserve">Accueil — Mobile (375 px)</w:t>
-      </w:r>
-    </w:p>
-    <w:p>
-      <w:pPr>
-        <w:spacing w:before="100" w:after="60"/>
-        <w:jc w:val="center"/>
-      </w:pPr>
+      <w:r>
+        <w:t xml:space="preserve">        </w:t>
+      </w:r>
       <w:r>
         <w:drawing>
           <wp:inline distT="0" distB="0" distL="0" distR="0">
-            <wp:extent cx="2533650" cy="5715000"/>
+            <wp:extent cx="1990725" cy="4476750"/>
             <wp:effectExtent t="0" r="0" b="0" l="0"/>
-            <wp:docPr id="1" name="accueil-tablette.png" descr="Accueil — Tablette (768 px)" title="Accueil — Tablette (768 px)"/>
+            <wp:docPr id="1" name="accueil-tablette.png" descr="accueil-tablette.png" title="accueil-tablette.png"/>
             <wp:cNvGraphicFramePr>
               <a:graphicFrameLocks xmlns:a="http://schemas.openxmlformats.org/drawingml/2006/main" noChangeAspect="1"/>
             </wp:cNvGraphicFramePr>
@@ -2098,7 +2284,7 @@
                   <pic:spPr bwMode="auto">
                     <a:xfrm>
                       <a:off x="0" y="0"/>
-                      <a:ext cx="2533650" cy="5715000"/>
+                      <a:ext cx="1990725" cy="4476750"/>
                     </a:xfrm>
                     <a:prstGeom prst="rect">
                       <a:avLst/>
@@ -2124,11 +2310,12 @@
           <w:sz w:val="18"/>
           <w:szCs w:val="18"/>
         </w:rPr>
-        <w:t xml:space="preserve">Accueil — Tablette (768 px)</w:t>
-      </w:r>
-    </w:p>
-    <w:p>
-      <w:pPr>
+        <w:t xml:space="preserve">Accueil — Mobile (375 px) et Tablette (768 px)</w:t>
+      </w:r>
+    </w:p>
+    <w:p>
+      <w:pPr>
+        <w:keepNext/>
         <w:spacing w:before="100" w:after="60"/>
         <w:jc w:val="center"/>
       </w:pPr>
@@ -2192,6 +2379,8 @@
     <w:p>
       <w:pPr>
         <w:pStyle w:val="Heading3"/>
+        <w:keepNext/>
+        <w:keepLines/>
         <w:spacing w:before="200" w:after="100"/>
       </w:pPr>
       <w:r>
@@ -2204,15 +2393,16 @@
     </w:p>
     <w:p>
       <w:pPr>
+        <w:keepNext/>
         <w:spacing w:before="100" w:after="60"/>
         <w:jc w:val="center"/>
       </w:pPr>
       <w:r>
         <w:drawing>
           <wp:inline distT="0" distB="0" distL="0" distR="0">
-            <wp:extent cx="1276350" cy="5715000"/>
+            <wp:extent cx="1000125" cy="4476750"/>
             <wp:effectExtent t="0" r="0" b="0" l="0"/>
-            <wp:docPr id="1" name="liste-mobile.png" descr="Liste — catégorie Bâtiment — Mobile (375 px)" title="Liste — catégorie Bâtiment — Mobile (375 px)"/>
+            <wp:docPr id="1" name="liste-mobile.png" descr="liste-mobile.png" title="liste-mobile.png"/>
             <wp:cNvGraphicFramePr>
               <a:graphicFrameLocks xmlns:a="http://schemas.openxmlformats.org/drawingml/2006/main" noChangeAspect="1"/>
             </wp:cNvGraphicFramePr>
@@ -2235,7 +2425,7 @@
                   <pic:spPr bwMode="auto">
                     <a:xfrm>
                       <a:off x="0" y="0"/>
-                      <a:ext cx="1276350" cy="5715000"/>
+                      <a:ext cx="1000125" cy="4476750"/>
                     </a:xfrm>
                     <a:prstGeom prst="rect">
                       <a:avLst/>
@@ -2247,34 +2437,15 @@
           </wp:inline>
         </w:drawing>
       </w:r>
-    </w:p>
-    <w:p>
-      <w:pPr>
-        <w:spacing w:after="180"/>
-        <w:jc w:val="center"/>
-      </w:pPr>
-      <w:r>
-        <w:rPr>
-          <w:i/>
-          <w:iCs/>
-          <w:color w:val="384050"/>
-          <w:sz w:val="18"/>
-          <w:szCs w:val="18"/>
-        </w:rPr>
-        <w:t xml:space="preserve">Liste — catégorie Bâtiment — Mobile (375 px)</w:t>
-      </w:r>
-    </w:p>
-    <w:p>
-      <w:pPr>
-        <w:spacing w:before="100" w:after="60"/>
-        <w:jc w:val="center"/>
-      </w:pPr>
+      <w:r>
+        <w:t xml:space="preserve">        </w:t>
+      </w:r>
       <w:r>
         <w:drawing>
           <wp:inline distT="0" distB="0" distL="0" distR="0">
-            <wp:extent cx="3429000" cy="4705350"/>
+            <wp:extent cx="3257550" cy="4476750"/>
             <wp:effectExtent t="0" r="0" b="0" l="0"/>
-            <wp:docPr id="1" name="liste-tablette.png" descr="Liste — catégorie Bâtiment — Tablette (768 px)" title="Liste — catégorie Bâtiment — Tablette (768 px)"/>
+            <wp:docPr id="1" name="liste-tablette.png" descr="liste-tablette.png" title="liste-tablette.png"/>
             <wp:cNvGraphicFramePr>
               <a:graphicFrameLocks xmlns:a="http://schemas.openxmlformats.org/drawingml/2006/main" noChangeAspect="1"/>
             </wp:cNvGraphicFramePr>
@@ -2297,7 +2468,7 @@
                   <pic:spPr bwMode="auto">
                     <a:xfrm>
                       <a:off x="0" y="0"/>
-                      <a:ext cx="3429000" cy="4705350"/>
+                      <a:ext cx="3257550" cy="4476750"/>
                     </a:xfrm>
                     <a:prstGeom prst="rect">
                       <a:avLst/>
@@ -2323,11 +2494,12 @@
           <w:sz w:val="18"/>
           <w:szCs w:val="18"/>
         </w:rPr>
-        <w:t xml:space="preserve">Liste — catégorie Bâtiment — Tablette (768 px)</w:t>
-      </w:r>
-    </w:p>
-    <w:p>
-      <w:pPr>
+        <w:t xml:space="preserve">Liste — catégorie Bâtiment — Mobile (375 px) et Tablette (768 px)</w:t>
+      </w:r>
+    </w:p>
+    <w:p>
+      <w:pPr>
+        <w:keepNext/>
         <w:spacing w:before="100" w:after="60"/>
         <w:jc w:val="center"/>
       </w:pPr>
@@ -2391,6 +2563,8 @@
     <w:p>
       <w:pPr>
         <w:pStyle w:val="Heading3"/>
+        <w:keepNext/>
+        <w:keepLines/>
         <w:spacing w:before="200" w:after="100"/>
       </w:pPr>
       <w:r>
@@ -2403,7 +2577,7 @@
     </w:p>
     <w:p>
       <w:pPr>
-        <w:spacing w:after="120"/>
+        <w:spacing w:after="200" w:line="276"/>
         <w:jc w:val="both"/>
       </w:pPr>
       <w:r>
@@ -2412,15 +2586,16 @@
     </w:p>
     <w:p>
       <w:pPr>
+        <w:keepNext/>
         <w:spacing w:before="100" w:after="60"/>
         <w:jc w:val="center"/>
       </w:pPr>
       <w:r>
         <w:drawing>
           <wp:inline distT="0" distB="0" distL="0" distR="0">
-            <wp:extent cx="1704975" cy="5715000"/>
+            <wp:extent cx="1333500" cy="4476750"/>
             <wp:effectExtent t="0" r="0" b="0" l="0"/>
-            <wp:docPr id="1" name="fiche-mobile.png" descr="Fiche artisan — Mobile (375 px)" title="Fiche artisan — Mobile (375 px)"/>
+            <wp:docPr id="1" name="fiche-mobile.png" descr="fiche-mobile.png" title="fiche-mobile.png"/>
             <wp:cNvGraphicFramePr>
               <a:graphicFrameLocks xmlns:a="http://schemas.openxmlformats.org/drawingml/2006/main" noChangeAspect="1"/>
             </wp:cNvGraphicFramePr>
@@ -2443,7 +2618,7 @@
                   <pic:spPr bwMode="auto">
                     <a:xfrm>
                       <a:off x="0" y="0"/>
-                      <a:ext cx="1704975" cy="5715000"/>
+                      <a:ext cx="1333500" cy="4476750"/>
                     </a:xfrm>
                     <a:prstGeom prst="rect">
                       <a:avLst/>
@@ -2455,34 +2630,15 @@
           </wp:inline>
         </w:drawing>
       </w:r>
-    </w:p>
-    <w:p>
-      <w:pPr>
-        <w:spacing w:after="180"/>
-        <w:jc w:val="center"/>
-      </w:pPr>
-      <w:r>
-        <w:rPr>
-          <w:i/>
-          <w:iCs/>
-          <w:color w:val="384050"/>
-          <w:sz w:val="18"/>
-          <w:szCs w:val="18"/>
-        </w:rPr>
-        <w:t xml:space="preserve">Fiche artisan — Mobile (375 px)</w:t>
-      </w:r>
-    </w:p>
-    <w:p>
-      <w:pPr>
-        <w:spacing w:before="100" w:after="60"/>
-        <w:jc w:val="center"/>
-      </w:pPr>
+      <w:r>
+        <w:t xml:space="preserve">        </w:t>
+      </w:r>
       <w:r>
         <w:drawing>
           <wp:inline distT="0" distB="0" distL="0" distR="0">
-            <wp:extent cx="3429000" cy="5695950"/>
+            <wp:extent cx="2695575" cy="4476750"/>
             <wp:effectExtent t="0" r="0" b="0" l="0"/>
-            <wp:docPr id="1" name="fiche-tablette.png" descr="Fiche artisan — Tablette (768 px)" title="Fiche artisan — Tablette (768 px)"/>
+            <wp:docPr id="1" name="fiche-tablette.png" descr="fiche-tablette.png" title="fiche-tablette.png"/>
             <wp:cNvGraphicFramePr>
               <a:graphicFrameLocks xmlns:a="http://schemas.openxmlformats.org/drawingml/2006/main" noChangeAspect="1"/>
             </wp:cNvGraphicFramePr>
@@ -2505,7 +2661,7 @@
                   <pic:spPr bwMode="auto">
                     <a:xfrm>
                       <a:off x="0" y="0"/>
-                      <a:ext cx="3429000" cy="5695950"/>
+                      <a:ext cx="2695575" cy="4476750"/>
                     </a:xfrm>
                     <a:prstGeom prst="rect">
                       <a:avLst/>
@@ -2531,11 +2687,12 @@
           <w:sz w:val="18"/>
           <w:szCs w:val="18"/>
         </w:rPr>
-        <w:t xml:space="preserve">Fiche artisan — Tablette (768 px)</w:t>
-      </w:r>
-    </w:p>
-    <w:p>
-      <w:pPr>
+        <w:t xml:space="preserve">Fiche artisan — Mobile (375 px) et Tablette (768 px)</w:t>
+      </w:r>
+    </w:p>
+    <w:p>
+      <w:pPr>
+        <w:keepNext/>
         <w:spacing w:before="100" w:after="60"/>
         <w:jc w:val="center"/>
       </w:pPr>
@@ -2599,6 +2756,8 @@
     <w:p>
       <w:pPr>
         <w:pStyle w:val="Heading3"/>
+        <w:keepNext/>
+        <w:keepLines/>
         <w:spacing w:before="200" w:after="100"/>
       </w:pPr>
       <w:r>
@@ -2611,6 +2770,7 @@
     </w:p>
     <w:p>
       <w:pPr>
+        <w:keepNext/>
         <w:spacing w:before="100" w:after="60"/>
         <w:jc w:val="center"/>
       </w:pPr>
@@ -2673,6 +2833,7 @@
     </w:p>
     <w:p>
       <w:pPr>
+        <w:keepNext/>
         <w:spacing w:before="100" w:after="60"/>
         <w:jc w:val="center"/>
       </w:pPr>
@@ -2736,6 +2897,8 @@
     <w:p>
       <w:pPr>
         <w:pStyle w:val="Heading2"/>
+        <w:keepNext/>
+        <w:keepLines/>
         <w:spacing w:before="240" w:after="120"/>
       </w:pPr>
       <w:r>
@@ -2748,7 +2911,7 @@
     </w:p>
     <w:p>
       <w:pPr>
-        <w:spacing w:after="120"/>
+        <w:spacing w:after="200" w:line="276"/>
         <w:jc w:val="both"/>
       </w:pPr>
       <w:r>
@@ -2757,6 +2920,7 @@
     </w:p>
     <w:p>
       <w:pPr>
+        <w:keepNext/>
         <w:spacing w:before="100" w:after="60"/>
         <w:jc w:val="center"/>
       </w:pPr>
@@ -2804,6 +2968,8 @@
     <w:p>
       <w:pPr>
         <w:pStyle w:val="Heading2"/>
+        <w:keepNext/>
+        <w:keepLines/>
         <w:spacing w:before="240" w:after="120"/>
       </w:pPr>
       <w:r>
@@ -2816,7 +2982,7 @@
     </w:p>
     <w:p>
       <w:pPr>
-        <w:spacing w:after="120"/>
+        <w:spacing w:after="200" w:line="276"/>
         <w:jc w:val="both"/>
       </w:pPr>
       <w:r>
@@ -2912,6 +3078,8 @@
     <w:p>
       <w:pPr>
         <w:pStyle w:val="Heading2"/>
+        <w:keepNext/>
+        <w:keepLines/>
         <w:spacing w:before="240" w:after="120"/>
       </w:pPr>
       <w:r>
@@ -2924,7 +3092,7 @@
     </w:p>
     <w:p>
       <w:pPr>
-        <w:spacing w:after="120"/>
+        <w:spacing w:after="200" w:line="276"/>
         <w:jc w:val="both"/>
       </w:pPr>
       <w:r>
@@ -3002,6 +3170,8 @@
     <w:p>
       <w:pPr>
         <w:pStyle w:val="Heading2"/>
+        <w:keepNext/>
+        <w:keepLines/>
         <w:spacing w:before="240" w:after="120"/>
       </w:pPr>
       <w:r>
@@ -3014,7 +3184,7 @@
     </w:p>
     <w:p>
       <w:pPr>
-        <w:spacing w:after="120"/>
+        <w:spacing w:after="200" w:line="276"/>
         <w:jc w:val="both"/>
       </w:pPr>
       <w:r>
@@ -3023,7 +3193,7 @@
     </w:p>
     <w:p>
       <w:pPr>
-        <w:spacing w:after="120"/>
+        <w:spacing w:after="200" w:line="276"/>
         <w:jc w:val="both"/>
       </w:pPr>
       <w:r>
@@ -3033,6 +3203,8 @@
     <w:p>
       <w:pPr>
         <w:pStyle w:val="Heading2"/>
+        <w:keepNext/>
+        <w:keepLines/>
         <w:spacing w:before="240" w:after="120"/>
       </w:pPr>
       <w:r>
@@ -3045,7 +3217,7 @@
     </w:p>
     <w:p>
       <w:pPr>
-        <w:spacing w:after="120"/>
+        <w:spacing w:after="200" w:line="276"/>
         <w:jc w:val="both"/>
       </w:pPr>
       <w:r>
@@ -3060,6 +3232,8 @@
     <w:p>
       <w:pPr>
         <w:pStyle w:val="Heading1"/>
+        <w:keepNext/>
+        <w:keepLines/>
         <w:spacing w:before="360" w:after="180"/>
       </w:pPr>
       <w:r>
@@ -3073,6 +3247,8 @@
     <w:p>
       <w:pPr>
         <w:pStyle w:val="Heading2"/>
+        <w:keepNext/>
+        <w:keepLines/>
         <w:spacing w:before="240" w:after="120"/>
       </w:pPr>
       <w:r>
@@ -3090,7 +3266,7 @@
           <w:ilvl w:val="0"/>
           <w:numId w:val="2"/>
         </w:numPr>
-        <w:spacing w:after="80"/>
+        <w:spacing w:after="120" w:line="276"/>
       </w:pPr>
       <w:r>
         <w:t xml:space="preserve">Un artisan appartient à une seule spécialité.</w:t>
@@ -3103,7 +3279,7 @@
           <w:ilvl w:val="0"/>
           <w:numId w:val="2"/>
         </w:numPr>
-        <w:spacing w:after="80"/>
+        <w:spacing w:after="120" w:line="276"/>
       </w:pPr>
       <w:r>
         <w:t xml:space="preserve">Une spécialité est rattachée à une seule catégorie.</w:t>
@@ -3116,7 +3292,7 @@
           <w:ilvl w:val="0"/>
           <w:numId w:val="2"/>
         </w:numPr>
-        <w:spacing w:after="80"/>
+        <w:spacing w:after="120" w:line="276"/>
       </w:pPr>
       <w:r>
         <w:t xml:space="preserve">Un artisan est localisé dans une seule ville ; une ville regroupe potentiellement plusieurs artisans.</w:t>
@@ -3129,7 +3305,7 @@
           <w:ilvl w:val="0"/>
           <w:numId w:val="2"/>
         </w:numPr>
-        <w:spacing w:after="80"/>
+        <w:spacing w:after="120" w:line="276"/>
       </w:pPr>
       <w:r>
         <w:t xml:space="preserve">Un artisan peut être marqué « artisan du mois ».</w:t>
@@ -3142,7 +3318,7 @@
           <w:ilvl w:val="0"/>
           <w:numId w:val="2"/>
         </w:numPr>
-        <w:spacing w:after="80"/>
+        <w:spacing w:after="120" w:line="276"/>
       </w:pPr>
       <w:r>
         <w:t xml:space="preserve">Chaque artisan possède une note décimale entre 0 et 5.</w:t>
@@ -3155,7 +3331,7 @@
           <w:ilvl w:val="0"/>
           <w:numId w:val="2"/>
         </w:numPr>
-        <w:spacing w:after="80"/>
+        <w:spacing w:after="120" w:line="276"/>
       </w:pPr>
       <w:r>
         <w:t xml:space="preserve">Un message de contact est associé à un seul artisan ; un artisan peut en recevoir plusieurs.</w:t>
@@ -3164,6 +3340,8 @@
     <w:p>
       <w:pPr>
         <w:pStyle w:val="Heading2"/>
+        <w:keepNext/>
+        <w:keepLines/>
         <w:spacing w:before="240" w:after="120"/>
       </w:pPr>
       <w:r>
@@ -3176,7 +3354,7 @@
     </w:p>
     <w:p>
       <w:pPr>
-        <w:spacing w:after="120"/>
+        <w:spacing w:after="200" w:line="276"/>
         <w:jc w:val="both"/>
       </w:pPr>
       <w:r>
@@ -3186,6 +3364,8 @@
     <w:p>
       <w:pPr>
         <w:pStyle w:val="Heading2"/>
+        <w:keepNext/>
+        <w:keepLines/>
         <w:spacing w:before="240" w:after="120"/>
       </w:pPr>
       <w:r>
@@ -3198,6 +3378,7 @@
     </w:p>
     <w:p>
       <w:pPr>
+        <w:keepNext/>
         <w:spacing w:before="100" w:after="60"/>
         <w:jc w:val="center"/>
       </w:pPr>
@@ -3261,6 +3442,8 @@
     <w:p>
       <w:pPr>
         <w:pStyle w:val="Heading2"/>
+        <w:keepNext/>
+        <w:keepLines/>
         <w:spacing w:before="240" w:after="120"/>
       </w:pPr>
       <w:r>
@@ -3273,6 +3456,7 @@
     </w:p>
     <w:p>
       <w:pPr>
+        <w:keepNext/>
         <w:spacing w:before="100" w:after="60"/>
         <w:jc w:val="center"/>
       </w:pPr>
@@ -3335,7 +3519,7 @@
     </w:p>
     <w:p>
       <w:pPr>
-        <w:spacing w:after="120"/>
+        <w:spacing w:after="200" w:line="276"/>
         <w:jc w:val="both"/>
       </w:pPr>
       <w:r>
@@ -3413,6 +3597,8 @@
     <w:p>
       <w:pPr>
         <w:pStyle w:val="Heading2"/>
+        <w:keepNext/>
+        <w:keepLines/>
         <w:spacing w:before="240" w:after="120"/>
       </w:pPr>
       <w:r>
@@ -3708,7 +3894,7 @@
     </w:p>
     <w:p>
       <w:pPr>
-        <w:spacing w:after="120"/>
+        <w:spacing w:after="200" w:line="276"/>
         <w:jc w:val="both"/>
       </w:pPr>
       <w:r>
@@ -3718,6 +3904,8 @@
     <w:p>
       <w:pPr>
         <w:pStyle w:val="Heading2"/>
+        <w:keepNext/>
+        <w:keepLines/>
         <w:spacing w:before="240" w:after="120"/>
       </w:pPr>
       <w:r>
@@ -3730,7 +3918,7 @@
     </w:p>
     <w:p>
       <w:pPr>
-        <w:spacing w:after="120"/>
+        <w:spacing w:after="200" w:line="276"/>
         <w:jc w:val="both"/>
       </w:pPr>
       <w:r>
@@ -3744,7 +3932,7 @@
           <w:ilvl w:val="0"/>
           <w:numId w:val="2"/>
         </w:numPr>
-        <w:spacing w:after="80"/>
+        <w:spacing w:after="120" w:line="276"/>
       </w:pPr>
       <w:r>
         <w:t xml:space="preserve">4 catégories : Bâtiment, Services, Fabrication, Alimentation.</w:t>
@@ -3757,7 +3945,7 @@
           <w:ilvl w:val="0"/>
           <w:numId w:val="2"/>
         </w:numPr>
-        <w:spacing w:after="80"/>
+        <w:spacing w:after="120" w:line="276"/>
       </w:pPr>
       <w:r>
         <w:t xml:space="preserve">15 spécialités réparties dans les 4 catégories.</w:t>
@@ -3770,7 +3958,7 @@
           <w:ilvl w:val="0"/>
           <w:numId w:val="2"/>
         </w:numPr>
-        <w:spacing w:after="80"/>
+        <w:spacing w:after="120" w:line="276"/>
       </w:pPr>
       <w:r>
         <w:t xml:space="preserve">14 villes uniques (Lyon revient 3 fois, Valence 2 fois, les autres 1 fois).</w:t>
@@ -3783,7 +3971,7 @@
           <w:ilvl w:val="0"/>
           <w:numId w:val="2"/>
         </w:numPr>
-        <w:spacing w:after="80"/>
+        <w:spacing w:after="120" w:line="276"/>
       </w:pPr>
       <w:r>
         <w:t xml:space="preserve">17 artisans dont 3 mis en avant comme « artisans du mois ».</w:t>
@@ -3792,6 +3980,8 @@
     <w:p>
       <w:pPr>
         <w:pStyle w:val="Heading2"/>
+        <w:keepNext/>
+        <w:keepLines/>
         <w:spacing w:before="240" w:after="120"/>
       </w:pPr>
       <w:r>
@@ -3804,7 +3994,7 @@
     </w:p>
     <w:p>
       <w:pPr>
-        <w:spacing w:after="120"/>
+        <w:spacing w:after="200" w:line="276"/>
         <w:jc w:val="both"/>
       </w:pPr>
       <w:r>
@@ -3881,7 +4071,7 @@
     </w:p>
     <w:p>
       <w:pPr>
-        <w:spacing w:after="120"/>
+        <w:spacing w:after="200" w:line="276"/>
         <w:jc w:val="both"/>
       </w:pPr>
       <w:r>
@@ -3890,7 +4080,7 @@
     </w:p>
     <w:p>
       <w:pPr>
-        <w:spacing w:after="120"/>
+        <w:spacing w:after="200" w:line="276"/>
         <w:jc w:val="both"/>
       </w:pPr>
       <w:r>
@@ -3900,6 +4090,8 @@
     <w:p>
       <w:pPr>
         <w:pStyle w:val="Heading2"/>
+        <w:keepNext/>
+        <w:keepLines/>
         <w:spacing w:before="240" w:after="120"/>
       </w:pPr>
       <w:r>
@@ -3912,7 +4104,7 @@
     </w:p>
     <w:p>
       <w:pPr>
-        <w:spacing w:after="120"/>
+        <w:spacing w:after="200" w:line="276"/>
         <w:jc w:val="both"/>
       </w:pPr>
       <w:r>
@@ -4040,6 +4232,8 @@
     <w:p>
       <w:pPr>
         <w:pStyle w:val="Heading2"/>
+        <w:keepNext/>
+        <w:keepLines/>
         <w:spacing w:before="240" w:after="120"/>
       </w:pPr>
       <w:r>
@@ -4052,7 +4246,7 @@
     </w:p>
     <w:p>
       <w:pPr>
-        <w:spacing w:after="120"/>
+        <w:spacing w:after="200" w:line="276"/>
         <w:jc w:val="both"/>
       </w:pPr>
       <w:r>
@@ -4121,6 +4315,8 @@
     <w:p>
       <w:pPr>
         <w:pStyle w:val="Heading2"/>
+        <w:keepNext/>
+        <w:keepLines/>
         <w:spacing w:before="240" w:after="120"/>
       </w:pPr>
       <w:r>
@@ -4133,7 +4329,7 @@
     </w:p>
     <w:p>
       <w:pPr>
-        <w:spacing w:after="120"/>
+        <w:spacing w:after="200" w:line="276"/>
         <w:jc w:val="both"/>
       </w:pPr>
       <w:r>
@@ -4142,7 +4338,7 @@
     </w:p>
     <w:p>
       <w:pPr>
-        <w:spacing w:after="120"/>
+        <w:spacing w:after="200" w:line="276"/>
         <w:jc w:val="both"/>
       </w:pPr>
       <w:r>
@@ -4169,6 +4365,7 @@
       </w:tblGrid>
       <w:tr>
         <w:trPr>
+          <w:cantSplit/>
           <w:tblHeader/>
         </w:trPr>
         <w:tc>
@@ -4189,6 +4386,9 @@
             </w:tcMar>
           </w:tcPr>
           <w:p>
+            <w:pPr>
+              <w:keepNext/>
+            </w:pPr>
             <w:r>
               <w:rPr>
                 <w:b/>
@@ -4217,6 +4417,9 @@
             </w:tcMar>
           </w:tcPr>
           <w:p>
+            <w:pPr>
+              <w:keepNext/>
+            </w:pPr>
             <w:r>
               <w:rPr>
                 <w:b/>
@@ -4245,6 +4448,9 @@
             </w:tcMar>
           </w:tcPr>
           <w:p>
+            <w:pPr>
+              <w:keepNext/>
+            </w:pPr>
             <w:r>
               <w:rPr>
                 <w:b/>
@@ -4273,6 +4479,9 @@
             </w:tcMar>
           </w:tcPr>
           <w:p>
+            <w:pPr>
+              <w:keepNext/>
+            </w:pPr>
             <w:r>
               <w:rPr>
                 <w:b/>
@@ -4285,6 +4494,9 @@
         </w:tc>
       </w:tr>
       <w:tr>
+        <w:trPr>
+          <w:cantSplit/>
+        </w:trPr>
         <w:tc>
           <w:tcPr>
             <w:tcW w:type="dxa" w:w="1700"/>
@@ -4302,6 +4514,9 @@
             </w:tcMar>
           </w:tcPr>
           <w:p>
+            <w:pPr>
+              <w:keepNext/>
+            </w:pPr>
             <w:r>
               <w:t xml:space="preserve">Nominal</w:t>
             </w:r>
@@ -4324,6 +4539,9 @@
             </w:tcMar>
           </w:tcPr>
           <w:p>
+            <w:pPr>
+              <w:keepNext/>
+            </w:pPr>
             <w:r>
               <w:t xml:space="preserve">Deux avis sur l'artisan 1 : Claire (5/5) puis Marc (3/5).</w:t>
             </w:r>
@@ -4346,6 +4564,9 @@
             </w:tcMar>
           </w:tcPr>
           <w:p>
+            <w:pPr>
+              <w:keepNext/>
+            </w:pPr>
             <w:r>
               <w:t xml:space="preserve">201 à chaque dépôt ; le GET renvoie count 2 et average 4.</w:t>
             </w:r>
@@ -4368,6 +4589,9 @@
             </w:tcMar>
           </w:tcPr>
           <w:p>
+            <w:pPr>
+              <w:keepNext/>
+            </w:pPr>
             <w:r>
               <w:t xml:space="preserve">Conforme (count 2, average 4).</w:t>
             </w:r>
@@ -4375,6 +4599,9 @@
         </w:tc>
       </w:tr>
       <w:tr>
+        <w:trPr>
+          <w:cantSplit/>
+        </w:trPr>
         <w:tc>
           <w:tcPr>
             <w:tcW w:type="dxa" w:w="1700"/>
@@ -4392,6 +4619,9 @@
             </w:tcMar>
           </w:tcPr>
           <w:p>
+            <w:pPr>
+              <w:keepNext/>
+            </w:pPr>
             <w:r>
               <w:t xml:space="preserve">Saisie invalide</w:t>
             </w:r>
@@ -4414,6 +4644,9 @@
             </w:tcMar>
           </w:tcPr>
           <w:p>
+            <w:pPr>
+              <w:keepNext/>
+            </w:pPr>
             <w:r>
               <w:t xml:space="preserve">Un avis avec une note de 9 et un commentaire trop court.</w:t>
             </w:r>
@@ -4436,6 +4669,9 @@
             </w:tcMar>
           </w:tcPr>
           <w:p>
+            <w:pPr>
+              <w:keepNext/>
+            </w:pPr>
             <w:r>
               <w:t xml:space="preserve">400 — erreur de validation.</w:t>
             </w:r>
@@ -4458,6 +4694,9 @@
             </w:tcMar>
           </w:tcPr>
           <w:p>
+            <w:pPr>
+              <w:keepNext/>
+            </w:pPr>
             <w:r>
               <w:t xml:space="preserve">Conforme (400, ValidationError).</w:t>
             </w:r>
@@ -4465,6 +4704,9 @@
         </w:tc>
       </w:tr>
       <w:tr>
+        <w:trPr>
+          <w:cantSplit/>
+        </w:trPr>
         <w:tc>
           <w:tcPr>
             <w:tcW w:type="dxa" w:w="1700"/>
@@ -4482,6 +4724,9 @@
             </w:tcMar>
           </w:tcPr>
           <w:p>
+            <w:pPr>
+              <w:keepNext w:val="false"/>
+            </w:pPr>
             <w:r>
               <w:t xml:space="preserve">Base NoSQL indisponible</w:t>
             </w:r>
@@ -4504,6 +4749,9 @@
             </w:tcMar>
           </w:tcPr>
           <w:p>
+            <w:pPr>
+              <w:keepNext w:val="false"/>
+            </w:pPr>
             <w:r>
               <w:t xml:space="preserve">Dépôt d'un avis alors que MongoDB est arrêté.</w:t>
             </w:r>
@@ -4526,6 +4774,9 @@
             </w:tcMar>
           </w:tcPr>
           <w:p>
+            <w:pPr>
+              <w:keepNext w:val="false"/>
+            </w:pPr>
             <w:r>
               <w:t xml:space="preserve">503 — service indisponible.</w:t>
             </w:r>
@@ -4548,6 +4799,9 @@
             </w:tcMar>
           </w:tcPr>
           <w:p>
+            <w:pPr>
+              <w:keepNext w:val="false"/>
+            </w:pPr>
             <w:r>
               <w:t xml:space="preserve">Conforme (503).</w:t>
             </w:r>
@@ -4557,7 +4811,7 @@
     </w:tbl>
     <w:p>
       <w:pPr>
-        <w:spacing w:after="120"/>
+        <w:spacing w:after="200" w:line="276"/>
         <w:jc w:val="both"/>
       </w:pPr>
       <w:r>
@@ -4567,6 +4821,8 @@
     <w:p>
       <w:pPr>
         <w:pStyle w:val="Heading2"/>
+        <w:keepNext/>
+        <w:keepLines/>
         <w:spacing w:before="240" w:after="120"/>
       </w:pPr>
       <w:r>
@@ -4579,7 +4835,7 @@
     </w:p>
     <w:p>
       <w:pPr>
-        <w:spacing w:after="120"/>
+        <w:spacing w:after="200" w:line="276"/>
         <w:jc w:val="both"/>
       </w:pPr>
       <w:r>
@@ -4593,7 +4849,7 @@
           <w:ilvl w:val="0"/>
           <w:numId w:val="2"/>
         </w:numPr>
-        <w:spacing w:after="80"/>
+        <w:spacing w:after="120" w:line="276"/>
       </w:pPr>
       <w:r>
         <w:t xml:space="preserve">Artisans (SQL) : liste, fiche détaillée, artisan introuvable, recherche sans résultat.</w:t>
@@ -4606,7 +4862,7 @@
           <w:ilvl w:val="0"/>
           <w:numId w:val="2"/>
         </w:numPr>
-        <w:spacing w:after="80"/>
+        <w:spacing w:after="120" w:line="276"/>
       </w:pPr>
       <w:r>
         <w:t xml:space="preserve">Avis (NoSQL) : liste vide au départ, dépôt d'un avis, recalcul de la note moyenne, artisan inexistant.</w:t>
@@ -4619,7 +4875,7 @@
           <w:ilvl w:val="0"/>
           <w:numId w:val="2"/>
         </w:numPr>
-        <w:spacing w:after="80"/>
+        <w:spacing w:after="120" w:line="276"/>
       </w:pPr>
       <w:r>
         <w:t xml:space="preserve">Sécurité : accès refusé sans clé d'API ou avec une mauvaise clé, validation des entrées, route de santé publique.</w:t>
@@ -4627,7 +4883,7 @@
     </w:p>
     <w:p>
       <w:pPr>
-        <w:spacing w:after="120"/>
+        <w:spacing w:after="200" w:line="276"/>
         <w:jc w:val="both"/>
       </w:pPr>
       <w:r>
@@ -4642,6 +4898,8 @@
     <w:p>
       <w:pPr>
         <w:pStyle w:val="Heading1"/>
+        <w:keepNext/>
+        <w:keepLines/>
         <w:spacing w:before="360" w:after="180"/>
       </w:pPr>
       <w:r>
@@ -4654,7 +4912,7 @@
     </w:p>
     <w:p>
       <w:pPr>
-        <w:spacing w:after="120"/>
+        <w:spacing w:after="200" w:line="276"/>
         <w:jc w:val="both"/>
       </w:pPr>
       <w:r>
@@ -4664,6 +4922,8 @@
     <w:p>
       <w:pPr>
         <w:pStyle w:val="Heading2"/>
+        <w:keepNext/>
+        <w:keepLines/>
         <w:spacing w:before="240" w:after="120"/>
       </w:pPr>
       <w:r>
@@ -4693,6 +4953,7 @@
       </w:tblGrid>
       <w:tr>
         <w:trPr>
+          <w:cantSplit/>
           <w:tblHeader/>
         </w:trPr>
         <w:tc>
@@ -4713,6 +4974,9 @@
             </w:tcMar>
           </w:tcPr>
           <w:p>
+            <w:pPr>
+              <w:keepNext/>
+            </w:pPr>
             <w:r>
               <w:rPr>
                 <w:b/>
@@ -4741,6 +5005,9 @@
             </w:tcMar>
           </w:tcPr>
           <w:p>
+            <w:pPr>
+              <w:keepNext/>
+            </w:pPr>
             <w:r>
               <w:rPr>
                 <w:b/>
@@ -4769,6 +5036,9 @@
             </w:tcMar>
           </w:tcPr>
           <w:p>
+            <w:pPr>
+              <w:keepNext/>
+            </w:pPr>
             <w:r>
               <w:rPr>
                 <w:b/>
@@ -4781,6 +5051,9 @@
         </w:tc>
       </w:tr>
       <w:tr>
+        <w:trPr>
+          <w:cantSplit/>
+        </w:trPr>
         <w:tc>
           <w:tcPr>
             <w:tcW w:type="dxa" w:w="2400"/>
@@ -4798,6 +5071,9 @@
             </w:tcMar>
           </w:tcPr>
           <w:p>
+            <w:pPr>
+              <w:keepNext/>
+            </w:pPr>
             <w:r>
               <w:t xml:space="preserve">Clé d’API partagée</w:t>
             </w:r>
@@ -4820,6 +5096,9 @@
             </w:tcMar>
           </w:tcPr>
           <w:p>
+            <w:pPr>
+              <w:keepNext/>
+            </w:pPr>
             <w:r>
               <w:t xml:space="preserve">Middleware Express vérifiant l’en-tête x-api-key (comparaison à temps constant via crypto.timingSafeEqual).</w:t>
             </w:r>
@@ -4842,6 +5121,9 @@
             </w:tcMar>
           </w:tcPr>
           <w:p>
+            <w:pPr>
+              <w:keepNext/>
+            </w:pPr>
             <w:r>
               <w:t xml:space="preserve">Restreint l’accès de l’API à la seule application web (exigence du brief).</w:t>
             </w:r>
@@ -4849,6 +5131,9 @@
         </w:tc>
       </w:tr>
       <w:tr>
+        <w:trPr>
+          <w:cantSplit/>
+        </w:trPr>
         <w:tc>
           <w:tcPr>
             <w:tcW w:type="dxa" w:w="2400"/>
@@ -4866,6 +5151,9 @@
             </w:tcMar>
           </w:tcPr>
           <w:p>
+            <w:pPr>
+              <w:keepNext/>
+            </w:pPr>
             <w:r>
               <w:t xml:space="preserve">CORS allowlist</w:t>
             </w:r>
@@ -4888,6 +5176,9 @@
             </w:tcMar>
           </w:tcPr>
           <w:p>
+            <w:pPr>
+              <w:keepNext/>
+            </w:pPr>
             <w:r>
               <w:t xml:space="preserve">Politique CORS limitée aux origines listées dans CORS_ORIGIN ; méthodes restreintes à GET et POST.</w:t>
             </w:r>
@@ -4910,6 +5201,9 @@
             </w:tcMar>
           </w:tcPr>
           <w:p>
+            <w:pPr>
+              <w:keepNext/>
+            </w:pPr>
             <w:r>
               <w:t xml:space="preserve">Empêche tout site tiers d’appeler l’API depuis un navigateur.</w:t>
             </w:r>
@@ -4917,6 +5211,9 @@
         </w:tc>
       </w:tr>
       <w:tr>
+        <w:trPr>
+          <w:cantSplit/>
+        </w:trPr>
         <w:tc>
           <w:tcPr>
             <w:tcW w:type="dxa" w:w="2400"/>
@@ -4934,6 +5231,9 @@
             </w:tcMar>
           </w:tcPr>
           <w:p>
+            <w:pPr>
+              <w:keepNext/>
+            </w:pPr>
             <w:r>
               <w:t xml:space="preserve">Helmet</w:t>
             </w:r>
@@ -4956,6 +5256,9 @@
             </w:tcMar>
           </w:tcPr>
           <w:p>
+            <w:pPr>
+              <w:keepNext/>
+            </w:pPr>
             <w:r>
               <w:t xml:space="preserve">En-têtes HTTP : nosniff, no-referrer, HSTS, X-Frame-Options…</w:t>
             </w:r>
@@ -4978,6 +5281,9 @@
             </w:tcMar>
           </w:tcPr>
           <w:p>
+            <w:pPr>
+              <w:keepNext/>
+            </w:pPr>
             <w:r>
               <w:t xml:space="preserve">Bouche les défauts de configuration HTTP courants (sniffing MIME, downgrade TLS, fuite de referer).</w:t>
             </w:r>
@@ -4985,6 +5291,9 @@
         </w:tc>
       </w:tr>
       <w:tr>
+        <w:trPr>
+          <w:cantSplit/>
+        </w:trPr>
         <w:tc>
           <w:tcPr>
             <w:tcW w:type="dxa" w:w="2400"/>
@@ -5002,6 +5311,9 @@
             </w:tcMar>
           </w:tcPr>
           <w:p>
+            <w:pPr>
+              <w:keepNext/>
+            </w:pPr>
             <w:r>
               <w:t xml:space="preserve">Rate limiting</w:t>
             </w:r>
@@ -5024,6 +5336,9 @@
             </w:tcMar>
           </w:tcPr>
           <w:p>
+            <w:pPr>
+              <w:keepNext/>
+            </w:pPr>
             <w:r>
               <w:t xml:space="preserve">express-rate-limit : 100 req/15 min global, 5 req/15 min sur le formulaire de contact.</w:t>
             </w:r>
@@ -5046,6 +5361,9 @@
             </w:tcMar>
           </w:tcPr>
           <w:p>
+            <w:pPr>
+              <w:keepNext/>
+            </w:pPr>
             <w:r>
               <w:t xml:space="preserve">Empêche le spam et la force brute sur la clé d’API.</w:t>
             </w:r>
@@ -5053,6 +5371,9 @@
         </w:tc>
       </w:tr>
       <w:tr>
+        <w:trPr>
+          <w:cantSplit/>
+        </w:trPr>
         <w:tc>
           <w:tcPr>
             <w:tcW w:type="dxa" w:w="2400"/>
@@ -5070,6 +5391,9 @@
             </w:tcMar>
           </w:tcPr>
           <w:p>
+            <w:pPr>
+              <w:keepNext/>
+            </w:pPr>
             <w:r>
               <w:t xml:space="preserve">Validation des entrées</w:t>
             </w:r>
@@ -5092,6 +5416,9 @@
             </w:tcMar>
           </w:tcPr>
           <w:p>
+            <w:pPr>
+              <w:keepNext/>
+            </w:pPr>
             <w:r>
               <w:t xml:space="preserve">express-validator côté serveur + validation HTML5/JS côté client.</w:t>
             </w:r>
@@ -5114,6 +5441,9 @@
             </w:tcMar>
           </w:tcPr>
           <w:p>
+            <w:pPr>
+              <w:keepNext/>
+            </w:pPr>
             <w:r>
               <w:t xml:space="preserve">Évite les données malformées, prépare le terrain contre XSS et injection.</w:t>
             </w:r>
@@ -5121,6 +5451,9 @@
         </w:tc>
       </w:tr>
       <w:tr>
+        <w:trPr>
+          <w:cantSplit/>
+        </w:trPr>
         <w:tc>
           <w:tcPr>
             <w:tcW w:type="dxa" w:w="2400"/>
@@ -5138,6 +5471,9 @@
             </w:tcMar>
           </w:tcPr>
           <w:p>
+            <w:pPr>
+              <w:keepNext/>
+            </w:pPr>
             <w:r>
               <w:t xml:space="preserve">Anti-injection SQL</w:t>
             </w:r>
@@ -5160,6 +5496,9 @@
             </w:tcMar>
           </w:tcPr>
           <w:p>
+            <w:pPr>
+              <w:keepNext/>
+            </w:pPr>
             <w:r>
               <w:t xml:space="preserve">Accès BDD via Sequelize (requêtes paramétrées). Aucun assemblage manuel.</w:t>
             </w:r>
@@ -5182,6 +5521,9 @@
             </w:tcMar>
           </w:tcPr>
           <w:p>
+            <w:pPr>
+              <w:keepNext/>
+            </w:pPr>
             <w:r>
               <w:t xml:space="preserve">Empêche l’injection SQL (OWASP A03).</w:t>
             </w:r>
@@ -5189,6 +5531,9 @@
         </w:tc>
       </w:tr>
       <w:tr>
+        <w:trPr>
+          <w:cantSplit/>
+        </w:trPr>
         <w:tc>
           <w:tcPr>
             <w:tcW w:type="dxa" w:w="2400"/>
@@ -5206,6 +5551,9 @@
             </w:tcMar>
           </w:tcPr>
           <w:p>
+            <w:pPr>
+              <w:keepNext/>
+            </w:pPr>
             <w:r>
               <w:t xml:space="preserve">Privilèges BDD minimaux</w:t>
             </w:r>
@@ -5228,6 +5576,9 @@
             </w:tcMar>
           </w:tcPr>
           <w:p>
+            <w:pPr>
+              <w:keepNext/>
+            </w:pPr>
             <w:r>
               <w:t xml:space="preserve">Compte applicatif (ttartisan_app) limité à SELECT/INSERT/UPDATE/DELETE.</w:t>
             </w:r>
@@ -5250,6 +5601,9 @@
             </w:tcMar>
           </w:tcPr>
           <w:p>
+            <w:pPr>
+              <w:keepNext/>
+            </w:pPr>
             <w:r>
               <w:t xml:space="preserve">Limite l’impact d’une compromission de la couche applicative.</w:t>
             </w:r>
@@ -5257,6 +5611,9 @@
         </w:tc>
       </w:tr>
       <w:tr>
+        <w:trPr>
+          <w:cantSplit/>
+        </w:trPr>
         <w:tc>
           <w:tcPr>
             <w:tcW w:type="dxa" w:w="2400"/>
@@ -5274,6 +5631,9 @@
             </w:tcMar>
           </w:tcPr>
           <w:p>
+            <w:pPr>
+              <w:keepNext/>
+            </w:pPr>
             <w:r>
               <w:t xml:space="preserve">Secrets en variables d’env.</w:t>
             </w:r>
@@ -5296,6 +5656,9 @@
             </w:tcMar>
           </w:tcPr>
           <w:p>
+            <w:pPr>
+              <w:keepNext/>
+            </w:pPr>
             <w:r>
               <w:t xml:space="preserve">dotenv + .env hors du dépôt (.gitignore).</w:t>
             </w:r>
@@ -5318,6 +5681,9 @@
             </w:tcMar>
           </w:tcPr>
           <w:p>
+            <w:pPr>
+              <w:keepNext/>
+            </w:pPr>
             <w:r>
               <w:t xml:space="preserve">Pas de secret dans le code, rotation facile.</w:t>
             </w:r>
@@ -5325,6 +5691,9 @@
         </w:tc>
       </w:tr>
       <w:tr>
+        <w:trPr>
+          <w:cantSplit/>
+        </w:trPr>
         <w:tc>
           <w:tcPr>
             <w:tcW w:type="dxa" w:w="2400"/>
@@ -5342,6 +5711,9 @@
             </w:tcMar>
           </w:tcPr>
           <w:p>
+            <w:pPr>
+              <w:keepNext/>
+            </w:pPr>
             <w:r>
               <w:t xml:space="preserve">HTTPS obligatoire</w:t>
             </w:r>
@@ -5364,6 +5736,9 @@
             </w:tcMar>
           </w:tcPr>
           <w:p>
+            <w:pPr>
+              <w:keepNext/>
+            </w:pPr>
             <w:r>
               <w:t xml:space="preserve">TLS terminé par l’hébergeur ; HSTS via Helmet.</w:t>
             </w:r>
@@ -5386,6 +5761,9 @@
             </w:tcMar>
           </w:tcPr>
           <w:p>
+            <w:pPr>
+              <w:keepNext/>
+            </w:pPr>
             <w:r>
               <w:t xml:space="preserve">Confidentialité et intégrité des échanges (notamment du formulaire).</w:t>
             </w:r>
@@ -5393,6 +5771,9 @@
         </w:tc>
       </w:tr>
       <w:tr>
+        <w:trPr>
+          <w:cantSplit/>
+        </w:trPr>
         <w:tc>
           <w:tcPr>
             <w:tcW w:type="dxa" w:w="2400"/>
@@ -5410,6 +5791,9 @@
             </w:tcMar>
           </w:tcPr>
           <w:p>
+            <w:pPr>
+              <w:keepNext/>
+            </w:pPr>
             <w:r>
               <w:t xml:space="preserve">Taille des requêtes</w:t>
             </w:r>
@@ -5432,6 +5816,9 @@
             </w:tcMar>
           </w:tcPr>
           <w:p>
+            <w:pPr>
+              <w:keepNext/>
+            </w:pPr>
             <w:r>
               <w:t xml:space="preserve">express.json({ limit: '32kb' }).</w:t>
             </w:r>
@@ -5454,6 +5841,9 @@
             </w:tcMar>
           </w:tcPr>
           <w:p>
+            <w:pPr>
+              <w:keepNext/>
+            </w:pPr>
             <w:r>
               <w:t xml:space="preserve">Protection basique contre les payloads abusifs.</w:t>
             </w:r>
@@ -5461,6 +5851,9 @@
         </w:tc>
       </w:tr>
       <w:tr>
+        <w:trPr>
+          <w:cantSplit/>
+        </w:trPr>
         <w:tc>
           <w:tcPr>
             <w:tcW w:type="dxa" w:w="2400"/>
@@ -5478,6 +5871,9 @@
             </w:tcMar>
           </w:tcPr>
           <w:p>
+            <w:pPr>
+              <w:keepNext/>
+            </w:pPr>
             <w:r>
               <w:t xml:space="preserve">Gestion d’erreurs centralisée</w:t>
             </w:r>
@@ -5500,6 +5896,9 @@
             </w:tcMar>
           </w:tcPr>
           <w:p>
+            <w:pPr>
+              <w:keepNext/>
+            </w:pPr>
             <w:r>
               <w:t xml:space="preserve">Middleware errorHandler qui masque les détails techniques en production.</w:t>
             </w:r>
@@ -5522,6 +5921,9 @@
             </w:tcMar>
           </w:tcPr>
           <w:p>
+            <w:pPr>
+              <w:keepNext/>
+            </w:pPr>
             <w:r>
               <w:t xml:space="preserve">Pas de fuite de stack trace ou de schéma BDD.</w:t>
             </w:r>
@@ -5529,6 +5931,9 @@
         </w:tc>
       </w:tr>
       <w:tr>
+        <w:trPr>
+          <w:cantSplit/>
+        </w:trPr>
         <w:tc>
           <w:tcPr>
             <w:tcW w:type="dxa" w:w="2400"/>
@@ -5546,6 +5951,9 @@
             </w:tcMar>
           </w:tcPr>
           <w:p>
+            <w:pPr>
+              <w:keepNext w:val="false"/>
+            </w:pPr>
             <w:r>
               <w:t xml:space="preserve">Traçabilité</w:t>
             </w:r>
@@ -5568,6 +5976,9 @@
             </w:tcMar>
           </w:tcPr>
           <w:p>
+            <w:pPr>
+              <w:keepNext w:val="false"/>
+            </w:pPr>
             <w:r>
               <w:t xml:space="preserve">Table contact_messages : enregistrement systématique des messages envoyés.</w:t>
             </w:r>
@@ -5590,6 +6001,9 @@
             </w:tcMar>
           </w:tcPr>
           <w:p>
+            <w:pPr>
+              <w:keepNext w:val="false"/>
+            </w:pPr>
             <w:r>
               <w:t xml:space="preserve">Auditabilité en cas d’incident (spam, réclamation).</w:t>
             </w:r>
@@ -5600,6 +6014,8 @@
     <w:p>
       <w:pPr>
         <w:pStyle w:val="Heading2"/>
+        <w:keepNext/>
+        <w:keepLines/>
         <w:spacing w:before="240" w:after="120"/>
       </w:pPr>
       <w:r>
@@ -5613,6 +6029,8 @@
     <w:p>
       <w:pPr>
         <w:pStyle w:val="Heading3"/>
+        <w:keepNext/>
+        <w:keepLines/>
         <w:spacing w:before="200" w:after="100"/>
       </w:pPr>
       <w:r>
@@ -5625,7 +6043,7 @@
     </w:p>
     <w:p>
       <w:pPr>
-        <w:spacing w:after="120"/>
+        <w:spacing w:after="200" w:line="276"/>
         <w:jc w:val="both"/>
       </w:pPr>
       <w:r>
@@ -5635,6 +6053,8 @@
     <w:p>
       <w:pPr>
         <w:pStyle w:val="Heading3"/>
+        <w:keepNext/>
+        <w:keepLines/>
         <w:spacing w:before="200" w:after="100"/>
       </w:pPr>
       <w:r>
@@ -5647,7 +6067,7 @@
     </w:p>
     <w:p>
       <w:pPr>
-        <w:spacing w:after="120"/>
+        <w:spacing w:after="200" w:line="276"/>
         <w:jc w:val="both"/>
       </w:pPr>
       <w:r>
@@ -5657,6 +6077,8 @@
     <w:p>
       <w:pPr>
         <w:pStyle w:val="Heading3"/>
+        <w:keepNext/>
+        <w:keepLines/>
         <w:spacing w:before="200" w:after="100"/>
       </w:pPr>
       <w:r>
@@ -5669,7 +6091,7 @@
     </w:p>
     <w:p>
       <w:pPr>
-        <w:spacing w:after="120"/>
+        <w:spacing w:after="200" w:line="276"/>
         <w:jc w:val="both"/>
       </w:pPr>
       <w:r>
@@ -5679,6 +6101,8 @@
     <w:p>
       <w:pPr>
         <w:pStyle w:val="Heading3"/>
+        <w:keepNext/>
+        <w:keepLines/>
         <w:spacing w:before="200" w:after="100"/>
       </w:pPr>
       <w:r>
@@ -5691,7 +6115,7 @@
     </w:p>
     <w:p>
       <w:pPr>
-        <w:spacing w:after="120"/>
+        <w:spacing w:after="200" w:line="276"/>
         <w:jc w:val="both"/>
       </w:pPr>
       <w:r>
@@ -5706,6 +6130,8 @@
     <w:p>
       <w:pPr>
         <w:pStyle w:val="Heading1"/>
+        <w:keepNext/>
+        <w:keepLines/>
         <w:spacing w:before="360" w:after="180"/>
       </w:pPr>
       <w:r>
@@ -5719,6 +6145,8 @@
     <w:p>
       <w:pPr>
         <w:pStyle w:val="Heading2"/>
+        <w:keepNext/>
+        <w:keepLines/>
         <w:spacing w:before="240" w:after="120"/>
       </w:pPr>
       <w:r>
@@ -5736,7 +6164,7 @@
           <w:ilvl w:val="0"/>
           <w:numId w:val="2"/>
         </w:numPr>
-        <w:spacing w:after="80"/>
+        <w:spacing w:after="120" w:line="276"/>
       </w:pPr>
       <w:r>
         <w:t xml:space="preserve">OWASP Top 10 (2021) — vulnérabilités web et recommandations.</w:t>
@@ -5749,7 +6177,7 @@
           <w:ilvl w:val="0"/>
           <w:numId w:val="2"/>
         </w:numPr>
-        <w:spacing w:after="80"/>
+        <w:spacing w:after="120" w:line="276"/>
       </w:pPr>
       <w:r>
         <w:t xml:space="preserve">OWASP Cheat Sheets — fiches pratiques.</w:t>
@@ -5762,7 +6190,7 @@
           <w:ilvl w:val="0"/>
           <w:numId w:val="2"/>
         </w:numPr>
-        <w:spacing w:after="80"/>
+        <w:spacing w:after="120" w:line="276"/>
       </w:pPr>
       <w:r>
         <w:t xml:space="preserve">Snyk Vulnerability DB &amp; GitHub Security Advisories — CVE des paquets npm utilisés.</w:t>
@@ -5775,7 +6203,7 @@
           <w:ilvl w:val="0"/>
           <w:numId w:val="2"/>
         </w:numPr>
-        <w:spacing w:after="80"/>
+        <w:spacing w:after="120" w:line="276"/>
       </w:pPr>
       <w:r>
         <w:t xml:space="preserve">CNIL — bonnes pratiques RGPD pour les formulaires.</w:t>
@@ -5788,7 +6216,7 @@
           <w:ilvl w:val="0"/>
           <w:numId w:val="2"/>
         </w:numPr>
-        <w:spacing w:after="80"/>
+        <w:spacing w:after="120" w:line="276"/>
       </w:pPr>
       <w:r>
         <w:t xml:space="preserve">W3C — WCAG 2.1 (accessibilité, imposé par le brief).</w:t>
@@ -5801,7 +6229,7 @@
           <w:ilvl w:val="0"/>
           <w:numId w:val="2"/>
         </w:numPr>
-        <w:spacing w:after="80"/>
+        <w:spacing w:after="120" w:line="276"/>
       </w:pPr>
       <w:r>
         <w:t xml:space="preserve">MDN Web Docs — détails sur les en-têtes HTTP de sécurité (CSP, HSTS, etc.).</w:t>
@@ -5810,6 +6238,8 @@
     <w:p>
       <w:pPr>
         <w:pStyle w:val="Heading2"/>
+        <w:keepNext/>
+        <w:keepLines/>
         <w:spacing w:before="240" w:after="120"/>
       </w:pPr>
       <w:r>
@@ -5838,6 +6268,7 @@
       </w:tblGrid>
       <w:tr>
         <w:trPr>
+          <w:cantSplit/>
           <w:tblHeader/>
         </w:trPr>
         <w:tc>
@@ -5858,6 +6289,9 @@
             </w:tcMar>
           </w:tcPr>
           <w:p>
+            <w:pPr>
+              <w:keepNext/>
+            </w:pPr>
             <w:r>
               <w:rPr>
                 <w:b/>
@@ -5886,6 +6320,9 @@
             </w:tcMar>
           </w:tcPr>
           <w:p>
+            <w:pPr>
+              <w:keepNext/>
+            </w:pPr>
             <w:r>
               <w:rPr>
                 <w:b/>
@@ -5898,6 +6335,9 @@
         </w:tc>
       </w:tr>
       <w:tr>
+        <w:trPr>
+          <w:cantSplit/>
+        </w:trPr>
         <w:tc>
           <w:tcPr>
             <w:tcW w:type="dxa" w:w="3360"/>
@@ -5915,6 +6355,9 @@
             </w:tcMar>
           </w:tcPr>
           <w:p>
+            <w:pPr>
+              <w:keepNext/>
+            </w:pPr>
             <w:r>
               <w:t xml:space="preserve">A01 Broken Access Control</w:t>
             </w:r>
@@ -5937,6 +6380,9 @@
             </w:tcMar>
           </w:tcPr>
           <w:p>
+            <w:pPr>
+              <w:keepNext/>
+            </w:pPr>
             <w:r>
               <w:t xml:space="preserve">Clé d’API obligatoire, pas de session, pas d’admin exposé.</w:t>
             </w:r>
@@ -5944,6 +6390,9 @@
         </w:tc>
       </w:tr>
       <w:tr>
+        <w:trPr>
+          <w:cantSplit/>
+        </w:trPr>
         <w:tc>
           <w:tcPr>
             <w:tcW w:type="dxa" w:w="3360"/>
@@ -5961,6 +6410,9 @@
             </w:tcMar>
           </w:tcPr>
           <w:p>
+            <w:pPr>
+              <w:keepNext/>
+            </w:pPr>
             <w:r>
               <w:t xml:space="preserve">A02 Cryptographic Failures</w:t>
             </w:r>
@@ -5983,6 +6435,9 @@
             </w:tcMar>
           </w:tcPr>
           <w:p>
+            <w:pPr>
+              <w:keepNext/>
+            </w:pPr>
             <w:r>
               <w:t xml:space="preserve">HTTPS + HSTS, secrets en variables d’environnement, comparaison à temps constant.</w:t>
             </w:r>
@@ -5990,6 +6445,9 @@
         </w:tc>
       </w:tr>
       <w:tr>
+        <w:trPr>
+          <w:cantSplit/>
+        </w:trPr>
         <w:tc>
           <w:tcPr>
             <w:tcW w:type="dxa" w:w="3360"/>
@@ -6007,6 +6465,9 @@
             </w:tcMar>
           </w:tcPr>
           <w:p>
+            <w:pPr>
+              <w:keepNext/>
+            </w:pPr>
             <w:r>
               <w:t xml:space="preserve">A03 Injection</w:t>
             </w:r>
@@ -6029,6 +6490,9 @@
             </w:tcMar>
           </w:tcPr>
           <w:p>
+            <w:pPr>
+              <w:keepNext/>
+            </w:pPr>
             <w:r>
               <w:t xml:space="preserve">Sequelize (paramétré), express-validator, échappement React.</w:t>
             </w:r>
@@ -6036,6 +6500,9 @@
         </w:tc>
       </w:tr>
       <w:tr>
+        <w:trPr>
+          <w:cantSplit/>
+        </w:trPr>
         <w:tc>
           <w:tcPr>
             <w:tcW w:type="dxa" w:w="3360"/>
@@ -6053,6 +6520,9 @@
             </w:tcMar>
           </w:tcPr>
           <w:p>
+            <w:pPr>
+              <w:keepNext/>
+            </w:pPr>
             <w:r>
               <w:t xml:space="preserve">A04 Insecure Design</w:t>
             </w:r>
@@ -6075,6 +6545,9 @@
             </w:tcMar>
           </w:tcPr>
           <w:p>
+            <w:pPr>
+              <w:keepNext/>
+            </w:pPr>
             <w:r>
               <w:t xml:space="preserve">Modèle simple, contraintes BDD, moindre privilège.</w:t>
             </w:r>
@@ -6082,6 +6555,9 @@
         </w:tc>
       </w:tr>
       <w:tr>
+        <w:trPr>
+          <w:cantSplit/>
+        </w:trPr>
         <w:tc>
           <w:tcPr>
             <w:tcW w:type="dxa" w:w="3360"/>
@@ -6099,6 +6575,9 @@
             </w:tcMar>
           </w:tcPr>
           <w:p>
+            <w:pPr>
+              <w:keepNext/>
+            </w:pPr>
             <w:r>
               <w:t xml:space="preserve">A05 Security Misconfiguration</w:t>
             </w:r>
@@ -6121,6 +6600,9 @@
             </w:tcMar>
           </w:tcPr>
           <w:p>
+            <w:pPr>
+              <w:keepNext/>
+            </w:pPr>
             <w:r>
               <w:t xml:space="preserve">Helmet, x-powered-by désactivé, errorHandler discret en production.</w:t>
             </w:r>
@@ -6128,6 +6610,9 @@
         </w:tc>
       </w:tr>
       <w:tr>
+        <w:trPr>
+          <w:cantSplit/>
+        </w:trPr>
         <w:tc>
           <w:tcPr>
             <w:tcW w:type="dxa" w:w="3360"/>
@@ -6145,6 +6630,9 @@
             </w:tcMar>
           </w:tcPr>
           <w:p>
+            <w:pPr>
+              <w:keepNext/>
+            </w:pPr>
             <w:r>
               <w:t xml:space="preserve">A06 Vulnerable Components</w:t>
             </w:r>
@@ -6167,6 +6655,9 @@
             </w:tcMar>
           </w:tcPr>
           <w:p>
+            <w:pPr>
+              <w:keepNext/>
+            </w:pPr>
             <w:r>
               <w:t xml:space="preserve">npm audit, dépendances à jour, lockfile commité.</w:t>
             </w:r>
@@ -6174,6 +6665,9 @@
         </w:tc>
       </w:tr>
       <w:tr>
+        <w:trPr>
+          <w:cantSplit/>
+        </w:trPr>
         <w:tc>
           <w:tcPr>
             <w:tcW w:type="dxa" w:w="3360"/>
@@ -6191,6 +6685,9 @@
             </w:tcMar>
           </w:tcPr>
           <w:p>
+            <w:pPr>
+              <w:keepNext/>
+            </w:pPr>
             <w:r>
               <w:t xml:space="preserve">A07 Auth Failures</w:t>
             </w:r>
@@ -6213,6 +6710,9 @@
             </w:tcMar>
           </w:tcPr>
           <w:p>
+            <w:pPr>
+              <w:keepNext/>
+            </w:pPr>
             <w:r>
               <w:t xml:space="preserve">Pas d’espace membre, rate limiting, clé longue et aléatoire.</w:t>
             </w:r>
@@ -6220,6 +6720,9 @@
         </w:tc>
       </w:tr>
       <w:tr>
+        <w:trPr>
+          <w:cantSplit/>
+        </w:trPr>
         <w:tc>
           <w:tcPr>
             <w:tcW w:type="dxa" w:w="3360"/>
@@ -6237,6 +6740,9 @@
             </w:tcMar>
           </w:tcPr>
           <w:p>
+            <w:pPr>
+              <w:keepNext/>
+            </w:pPr>
             <w:r>
               <w:t xml:space="preserve">A08 Software Integrity</w:t>
             </w:r>
@@ -6259,6 +6765,9 @@
             </w:tcMar>
           </w:tcPr>
           <w:p>
+            <w:pPr>
+              <w:keepNext/>
+            </w:pPr>
             <w:r>
               <w:t xml:space="preserve">package-lock.json versionné, sources officielles npm.</w:t>
             </w:r>
@@ -6266,6 +6775,9 @@
         </w:tc>
       </w:tr>
       <w:tr>
+        <w:trPr>
+          <w:cantSplit/>
+        </w:trPr>
         <w:tc>
           <w:tcPr>
             <w:tcW w:type="dxa" w:w="3360"/>
@@ -6283,6 +6795,9 @@
             </w:tcMar>
           </w:tcPr>
           <w:p>
+            <w:pPr>
+              <w:keepNext/>
+            </w:pPr>
             <w:r>
               <w:t xml:space="preserve">A09 Logging Failures</w:t>
             </w:r>
@@ -6305,6 +6820,9 @@
             </w:tcMar>
           </w:tcPr>
           <w:p>
+            <w:pPr>
+              <w:keepNext/>
+            </w:pPr>
             <w:r>
               <w:t xml:space="preserve">Morgan en logs HTTP, traçabilité des messages.</w:t>
             </w:r>
@@ -6312,6 +6830,9 @@
         </w:tc>
       </w:tr>
       <w:tr>
+        <w:trPr>
+          <w:cantSplit/>
+        </w:trPr>
         <w:tc>
           <w:tcPr>
             <w:tcW w:type="dxa" w:w="3360"/>
@@ -6329,6 +6850,9 @@
             </w:tcMar>
           </w:tcPr>
           <w:p>
+            <w:pPr>
+              <w:keepNext w:val="false"/>
+            </w:pPr>
             <w:r>
               <w:t xml:space="preserve">A10 SSRF</w:t>
             </w:r>
@@ -6351,6 +6875,9 @@
             </w:tcMar>
           </w:tcPr>
           <w:p>
+            <w:pPr>
+              <w:keepNext w:val="false"/>
+            </w:pPr>
             <w:r>
               <w:t xml:space="preserve">Aucune requête sortante déclenchée par des données utilisateur.</w:t>
             </w:r>
@@ -6361,6 +6888,8 @@
     <w:p>
       <w:pPr>
         <w:pStyle w:val="Heading2"/>
+        <w:keepNext/>
+        <w:keepLines/>
         <w:spacing w:before="240" w:after="120"/>
       </w:pPr>
       <w:r>
@@ -6390,6 +6919,7 @@
       </w:tblGrid>
       <w:tr>
         <w:trPr>
+          <w:cantSplit/>
           <w:tblHeader/>
         </w:trPr>
         <w:tc>
@@ -6410,6 +6940,9 @@
             </w:tcMar>
           </w:tcPr>
           <w:p>
+            <w:pPr>
+              <w:keepNext/>
+            </w:pPr>
             <w:r>
               <w:rPr>
                 <w:b/>
@@ -6438,6 +6971,9 @@
             </w:tcMar>
           </w:tcPr>
           <w:p>
+            <w:pPr>
+              <w:keepNext/>
+            </w:pPr>
             <w:r>
               <w:rPr>
                 <w:b/>
@@ -6466,6 +7002,9 @@
             </w:tcMar>
           </w:tcPr>
           <w:p>
+            <w:pPr>
+              <w:keepNext/>
+            </w:pPr>
             <w:r>
               <w:rPr>
                 <w:b/>
@@ -6478,6 +7017,9 @@
         </w:tc>
       </w:tr>
       <w:tr>
+        <w:trPr>
+          <w:cantSplit/>
+        </w:trPr>
         <w:tc>
           <w:tcPr>
             <w:tcW w:type="dxa" w:w="3000"/>
@@ -6495,6 +7037,9 @@
             </w:tcMar>
           </w:tcPr>
           <w:p>
+            <w:pPr>
+              <w:keepNext/>
+            </w:pPr>
             <w:r>
               <w:t xml:space="preserve">Injection SQL via ?q='OR 1=1--</w:t>
             </w:r>
@@ -6517,6 +7062,9 @@
             </w:tcMar>
           </w:tcPr>
           <w:p>
+            <w:pPr>
+              <w:keepNext/>
+            </w:pPr>
             <w:r>
               <w:t xml:space="preserve">Aucune ligne supplémentaire renvoyée</w:t>
             </w:r>
@@ -6539,6 +7087,9 @@
             </w:tcMar>
           </w:tcPr>
           <w:p>
+            <w:pPr>
+              <w:keepNext/>
+            </w:pPr>
             <w:r>
               <w:t xml:space="preserve">OK — Sequelize paramétré</w:t>
             </w:r>
@@ -6546,6 +7097,9 @@
         </w:tc>
       </w:tr>
       <w:tr>
+        <w:trPr>
+          <w:cantSplit/>
+        </w:trPr>
         <w:tc>
           <w:tcPr>
             <w:tcW w:type="dxa" w:w="3000"/>
@@ -6563,6 +7117,9 @@
             </w:tcMar>
           </w:tcPr>
           <w:p>
+            <w:pPr>
+              <w:keepNext/>
+            </w:pPr>
             <w:r>
               <w:t xml:space="preserve">XSS via formulaire de contact</w:t>
             </w:r>
@@ -6585,6 +7142,9 @@
             </w:tcMar>
           </w:tcPr>
           <w:p>
+            <w:pPr>
+              <w:keepNext/>
+            </w:pPr>
             <w:r>
               <w:t xml:space="preserve">Texte stocké tel quel, non exécuté</w:t>
             </w:r>
@@ -6607,6 +7167,9 @@
             </w:tcMar>
           </w:tcPr>
           <w:p>
+            <w:pPr>
+              <w:keepNext/>
+            </w:pPr>
             <w:r>
               <w:t xml:space="preserve">OK — React échappe automatiquement</w:t>
             </w:r>
@@ -6614,6 +7177,9 @@
         </w:tc>
       </w:tr>
       <w:tr>
+        <w:trPr>
+          <w:cantSplit/>
+        </w:trPr>
         <w:tc>
           <w:tcPr>
             <w:tcW w:type="dxa" w:w="3000"/>
@@ -6631,6 +7197,9 @@
             </w:tcMar>
           </w:tcPr>
           <w:p>
+            <w:pPr>
+              <w:keepNext/>
+            </w:pPr>
             <w:r>
               <w:t xml:space="preserve">Appel sans clé d’API</w:t>
             </w:r>
@@ -6653,6 +7222,9 @@
             </w:tcMar>
           </w:tcPr>
           <w:p>
+            <w:pPr>
+              <w:keepNext/>
+            </w:pPr>
             <w:r>
               <w:t xml:space="preserve">401 Unauthorized</w:t>
             </w:r>
@@ -6675,6 +7247,9 @@
             </w:tcMar>
           </w:tcPr>
           <w:p>
+            <w:pPr>
+              <w:keepNext/>
+            </w:pPr>
             <w:r>
               <w:t xml:space="preserve">OK — middleware apiKey</w:t>
             </w:r>
@@ -6682,6 +7257,9 @@
         </w:tc>
       </w:tr>
       <w:tr>
+        <w:trPr>
+          <w:cantSplit/>
+        </w:trPr>
         <w:tc>
           <w:tcPr>
             <w:tcW w:type="dxa" w:w="3000"/>
@@ -6699,6 +7277,9 @@
             </w:tcMar>
           </w:tcPr>
           <w:p>
+            <w:pPr>
+              <w:keepNext/>
+            </w:pPr>
             <w:r>
               <w:t xml:space="preserve">Origine non autorisée</w:t>
             </w:r>
@@ -6721,6 +7302,9 @@
             </w:tcMar>
           </w:tcPr>
           <w:p>
+            <w:pPr>
+              <w:keepNext/>
+            </w:pPr>
             <w:r>
               <w:t xml:space="preserve">Erreur CORS</w:t>
             </w:r>
@@ -6743,6 +7327,9 @@
             </w:tcMar>
           </w:tcPr>
           <w:p>
+            <w:pPr>
+              <w:keepNext/>
+            </w:pPr>
             <w:r>
               <w:t xml:space="preserve">OK</w:t>
             </w:r>
@@ -6750,6 +7337,9 @@
         </w:tc>
       </w:tr>
       <w:tr>
+        <w:trPr>
+          <w:cantSplit/>
+        </w:trPr>
         <w:tc>
           <w:tcPr>
             <w:tcW w:type="dxa" w:w="3000"/>
@@ -6767,6 +7357,9 @@
             </w:tcMar>
           </w:tcPr>
           <w:p>
+            <w:pPr>
+              <w:keepNext/>
+            </w:pPr>
             <w:r>
               <w:t xml:space="preserve">Spam du formulaire (&gt;5/15 min)</w:t>
             </w:r>
@@ -6789,6 +7382,9 @@
             </w:tcMar>
           </w:tcPr>
           <w:p>
+            <w:pPr>
+              <w:keepNext/>
+            </w:pPr>
             <w:r>
               <w:t xml:space="preserve">429 Too Many Requests</w:t>
             </w:r>
@@ -6811,6 +7407,9 @@
             </w:tcMar>
           </w:tcPr>
           <w:p>
+            <w:pPr>
+              <w:keepNext/>
+            </w:pPr>
             <w:r>
               <w:t xml:space="preserve">OK — express-rate-limit</w:t>
             </w:r>
@@ -6818,6 +7417,9 @@
         </w:tc>
       </w:tr>
       <w:tr>
+        <w:trPr>
+          <w:cantSplit/>
+        </w:trPr>
         <w:tc>
           <w:tcPr>
             <w:tcW w:type="dxa" w:w="3000"/>
@@ -6835,6 +7437,9 @@
             </w:tcMar>
           </w:tcPr>
           <w:p>
+            <w:pPr>
+              <w:keepNext/>
+            </w:pPr>
             <w:r>
               <w:t xml:space="preserve">Payload JSON &gt; 32 ko</w:t>
             </w:r>
@@ -6857,6 +7462,9 @@
             </w:tcMar>
           </w:tcPr>
           <w:p>
+            <w:pPr>
+              <w:keepNext/>
+            </w:pPr>
             <w:r>
               <w:t xml:space="preserve">Refus 413</w:t>
             </w:r>
@@ -6879,6 +7487,9 @@
             </w:tcMar>
           </w:tcPr>
           <w:p>
+            <w:pPr>
+              <w:keepNext/>
+            </w:pPr>
             <w:r>
               <w:t xml:space="preserve">OK — express.json limit</w:t>
             </w:r>
@@ -6886,6 +7497,9 @@
         </w:tc>
       </w:tr>
       <w:tr>
+        <w:trPr>
+          <w:cantSplit/>
+        </w:trPr>
         <w:tc>
           <w:tcPr>
             <w:tcW w:type="dxa" w:w="3000"/>
@@ -6903,6 +7517,9 @@
             </w:tcMar>
           </w:tcPr>
           <w:p>
+            <w:pPr>
+              <w:keepNext w:val="false"/>
+            </w:pPr>
             <w:r>
               <w:t xml:space="preserve">npm audit (front + back)</w:t>
             </w:r>
@@ -6925,6 +7542,9 @@
             </w:tcMar>
           </w:tcPr>
           <w:p>
+            <w:pPr>
+              <w:keepNext w:val="false"/>
+            </w:pPr>
             <w:r>
               <w:t xml:space="preserve">Aucune vuln. critique</w:t>
             </w:r>
@@ -6947,6 +7567,9 @@
             </w:tcMar>
           </w:tcPr>
           <w:p>
+            <w:pPr>
+              <w:keepNext w:val="false"/>
+            </w:pPr>
             <w:r>
               <w:t xml:space="preserve">OK au moment du rendu</w:t>
             </w:r>
@@ -6957,6 +7580,8 @@
     <w:p>
       <w:pPr>
         <w:pStyle w:val="Heading2"/>
+        <w:keepNext/>
+        <w:keepLines/>
         <w:spacing w:before="240" w:after="120"/>
       </w:pPr>
       <w:r>
@@ -6974,7 +7599,7 @@
           <w:ilvl w:val="0"/>
           <w:numId w:val="2"/>
         </w:numPr>
-        <w:spacing w:after="80"/>
+        <w:spacing w:after="120" w:line="276"/>
       </w:pPr>
       <w:r>
         <w:t xml:space="preserve">Comparaison naïve de la clé d’API remplacée par crypto.timingSafeEqual (anti-timing attack).</w:t>
@@ -6987,7 +7612,7 @@
           <w:ilvl w:val="0"/>
           <w:numId w:val="2"/>
         </w:numPr>
-        <w:spacing w:after="80"/>
+        <w:spacing w:after="120" w:line="276"/>
       </w:pPr>
       <w:r>
         <w:t xml:space="preserve">Ajout d’un handler explicite pour les 404 API afin d’éviter toute fuite de stack Express.</w:t>
@@ -7000,7 +7625,7 @@
           <w:ilvl w:val="0"/>
           <w:numId w:val="2"/>
         </w:numPr>
-        <w:spacing w:after="80"/>
+        <w:spacing w:after="120" w:line="276"/>
       </w:pPr>
       <w:r>
         <w:t xml:space="preserve">Désactivation de l’en-tête X-Powered-By d’Express.</w:t>
@@ -7013,7 +7638,7 @@
           <w:ilvl w:val="0"/>
           <w:numId w:val="2"/>
         </w:numPr>
-        <w:spacing w:after="80"/>
+        <w:spacing w:after="120" w:line="276"/>
       </w:pPr>
       <w:r>
         <w:t xml:space="preserve">Aucun usage de dangerouslySetInnerHTML côté React (XSS stocké/réfléchi).</w:t>
@@ -7027,6 +7652,8 @@
     <w:p>
       <w:pPr>
         <w:pStyle w:val="Heading1"/>
+        <w:keepNext/>
+        <w:keepLines/>
         <w:spacing w:before="360" w:after="180"/>
       </w:pPr>
       <w:r>
@@ -7040,6 +7667,8 @@
     <w:p>
       <w:pPr>
         <w:pStyle w:val="Heading2"/>
+        <w:keepNext/>
+        <w:keepLines/>
         <w:spacing w:before="240" w:after="120"/>
       </w:pPr>
       <w:r>
@@ -7057,7 +7686,7 @@
       <w:r>
         <w:t xml:space="preserve">Le dépôt est public et contient l’intégralité du code, les scripts SQL et le README.md : </w:t>
       </w:r>
-      <w:hyperlink w:history="1" r:id="rIdo0bobxrah7jzdi-gao-wz">
+      <w:hyperlink w:history="1" r:id="rIdncbo0g4ntv8a4uosnyf3l">
         <w:r>
           <w:rPr>
             <w:rStyle w:val="Hyperlink"/>
@@ -7068,7 +7697,7 @@
     </w:p>
     <w:p>
       <w:pPr>
-        <w:spacing w:after="120"/>
+        <w:spacing w:after="200" w:line="276"/>
         <w:jc w:val="both"/>
       </w:pPr>
       <w:r>
@@ -7082,7 +7711,7 @@
           <w:ilvl w:val="0"/>
           <w:numId w:val="2"/>
         </w:numPr>
-        <w:spacing w:after="80"/>
+        <w:spacing w:after="120" w:line="276"/>
       </w:pPr>
       <w:r>
         <w:t xml:space="preserve">backend/ — API Express + Sequelize.</w:t>
@@ -7095,7 +7724,7 @@
           <w:ilvl w:val="0"/>
           <w:numId w:val="2"/>
         </w:numPr>
-        <w:spacing w:after="80"/>
+        <w:spacing w:after="120" w:line="276"/>
       </w:pPr>
       <w:r>
         <w:t xml:space="preserve">frontend/ — Application React + Bootstrap + Sass.</w:t>
@@ -7108,7 +7737,7 @@
           <w:ilvl w:val="0"/>
           <w:numId w:val="2"/>
         </w:numPr>
-        <w:spacing w:after="80"/>
+        <w:spacing w:after="120" w:line="276"/>
       </w:pPr>
       <w:r>
         <w:t xml:space="preserve">database/01_schema.sql — Création de la base de données (version XAMPP locale).</w:t>
@@ -7121,7 +7750,7 @@
           <w:ilvl w:val="0"/>
           <w:numId w:val="2"/>
         </w:numPr>
-        <w:spacing w:after="80"/>
+        <w:spacing w:after="120" w:line="276"/>
       </w:pPr>
       <w:r>
         <w:t xml:space="preserve">database/02_seed.sql — Alimentation (17 artisans).</w:t>
@@ -7134,7 +7763,7 @@
           <w:ilvl w:val="0"/>
           <w:numId w:val="2"/>
         </w:numPr>
-        <w:spacing w:after="80"/>
+        <w:spacing w:after="120" w:line="276"/>
       </w:pPr>
       <w:r>
         <w:t xml:space="preserve">database/remote/ — Variantes des scripts SQL pour hébergement distant (AlwaysData).</w:t>
@@ -7147,7 +7776,7 @@
           <w:ilvl w:val="0"/>
           <w:numId w:val="2"/>
         </w:numPr>
-        <w:spacing w:after="80"/>
+        <w:spacing w:after="120" w:line="276"/>
       </w:pPr>
       <w:r>
         <w:t xml:space="preserve">docs/ — Documentation technique (sécurité, veille, BDD, maquettes).</w:t>
@@ -7160,7 +7789,7 @@
           <w:ilvl w:val="0"/>
           <w:numId w:val="2"/>
         </w:numPr>
-        <w:spacing w:after="80"/>
+        <w:spacing w:after="120" w:line="276"/>
       </w:pPr>
       <w:r>
         <w:t xml:space="preserve">README.md — Prérequis, installation, lancement.</w:t>
@@ -7169,6 +7798,8 @@
     <w:p>
       <w:pPr>
         <w:pStyle w:val="Heading2"/>
+        <w:keepNext/>
+        <w:keepLines/>
         <w:spacing w:before="240" w:after="120"/>
       </w:pPr>
       <w:r>
@@ -7186,7 +7817,7 @@
       <w:r>
         <w:t xml:space="preserve">Frontend (Vercel) : </w:t>
       </w:r>
-      <w:hyperlink w:history="1" r:id="rId3b4wlzw71ovj-xcl2snao">
+      <w:hyperlink w:history="1" r:id="rIde98tbpttvxi9yp_ofxaos">
         <w:r>
           <w:rPr>
             <w:rStyle w:val="Hyperlink"/>
@@ -7202,7 +7833,7 @@
       <w:r>
         <w:t xml:space="preserve">API (Render) : </w:t>
       </w:r>
-      <w:hyperlink w:history="1" r:id="rIdhj4-7vmgvp0ofcqezll8x">
+      <w:hyperlink w:history="1" r:id="rIdfv4vkwrvh96j9qkp-yzgj">
         <w:r>
           <w:rPr>
             <w:rStyle w:val="Hyperlink"/>
@@ -7213,7 +7844,7 @@
     </w:p>
     <w:p>
       <w:pPr>
-        <w:spacing w:after="120"/>
+        <w:spacing w:after="200" w:line="276"/>
         <w:jc w:val="both"/>
       </w:pPr>
       <w:r>
@@ -7223,6 +7854,8 @@
     <w:p>
       <w:pPr>
         <w:pStyle w:val="Heading2"/>
+        <w:keepNext/>
+        <w:keepLines/>
         <w:spacing w:before="240" w:after="120"/>
       </w:pPr>
       <w:r>
@@ -7240,7 +7873,7 @@
       <w:r>
         <w:t xml:space="preserve">Fichier de maquettes (lecture publique) : </w:t>
       </w:r>
-      <w:hyperlink w:history="1" r:id="rId3sswriukvwejmydulve_b">
+      <w:hyperlink w:history="1" r:id="rIdwmi7vbyxkrsqasmaffeim">
         <w:r>
           <w:rPr>
             <w:rStyle w:val="Hyperlink"/>
@@ -7286,7 +7919,7 @@
       <w:rPr>
         <w:color w:val="384050"/>
       </w:rPr>
-      <w:t xml:space="preserve">19/07/2026</w:t>
+      <w:t xml:space="preserve">20/07/2026</w:t>
     </w:r>
     <w:r>
       <w:rPr>

</xml_diff>

<commit_message>
Regroupe le jeu d'essai (3.10) en entier sur une même page grâce à un saut de page avant le titre
</commit_message>
<xml_diff>
--- a/docs/dossier-trouve-ton-artisan.docx
+++ b/docs/dossier-trouve-ton-artisan.docx
@@ -186,6 +186,7 @@
     </w:p>
     <w:p>
       <w:pPr>
+        <w:keepNext w:val="false"/>
         <w:spacing w:after="200" w:line="276"/>
         <w:jc w:val="both"/>
       </w:pPr>
@@ -725,6 +726,7 @@
     </w:tbl>
     <w:p>
       <w:pPr>
+        <w:keepNext w:val="false"/>
         <w:spacing w:after="200" w:line="276"/>
         <w:jc w:val="both"/>
       </w:pPr>
@@ -773,6 +775,7 @@
     </w:p>
     <w:p>
       <w:pPr>
+        <w:keepNext w:val="false"/>
         <w:spacing w:after="200" w:line="276"/>
         <w:jc w:val="both"/>
       </w:pPr>
@@ -782,6 +785,7 @@
     </w:p>
     <w:p>
       <w:pPr>
+        <w:keepNext w:val="false"/>
         <w:spacing w:after="200" w:line="276"/>
         <w:jc w:val="both"/>
       </w:pPr>
@@ -806,6 +810,7 @@
     </w:p>
     <w:p>
       <w:pPr>
+        <w:keepNext w:val="false"/>
         <w:spacing w:after="200" w:line="276"/>
         <w:jc w:val="both"/>
       </w:pPr>
@@ -1068,6 +1073,7 @@
     </w:p>
     <w:p>
       <w:pPr>
+        <w:keepNext w:val="false"/>
         <w:spacing w:after="200" w:line="276"/>
         <w:jc w:val="both"/>
       </w:pPr>
@@ -1077,6 +1083,7 @@
     </w:p>
     <w:p>
       <w:pPr>
+        <w:keepNext w:val="false"/>
         <w:spacing w:after="200" w:line="276"/>
         <w:jc w:val="both"/>
       </w:pPr>
@@ -1216,6 +1223,7 @@
     </w:p>
     <w:p>
       <w:pPr>
+        <w:keepNext w:val="false"/>
         <w:spacing w:after="200" w:line="276"/>
         <w:jc w:val="both"/>
       </w:pPr>
@@ -1245,6 +1253,7 @@
     </w:p>
     <w:p>
       <w:pPr>
+        <w:keepNext w:val="false"/>
         <w:spacing w:after="200" w:line="276"/>
         <w:jc w:val="both"/>
       </w:pPr>
@@ -2048,6 +2057,7 @@
     </w:tbl>
     <w:p>
       <w:pPr>
+        <w:keepNext w:val="false"/>
         <w:spacing w:after="200" w:line="276"/>
         <w:jc w:val="both"/>
       </w:pPr>
@@ -2061,6 +2071,7 @@
     </w:p>
     <w:p>
       <w:pPr>
+        <w:keepNext w:val="false"/>
         <w:spacing w:after="200" w:line="276"/>
         <w:jc w:val="both"/>
       </w:pPr>
@@ -2090,7 +2101,7 @@
       <w:r>
         <w:t xml:space="preserve">Maquettes complètes (consultation publique) : </w:t>
       </w:r>
-      <w:hyperlink w:history="1" r:id="rId-valkaytsznqnm3iobpfc">
+      <w:hyperlink w:history="1" r:id="rIdwnowagqzveazcpb-jmmo1">
         <w:r>
           <w:rPr>
             <w:rStyle w:val="Hyperlink"/>
@@ -2577,6 +2588,7 @@
     </w:p>
     <w:p>
       <w:pPr>
+        <w:keepNext w:val="false"/>
         <w:spacing w:after="200" w:line="276"/>
         <w:jc w:val="both"/>
       </w:pPr>
@@ -2911,6 +2923,7 @@
     </w:p>
     <w:p>
       <w:pPr>
+        <w:keepNext w:val="false"/>
         <w:spacing w:after="200" w:line="276"/>
         <w:jc w:val="both"/>
       </w:pPr>
@@ -2982,6 +2995,7 @@
     </w:p>
     <w:p>
       <w:pPr>
+        <w:keepNext w:val="false"/>
         <w:spacing w:after="200" w:line="276"/>
         <w:jc w:val="both"/>
       </w:pPr>
@@ -3092,6 +3106,7 @@
     </w:p>
     <w:p>
       <w:pPr>
+        <w:keepNext w:val="false"/>
         <w:spacing w:after="200" w:line="276"/>
         <w:jc w:val="both"/>
       </w:pPr>
@@ -3184,6 +3199,7 @@
     </w:p>
     <w:p>
       <w:pPr>
+        <w:keepNext w:val="false"/>
         <w:spacing w:after="200" w:line="276"/>
         <w:jc w:val="both"/>
       </w:pPr>
@@ -3193,6 +3209,7 @@
     </w:p>
     <w:p>
       <w:pPr>
+        <w:keepNext w:val="false"/>
         <w:spacing w:after="200" w:line="276"/>
         <w:jc w:val="both"/>
       </w:pPr>
@@ -3217,6 +3234,7 @@
     </w:p>
     <w:p>
       <w:pPr>
+        <w:keepNext w:val="false"/>
         <w:spacing w:after="200" w:line="276"/>
         <w:jc w:val="both"/>
       </w:pPr>
@@ -3354,6 +3372,7 @@
     </w:p>
     <w:p>
       <w:pPr>
+        <w:keepNext w:val="false"/>
         <w:spacing w:after="200" w:line="276"/>
         <w:jc w:val="both"/>
       </w:pPr>
@@ -3519,6 +3538,7 @@
     </w:p>
     <w:p>
       <w:pPr>
+        <w:keepNext w:val="false"/>
         <w:spacing w:after="200" w:line="276"/>
         <w:jc w:val="both"/>
       </w:pPr>
@@ -3894,6 +3914,7 @@
     </w:p>
     <w:p>
       <w:pPr>
+        <w:keepNext w:val="false"/>
         <w:spacing w:after="200" w:line="276"/>
         <w:jc w:val="both"/>
       </w:pPr>
@@ -3918,6 +3939,7 @@
     </w:p>
     <w:p>
       <w:pPr>
+        <w:keepNext w:val="false"/>
         <w:spacing w:after="200" w:line="276"/>
         <w:jc w:val="both"/>
       </w:pPr>
@@ -3994,6 +4016,7 @@
     </w:p>
     <w:p>
       <w:pPr>
+        <w:keepNext w:val="false"/>
         <w:spacing w:after="200" w:line="276"/>
         <w:jc w:val="both"/>
       </w:pPr>
@@ -4071,6 +4094,7 @@
     </w:p>
     <w:p>
       <w:pPr>
+        <w:keepNext w:val="false"/>
         <w:spacing w:after="200" w:line="276"/>
         <w:jc w:val="both"/>
       </w:pPr>
@@ -4080,6 +4104,7 @@
     </w:p>
     <w:p>
       <w:pPr>
+        <w:keepNext w:val="false"/>
         <w:spacing w:after="200" w:line="276"/>
         <w:jc w:val="both"/>
       </w:pPr>
@@ -4104,6 +4129,7 @@
     </w:p>
     <w:p>
       <w:pPr>
+        <w:keepNext w:val="false"/>
         <w:spacing w:after="200" w:line="276"/>
         <w:jc w:val="both"/>
       </w:pPr>
@@ -4246,6 +4272,7 @@
     </w:p>
     <w:p>
       <w:pPr>
+        <w:keepNext w:val="false"/>
         <w:spacing w:after="200" w:line="276"/>
         <w:jc w:val="both"/>
       </w:pPr>
@@ -4317,6 +4344,7 @@
         <w:pStyle w:val="Heading2"/>
         <w:keepNext/>
         <w:keepLines/>
+        <w:pageBreakBefore/>
         <w:spacing w:before="240" w:after="120"/>
       </w:pPr>
       <w:r>
@@ -4329,6 +4357,7 @@
     </w:p>
     <w:p>
       <w:pPr>
+        <w:keepNext/>
         <w:spacing w:after="200" w:line="276"/>
         <w:jc w:val="both"/>
       </w:pPr>
@@ -4338,6 +4367,7 @@
     </w:p>
     <w:p>
       <w:pPr>
+        <w:keepNext/>
         <w:spacing w:after="200" w:line="276"/>
         <w:jc w:val="both"/>
       </w:pPr>
@@ -4811,6 +4841,7 @@
     </w:tbl>
     <w:p>
       <w:pPr>
+        <w:keepNext w:val="false"/>
         <w:spacing w:after="200" w:line="276"/>
         <w:jc w:val="both"/>
       </w:pPr>
@@ -4835,6 +4866,7 @@
     </w:p>
     <w:p>
       <w:pPr>
+        <w:keepNext w:val="false"/>
         <w:spacing w:after="200" w:line="276"/>
         <w:jc w:val="both"/>
       </w:pPr>
@@ -4883,6 +4915,7 @@
     </w:p>
     <w:p>
       <w:pPr>
+        <w:keepNext w:val="false"/>
         <w:spacing w:after="200" w:line="276"/>
         <w:jc w:val="both"/>
       </w:pPr>
@@ -4912,6 +4945,7 @@
     </w:p>
     <w:p>
       <w:pPr>
+        <w:keepNext w:val="false"/>
         <w:spacing w:after="200" w:line="276"/>
         <w:jc w:val="both"/>
       </w:pPr>
@@ -6043,6 +6077,7 @@
     </w:p>
     <w:p>
       <w:pPr>
+        <w:keepNext w:val="false"/>
         <w:spacing w:after="200" w:line="276"/>
         <w:jc w:val="both"/>
       </w:pPr>
@@ -6067,6 +6102,7 @@
     </w:p>
     <w:p>
       <w:pPr>
+        <w:keepNext w:val="false"/>
         <w:spacing w:after="200" w:line="276"/>
         <w:jc w:val="both"/>
       </w:pPr>
@@ -6091,6 +6127,7 @@
     </w:p>
     <w:p>
       <w:pPr>
+        <w:keepNext w:val="false"/>
         <w:spacing w:after="200" w:line="276"/>
         <w:jc w:val="both"/>
       </w:pPr>
@@ -6115,6 +6152,7 @@
     </w:p>
     <w:p>
       <w:pPr>
+        <w:keepNext w:val="false"/>
         <w:spacing w:after="200" w:line="276"/>
         <w:jc w:val="both"/>
       </w:pPr>
@@ -7686,7 +7724,7 @@
       <w:r>
         <w:t xml:space="preserve">Le dépôt est public et contient l’intégralité du code, les scripts SQL et le README.md : </w:t>
       </w:r>
-      <w:hyperlink w:history="1" r:id="rIdncbo0g4ntv8a4uosnyf3l">
+      <w:hyperlink w:history="1" r:id="rIdi1i46njhqgnwvug5sd2me">
         <w:r>
           <w:rPr>
             <w:rStyle w:val="Hyperlink"/>
@@ -7697,6 +7735,7 @@
     </w:p>
     <w:p>
       <w:pPr>
+        <w:keepNext w:val="false"/>
         <w:spacing w:after="200" w:line="276"/>
         <w:jc w:val="both"/>
       </w:pPr>
@@ -7817,7 +7856,7 @@
       <w:r>
         <w:t xml:space="preserve">Frontend (Vercel) : </w:t>
       </w:r>
-      <w:hyperlink w:history="1" r:id="rIde98tbpttvxi9yp_ofxaos">
+      <w:hyperlink w:history="1" r:id="rIdkimvr-hax0iamrqefjhm_">
         <w:r>
           <w:rPr>
             <w:rStyle w:val="Hyperlink"/>
@@ -7833,7 +7872,7 @@
       <w:r>
         <w:t xml:space="preserve">API (Render) : </w:t>
       </w:r>
-      <w:hyperlink w:history="1" r:id="rIdfv4vkwrvh96j9qkp-yzgj">
+      <w:hyperlink w:history="1" r:id="rIdc1akoavuvfssalsh6-bgf">
         <w:r>
           <w:rPr>
             <w:rStyle w:val="Hyperlink"/>
@@ -7844,6 +7883,7 @@
     </w:p>
     <w:p>
       <w:pPr>
+        <w:keepNext w:val="false"/>
         <w:spacing w:after="200" w:line="276"/>
         <w:jc w:val="both"/>
       </w:pPr>
@@ -7873,7 +7913,7 @@
       <w:r>
         <w:t xml:space="preserve">Fichier de maquettes (lecture publique) : </w:t>
       </w:r>
-      <w:hyperlink w:history="1" r:id="rIdwmi7vbyxkrsqasmaffeim">
+      <w:hyperlink w:history="1" r:id="rIdkjdppvla80oadwg89qh1j">
         <w:r>
           <w:rPr>
             <w:rStyle w:val="Hyperlink"/>

</xml_diff>

<commit_message>
Répartit les sections base de données sur des pages entières
Le modèle physique (3.5) était coupé sur deux pages : chaque section occupe
désormais sa page — le MLD seul (3.4), le modèle physique entier avec le jeu
d'essai (3.5 et 3.6), le volet NoSQL avec les composants d'accès (3.7 et 3.8),
puis les composants métier (3.9). Le bloc SQL ne peut plus se couper, le
sommaire a été revérifié, et une dernière retouche de relecture est intégrée.
</commit_message>
<xml_diff>
--- a/docs/dossier-trouve-ton-artisan.docx
+++ b/docs/dossier-trouve-ton-artisan.docx
@@ -134,7 +134,7 @@
         <w:keepNext/>
         <w:keepLines/>
       </w:pPr>
-      <w:bookmarkStart w:id="0" w:name="_Toc235437007"/>
+      <w:bookmarkStart w:id="0" w:name="_Toc235438532"/>
       <w:r>
         <w:lastRenderedPageBreak/>
         <w:t>Sommaire</w:t>
@@ -172,7 +172,7 @@
           <w:r>
             <w:fldChar w:fldCharType="separate"/>
           </w:r>
-          <w:hyperlink w:anchor="_Toc235437007" w:history="1">
+          <w:hyperlink w:anchor="_Toc235438532" w:history="1">
             <w:r>
               <w:rPr>
                 <w:rStyle w:val="Lienhypertexte"/>
@@ -196,7 +196,7 @@
               <w:rPr>
                 <w:noProof/>
               </w:rPr>
-              <w:instrText xml:space="preserve"> PAGEREF _Toc235437007 \h </w:instrText>
+              <w:instrText xml:space="preserve"> PAGEREF _Toc235438532 \h </w:instrText>
             </w:r>
             <w:r>
               <w:rPr>
@@ -238,7 +238,7 @@
               <w14:ligatures w14:val="standardContextual"/>
             </w:rPr>
           </w:pPr>
-          <w:hyperlink w:anchor="_Toc235437008" w:history="1">
+          <w:hyperlink w:anchor="_Toc235438533" w:history="1">
             <w:r>
               <w:rPr>
                 <w:rStyle w:val="Lienhypertexte"/>
@@ -262,7 +262,7 @@
               <w:rPr>
                 <w:noProof/>
               </w:rPr>
-              <w:instrText xml:space="preserve"> PAGEREF _Toc235437008 \h </w:instrText>
+              <w:instrText xml:space="preserve"> PAGEREF _Toc235438533 \h </w:instrText>
             </w:r>
             <w:r>
               <w:rPr>
@@ -304,7 +304,7 @@
               <w14:ligatures w14:val="standardContextual"/>
             </w:rPr>
           </w:pPr>
-          <w:hyperlink w:anchor="_Toc235437009" w:history="1">
+          <w:hyperlink w:anchor="_Toc235438534" w:history="1">
             <w:r>
               <w:rPr>
                 <w:rStyle w:val="Lienhypertexte"/>
@@ -328,7 +328,7 @@
               <w:rPr>
                 <w:noProof/>
               </w:rPr>
-              <w:instrText xml:space="preserve"> PAGEREF _Toc235437009 \h </w:instrText>
+              <w:instrText xml:space="preserve"> PAGEREF _Toc235438534 \h </w:instrText>
             </w:r>
             <w:r>
               <w:rPr>
@@ -370,7 +370,7 @@
               <w14:ligatures w14:val="standardContextual"/>
             </w:rPr>
           </w:pPr>
-          <w:hyperlink w:anchor="_Toc235437010" w:history="1">
+          <w:hyperlink w:anchor="_Toc235438535" w:history="1">
             <w:r>
               <w:rPr>
                 <w:rStyle w:val="Lienhypertexte"/>
@@ -394,7 +394,7 @@
               <w:rPr>
                 <w:noProof/>
               </w:rPr>
-              <w:instrText xml:space="preserve"> PAGEREF _Toc235437010 \h </w:instrText>
+              <w:instrText xml:space="preserve"> PAGEREF _Toc235438535 \h </w:instrText>
             </w:r>
             <w:r>
               <w:rPr>
@@ -436,7 +436,7 @@
               <w14:ligatures w14:val="standardContextual"/>
             </w:rPr>
           </w:pPr>
-          <w:hyperlink w:anchor="_Toc235437011" w:history="1">
+          <w:hyperlink w:anchor="_Toc235438536" w:history="1">
             <w:r>
               <w:rPr>
                 <w:rStyle w:val="Lienhypertexte"/>
@@ -460,7 +460,7 @@
               <w:rPr>
                 <w:noProof/>
               </w:rPr>
-              <w:instrText xml:space="preserve"> PAGEREF _Toc235437011 \h </w:instrText>
+              <w:instrText xml:space="preserve"> PAGEREF _Toc235438536 \h </w:instrText>
             </w:r>
             <w:r>
               <w:rPr>
@@ -502,7 +502,7 @@
               <w14:ligatures w14:val="standardContextual"/>
             </w:rPr>
           </w:pPr>
-          <w:hyperlink w:anchor="_Toc235437012" w:history="1">
+          <w:hyperlink w:anchor="_Toc235438537" w:history="1">
             <w:r>
               <w:rPr>
                 <w:rStyle w:val="Lienhypertexte"/>
@@ -526,7 +526,7 @@
               <w:rPr>
                 <w:noProof/>
               </w:rPr>
-              <w:instrText xml:space="preserve"> PAGEREF _Toc235437012 \h </w:instrText>
+              <w:instrText xml:space="preserve"> PAGEREF _Toc235438537 \h </w:instrText>
             </w:r>
             <w:r>
               <w:rPr>
@@ -568,7 +568,7 @@
               <w14:ligatures w14:val="standardContextual"/>
             </w:rPr>
           </w:pPr>
-          <w:hyperlink w:anchor="_Toc235437013" w:history="1">
+          <w:hyperlink w:anchor="_Toc235438538" w:history="1">
             <w:r>
               <w:rPr>
                 <w:rStyle w:val="Lienhypertexte"/>
@@ -592,7 +592,7 @@
               <w:rPr>
                 <w:noProof/>
               </w:rPr>
-              <w:instrText xml:space="preserve"> PAGEREF _Toc235437013 \h </w:instrText>
+              <w:instrText xml:space="preserve"> PAGEREF _Toc235438538 \h </w:instrText>
             </w:r>
             <w:r>
               <w:rPr>
@@ -634,7 +634,7 @@
               <w14:ligatures w14:val="standardContextual"/>
             </w:rPr>
           </w:pPr>
-          <w:hyperlink w:anchor="_Toc235437014" w:history="1">
+          <w:hyperlink w:anchor="_Toc235438539" w:history="1">
             <w:r>
               <w:rPr>
                 <w:rStyle w:val="Lienhypertexte"/>
@@ -658,7 +658,7 @@
               <w:rPr>
                 <w:noProof/>
               </w:rPr>
-              <w:instrText xml:space="preserve"> PAGEREF _Toc235437014 \h </w:instrText>
+              <w:instrText xml:space="preserve"> PAGEREF _Toc235438539 \h </w:instrText>
             </w:r>
             <w:r>
               <w:rPr>
@@ -700,7 +700,7 @@
               <w14:ligatures w14:val="standardContextual"/>
             </w:rPr>
           </w:pPr>
-          <w:hyperlink w:anchor="_Toc235437015" w:history="1">
+          <w:hyperlink w:anchor="_Toc235438540" w:history="1">
             <w:r>
               <w:rPr>
                 <w:rStyle w:val="Lienhypertexte"/>
@@ -724,7 +724,7 @@
               <w:rPr>
                 <w:noProof/>
               </w:rPr>
-              <w:instrText xml:space="preserve"> PAGEREF _Toc235437015 \h </w:instrText>
+              <w:instrText xml:space="preserve"> PAGEREF _Toc235438540 \h </w:instrText>
             </w:r>
             <w:r>
               <w:rPr>
@@ -766,7 +766,7 @@
               <w14:ligatures w14:val="standardContextual"/>
             </w:rPr>
           </w:pPr>
-          <w:hyperlink w:anchor="_Toc235437016" w:history="1">
+          <w:hyperlink w:anchor="_Toc235438541" w:history="1">
             <w:r>
               <w:rPr>
                 <w:rStyle w:val="Lienhypertexte"/>
@@ -790,7 +790,7 @@
               <w:rPr>
                 <w:noProof/>
               </w:rPr>
-              <w:instrText xml:space="preserve"> PAGEREF _Toc235437016 \h </w:instrText>
+              <w:instrText xml:space="preserve"> PAGEREF _Toc235438541 \h </w:instrText>
             </w:r>
             <w:r>
               <w:rPr>
@@ -832,7 +832,7 @@
               <w14:ligatures w14:val="standardContextual"/>
             </w:rPr>
           </w:pPr>
-          <w:hyperlink w:anchor="_Toc235437017" w:history="1">
+          <w:hyperlink w:anchor="_Toc235438542" w:history="1">
             <w:r>
               <w:rPr>
                 <w:rStyle w:val="Lienhypertexte"/>
@@ -856,7 +856,7 @@
               <w:rPr>
                 <w:noProof/>
               </w:rPr>
-              <w:instrText xml:space="preserve"> PAGEREF _Toc235437017 \h </w:instrText>
+              <w:instrText xml:space="preserve"> PAGEREF _Toc235438542 \h </w:instrText>
             </w:r>
             <w:r>
               <w:rPr>
@@ -898,7 +898,7 @@
               <w14:ligatures w14:val="standardContextual"/>
             </w:rPr>
           </w:pPr>
-          <w:hyperlink w:anchor="_Toc235437018" w:history="1">
+          <w:hyperlink w:anchor="_Toc235438543" w:history="1">
             <w:r>
               <w:rPr>
                 <w:rStyle w:val="Lienhypertexte"/>
@@ -922,7 +922,7 @@
               <w:rPr>
                 <w:noProof/>
               </w:rPr>
-              <w:instrText xml:space="preserve"> PAGEREF _Toc235437018 \h </w:instrText>
+              <w:instrText xml:space="preserve"> PAGEREF _Toc235438543 \h </w:instrText>
             </w:r>
             <w:r>
               <w:rPr>
@@ -964,7 +964,7 @@
               <w14:ligatures w14:val="standardContextual"/>
             </w:rPr>
           </w:pPr>
-          <w:hyperlink w:anchor="_Toc235437019" w:history="1">
+          <w:hyperlink w:anchor="_Toc235438544" w:history="1">
             <w:r>
               <w:rPr>
                 <w:rStyle w:val="Lienhypertexte"/>
@@ -988,7 +988,7 @@
               <w:rPr>
                 <w:noProof/>
               </w:rPr>
-              <w:instrText xml:space="preserve"> PAGEREF _Toc235437019 \h </w:instrText>
+              <w:instrText xml:space="preserve"> PAGEREF _Toc235438544 \h </w:instrText>
             </w:r>
             <w:r>
               <w:rPr>
@@ -1030,7 +1030,7 @@
               <w14:ligatures w14:val="standardContextual"/>
             </w:rPr>
           </w:pPr>
-          <w:hyperlink w:anchor="_Toc235437020" w:history="1">
+          <w:hyperlink w:anchor="_Toc235438545" w:history="1">
             <w:r>
               <w:rPr>
                 <w:rStyle w:val="Lienhypertexte"/>
@@ -1054,7 +1054,7 @@
               <w:rPr>
                 <w:noProof/>
               </w:rPr>
-              <w:instrText xml:space="preserve"> PAGEREF _Toc235437020 \h </w:instrText>
+              <w:instrText xml:space="preserve"> PAGEREF _Toc235438545 \h </w:instrText>
             </w:r>
             <w:r>
               <w:rPr>
@@ -1096,7 +1096,7 @@
               <w14:ligatures w14:val="standardContextual"/>
             </w:rPr>
           </w:pPr>
-          <w:hyperlink w:anchor="_Toc235437021" w:history="1">
+          <w:hyperlink w:anchor="_Toc235438546" w:history="1">
             <w:r>
               <w:rPr>
                 <w:rStyle w:val="Lienhypertexte"/>
@@ -1120,7 +1120,7 @@
               <w:rPr>
                 <w:noProof/>
               </w:rPr>
-              <w:instrText xml:space="preserve"> PAGEREF _Toc235437021 \h </w:instrText>
+              <w:instrText xml:space="preserve"> PAGEREF _Toc235438546 \h </w:instrText>
             </w:r>
             <w:r>
               <w:rPr>
@@ -1162,7 +1162,7 @@
               <w14:ligatures w14:val="standardContextual"/>
             </w:rPr>
           </w:pPr>
-          <w:hyperlink w:anchor="_Toc235437022" w:history="1">
+          <w:hyperlink w:anchor="_Toc235438547" w:history="1">
             <w:r>
               <w:rPr>
                 <w:rStyle w:val="Lienhypertexte"/>
@@ -1186,7 +1186,7 @@
               <w:rPr>
                 <w:noProof/>
               </w:rPr>
-              <w:instrText xml:space="preserve"> PAGEREF _Toc235437022 \h </w:instrText>
+              <w:instrText xml:space="preserve"> PAGEREF _Toc235438547 \h </w:instrText>
             </w:r>
             <w:r>
               <w:rPr>
@@ -1228,7 +1228,7 @@
               <w14:ligatures w14:val="standardContextual"/>
             </w:rPr>
           </w:pPr>
-          <w:hyperlink w:anchor="_Toc235437023" w:history="1">
+          <w:hyperlink w:anchor="_Toc235438548" w:history="1">
             <w:r>
               <w:rPr>
                 <w:rStyle w:val="Lienhypertexte"/>
@@ -1252,7 +1252,7 @@
               <w:rPr>
                 <w:noProof/>
               </w:rPr>
-              <w:instrText xml:space="preserve"> PAGEREF _Toc235437023 \h </w:instrText>
+              <w:instrText xml:space="preserve"> PAGEREF _Toc235438548 \h </w:instrText>
             </w:r>
             <w:r>
               <w:rPr>
@@ -1294,7 +1294,7 @@
               <w14:ligatures w14:val="standardContextual"/>
             </w:rPr>
           </w:pPr>
-          <w:hyperlink w:anchor="_Toc235437024" w:history="1">
+          <w:hyperlink w:anchor="_Toc235438549" w:history="1">
             <w:r>
               <w:rPr>
                 <w:rStyle w:val="Lienhypertexte"/>
@@ -1318,7 +1318,7 @@
               <w:rPr>
                 <w:noProof/>
               </w:rPr>
-              <w:instrText xml:space="preserve"> PAGEREF _Toc235437024 \h </w:instrText>
+              <w:instrText xml:space="preserve"> PAGEREF _Toc235438549 \h </w:instrText>
             </w:r>
             <w:r>
               <w:rPr>
@@ -1360,7 +1360,7 @@
               <w14:ligatures w14:val="standardContextual"/>
             </w:rPr>
           </w:pPr>
-          <w:hyperlink w:anchor="_Toc235437025" w:history="1">
+          <w:hyperlink w:anchor="_Toc235438550" w:history="1">
             <w:r>
               <w:rPr>
                 <w:rStyle w:val="Lienhypertexte"/>
@@ -1384,7 +1384,7 @@
               <w:rPr>
                 <w:noProof/>
               </w:rPr>
-              <w:instrText xml:space="preserve"> PAGEREF _Toc235437025 \h </w:instrText>
+              <w:instrText xml:space="preserve"> PAGEREF _Toc235438550 \h </w:instrText>
             </w:r>
             <w:r>
               <w:rPr>
@@ -1426,7 +1426,7 @@
               <w14:ligatures w14:val="standardContextual"/>
             </w:rPr>
           </w:pPr>
-          <w:hyperlink w:anchor="_Toc235437026" w:history="1">
+          <w:hyperlink w:anchor="_Toc235438551" w:history="1">
             <w:r>
               <w:rPr>
                 <w:rStyle w:val="Lienhypertexte"/>
@@ -1450,7 +1450,7 @@
               <w:rPr>
                 <w:noProof/>
               </w:rPr>
-              <w:instrText xml:space="preserve"> PAGEREF _Toc235437026 \h </w:instrText>
+              <w:instrText xml:space="preserve"> PAGEREF _Toc235438551 \h </w:instrText>
             </w:r>
             <w:r>
               <w:rPr>
@@ -1492,7 +1492,7 @@
               <w14:ligatures w14:val="standardContextual"/>
             </w:rPr>
           </w:pPr>
-          <w:hyperlink w:anchor="_Toc235437027" w:history="1">
+          <w:hyperlink w:anchor="_Toc235438552" w:history="1">
             <w:r>
               <w:rPr>
                 <w:rStyle w:val="Lienhypertexte"/>
@@ -1516,7 +1516,7 @@
               <w:rPr>
                 <w:noProof/>
               </w:rPr>
-              <w:instrText xml:space="preserve"> PAGEREF _Toc235437027 \h </w:instrText>
+              <w:instrText xml:space="preserve"> PAGEREF _Toc235438552 \h </w:instrText>
             </w:r>
             <w:r>
               <w:rPr>
@@ -1558,7 +1558,7 @@
               <w14:ligatures w14:val="standardContextual"/>
             </w:rPr>
           </w:pPr>
-          <w:hyperlink w:anchor="_Toc235437028" w:history="1">
+          <w:hyperlink w:anchor="_Toc235438553" w:history="1">
             <w:r>
               <w:rPr>
                 <w:rStyle w:val="Lienhypertexte"/>
@@ -1582,7 +1582,7 @@
               <w:rPr>
                 <w:noProof/>
               </w:rPr>
-              <w:instrText xml:space="preserve"> PAGEREF _Toc235437028 \h </w:instrText>
+              <w:instrText xml:space="preserve"> PAGEREF _Toc235438553 \h </w:instrText>
             </w:r>
             <w:r>
               <w:rPr>
@@ -1624,7 +1624,7 @@
               <w14:ligatures w14:val="standardContextual"/>
             </w:rPr>
           </w:pPr>
-          <w:hyperlink w:anchor="_Toc235437029" w:history="1">
+          <w:hyperlink w:anchor="_Toc235438554" w:history="1">
             <w:r>
               <w:rPr>
                 <w:rStyle w:val="Lienhypertexte"/>
@@ -1648,7 +1648,7 @@
               <w:rPr>
                 <w:noProof/>
               </w:rPr>
-              <w:instrText xml:space="preserve"> PAGEREF _Toc235437029 \h </w:instrText>
+              <w:instrText xml:space="preserve"> PAGEREF _Toc235438554 \h </w:instrText>
             </w:r>
             <w:r>
               <w:rPr>
@@ -1690,7 +1690,7 @@
               <w14:ligatures w14:val="standardContextual"/>
             </w:rPr>
           </w:pPr>
-          <w:hyperlink w:anchor="_Toc235437030" w:history="1">
+          <w:hyperlink w:anchor="_Toc235438555" w:history="1">
             <w:r>
               <w:rPr>
                 <w:rStyle w:val="Lienhypertexte"/>
@@ -1714,7 +1714,7 @@
               <w:rPr>
                 <w:noProof/>
               </w:rPr>
-              <w:instrText xml:space="preserve"> PAGEREF _Toc235437030 \h </w:instrText>
+              <w:instrText xml:space="preserve"> PAGEREF _Toc235438555 \h </w:instrText>
             </w:r>
             <w:r>
               <w:rPr>
@@ -1756,7 +1756,7 @@
               <w14:ligatures w14:val="standardContextual"/>
             </w:rPr>
           </w:pPr>
-          <w:hyperlink w:anchor="_Toc235437031" w:history="1">
+          <w:hyperlink w:anchor="_Toc235438556" w:history="1">
             <w:r>
               <w:rPr>
                 <w:rStyle w:val="Lienhypertexte"/>
@@ -1780,7 +1780,7 @@
               <w:rPr>
                 <w:noProof/>
               </w:rPr>
-              <w:instrText xml:space="preserve"> PAGEREF _Toc235437031 \h </w:instrText>
+              <w:instrText xml:space="preserve"> PAGEREF _Toc235438556 \h </w:instrText>
             </w:r>
             <w:r>
               <w:rPr>
@@ -1822,7 +1822,7 @@
               <w14:ligatures w14:val="standardContextual"/>
             </w:rPr>
           </w:pPr>
-          <w:hyperlink w:anchor="_Toc235437032" w:history="1">
+          <w:hyperlink w:anchor="_Toc235438557" w:history="1">
             <w:r>
               <w:rPr>
                 <w:rStyle w:val="Lienhypertexte"/>
@@ -1846,7 +1846,7 @@
               <w:rPr>
                 <w:noProof/>
               </w:rPr>
-              <w:instrText xml:space="preserve"> PAGEREF _Toc235437032 \h </w:instrText>
+              <w:instrText xml:space="preserve"> PAGEREF _Toc235438557 \h </w:instrText>
             </w:r>
             <w:r>
               <w:rPr>
@@ -1888,7 +1888,7 @@
               <w14:ligatures w14:val="standardContextual"/>
             </w:rPr>
           </w:pPr>
-          <w:hyperlink w:anchor="_Toc235437033" w:history="1">
+          <w:hyperlink w:anchor="_Toc235438558" w:history="1">
             <w:r>
               <w:rPr>
                 <w:rStyle w:val="Lienhypertexte"/>
@@ -1912,7 +1912,7 @@
               <w:rPr>
                 <w:noProof/>
               </w:rPr>
-              <w:instrText xml:space="preserve"> PAGEREF _Toc235437033 \h </w:instrText>
+              <w:instrText xml:space="preserve"> PAGEREF _Toc235438558 \h </w:instrText>
             </w:r>
             <w:r>
               <w:rPr>
@@ -1954,7 +1954,7 @@
               <w14:ligatures w14:val="standardContextual"/>
             </w:rPr>
           </w:pPr>
-          <w:hyperlink w:anchor="_Toc235437034" w:history="1">
+          <w:hyperlink w:anchor="_Toc235438559" w:history="1">
             <w:r>
               <w:rPr>
                 <w:rStyle w:val="Lienhypertexte"/>
@@ -1978,7 +1978,7 @@
               <w:rPr>
                 <w:noProof/>
               </w:rPr>
-              <w:instrText xml:space="preserve"> PAGEREF _Toc235437034 \h </w:instrText>
+              <w:instrText xml:space="preserve"> PAGEREF _Toc235438559 \h </w:instrText>
             </w:r>
             <w:r>
               <w:rPr>
@@ -2020,7 +2020,7 @@
               <w14:ligatures w14:val="standardContextual"/>
             </w:rPr>
           </w:pPr>
-          <w:hyperlink w:anchor="_Toc235437035" w:history="1">
+          <w:hyperlink w:anchor="_Toc235438560" w:history="1">
             <w:r>
               <w:rPr>
                 <w:rStyle w:val="Lienhypertexte"/>
@@ -2044,7 +2044,7 @@
               <w:rPr>
                 <w:noProof/>
               </w:rPr>
-              <w:instrText xml:space="preserve"> PAGEREF _Toc235437035 \h </w:instrText>
+              <w:instrText xml:space="preserve"> PAGEREF _Toc235438560 \h </w:instrText>
             </w:r>
             <w:r>
               <w:rPr>
@@ -2086,7 +2086,7 @@
               <w14:ligatures w14:val="standardContextual"/>
             </w:rPr>
           </w:pPr>
-          <w:hyperlink w:anchor="_Toc235437036" w:history="1">
+          <w:hyperlink w:anchor="_Toc235438561" w:history="1">
             <w:r>
               <w:rPr>
                 <w:rStyle w:val="Lienhypertexte"/>
@@ -2110,7 +2110,7 @@
               <w:rPr>
                 <w:noProof/>
               </w:rPr>
-              <w:instrText xml:space="preserve"> PAGEREF _Toc235437036 \h </w:instrText>
+              <w:instrText xml:space="preserve"> PAGEREF _Toc235438561 \h </w:instrText>
             </w:r>
             <w:r>
               <w:rPr>
@@ -2127,7 +2127,7 @@
               <w:rPr>
                 <w:noProof/>
               </w:rPr>
-              <w:t>18</w:t>
+              <w:t>19</w:t>
             </w:r>
             <w:r>
               <w:rPr>
@@ -2152,7 +2152,7 @@
               <w14:ligatures w14:val="standardContextual"/>
             </w:rPr>
           </w:pPr>
-          <w:hyperlink w:anchor="_Toc235437037" w:history="1">
+          <w:hyperlink w:anchor="_Toc235438562" w:history="1">
             <w:r>
               <w:rPr>
                 <w:rStyle w:val="Lienhypertexte"/>
@@ -2176,7 +2176,7 @@
               <w:rPr>
                 <w:noProof/>
               </w:rPr>
-              <w:instrText xml:space="preserve"> PAGEREF _Toc235437037 \h </w:instrText>
+              <w:instrText xml:space="preserve"> PAGEREF _Toc235438562 \h </w:instrText>
             </w:r>
             <w:r>
               <w:rPr>
@@ -2218,7 +2218,7 @@
               <w14:ligatures w14:val="standardContextual"/>
             </w:rPr>
           </w:pPr>
-          <w:hyperlink w:anchor="_Toc235437038" w:history="1">
+          <w:hyperlink w:anchor="_Toc235438563" w:history="1">
             <w:r>
               <w:rPr>
                 <w:rStyle w:val="Lienhypertexte"/>
@@ -2242,7 +2242,7 @@
               <w:rPr>
                 <w:noProof/>
               </w:rPr>
-              <w:instrText xml:space="preserve"> PAGEREF _Toc235437038 \h </w:instrText>
+              <w:instrText xml:space="preserve"> PAGEREF _Toc235438563 \h </w:instrText>
             </w:r>
             <w:r>
               <w:rPr>
@@ -2259,7 +2259,7 @@
               <w:rPr>
                 <w:noProof/>
               </w:rPr>
-              <w:t>19</w:t>
+              <w:t>20</w:t>
             </w:r>
             <w:r>
               <w:rPr>
@@ -2284,7 +2284,7 @@
               <w14:ligatures w14:val="standardContextual"/>
             </w:rPr>
           </w:pPr>
-          <w:hyperlink w:anchor="_Toc235437039" w:history="1">
+          <w:hyperlink w:anchor="_Toc235438564" w:history="1">
             <w:r>
               <w:rPr>
                 <w:rStyle w:val="Lienhypertexte"/>
@@ -2308,7 +2308,7 @@
               <w:rPr>
                 <w:noProof/>
               </w:rPr>
-              <w:instrText xml:space="preserve"> PAGEREF _Toc235437039 \h </w:instrText>
+              <w:instrText xml:space="preserve"> PAGEREF _Toc235438564 \h </w:instrText>
             </w:r>
             <w:r>
               <w:rPr>
@@ -2350,7 +2350,7 @@
               <w14:ligatures w14:val="standardContextual"/>
             </w:rPr>
           </w:pPr>
-          <w:hyperlink w:anchor="_Toc235437040" w:history="1">
+          <w:hyperlink w:anchor="_Toc235438565" w:history="1">
             <w:r>
               <w:rPr>
                 <w:rStyle w:val="Lienhypertexte"/>
@@ -2374,7 +2374,7 @@
               <w:rPr>
                 <w:noProof/>
               </w:rPr>
-              <w:instrText xml:space="preserve"> PAGEREF _Toc235437040 \h </w:instrText>
+              <w:instrText xml:space="preserve"> PAGEREF _Toc235438565 \h </w:instrText>
             </w:r>
             <w:r>
               <w:rPr>
@@ -2391,7 +2391,7 @@
               <w:rPr>
                 <w:noProof/>
               </w:rPr>
-              <w:t>20</w:t>
+              <w:t>21</w:t>
             </w:r>
             <w:r>
               <w:rPr>
@@ -2416,7 +2416,7 @@
               <w14:ligatures w14:val="standardContextual"/>
             </w:rPr>
           </w:pPr>
-          <w:hyperlink w:anchor="_Toc235437041" w:history="1">
+          <w:hyperlink w:anchor="_Toc235438566" w:history="1">
             <w:r>
               <w:rPr>
                 <w:rStyle w:val="Lienhypertexte"/>
@@ -2440,7 +2440,7 @@
               <w:rPr>
                 <w:noProof/>
               </w:rPr>
-              <w:instrText xml:space="preserve"> PAGEREF _Toc235437041 \h </w:instrText>
+              <w:instrText xml:space="preserve"> PAGEREF _Toc235438566 \h </w:instrText>
             </w:r>
             <w:r>
               <w:rPr>
@@ -2457,7 +2457,7 @@
               <w:rPr>
                 <w:noProof/>
               </w:rPr>
-              <w:t>21</w:t>
+              <w:t>22</w:t>
             </w:r>
             <w:r>
               <w:rPr>
@@ -2482,7 +2482,7 @@
               <w14:ligatures w14:val="standardContextual"/>
             </w:rPr>
           </w:pPr>
-          <w:hyperlink w:anchor="_Toc235437042" w:history="1">
+          <w:hyperlink w:anchor="_Toc235438567" w:history="1">
             <w:r>
               <w:rPr>
                 <w:rStyle w:val="Lienhypertexte"/>
@@ -2506,7 +2506,7 @@
               <w:rPr>
                 <w:noProof/>
               </w:rPr>
-              <w:instrText xml:space="preserve"> PAGEREF _Toc235437042 \h </w:instrText>
+              <w:instrText xml:space="preserve"> PAGEREF _Toc235438567 \h </w:instrText>
             </w:r>
             <w:r>
               <w:rPr>
@@ -2523,7 +2523,7 @@
               <w:rPr>
                 <w:noProof/>
               </w:rPr>
-              <w:t>21</w:t>
+              <w:t>22</w:t>
             </w:r>
             <w:r>
               <w:rPr>
@@ -2548,7 +2548,7 @@
               <w14:ligatures w14:val="standardContextual"/>
             </w:rPr>
           </w:pPr>
-          <w:hyperlink w:anchor="_Toc235437043" w:history="1">
+          <w:hyperlink w:anchor="_Toc235438568" w:history="1">
             <w:r>
               <w:rPr>
                 <w:rStyle w:val="Lienhypertexte"/>
@@ -2572,7 +2572,7 @@
               <w:rPr>
                 <w:noProof/>
               </w:rPr>
-              <w:instrText xml:space="preserve"> PAGEREF _Toc235437043 \h </w:instrText>
+              <w:instrText xml:space="preserve"> PAGEREF _Toc235438568 \h </w:instrText>
             </w:r>
             <w:r>
               <w:rPr>
@@ -2589,7 +2589,7 @@
               <w:rPr>
                 <w:noProof/>
               </w:rPr>
-              <w:t>22</w:t>
+              <w:t>23</w:t>
             </w:r>
             <w:r>
               <w:rPr>
@@ -2614,7 +2614,7 @@
               <w14:ligatures w14:val="standardContextual"/>
             </w:rPr>
           </w:pPr>
-          <w:hyperlink w:anchor="_Toc235437044" w:history="1">
+          <w:hyperlink w:anchor="_Toc235438569" w:history="1">
             <w:r>
               <w:rPr>
                 <w:rStyle w:val="Lienhypertexte"/>
@@ -2638,7 +2638,7 @@
               <w:rPr>
                 <w:noProof/>
               </w:rPr>
-              <w:instrText xml:space="preserve"> PAGEREF _Toc235437044 \h </w:instrText>
+              <w:instrText xml:space="preserve"> PAGEREF _Toc235438569 \h </w:instrText>
             </w:r>
             <w:r>
               <w:rPr>
@@ -2655,7 +2655,7 @@
               <w:rPr>
                 <w:noProof/>
               </w:rPr>
-              <w:t>22</w:t>
+              <w:t>23</w:t>
             </w:r>
             <w:r>
               <w:rPr>
@@ -2680,7 +2680,7 @@
               <w14:ligatures w14:val="standardContextual"/>
             </w:rPr>
           </w:pPr>
-          <w:hyperlink w:anchor="_Toc235437045" w:history="1">
+          <w:hyperlink w:anchor="_Toc235438570" w:history="1">
             <w:r>
               <w:rPr>
                 <w:rStyle w:val="Lienhypertexte"/>
@@ -2704,7 +2704,7 @@
               <w:rPr>
                 <w:noProof/>
               </w:rPr>
-              <w:instrText xml:space="preserve"> PAGEREF _Toc235437045 \h </w:instrText>
+              <w:instrText xml:space="preserve"> PAGEREF _Toc235438570 \h </w:instrText>
             </w:r>
             <w:r>
               <w:rPr>
@@ -2721,7 +2721,7 @@
               <w:rPr>
                 <w:noProof/>
               </w:rPr>
-              <w:t>23</w:t>
+              <w:t>24</w:t>
             </w:r>
             <w:r>
               <w:rPr>
@@ -2746,7 +2746,7 @@
               <w14:ligatures w14:val="standardContextual"/>
             </w:rPr>
           </w:pPr>
-          <w:hyperlink w:anchor="_Toc235437046" w:history="1">
+          <w:hyperlink w:anchor="_Toc235438571" w:history="1">
             <w:r>
               <w:rPr>
                 <w:rStyle w:val="Lienhypertexte"/>
@@ -2770,7 +2770,7 @@
               <w:rPr>
                 <w:noProof/>
               </w:rPr>
-              <w:instrText xml:space="preserve"> PAGEREF _Toc235437046 \h </w:instrText>
+              <w:instrText xml:space="preserve"> PAGEREF _Toc235438571 \h </w:instrText>
             </w:r>
             <w:r>
               <w:rPr>
@@ -2787,7 +2787,7 @@
               <w:rPr>
                 <w:noProof/>
               </w:rPr>
-              <w:t>23</w:t>
+              <w:t>24</w:t>
             </w:r>
             <w:r>
               <w:rPr>
@@ -2812,7 +2812,7 @@
               <w14:ligatures w14:val="standardContextual"/>
             </w:rPr>
           </w:pPr>
-          <w:hyperlink w:anchor="_Toc235437047" w:history="1">
+          <w:hyperlink w:anchor="_Toc235438572" w:history="1">
             <w:r>
               <w:rPr>
                 <w:rStyle w:val="Lienhypertexte"/>
@@ -2836,7 +2836,7 @@
               <w:rPr>
                 <w:noProof/>
               </w:rPr>
-              <w:instrText xml:space="preserve"> PAGEREF _Toc235437047 \h </w:instrText>
+              <w:instrText xml:space="preserve"> PAGEREF _Toc235438572 \h </w:instrText>
             </w:r>
             <w:r>
               <w:rPr>
@@ -2853,7 +2853,7 @@
               <w:rPr>
                 <w:noProof/>
               </w:rPr>
-              <w:t>23</w:t>
+              <w:t>24</w:t>
             </w:r>
             <w:r>
               <w:rPr>
@@ -2878,7 +2878,7 @@
               <w14:ligatures w14:val="standardContextual"/>
             </w:rPr>
           </w:pPr>
-          <w:hyperlink w:anchor="_Toc235437048" w:history="1">
+          <w:hyperlink w:anchor="_Toc235438573" w:history="1">
             <w:r>
               <w:rPr>
                 <w:rStyle w:val="Lienhypertexte"/>
@@ -2902,7 +2902,7 @@
               <w:rPr>
                 <w:noProof/>
               </w:rPr>
-              <w:instrText xml:space="preserve"> PAGEREF _Toc235437048 \h </w:instrText>
+              <w:instrText xml:space="preserve"> PAGEREF _Toc235438573 \h </w:instrText>
             </w:r>
             <w:r>
               <w:rPr>
@@ -2919,7 +2919,7 @@
               <w:rPr>
                 <w:noProof/>
               </w:rPr>
-              <w:t>23</w:t>
+              <w:t>24</w:t>
             </w:r>
             <w:r>
               <w:rPr>
@@ -2944,7 +2944,7 @@
               <w14:ligatures w14:val="standardContextual"/>
             </w:rPr>
           </w:pPr>
-          <w:hyperlink w:anchor="_Toc235437049" w:history="1">
+          <w:hyperlink w:anchor="_Toc235438574" w:history="1">
             <w:r>
               <w:rPr>
                 <w:rStyle w:val="Lienhypertexte"/>
@@ -2968,7 +2968,7 @@
               <w:rPr>
                 <w:noProof/>
               </w:rPr>
-              <w:instrText xml:space="preserve"> PAGEREF _Toc235437049 \h </w:instrText>
+              <w:instrText xml:space="preserve"> PAGEREF _Toc235438574 \h </w:instrText>
             </w:r>
             <w:r>
               <w:rPr>
@@ -2985,7 +2985,7 @@
               <w:rPr>
                 <w:noProof/>
               </w:rPr>
-              <w:t>23</w:t>
+              <w:t>24</w:t>
             </w:r>
             <w:r>
               <w:rPr>
@@ -3010,7 +3010,7 @@
               <w14:ligatures w14:val="standardContextual"/>
             </w:rPr>
           </w:pPr>
-          <w:hyperlink w:anchor="_Toc235437050" w:history="1">
+          <w:hyperlink w:anchor="_Toc235438575" w:history="1">
             <w:r>
               <w:rPr>
                 <w:rStyle w:val="Lienhypertexte"/>
@@ -3034,7 +3034,7 @@
               <w:rPr>
                 <w:noProof/>
               </w:rPr>
-              <w:instrText xml:space="preserve"> PAGEREF _Toc235437050 \h </w:instrText>
+              <w:instrText xml:space="preserve"> PAGEREF _Toc235438575 \h </w:instrText>
             </w:r>
             <w:r>
               <w:rPr>
@@ -3051,7 +3051,7 @@
               <w:rPr>
                 <w:noProof/>
               </w:rPr>
-              <w:t>24</w:t>
+              <w:t>25</w:t>
             </w:r>
             <w:r>
               <w:rPr>
@@ -3076,7 +3076,7 @@
               <w14:ligatures w14:val="standardContextual"/>
             </w:rPr>
           </w:pPr>
-          <w:hyperlink w:anchor="_Toc235437051" w:history="1">
+          <w:hyperlink w:anchor="_Toc235438576" w:history="1">
             <w:r>
               <w:rPr>
                 <w:rStyle w:val="Lienhypertexte"/>
@@ -3100,7 +3100,7 @@
               <w:rPr>
                 <w:noProof/>
               </w:rPr>
-              <w:instrText xml:space="preserve"> PAGEREF _Toc235437051 \h </w:instrText>
+              <w:instrText xml:space="preserve"> PAGEREF _Toc235438576 \h </w:instrText>
             </w:r>
             <w:r>
               <w:rPr>
@@ -3117,7 +3117,7 @@
               <w:rPr>
                 <w:noProof/>
               </w:rPr>
-              <w:t>24</w:t>
+              <w:t>25</w:t>
             </w:r>
             <w:r>
               <w:rPr>
@@ -3142,7 +3142,7 @@
               <w14:ligatures w14:val="standardContextual"/>
             </w:rPr>
           </w:pPr>
-          <w:hyperlink w:anchor="_Toc235437052" w:history="1">
+          <w:hyperlink w:anchor="_Toc235438577" w:history="1">
             <w:r>
               <w:rPr>
                 <w:rStyle w:val="Lienhypertexte"/>
@@ -3166,7 +3166,7 @@
               <w:rPr>
                 <w:noProof/>
               </w:rPr>
-              <w:instrText xml:space="preserve"> PAGEREF _Toc235437052 \h </w:instrText>
+              <w:instrText xml:space="preserve"> PAGEREF _Toc235438577 \h </w:instrText>
             </w:r>
             <w:r>
               <w:rPr>
@@ -3183,7 +3183,7 @@
               <w:rPr>
                 <w:noProof/>
               </w:rPr>
-              <w:t>24</w:t>
+              <w:t>25</w:t>
             </w:r>
             <w:r>
               <w:rPr>
@@ -3208,7 +3208,7 @@
               <w14:ligatures w14:val="standardContextual"/>
             </w:rPr>
           </w:pPr>
-          <w:hyperlink w:anchor="_Toc235437053" w:history="1">
+          <w:hyperlink w:anchor="_Toc235438578" w:history="1">
             <w:r>
               <w:rPr>
                 <w:rStyle w:val="Lienhypertexte"/>
@@ -3232,7 +3232,7 @@
               <w:rPr>
                 <w:noProof/>
               </w:rPr>
-              <w:instrText xml:space="preserve"> PAGEREF _Toc235437053 \h </w:instrText>
+              <w:instrText xml:space="preserve"> PAGEREF _Toc235438578 \h </w:instrText>
             </w:r>
             <w:r>
               <w:rPr>
@@ -3249,7 +3249,7 @@
               <w:rPr>
                 <w:noProof/>
               </w:rPr>
-              <w:t>25</w:t>
+              <w:t>26</w:t>
             </w:r>
             <w:r>
               <w:rPr>
@@ -3274,7 +3274,7 @@
               <w14:ligatures w14:val="standardContextual"/>
             </w:rPr>
           </w:pPr>
-          <w:hyperlink w:anchor="_Toc235437054" w:history="1">
+          <w:hyperlink w:anchor="_Toc235438579" w:history="1">
             <w:r>
               <w:rPr>
                 <w:rStyle w:val="Lienhypertexte"/>
@@ -3298,7 +3298,7 @@
               <w:rPr>
                 <w:noProof/>
               </w:rPr>
-              <w:instrText xml:space="preserve"> PAGEREF _Toc235437054 \h </w:instrText>
+              <w:instrText xml:space="preserve"> PAGEREF _Toc235438579 \h </w:instrText>
             </w:r>
             <w:r>
               <w:rPr>
@@ -3315,7 +3315,7 @@
               <w:rPr>
                 <w:noProof/>
               </w:rPr>
-              <w:t>25</w:t>
+              <w:t>26</w:t>
             </w:r>
             <w:r>
               <w:rPr>
@@ -3340,7 +3340,7 @@
               <w14:ligatures w14:val="standardContextual"/>
             </w:rPr>
           </w:pPr>
-          <w:hyperlink w:anchor="_Toc235437055" w:history="1">
+          <w:hyperlink w:anchor="_Toc235438580" w:history="1">
             <w:r>
               <w:rPr>
                 <w:rStyle w:val="Lienhypertexte"/>
@@ -3364,7 +3364,7 @@
               <w:rPr>
                 <w:noProof/>
               </w:rPr>
-              <w:instrText xml:space="preserve"> PAGEREF _Toc235437055 \h </w:instrText>
+              <w:instrText xml:space="preserve"> PAGEREF _Toc235438580 \h </w:instrText>
             </w:r>
             <w:r>
               <w:rPr>
@@ -3381,7 +3381,7 @@
               <w:rPr>
                 <w:noProof/>
               </w:rPr>
-              <w:t>26</w:t>
+              <w:t>27</w:t>
             </w:r>
             <w:r>
               <w:rPr>
@@ -3406,7 +3406,7 @@
               <w14:ligatures w14:val="standardContextual"/>
             </w:rPr>
           </w:pPr>
-          <w:hyperlink w:anchor="_Toc235437056" w:history="1">
+          <w:hyperlink w:anchor="_Toc235438581" w:history="1">
             <w:r>
               <w:rPr>
                 <w:rStyle w:val="Lienhypertexte"/>
@@ -3430,7 +3430,7 @@
               <w:rPr>
                 <w:noProof/>
               </w:rPr>
-              <w:instrText xml:space="preserve"> PAGEREF _Toc235437056 \h </w:instrText>
+              <w:instrText xml:space="preserve"> PAGEREF _Toc235438581 \h </w:instrText>
             </w:r>
             <w:r>
               <w:rPr>
@@ -3447,7 +3447,7 @@
               <w:rPr>
                 <w:noProof/>
               </w:rPr>
-              <w:t>26</w:t>
+              <w:t>27</w:t>
             </w:r>
             <w:r>
               <w:rPr>
@@ -3472,7 +3472,7 @@
               <w14:ligatures w14:val="standardContextual"/>
             </w:rPr>
           </w:pPr>
-          <w:hyperlink w:anchor="_Toc235437057" w:history="1">
+          <w:hyperlink w:anchor="_Toc235438582" w:history="1">
             <w:r>
               <w:rPr>
                 <w:rStyle w:val="Lienhypertexte"/>
@@ -3496,7 +3496,7 @@
               <w:rPr>
                 <w:noProof/>
               </w:rPr>
-              <w:instrText xml:space="preserve"> PAGEREF _Toc235437057 \h </w:instrText>
+              <w:instrText xml:space="preserve"> PAGEREF _Toc235438582 \h </w:instrText>
             </w:r>
             <w:r>
               <w:rPr>
@@ -3513,7 +3513,7 @@
               <w:rPr>
                 <w:noProof/>
               </w:rPr>
-              <w:t>26</w:t>
+              <w:t>27</w:t>
             </w:r>
             <w:r>
               <w:rPr>
@@ -3538,7 +3538,7 @@
               <w14:ligatures w14:val="standardContextual"/>
             </w:rPr>
           </w:pPr>
-          <w:hyperlink w:anchor="_Toc235437058" w:history="1">
+          <w:hyperlink w:anchor="_Toc235438583" w:history="1">
             <w:r>
               <w:rPr>
                 <w:rStyle w:val="Lienhypertexte"/>
@@ -3562,7 +3562,7 @@
               <w:rPr>
                 <w:noProof/>
               </w:rPr>
-              <w:instrText xml:space="preserve"> PAGEREF _Toc235437058 \h </w:instrText>
+              <w:instrText xml:space="preserve"> PAGEREF _Toc235438583 \h </w:instrText>
             </w:r>
             <w:r>
               <w:rPr>
@@ -3579,7 +3579,7 @@
               <w:rPr>
                 <w:noProof/>
               </w:rPr>
-              <w:t>26</w:t>
+              <w:t>27</w:t>
             </w:r>
             <w:r>
               <w:rPr>
@@ -3607,7 +3607,7 @@
         <w:keepNext/>
         <w:keepLines/>
       </w:pPr>
-      <w:bookmarkStart w:id="1" w:name="_Toc235437008"/>
+      <w:bookmarkStart w:id="1" w:name="_Toc235438533"/>
       <w:r>
         <w:lastRenderedPageBreak/>
         <w:t>Introduction — Compétences du référentiel couvertes</w:t>
@@ -3630,7 +3630,7 @@
         <w:keepLines/>
         <w:spacing w:before="240" w:after="120"/>
       </w:pPr>
-      <w:bookmarkStart w:id="2" w:name="_Toc235437009"/>
+      <w:bookmarkStart w:id="2" w:name="_Toc235438534"/>
       <w:r>
         <w:t>Activité-type 1 — Développer la partie front-end d'une application web ou web mobile sécurisée</w:t>
       </w:r>
@@ -3918,7 +3918,7 @@
         <w:keepLines/>
         <w:spacing w:before="240" w:after="120"/>
       </w:pPr>
-      <w:bookmarkStart w:id="3" w:name="_Toc235437010"/>
+      <w:bookmarkStart w:id="3" w:name="_Toc235438535"/>
       <w:r>
         <w:t>Activité-type 2 — Développer la partie back-end d'une application web ou web mobile sécurisée</w:t>
       </w:r>
@@ -4207,7 +4207,7 @@
         <w:keepNext/>
         <w:keepLines/>
       </w:pPr>
-      <w:bookmarkStart w:id="4" w:name="_Toc235437011"/>
+      <w:bookmarkStart w:id="4" w:name="_Toc235438536"/>
       <w:r>
         <w:lastRenderedPageBreak/>
         <w:t>1. Contexte du projet</w:t>
@@ -4221,7 +4221,7 @@
         <w:keepLines/>
         <w:spacing w:before="240" w:after="120"/>
       </w:pPr>
-      <w:bookmarkStart w:id="5" w:name="_Toc235437012"/>
+      <w:bookmarkStart w:id="5" w:name="_Toc235438537"/>
       <w:r>
         <w:t>1.1 Présentation de l'entreprise</w:t>
       </w:r>
@@ -4258,7 +4258,7 @@
         <w:keepLines/>
         <w:spacing w:before="240" w:after="120"/>
       </w:pPr>
-      <w:bookmarkStart w:id="6" w:name="_Toc235437013"/>
+      <w:bookmarkStart w:id="6" w:name="_Toc235438538"/>
       <w:r>
         <w:t>1.2 Expression des besoins</w:t>
       </w:r>
@@ -4338,7 +4338,7 @@
         <w:keepLines/>
         <w:spacing w:before="240" w:after="120"/>
       </w:pPr>
-      <w:bookmarkStart w:id="7" w:name="_Toc235437014"/>
+      <w:bookmarkStart w:id="7" w:name="_Toc235438539"/>
       <w:r>
         <w:t>1.3 Contraintes</w:t>
       </w:r>
@@ -4442,7 +4442,7 @@
         <w:keepLines/>
         <w:spacing w:before="240" w:after="120"/>
       </w:pPr>
-      <w:bookmarkStart w:id="8" w:name="_Toc235437015"/>
+      <w:bookmarkStart w:id="8" w:name="_Toc235438540"/>
       <w:r>
         <w:t>1.4 Livrables attendus</w:t>
       </w:r>
@@ -4520,7 +4520,7 @@
         <w:keepLines/>
         <w:spacing w:before="240" w:after="120"/>
       </w:pPr>
-      <w:bookmarkStart w:id="9" w:name="_Toc235437016"/>
+      <w:bookmarkStart w:id="9" w:name="_Toc235438541"/>
       <w:r>
         <w:lastRenderedPageBreak/>
         <w:t>1.5 Environnement humain et technique, objectifs de qualité</w:t>
@@ -4695,7 +4695,7 @@
         <w:keepNext/>
         <w:keepLines/>
       </w:pPr>
-      <w:bookmarkStart w:id="10" w:name="_Toc235437017"/>
+      <w:bookmarkStart w:id="10" w:name="_Toc235438542"/>
       <w:r>
         <w:lastRenderedPageBreak/>
         <w:t>2. Réalisations front-end</w:t>
@@ -4736,7 +4736,7 @@
         <w:keepLines/>
         <w:spacing w:before="240" w:after="120"/>
       </w:pPr>
-      <w:bookmarkStart w:id="11" w:name="_Toc235437018"/>
+      <w:bookmarkStart w:id="11" w:name="_Toc235438543"/>
       <w:r>
         <w:t>2.1 Charte graphique</w:t>
       </w:r>
@@ -5558,7 +5558,7 @@
         <w:keepLines/>
         <w:spacing w:before="240" w:after="120"/>
       </w:pPr>
-      <w:bookmarkStart w:id="12" w:name="_Toc235437019"/>
+      <w:bookmarkStart w:id="12" w:name="_Toc235438544"/>
       <w:r>
         <w:t>2.2 Lien Figma</w:t>
       </w:r>
@@ -5587,7 +5587,7 @@
         <w:keepLines/>
         <w:spacing w:before="240" w:after="120"/>
       </w:pPr>
-      <w:bookmarkStart w:id="13" w:name="_Toc235437020"/>
+      <w:bookmarkStart w:id="13" w:name="_Toc235438545"/>
       <w:r>
         <w:lastRenderedPageBreak/>
         <w:t>2.3 Captures d’écran</w:t>
@@ -5601,7 +5601,7 @@
         <w:keepLines/>
         <w:spacing w:before="200"/>
       </w:pPr>
-      <w:bookmarkStart w:id="14" w:name="_Toc235437021"/>
+      <w:bookmarkStart w:id="14" w:name="_Toc235438546"/>
       <w:r>
         <w:t>2.3.1 Charte graphique</w:t>
       </w:r>
@@ -5688,7 +5688,7 @@
         <w:keepLines/>
         <w:spacing w:before="200"/>
       </w:pPr>
-      <w:bookmarkStart w:id="15" w:name="_Toc235437022"/>
+      <w:bookmarkStart w:id="15" w:name="_Toc235438547"/>
       <w:r>
         <w:lastRenderedPageBreak/>
         <w:t>2.3.2 Accueil</w:t>
@@ -5941,7 +5941,7 @@
         <w:keepLines/>
         <w:spacing w:before="200"/>
       </w:pPr>
-      <w:bookmarkStart w:id="16" w:name="_Toc235437023"/>
+      <w:bookmarkStart w:id="16" w:name="_Toc235438548"/>
       <w:r>
         <w:lastRenderedPageBreak/>
         <w:t>2.3.3 Liste des artisans</w:t>
@@ -6193,7 +6193,7 @@
         <w:keepLines/>
         <w:spacing w:before="200"/>
       </w:pPr>
-      <w:bookmarkStart w:id="17" w:name="_Toc235437024"/>
+      <w:bookmarkStart w:id="17" w:name="_Toc235438549"/>
       <w:r>
         <w:lastRenderedPageBreak/>
         <w:t>2.3.4 Fiche artisan + formulaire</w:t>
@@ -6454,7 +6454,7 @@
         <w:keepLines/>
         <w:spacing w:before="200"/>
       </w:pPr>
-      <w:bookmarkStart w:id="18" w:name="_Toc235437025"/>
+      <w:bookmarkStart w:id="18" w:name="_Toc235438550"/>
       <w:r>
         <w:lastRenderedPageBreak/>
         <w:t>2.3.5 Page 404</w:t>
@@ -6649,7 +6649,7 @@
         <w:pageBreakBefore/>
         <w:spacing w:before="240" w:after="120"/>
       </w:pPr>
-      <w:bookmarkStart w:id="19" w:name="_Toc235437026"/>
+      <w:bookmarkStart w:id="19" w:name="_Toc235438551"/>
       <w:r>
         <w:lastRenderedPageBreak/>
         <w:t>2.4 Enchaînement des écrans</w:t>
@@ -6723,7 +6723,7 @@
         <w:pageBreakBefore/>
         <w:spacing w:before="240" w:after="120"/>
       </w:pPr>
-      <w:bookmarkStart w:id="20" w:name="_Toc235437027"/>
+      <w:bookmarkStart w:id="20" w:name="_Toc235438552"/>
       <w:r>
         <w:lastRenderedPageBreak/>
         <w:t>2.5 Interfaces utilisateur statiques</w:t>
@@ -6832,7 +6832,7 @@
         <w:keepLines/>
         <w:spacing w:before="240" w:after="120"/>
       </w:pPr>
-      <w:bookmarkStart w:id="21" w:name="_Toc235437028"/>
+      <w:bookmarkStart w:id="21" w:name="_Toc235438553"/>
       <w:r>
         <w:t>2.6 Partie dynamique des interfaces</w:t>
       </w:r>
@@ -6932,7 +6932,7 @@
         <w:keepLines/>
         <w:spacing w:before="240" w:after="120"/>
       </w:pPr>
-      <w:bookmarkStart w:id="22" w:name="_Toc235437029"/>
+      <w:bookmarkStart w:id="22" w:name="_Toc235438554"/>
       <w:r>
         <w:t>2.7 Accessibilité et référencement</w:t>
       </w:r>
@@ -6963,7 +6963,7 @@
         <w:keepLines/>
         <w:spacing w:before="240" w:after="120"/>
       </w:pPr>
-      <w:bookmarkStart w:id="23" w:name="_Toc235437030"/>
+      <w:bookmarkStart w:id="23" w:name="_Toc235438555"/>
       <w:r>
         <w:lastRenderedPageBreak/>
         <w:t>2.8 Éco-conception</w:t>
@@ -6991,7 +6991,7 @@
         <w:keepNext/>
         <w:keepLines/>
       </w:pPr>
-      <w:bookmarkStart w:id="24" w:name="_Toc235437031"/>
+      <w:bookmarkStart w:id="24" w:name="_Toc235438556"/>
       <w:r>
         <w:lastRenderedPageBreak/>
         <w:t>3. Base de données et composants serveur</w:t>
@@ -7005,7 +7005,7 @@
         <w:keepLines/>
         <w:spacing w:before="240" w:after="120"/>
       </w:pPr>
-      <w:bookmarkStart w:id="25" w:name="_Toc235437032"/>
+      <w:bookmarkStart w:id="25" w:name="_Toc235438557"/>
       <w:r>
         <w:t>3.1 Règles de gestion</w:t>
       </w:r>
@@ -7096,7 +7096,7 @@
         <w:keepLines/>
         <w:spacing w:before="240" w:after="120"/>
       </w:pPr>
-      <w:bookmarkStart w:id="26" w:name="_Toc235437033"/>
+      <w:bookmarkStart w:id="26" w:name="_Toc235438558"/>
       <w:r>
         <w:t>3.2 Respect des formes normales</w:t>
       </w:r>
@@ -7118,7 +7118,7 @@
         <w:keepLines/>
         <w:spacing w:before="240" w:after="120"/>
       </w:pPr>
-      <w:bookmarkStart w:id="27" w:name="_Toc235437034"/>
+      <w:bookmarkStart w:id="27" w:name="_Toc235438559"/>
       <w:r>
         <w:t>3.3 Modèle conceptuel de données (MCD)</w:t>
       </w:r>
@@ -7197,7 +7197,7 @@
         <w:keepLines/>
         <w:spacing w:before="240" w:after="120"/>
       </w:pPr>
-      <w:bookmarkStart w:id="28" w:name="_Toc235437035"/>
+      <w:bookmarkStart w:id="28" w:name="_Toc235438560"/>
       <w:r>
         <w:lastRenderedPageBreak/>
         <w:t>3.4 Modèle logique de données (MLD)</w:t>
@@ -7215,8 +7215,8 @@
           <w:noProof/>
         </w:rPr>
         <w:drawing>
-          <wp:inline distT="0" distB="0" distL="0" distR="0" wp14:anchorId="4416B1C5" wp14:editId="35AE9F98">
-            <wp:extent cx="5143500" cy="3219450"/>
+          <wp:inline distT="0" distB="0" distL="0" distR="0" wp14:anchorId="4416B1C5" wp14:editId="45D6F43B">
+            <wp:extent cx="5143500" cy="5773003"/>
             <wp:effectExtent l="0" t="0" r="0" b="0"/>
             <wp:docPr id="205118826" name="mld.png" descr="MLD — types SQL, PK / UK / FK identifiés" title="MLD — types SQL, PK / UK / FK identifiés"/>
             <wp:cNvGraphicFramePr>
@@ -7241,7 +7241,7 @@
                   <pic:spPr bwMode="auto">
                     <a:xfrm>
                       <a:off x="0" y="0"/>
-                      <a:ext cx="5143500" cy="3219450"/>
+                      <a:ext cx="5158000" cy="5789278"/>
                     </a:xfrm>
                     <a:prstGeom prst="rect">
                       <a:avLst/>
@@ -7275,6 +7275,12 @@
         <w:spacing w:after="200" w:line="276" w:lineRule="auto"/>
         <w:jc w:val="both"/>
       </w:pPr>
+    </w:p>
+    <w:p>
+      <w:pPr>
+        <w:spacing w:after="200" w:line="276" w:lineRule="auto"/>
+        <w:jc w:val="both"/>
+      </w:pPr>
       <w:r>
         <w:t>Notation textuelle équivalente (avec PK soulignée et FK préfixées par #) :</w:t>
       </w:r>
@@ -7362,16 +7368,19 @@
         <w:pStyle w:val="Titre2"/>
         <w:keepNext/>
         <w:keepLines/>
+        <w:pageBreakBefore/>
         <w:spacing w:before="240" w:after="120"/>
       </w:pPr>
-      <w:bookmarkStart w:id="29" w:name="_Toc235437036"/>
-      <w:r>
+      <w:bookmarkStart w:id="29" w:name="_Toc235438561"/>
+      <w:r>
+        <w:lastRenderedPageBreak/>
         <w:t>3.5 Modèle physique de données (extrait)</w:t>
       </w:r>
       <w:bookmarkEnd w:id="29"/>
     </w:p>
     <w:p>
       <w:pPr>
+        <w:keepLines/>
         <w:shd w:val="clear" w:color="auto" w:fill="F1F8FC"/>
         <w:spacing w:after="120"/>
         <w:rPr>
@@ -7604,6 +7613,7 @@
           <w:lang w:val="en-US"/>
         </w:rPr>
         <w:br/>
+        <w:t xml:space="preserve">  CONSTRAINT chk_artisan_rating CHECK (rating &gt;= 0.0 AND rating &lt;= 5.0),</w:t>
       </w:r>
       <w:r>
         <w:rPr>
@@ -7612,8 +7622,8 @@
           <w:szCs w:val="20"/>
           <w:lang w:val="en-US"/>
         </w:rPr>
-        <w:lastRenderedPageBreak/>
-        <w:t xml:space="preserve">  CONSTRAINT chk_artisan_rating CHECK (rating &gt;= 0.0 AND rating &lt;= 5.0),</w:t>
+        <w:br/>
+        <w:t xml:space="preserve">  CONSTRAINT chk_artisan_email  CHECK (email LIKE '%_@_%.__%'),</w:t>
       </w:r>
       <w:r>
         <w:rPr>
@@ -7623,7 +7633,7 @@
           <w:lang w:val="en-US"/>
         </w:rPr>
         <w:br/>
-        <w:t xml:space="preserve">  CONSTRAINT chk_artisan_email  CHECK (email LIKE '%_@_%.__%'),</w:t>
+        <w:t xml:space="preserve">  CONSTRAINT fk_artisan_specialty</w:t>
       </w:r>
       <w:r>
         <w:rPr>
@@ -7633,7 +7643,7 @@
           <w:lang w:val="en-US"/>
         </w:rPr>
         <w:br/>
-        <w:t xml:space="preserve">  CONSTRAINT fk_artisan_specialty</w:t>
+        <w:t xml:space="preserve">    FOREIGN KEY (specialty_id) REFERENCES specialties(id)</w:t>
       </w:r>
       <w:r>
         <w:rPr>
@@ -7643,7 +7653,7 @@
           <w:lang w:val="en-US"/>
         </w:rPr>
         <w:br/>
-        <w:t xml:space="preserve">    FOREIGN KEY (specialty_id) REFERENCES specialties(id)</w:t>
+        <w:t xml:space="preserve">    ON DELETE RESTRICT ON UPDATE CASCADE,</w:t>
       </w:r>
       <w:r>
         <w:rPr>
@@ -7653,7 +7663,7 @@
           <w:lang w:val="en-US"/>
         </w:rPr>
         <w:br/>
-        <w:t xml:space="preserve">    ON DELETE RESTRICT ON UPDATE CASCADE,</w:t>
+        <w:t xml:space="preserve">  CONSTRAINT fk_artisan_city</w:t>
       </w:r>
       <w:r>
         <w:rPr>
@@ -7663,7 +7673,7 @@
           <w:lang w:val="en-US"/>
         </w:rPr>
         <w:br/>
-        <w:t xml:space="preserve">  CONSTRAINT fk_artisan_city</w:t>
+        <w:t xml:space="preserve">    FOREIGN KEY (city_id) REFERENCES cities(id)</w:t>
       </w:r>
       <w:r>
         <w:rPr>
@@ -7673,7 +7683,7 @@
           <w:lang w:val="en-US"/>
         </w:rPr>
         <w:br/>
-        <w:t xml:space="preserve">    FOREIGN KEY (city_id) REFERENCES cities(id)</w:t>
+        <w:t xml:space="preserve">    ON DELETE RESTRICT ON UPDATE CASCADE</w:t>
       </w:r>
       <w:r>
         <w:rPr>
@@ -7683,18 +7693,17 @@
           <w:lang w:val="en-US"/>
         </w:rPr>
         <w:br/>
-        <w:t xml:space="preserve">    ON DELETE RESTRICT ON UPDATE CASCADE</w:t>
-      </w:r>
-      <w:r>
-        <w:rPr>
-          <w:rFonts w:ascii="Consolas" w:eastAsia="Consolas" w:hAnsi="Consolas" w:cs="Consolas"/>
-          <w:sz w:val="20"/>
-          <w:szCs w:val="20"/>
+        <w:t>) ENGINE=InnoDB CHARSET=utf8mb4 COLLATE=utf8mb4_unicode_ci;</w:t>
+      </w:r>
+    </w:p>
+    <w:p>
+      <w:pPr>
+        <w:spacing w:after="200" w:line="276" w:lineRule="auto"/>
+        <w:jc w:val="both"/>
+        <w:rPr>
           <w:lang w:val="en-US"/>
         </w:rPr>
-        <w:br/>
-        <w:t>) ENGINE=InnoDB CHARSET=utf8mb4 COLLATE=utf8mb4_unicode_ci;</w:t>
-      </w:r>
+      </w:pPr>
     </w:p>
     <w:p>
       <w:pPr>
@@ -7712,7 +7721,7 @@
         <w:keepLines/>
         <w:spacing w:before="240" w:after="120"/>
       </w:pPr>
-      <w:bookmarkStart w:id="30" w:name="_Toc235437037"/>
+      <w:bookmarkStart w:id="30" w:name="_Toc235438562"/>
       <w:r>
         <w:t>3.6 Jeu d'essai (données initiales)</w:t>
       </w:r>
@@ -7784,10 +7793,12 @@
         <w:pStyle w:val="Titre2"/>
         <w:keepNext/>
         <w:keepLines/>
+        <w:pageBreakBefore/>
         <w:spacing w:before="240" w:after="120"/>
       </w:pPr>
-      <w:bookmarkStart w:id="31" w:name="_Toc235437038"/>
-      <w:r>
+      <w:bookmarkStart w:id="31" w:name="_Toc235438563"/>
+      <w:r>
+        <w:lastRenderedPageBreak/>
         <w:t>3.7 Données NoSQL : les avis clients (MongoDB)</w:t>
       </w:r>
       <w:bookmarkEnd w:id="31"/>
@@ -7884,6 +7895,12 @@
         <w:spacing w:after="200" w:line="276" w:lineRule="auto"/>
         <w:jc w:val="both"/>
       </w:pPr>
+    </w:p>
+    <w:p>
+      <w:pPr>
+        <w:spacing w:after="200" w:line="276" w:lineRule="auto"/>
+        <w:jc w:val="both"/>
+      </w:pPr>
       <w:r>
         <w:t>La connexion à MongoDB est volontairement non bloquante : si la base NoSQL est momentanément indisponible, l'API relationnelle continue de fonctionner et les routes d'avis renvoient un code 503 explicite.</w:t>
       </w:r>
@@ -7904,9 +7921,8 @@
         <w:keepLines/>
         <w:spacing w:before="240" w:after="120"/>
       </w:pPr>
-      <w:bookmarkStart w:id="32" w:name="_Toc235437039"/>
-      <w:r>
-        <w:lastRenderedPageBreak/>
+      <w:bookmarkStart w:id="32" w:name="_Toc235438564"/>
+      <w:r>
         <w:t>3.8 Composants d'accès aux données (SQL et NoSQL)</w:t>
       </w:r>
       <w:bookmarkEnd w:id="32"/>
@@ -8054,96 +8070,6 @@
         </w:rPr>
         <w:br/>
         <w:t>]);</w:t>
-      </w:r>
-    </w:p>
-    <w:p>
-      <w:pPr>
-        <w:pStyle w:val="Titre2"/>
-        <w:keepNext/>
-        <w:keepLines/>
-        <w:spacing w:before="240" w:after="120"/>
-      </w:pPr>
-      <w:bookmarkStart w:id="33" w:name="_Toc235437040"/>
-      <w:r>
-        <w:t>3.9 Composants métier côté serveur</w:t>
-      </w:r>
-      <w:bookmarkEnd w:id="33"/>
-    </w:p>
-    <w:p>
-      <w:pPr>
-        <w:spacing w:after="200" w:line="276" w:lineRule="auto"/>
-        <w:jc w:val="both"/>
-      </w:pPr>
-      <w:r>
-        <w:t>La logique métier est portée par les services, jamais par les contrôleurs, qui se contentent de lire la requête et de mettre en forme la réponse. La création d'un avis illustre la collaboration des deux bases : le service vérifie d'abord, côté relationnel, que l'artisan existe, avant d'enregistrer l'avis côté MongoDB.</w:t>
-      </w:r>
-    </w:p>
-    <w:p>
-      <w:pPr>
-        <w:shd w:val="clear" w:color="auto" w:fill="F1F8FC"/>
-        <w:spacing w:after="120"/>
-        <w:rPr>
-          <w:lang w:val="en-US"/>
-        </w:rPr>
-      </w:pPr>
-      <w:r>
-        <w:rPr>
-          <w:rFonts w:ascii="Consolas" w:eastAsia="Consolas" w:hAnsi="Consolas" w:cs="Consolas"/>
-          <w:sz w:val="20"/>
-          <w:szCs w:val="20"/>
-          <w:lang w:val="en-US"/>
-        </w:rPr>
-        <w:t>async function createReview(artisanId, { authorName, rating, comment }) {</w:t>
-      </w:r>
-      <w:r>
-        <w:rPr>
-          <w:rFonts w:ascii="Consolas" w:eastAsia="Consolas" w:hAnsi="Consolas" w:cs="Consolas"/>
-          <w:sz w:val="20"/>
-          <w:szCs w:val="20"/>
-          <w:lang w:val="en-US"/>
-        </w:rPr>
-        <w:br/>
-        <w:t xml:space="preserve">  const artisan = await Artisan.findByPk(artisanId);   // verification cote SQL</w:t>
-      </w:r>
-      <w:r>
-        <w:rPr>
-          <w:rFonts w:ascii="Consolas" w:eastAsia="Consolas" w:hAnsi="Consolas" w:cs="Consolas"/>
-          <w:sz w:val="20"/>
-          <w:szCs w:val="20"/>
-          <w:lang w:val="en-US"/>
-        </w:rPr>
-        <w:br/>
-        <w:t xml:space="preserve">  if (!artisan) return { notFound: true };</w:t>
-      </w:r>
-      <w:r>
-        <w:rPr>
-          <w:rFonts w:ascii="Consolas" w:eastAsia="Consolas" w:hAnsi="Consolas" w:cs="Consolas"/>
-          <w:sz w:val="20"/>
-          <w:szCs w:val="20"/>
-          <w:lang w:val="en-US"/>
-        </w:rPr>
-        <w:br/>
-        <w:t xml:space="preserve">  const review = await Review.create({ artisanId, authorName, rating, comment }); // ecriture NoSQL</w:t>
-      </w:r>
-      <w:r>
-        <w:rPr>
-          <w:rFonts w:ascii="Consolas" w:eastAsia="Consolas" w:hAnsi="Consolas" w:cs="Consolas"/>
-          <w:sz w:val="20"/>
-          <w:szCs w:val="20"/>
-          <w:lang w:val="en-US"/>
-        </w:rPr>
-        <w:br/>
-        <w:t xml:space="preserve">  return { review };</w:t>
-      </w:r>
-      <w:r>
-        <w:rPr>
-          <w:rFonts w:ascii="Consolas" w:eastAsia="Consolas" w:hAnsi="Consolas" w:cs="Consolas"/>
-          <w:sz w:val="20"/>
-          <w:szCs w:val="20"/>
-          <w:lang w:val="en-US"/>
-        </w:rPr>
-        <w:br/>
-        <w:t>}</w:t>
       </w:r>
     </w:p>
     <w:p>
@@ -8154,7 +8080,99 @@
         <w:pageBreakBefore/>
         <w:spacing w:before="240" w:after="120"/>
       </w:pPr>
-      <w:bookmarkStart w:id="34" w:name="_Toc235437041"/>
+      <w:bookmarkStart w:id="33" w:name="_Toc235438565"/>
+      <w:r>
+        <w:lastRenderedPageBreak/>
+        <w:t>3.9 Composants métier côté serveur</w:t>
+      </w:r>
+      <w:bookmarkEnd w:id="33"/>
+    </w:p>
+    <w:p>
+      <w:pPr>
+        <w:spacing w:after="200" w:line="276" w:lineRule="auto"/>
+        <w:jc w:val="both"/>
+      </w:pPr>
+      <w:r>
+        <w:t>La logique métier est portée par les services, jamais par les contrôleurs, qui se contentent de lire la requête et de mettre en forme la réponse. La création d'un avis illustre la collaboration des deux bases : le service vérifie d'abord, côté relationnel, que l'artisan existe, avant d'enregistrer l'avis côté MongoDB.</w:t>
+      </w:r>
+    </w:p>
+    <w:p>
+      <w:pPr>
+        <w:shd w:val="clear" w:color="auto" w:fill="F1F8FC"/>
+        <w:spacing w:after="120"/>
+        <w:rPr>
+          <w:lang w:val="en-US"/>
+        </w:rPr>
+      </w:pPr>
+      <w:r>
+        <w:rPr>
+          <w:rFonts w:ascii="Consolas" w:eastAsia="Consolas" w:hAnsi="Consolas" w:cs="Consolas"/>
+          <w:sz w:val="20"/>
+          <w:szCs w:val="20"/>
+          <w:lang w:val="en-US"/>
+        </w:rPr>
+        <w:t>async function createReview(artisanId, { authorName, rating, comment }) {</w:t>
+      </w:r>
+      <w:r>
+        <w:rPr>
+          <w:rFonts w:ascii="Consolas" w:eastAsia="Consolas" w:hAnsi="Consolas" w:cs="Consolas"/>
+          <w:sz w:val="20"/>
+          <w:szCs w:val="20"/>
+          <w:lang w:val="en-US"/>
+        </w:rPr>
+        <w:br/>
+        <w:t xml:space="preserve">  const artisan = await Artisan.findByPk(artisanId);   // verification cote SQL</w:t>
+      </w:r>
+      <w:r>
+        <w:rPr>
+          <w:rFonts w:ascii="Consolas" w:eastAsia="Consolas" w:hAnsi="Consolas" w:cs="Consolas"/>
+          <w:sz w:val="20"/>
+          <w:szCs w:val="20"/>
+          <w:lang w:val="en-US"/>
+        </w:rPr>
+        <w:br/>
+        <w:t xml:space="preserve">  if (!artisan) return { notFound: true };</w:t>
+      </w:r>
+      <w:r>
+        <w:rPr>
+          <w:rFonts w:ascii="Consolas" w:eastAsia="Consolas" w:hAnsi="Consolas" w:cs="Consolas"/>
+          <w:sz w:val="20"/>
+          <w:szCs w:val="20"/>
+          <w:lang w:val="en-US"/>
+        </w:rPr>
+        <w:br/>
+        <w:t xml:space="preserve">  const review = await Review.create({ artisanId, authorName, rating, comment }); // ecriture NoSQL</w:t>
+      </w:r>
+      <w:r>
+        <w:rPr>
+          <w:rFonts w:ascii="Consolas" w:eastAsia="Consolas" w:hAnsi="Consolas" w:cs="Consolas"/>
+          <w:sz w:val="20"/>
+          <w:szCs w:val="20"/>
+          <w:lang w:val="en-US"/>
+        </w:rPr>
+        <w:br/>
+        <w:t xml:space="preserve">  return { review };</w:t>
+      </w:r>
+      <w:r>
+        <w:rPr>
+          <w:rFonts w:ascii="Consolas" w:eastAsia="Consolas" w:hAnsi="Consolas" w:cs="Consolas"/>
+          <w:sz w:val="20"/>
+          <w:szCs w:val="20"/>
+          <w:lang w:val="en-US"/>
+        </w:rPr>
+        <w:br/>
+        <w:t>}</w:t>
+      </w:r>
+    </w:p>
+    <w:p>
+      <w:pPr>
+        <w:pStyle w:val="Titre2"/>
+        <w:keepNext/>
+        <w:keepLines/>
+        <w:pageBreakBefore/>
+        <w:spacing w:before="240" w:after="120"/>
+      </w:pPr>
+      <w:bookmarkStart w:id="34" w:name="_Toc235438566"/>
       <w:r>
         <w:lastRenderedPageBreak/>
         <w:t>3.10 Jeu d'essai de la fonctionnalité la plus représentative</w:t>
@@ -8654,7 +8672,7 @@
         <w:keepLines/>
         <w:spacing w:before="240" w:after="120"/>
       </w:pPr>
-      <w:bookmarkStart w:id="35" w:name="_Toc235437042"/>
+      <w:bookmarkStart w:id="35" w:name="_Toc235438567"/>
       <w:r>
         <w:t>3.11 Tests automatisés</w:t>
       </w:r>
@@ -8728,7 +8746,7 @@
         <w:keepNext/>
         <w:keepLines/>
       </w:pPr>
-      <w:bookmarkStart w:id="36" w:name="_Toc235437043"/>
+      <w:bookmarkStart w:id="36" w:name="_Toc235438568"/>
       <w:r>
         <w:lastRenderedPageBreak/>
         <w:t>4. Sécurité</w:t>
@@ -8751,7 +8769,7 @@
         <w:keepLines/>
         <w:spacing w:before="240" w:after="120"/>
       </w:pPr>
-      <w:bookmarkStart w:id="37" w:name="_Toc235437044"/>
+      <w:bookmarkStart w:id="37" w:name="_Toc235438569"/>
       <w:r>
         <w:t>4.1 Synthèse des mesures</w:t>
       </w:r>
@@ -9867,7 +9885,7 @@
         <w:keepLines/>
         <w:spacing w:before="240" w:after="120"/>
       </w:pPr>
-      <w:bookmarkStart w:id="38" w:name="_Toc235437045"/>
+      <w:bookmarkStart w:id="38" w:name="_Toc235438570"/>
       <w:r>
         <w:lastRenderedPageBreak/>
         <w:t>4.2 Détail des principales mesures</w:t>
@@ -9881,7 +9899,7 @@
         <w:keepLines/>
         <w:spacing w:before="200"/>
       </w:pPr>
-      <w:bookmarkStart w:id="39" w:name="_Toc235437046"/>
+      <w:bookmarkStart w:id="39" w:name="_Toc235438571"/>
       <w:r>
         <w:t>4.2.1 Authentification de l’application par clé d’API</w:t>
       </w:r>
@@ -9903,7 +9921,7 @@
         <w:keepLines/>
         <w:spacing w:before="200"/>
       </w:pPr>
-      <w:bookmarkStart w:id="40" w:name="_Toc235437047"/>
+      <w:bookmarkStart w:id="40" w:name="_Toc235438572"/>
       <w:r>
         <w:t>4.2.2 Politique CORS restrictive</w:t>
       </w:r>
@@ -9925,7 +9943,7 @@
         <w:keepLines/>
         <w:spacing w:before="200"/>
       </w:pPr>
-      <w:bookmarkStart w:id="41" w:name="_Toc235437048"/>
+      <w:bookmarkStart w:id="41" w:name="_Toc235438573"/>
       <w:r>
         <w:t>4.2.3 Protection des données utilisateur</w:t>
       </w:r>
@@ -9953,7 +9971,7 @@
         <w:keepLines/>
         <w:spacing w:before="200"/>
       </w:pPr>
-      <w:bookmarkStart w:id="42" w:name="_Toc235437049"/>
+      <w:bookmarkStart w:id="42" w:name="_Toc235438574"/>
       <w:r>
         <w:t>4.2.4 Limitation du débit et anti-spam</w:t>
       </w:r>
@@ -9985,7 +10003,7 @@
         <w:keepNext/>
         <w:keepLines/>
       </w:pPr>
-      <w:bookmarkStart w:id="43" w:name="_Toc235437050"/>
+      <w:bookmarkStart w:id="43" w:name="_Toc235438575"/>
       <w:r>
         <w:lastRenderedPageBreak/>
         <w:t>5. Veille de sécurité</w:t>
@@ -9999,7 +10017,7 @@
         <w:keepLines/>
         <w:spacing w:before="240" w:after="120"/>
       </w:pPr>
-      <w:bookmarkStart w:id="44" w:name="_Toc235437051"/>
+      <w:bookmarkStart w:id="44" w:name="_Toc235438576"/>
       <w:r>
         <w:t>5.1 Sources consultées</w:t>
       </w:r>
@@ -10096,7 +10114,7 @@
         <w:keepLines/>
         <w:spacing w:before="240" w:after="120"/>
       </w:pPr>
-      <w:bookmarkStart w:id="45" w:name="_Toc235437052"/>
+      <w:bookmarkStart w:id="45" w:name="_Toc235438577"/>
       <w:r>
         <w:t>5.2 Vulnérabilités OWASP étudiées</w:t>
       </w:r>
@@ -10749,7 +10767,7 @@
         <w:keepLines/>
         <w:spacing w:before="240" w:after="120"/>
       </w:pPr>
-      <w:bookmarkStart w:id="46" w:name="_Toc235437053"/>
+      <w:bookmarkStart w:id="46" w:name="_Toc235438578"/>
       <w:r>
         <w:lastRenderedPageBreak/>
         <w:t>5.3 Tests effectués sur le projet</w:t>
@@ -11445,7 +11463,7 @@
         <w:keepLines/>
         <w:spacing w:before="240" w:after="120"/>
       </w:pPr>
-      <w:bookmarkStart w:id="47" w:name="_Toc235437054"/>
+      <w:bookmarkStart w:id="47" w:name="_Toc235438579"/>
       <w:r>
         <w:t>5.4 Vulnérabilités corrigées en cours de développement</w:t>
       </w:r>
@@ -11514,7 +11532,7 @@
         <w:keepNext/>
         <w:keepLines/>
       </w:pPr>
-      <w:bookmarkStart w:id="48" w:name="_Toc235437055"/>
+      <w:bookmarkStart w:id="48" w:name="_Toc235438580"/>
       <w:r>
         <w:lastRenderedPageBreak/>
         <w:t>6. Liens du projet</w:t>
@@ -11528,7 +11546,7 @@
         <w:keepLines/>
         <w:spacing w:before="240" w:after="120"/>
       </w:pPr>
-      <w:bookmarkStart w:id="49" w:name="_Toc235437056"/>
+      <w:bookmarkStart w:id="49" w:name="_Toc235438581"/>
       <w:r>
         <w:t>6.1 Dépôt GitHub</w:t>
       </w:r>
@@ -11657,7 +11675,7 @@
         <w:keepLines/>
         <w:spacing w:before="240" w:after="120"/>
       </w:pPr>
-      <w:bookmarkStart w:id="50" w:name="_Toc235437057"/>
+      <w:bookmarkStart w:id="50" w:name="_Toc235438582"/>
       <w:r>
         <w:t>6.2 Site déployé</w:t>
       </w:r>
@@ -11711,7 +11729,7 @@
         <w:keepLines/>
         <w:spacing w:before="240" w:after="120"/>
       </w:pPr>
-      <w:bookmarkStart w:id="51" w:name="_Toc235437058"/>
+      <w:bookmarkStart w:id="51" w:name="_Toc235438583"/>
       <w:r>
         <w:t>6.3 Maquettes Figma</w:t>
       </w:r>

</xml_diff>